<commit_message>
committing updates to xalan-j xslt 3.0 implementation status document
</commit_message>
<xml_diff>
--- a/xalan-j/xsl3/xalanj_xslt3.0_implementation_status.docx
+++ b/xalan-j/xsl3/xalanj_xslt3.0_implementation_status.docx
@@ -32,13 +32,6 @@
           <w:b/>
           <w:bCs/>
         </w:rPr>
-        <w:t>-J</w:t>
-      </w:r>
-      <w:r>
-        <w:rPr>
-          <w:b/>
-          <w:bCs/>
-        </w:rPr>
         <w:t xml:space="preserve"> </w:t>
       </w:r>
       <w:r>
@@ -158,276 +151,256 @@
           <w:color w:val="404040" w:themeColor="text1" w:themeTint="BF"/>
           <w:lang w:val="en-IN"/>
         </w:rPr>
-        <w:t>0</w:t>
+        <w:t>11</w:t>
       </w:r>
       <w:r>
         <w:rPr>
           <w:color w:val="404040" w:themeColor="text1" w:themeTint="BF"/>
           <w:lang w:val="en-IN"/>
         </w:rPr>
-        <w:t>7</w:t>
+        <w:t>-</w:t>
       </w:r>
       <w:r>
         <w:rPr>
           <w:color w:val="404040" w:themeColor="text1" w:themeTint="BF"/>
           <w:lang w:val="en-IN"/>
         </w:rPr>
-        <w:t>-</w:t>
-      </w:r>
-      <w:r>
-        <w:rPr>
+        <w:t>04</w:t>
+      </w:r>
+    </w:p>
+    <w:p>
+      <w:pPr>
+        <w:rPr>
+          <w:rFonts w:hint="eastAsia"/>
+          <w:b/>
+          <w:bCs/>
+        </w:rPr>
+      </w:pPr>
+      <w:r>
+        <w:rPr>
+          <w:b/>
+          <w:bCs/>
+        </w:rPr>
+        <w:t xml:space="preserve">                                                </w:t>
+      </w:r>
+      <w:r>
+        <w:rPr>
+          <w:b/>
+          <w:bCs/>
+        </w:rPr>
+        <w:t xml:space="preserve">                                                                         </w:t>
+      </w:r>
+    </w:p>
+    <w:p>
+      <w:pPr>
+        <w:rPr>
+          <w:rFonts w:hint="eastAsia"/>
           <w:color w:val="404040" w:themeColor="text1" w:themeTint="BF"/>
           <w:lang w:val="en-IN"/>
         </w:rPr>
-        <w:t>1</w:t>
-      </w:r>
+      </w:pPr>
       <w:r>
         <w:rPr>
           <w:color w:val="404040" w:themeColor="text1" w:themeTint="BF"/>
           <w:lang w:val="en-IN"/>
         </w:rPr>
-        <w:t>8</w:t>
-      </w:r>
-    </w:p>
-    <w:p>
-      <w:pPr>
-        <w:rPr>
-          <w:rFonts w:hint="eastAsia"/>
-          <w:b/>
-          <w:bCs/>
-        </w:rPr>
-      </w:pPr>
-      <w:r>
-        <w:rPr>
-          <w:b/>
-          <w:bCs/>
-        </w:rPr>
-        <w:t xml:space="preserve">                                                </w:t>
-      </w:r>
-      <w:r>
-        <w:rPr>
-          <w:b/>
-          <w:bCs/>
-        </w:rPr>
-        <w:t xml:space="preserve">                                                                         </w:t>
-      </w:r>
-    </w:p>
-    <w:p>
-      <w:pPr>
-        <w:rPr>
-          <w:rFonts w:hint="eastAsia"/>
+        <w:t xml:space="preserve">       </w:t>
+      </w:r>
+      <w:r>
+        <w:rPr>
           <w:color w:val="404040" w:themeColor="text1" w:themeTint="BF"/>
           <w:lang w:val="en-IN"/>
         </w:rPr>
-      </w:pPr>
+        <w:t xml:space="preserve">                                                 </w:t>
+      </w:r>
       <w:r>
         <w:rPr>
           <w:color w:val="404040" w:themeColor="text1" w:themeTint="BF"/>
           <w:lang w:val="en-IN"/>
         </w:rPr>
-        <w:t xml:space="preserve">       </w:t>
+        <w:t>Authors</w:t>
       </w:r>
       <w:r>
         <w:rPr>
           <w:color w:val="404040" w:themeColor="text1" w:themeTint="BF"/>
           <w:lang w:val="en-IN"/>
         </w:rPr>
-        <w:t xml:space="preserve">                                                 </w:t>
-      </w:r>
-      <w:r>
-        <w:rPr>
+        <w:t>:</w:t>
+      </w:r>
+    </w:p>
+    <w:p>
+      <w:pPr>
+        <w:rPr>
+          <w:rFonts w:hint="eastAsia"/>
           <w:color w:val="404040" w:themeColor="text1" w:themeTint="BF"/>
           <w:lang w:val="en-IN"/>
         </w:rPr>
-        <w:t>Authors</w:t>
-      </w:r>
+      </w:pPr>
       <w:r>
         <w:rPr>
           <w:color w:val="404040" w:themeColor="text1" w:themeTint="BF"/>
           <w:lang w:val="en-IN"/>
         </w:rPr>
-        <w:t>:</w:t>
-      </w:r>
-    </w:p>
-    <w:p>
-      <w:pPr>
-        <w:rPr>
-          <w:rFonts w:hint="eastAsia"/>
+        <w:t xml:space="preserve">   </w:t>
+      </w:r>
+      <w:r>
+        <w:rPr>
           <w:color w:val="404040" w:themeColor="text1" w:themeTint="BF"/>
           <w:lang w:val="en-IN"/>
         </w:rPr>
-      </w:pPr>
+        <w:t xml:space="preserve">    </w:t>
+      </w:r>
       <w:r>
         <w:rPr>
           <w:color w:val="404040" w:themeColor="text1" w:themeTint="BF"/>
           <w:lang w:val="en-IN"/>
         </w:rPr>
-        <w:t xml:space="preserve">   </w:t>
+        <w:tab/>
       </w:r>
       <w:r>
         <w:rPr>
           <w:color w:val="404040" w:themeColor="text1" w:themeTint="BF"/>
           <w:lang w:val="en-IN"/>
         </w:rPr>
-        <w:t xml:space="preserve">    </w:t>
+        <w:tab/>
       </w:r>
       <w:r>
         <w:rPr>
           <w:color w:val="404040" w:themeColor="text1" w:themeTint="BF"/>
           <w:lang w:val="en-IN"/>
         </w:rPr>
-        <w:tab/>
+        <w:t xml:space="preserve">                                          </w:t>
       </w:r>
       <w:r>
         <w:rPr>
           <w:color w:val="404040" w:themeColor="text1" w:themeTint="BF"/>
           <w:lang w:val="en-IN"/>
         </w:rPr>
-        <w:tab/>
-      </w:r>
+        <w:t>Gary Gregory &lt;ggregory@apache.org&gt;</w:t>
+      </w:r>
+    </w:p>
+    <w:p>
+      <w:pPr>
+        <w:rPr>
+          <w:rFonts w:hint="eastAsia"/>
+          <w:color w:val="404040" w:themeColor="text1" w:themeTint="BF"/>
+          <w:lang w:val="de-DE"/>
+        </w:rPr>
+      </w:pPr>
       <w:r>
         <w:rPr>
           <w:color w:val="404040" w:themeColor="text1" w:themeTint="BF"/>
           <w:lang w:val="en-IN"/>
         </w:rPr>
-        <w:t xml:space="preserve">                                          </w:t>
+        <w:t xml:space="preserve">      </w:t>
       </w:r>
       <w:r>
         <w:rPr>
           <w:color w:val="404040" w:themeColor="text1" w:themeTint="BF"/>
           <w:lang w:val="en-IN"/>
         </w:rPr>
-        <w:t>Gary Gregory &lt;ggregory@apache.org&gt;</w:t>
-      </w:r>
-    </w:p>
-    <w:p>
-      <w:pPr>
-        <w:rPr>
-          <w:rFonts w:hint="eastAsia"/>
+        <w:t xml:space="preserve"> </w:t>
+      </w:r>
+      <w:r>
+        <w:rPr>
           <w:color w:val="404040" w:themeColor="text1" w:themeTint="BF"/>
           <w:lang w:val="en-IN"/>
         </w:rPr>
-      </w:pPr>
+        <w:tab/>
+      </w:r>
       <w:r>
         <w:rPr>
           <w:color w:val="404040" w:themeColor="text1" w:themeTint="BF"/>
           <w:lang w:val="en-IN"/>
         </w:rPr>
-        <w:t xml:space="preserve">      </w:t>
+        <w:tab/>
       </w:r>
       <w:r>
         <w:rPr>
           <w:color w:val="404040" w:themeColor="text1" w:themeTint="BF"/>
           <w:lang w:val="en-IN"/>
         </w:rPr>
-        <w:t xml:space="preserve"> </w:t>
+        <w:t xml:space="preserve">                                          </w:t>
       </w:r>
       <w:r>
         <w:rPr>
           <w:color w:val="404040" w:themeColor="text1" w:themeTint="BF"/>
-          <w:lang w:val="en-IN"/>
+          <w:lang w:val="de-DE"/>
+        </w:rPr>
+        <w:t>Joseph Kesselman &lt;</w:t>
+      </w:r>
+      <w:r>
+        <w:rPr>
+          <w:rFonts w:hint="eastAsia"/>
+          <w:color w:val="404040" w:themeColor="text1" w:themeTint="BF"/>
+          <w:lang w:val="de-DE"/>
+        </w:rPr>
+        <w:t>keshlam@alum.mit.edu</w:t>
+      </w:r>
+      <w:r>
+        <w:rPr>
+          <w:color w:val="404040" w:themeColor="text1" w:themeTint="BF"/>
+          <w:lang w:val="de-DE"/>
+        </w:rPr>
+        <w:t>&gt;</w:t>
+      </w:r>
+    </w:p>
+    <w:p>
+      <w:pPr>
+        <w:rPr>
+          <w:rFonts w:hint="eastAsia"/>
+          <w:color w:val="404040" w:themeColor="text1" w:themeTint="BF"/>
+          <w:lang w:val="de-DE"/>
+        </w:rPr>
+      </w:pPr>
+      <w:r>
+        <w:rPr>
+          <w:color w:val="404040" w:themeColor="text1" w:themeTint="BF"/>
+          <w:lang w:val="de-DE"/>
+        </w:rPr>
+        <w:t xml:space="preserve">       </w:t>
+      </w:r>
+      <w:r>
+        <w:rPr>
+          <w:color w:val="404040" w:themeColor="text1" w:themeTint="BF"/>
+          <w:lang w:val="de-DE"/>
         </w:rPr>
         <w:tab/>
       </w:r>
       <w:r>
         <w:rPr>
           <w:color w:val="404040" w:themeColor="text1" w:themeTint="BF"/>
-          <w:lang w:val="en-IN"/>
+          <w:lang w:val="de-DE"/>
         </w:rPr>
         <w:tab/>
       </w:r>
       <w:r>
         <w:rPr>
           <w:color w:val="404040" w:themeColor="text1" w:themeTint="BF"/>
-          <w:lang w:val="en-IN"/>
+          <w:lang w:val="de-DE"/>
         </w:rPr>
         <w:t xml:space="preserve">                                          </w:t>
       </w:r>
       <w:r>
         <w:rPr>
           <w:color w:val="404040" w:themeColor="text1" w:themeTint="BF"/>
-          <w:lang w:val="en-IN"/>
-        </w:rPr>
-        <w:t>Joseph Kesselman &lt;</w:t>
-      </w:r>
-      <w:r>
+          <w:lang w:val="de-DE"/>
+        </w:rPr>
+        <w:t>Mukul Gandhi &lt;mukulg@apache.org&gt;</w:t>
+      </w:r>
+    </w:p>
+    <w:p>
+      <w:pPr>
         <w:rPr>
           <w:rFonts w:hint="eastAsia"/>
           <w:color w:val="404040" w:themeColor="text1" w:themeTint="BF"/>
-          <w:lang w:val="en-IN"/>
-        </w:rPr>
-        <w:t>keshlam@alum.mit.edu</w:t>
-      </w:r>
+          <w:lang w:val="de-DE"/>
+        </w:rPr>
+      </w:pPr>
       <w:r>
         <w:rPr>
           <w:color w:val="404040" w:themeColor="text1" w:themeTint="BF"/>
-          <w:lang w:val="en-IN"/>
-        </w:rPr>
-        <w:t>&gt;</w:t>
-      </w:r>
-    </w:p>
-    <w:p>
-      <w:pPr>
-        <w:rPr>
-          <w:rFonts w:hint="eastAsia"/>
-          <w:color w:val="404040" w:themeColor="text1" w:themeTint="BF"/>
-          <w:lang w:val="en-IN"/>
-        </w:rPr>
-      </w:pPr>
-      <w:r>
-        <w:rPr>
-          <w:color w:val="404040" w:themeColor="text1" w:themeTint="BF"/>
-          <w:lang w:val="en-IN"/>
-        </w:rPr>
-        <w:t xml:space="preserve">      </w:t>
-      </w:r>
-      <w:r>
-        <w:rPr>
-          <w:color w:val="404040" w:themeColor="text1" w:themeTint="BF"/>
-          <w:lang w:val="en-IN"/>
-        </w:rPr>
-        <w:t xml:space="preserve"> </w:t>
-      </w:r>
-      <w:r>
-        <w:rPr>
-          <w:color w:val="404040" w:themeColor="text1" w:themeTint="BF"/>
-          <w:lang w:val="en-IN"/>
-        </w:rPr>
-        <w:tab/>
-      </w:r>
-      <w:r>
-        <w:rPr>
-          <w:color w:val="404040" w:themeColor="text1" w:themeTint="BF"/>
-          <w:lang w:val="en-IN"/>
-        </w:rPr>
-        <w:tab/>
-      </w:r>
-      <w:r>
-        <w:rPr>
-          <w:color w:val="404040" w:themeColor="text1" w:themeTint="BF"/>
-          <w:lang w:val="en-IN"/>
-        </w:rPr>
-        <w:t xml:space="preserve">                                          </w:t>
-      </w:r>
-      <w:r>
-        <w:rPr>
-          <w:color w:val="404040" w:themeColor="text1" w:themeTint="BF"/>
-          <w:lang w:val="en-IN"/>
-        </w:rPr>
-        <w:t>Mukul Gandhi &lt;mukulg@apache.org&gt;</w:t>
-      </w:r>
-    </w:p>
-    <w:p>
-      <w:pPr>
-        <w:rPr>
-          <w:rFonts w:hint="eastAsia"/>
-          <w:color w:val="404040" w:themeColor="text1" w:themeTint="BF"/>
-          <w:lang w:val="en-IN"/>
-        </w:rPr>
-      </w:pPr>
-      <w:r>
-        <w:rPr>
-          <w:color w:val="404040" w:themeColor="text1" w:themeTint="BF"/>
+          <w:lang w:val="de-DE"/>
         </w:rPr>
         <w:t xml:space="preserve">                                                                      </w:t>
       </w:r>
@@ -435,6 +408,7 @@
         <w:rPr>
           <w:sz w:val="20"/>
           <w:szCs w:val="20"/>
+          <w:lang w:val="de-DE"/>
         </w:rPr>
         <w:t xml:space="preserve">                                                                                              </w:t>
       </w:r>
@@ -442,6 +416,7 @@
         <w:rPr>
           <w:sz w:val="20"/>
           <w:szCs w:val="20"/>
+          <w:lang w:val="de-DE"/>
         </w:rPr>
         <w:t xml:space="preserve">               </w:t>
       </w:r>
@@ -449,6 +424,7 @@
         <w:rPr>
           <w:sz w:val="20"/>
           <w:szCs w:val="20"/>
+          <w:lang w:val="de-DE"/>
         </w:rPr>
         <w:t xml:space="preserve">               </w:t>
       </w:r>
@@ -456,6 +432,7 @@
         <w:rPr>
           <w:sz w:val="20"/>
           <w:szCs w:val="20"/>
+          <w:lang w:val="de-DE"/>
         </w:rPr>
         <w:t xml:space="preserve">       </w:t>
       </w:r>
@@ -463,6 +440,7 @@
         <w:rPr>
           <w:sz w:val="20"/>
           <w:szCs w:val="20"/>
+          <w:lang w:val="de-DE"/>
         </w:rPr>
         <w:t xml:space="preserve">                                                                                                                       </w:t>
       </w:r>
@@ -471,6 +449,7 @@
       <w:pPr>
         <w:rPr>
           <w:rFonts w:hint="eastAsia"/>
+          <w:lang w:val="de-DE"/>
         </w:rPr>
       </w:pPr>
     </w:p>
@@ -557,7 +536,18 @@
         <w:t>conformance features</w:t>
       </w:r>
       <w:r>
-        <w:t xml:space="preserve">, and the level to which </w:t>
+        <w:t xml:space="preserve">, and the level </w:t>
+      </w:r>
+      <w:proofErr w:type="spellStart"/>
+      <w:r>
+        <w:t>up</w:t>
+      </w:r>
+      <w:r>
+        <w:t>to</w:t>
+      </w:r>
+      <w:proofErr w:type="spellEnd"/>
+      <w:r>
+        <w:t xml:space="preserve"> which </w:t>
       </w:r>
       <w:proofErr w:type="spellStart"/>
       <w:r>
@@ -565,7 +555,7 @@
       </w:r>
       <w:proofErr w:type="spellEnd"/>
       <w:r>
-        <w:t>-J implements them</w:t>
+        <w:t xml:space="preserve"> implements them</w:t>
       </w:r>
       <w:r>
         <w:t>.</w:t>
@@ -1404,14 +1394,7 @@
           <w:sz w:val="22"/>
           <w:szCs w:val="22"/>
         </w:rPr>
-        <w:t xml:space="preserve">Partially </w:t>
-      </w:r>
-      <w:r>
-        <w:rPr>
-          <w:sz w:val="22"/>
-          <w:szCs w:val="22"/>
-        </w:rPr>
-        <w:t>supported</w:t>
+        <w:t>Not supported</w:t>
       </w:r>
     </w:p>
     <w:p>
@@ -1557,12 +1540,12 @@
       <w:r>
         <w:t>Xalan</w:t>
       </w:r>
-      <w:proofErr w:type="spellEnd"/>
-      <w:r>
-        <w:t>-J</w:t>
-      </w:r>
-      <w:r>
-        <w:t xml:space="preserve">’s </w:t>
+      <w:r>
+        <w:t>’s</w:t>
+      </w:r>
+      <w:proofErr w:type="spellEnd"/>
+      <w:r>
+        <w:t xml:space="preserve"> </w:t>
       </w:r>
       <w:r>
         <w:t>dev repos branch ‘</w:t>
@@ -2626,7 +2609,13 @@
       </w:r>
       <w:proofErr w:type="spellEnd"/>
     </w:p>
-    <w:p/>
+    <w:p>
+      <w:pPr>
+        <w:rPr>
+          <w:rFonts w:hint="eastAsia"/>
+        </w:rPr>
+      </w:pPr>
+    </w:p>
     <w:p>
       <w:pPr>
         <w:pStyle w:val="ListParagraph"/>
@@ -2640,7 +2629,13 @@
         </w:rPr>
       </w:pPr>
       <w:r>
-        <w:t xml:space="preserve">Implementation of XSLT 3.0 attribute </w:t>
+        <w:t>Implementation of XSLT 3.0 attribute</w:t>
+      </w:r>
+      <w:r>
+        <w:t>s</w:t>
+      </w:r>
+      <w:r>
+        <w:t xml:space="preserve"> </w:t>
       </w:r>
       <w:proofErr w:type="spellStart"/>
       <w:r>
@@ -2656,8 +2651,47 @@
         </w:rPr>
         <w:t>-default-namespace</w:t>
       </w:r>
-    </w:p>
-    <w:p/>
+      <w:r>
+        <w:t xml:space="preserve"> and expand-text</w:t>
+      </w:r>
+    </w:p>
+    <w:p>
+      <w:pPr>
+        <w:pStyle w:val="ListParagraph"/>
+        <w:ind w:left="426"/>
+        <w:rPr>
+          <w:rFonts w:hint="eastAsia"/>
+        </w:rPr>
+      </w:pPr>
+    </w:p>
+    <w:p>
+      <w:pPr>
+        <w:pStyle w:val="ListParagraph"/>
+        <w:numPr>
+          <w:ilvl w:val="0"/>
+          <w:numId w:val="13"/>
+        </w:numPr>
+        <w:ind w:left="426" w:hanging="426"/>
+        <w:rPr>
+          <w:rFonts w:hint="eastAsia"/>
+        </w:rPr>
+      </w:pPr>
+      <w:proofErr w:type="spellStart"/>
+      <w:r>
+        <w:t>xsl:mode</w:t>
+      </w:r>
+      <w:proofErr w:type="spellEnd"/>
+      <w:r>
+        <w:t xml:space="preserve"> instruction</w:t>
+      </w:r>
+    </w:p>
+    <w:p>
+      <w:pPr>
+        <w:rPr>
+          <w:rFonts w:hint="eastAsia"/>
+        </w:rPr>
+      </w:pPr>
+    </w:p>
     <w:p>
       <w:pPr>
         <w:rPr>
@@ -2694,7 +2728,7 @@
           <w:b/>
           <w:bCs/>
         </w:rPr>
-        <w:t>-J XSL transformation properties:</w:t>
+        <w:t xml:space="preserve"> XSL transformation properties:</w:t>
       </w:r>
     </w:p>
     <w:p>
@@ -2809,43 +2843,43 @@
       </w:r>
       <w:proofErr w:type="spellStart"/>
       <w:r>
+        <w:t>Xalan’s</w:t>
+      </w:r>
+      <w:proofErr w:type="spellEnd"/>
+      <w:r>
+        <w:t xml:space="preserve"> class </w:t>
+      </w:r>
+      <w:proofErr w:type="spellStart"/>
+      <w:r>
+        <w:t>TransformerImpl</w:t>
+      </w:r>
+      <w:proofErr w:type="spellEnd"/>
+      <w:r>
+        <w:t xml:space="preserve"> when </w:t>
+      </w:r>
+    </w:p>
+    <w:p>
+      <w:pPr>
+        <w:rPr>
+          <w:rFonts w:hint="eastAsia"/>
+        </w:rPr>
+      </w:pPr>
+      <w:r>
+        <w:t xml:space="preserve">     XSL transformation is invoked via API</w:t>
+      </w:r>
+      <w:r>
+        <w:t>, or via</w:t>
+      </w:r>
+      <w:r>
+        <w:t xml:space="preserve"> </w:t>
+      </w:r>
+      <w:proofErr w:type="spellStart"/>
+      <w:r>
         <w:t>Xalan</w:t>
       </w:r>
       <w:proofErr w:type="spellEnd"/>
       <w:r>
-        <w:t xml:space="preserve">-J’s class </w:t>
-      </w:r>
-      <w:proofErr w:type="spellStart"/>
-      <w:r>
-        <w:t>TransformerImpl</w:t>
-      </w:r>
-      <w:proofErr w:type="spellEnd"/>
-      <w:r>
-        <w:t xml:space="preserve"> when </w:t>
-      </w:r>
-    </w:p>
-    <w:p>
-      <w:pPr>
-        <w:rPr>
-          <w:rFonts w:hint="eastAsia"/>
-        </w:rPr>
-      </w:pPr>
-      <w:r>
-        <w:t xml:space="preserve">     XSL transformation is invoked via API</w:t>
-      </w:r>
-      <w:r>
-        <w:t>, or via</w:t>
-      </w:r>
-      <w:r>
-        <w:t xml:space="preserve"> </w:t>
-      </w:r>
-      <w:proofErr w:type="spellStart"/>
-      <w:r>
-        <w:t>Xalan</w:t>
-      </w:r>
-      <w:proofErr w:type="spellEnd"/>
-      <w:r>
-        <w:t>-J command line.</w:t>
+        <w:t xml:space="preserve"> command line.</w:t>
       </w:r>
     </w:p>
     <w:p>
@@ -3902,52 +3936,52 @@
         </w:rPr>
       </w:pPr>
       <w:r>
-        <w:t xml:space="preserve">              </w:t>
-      </w:r>
-      <w:proofErr w:type="spellStart"/>
-      <w:r>
-        <w:t>xs:g</w:t>
-      </w:r>
-      <w:r>
-        <w:t>Year</w:t>
-      </w:r>
-      <w:proofErr w:type="spellEnd"/>
-    </w:p>
-    <w:p>
-      <w:pPr>
-        <w:ind w:left="990" w:hanging="990"/>
-        <w:rPr>
-          <w:rFonts w:hint="eastAsia"/>
-        </w:rPr>
-      </w:pPr>
-      <w:r>
-        <w:t xml:space="preserve">              </w:t>
-      </w:r>
-      <w:proofErr w:type="spellStart"/>
-      <w:r>
-        <w:t>xs:</w:t>
-      </w:r>
-      <w:r>
-        <w:t>g</w:t>
-      </w:r>
-      <w:r>
-        <w:t>YearMonth</w:t>
-      </w:r>
-      <w:proofErr w:type="spellEnd"/>
-    </w:p>
-    <w:p>
-      <w:pPr>
-        <w:ind w:left="990" w:hanging="990"/>
-        <w:rPr>
-          <w:rFonts w:hint="eastAsia"/>
-        </w:rPr>
-      </w:pPr>
-      <w:r>
         <w:lastRenderedPageBreak/>
         <w:t xml:space="preserve">              </w:t>
       </w:r>
       <w:proofErr w:type="spellStart"/>
       <w:r>
+        <w:t>xs:g</w:t>
+      </w:r>
+      <w:r>
+        <w:t>Year</w:t>
+      </w:r>
+      <w:proofErr w:type="spellEnd"/>
+    </w:p>
+    <w:p>
+      <w:pPr>
+        <w:ind w:left="990" w:hanging="990"/>
+        <w:rPr>
+          <w:rFonts w:hint="eastAsia"/>
+        </w:rPr>
+      </w:pPr>
+      <w:r>
+        <w:t xml:space="preserve">              </w:t>
+      </w:r>
+      <w:proofErr w:type="spellStart"/>
+      <w:r>
+        <w:t>xs:</w:t>
+      </w:r>
+      <w:r>
+        <w:t>g</w:t>
+      </w:r>
+      <w:r>
+        <w:t>YearMonth</w:t>
+      </w:r>
+      <w:proofErr w:type="spellEnd"/>
+    </w:p>
+    <w:p>
+      <w:pPr>
+        <w:ind w:left="990" w:hanging="990"/>
+        <w:rPr>
+          <w:rFonts w:hint="eastAsia"/>
+        </w:rPr>
+      </w:pPr>
+      <w:r>
+        <w:t xml:space="preserve">              </w:t>
+      </w:r>
+      <w:proofErr w:type="spellStart"/>
+      <w:r>
         <w:t>xs:hexBinary</w:t>
       </w:r>
       <w:proofErr w:type="spellEnd"/>
@@ -4454,20 +4488,14 @@
         <w:rPr>
           <w:color w:val="000000"/>
         </w:rPr>
-        <w:t>Xalan</w:t>
+        <w:t>Xalan’s</w:t>
       </w:r>
       <w:proofErr w:type="spellEnd"/>
       <w:r>
         <w:rPr>
           <w:color w:val="000000"/>
         </w:rPr>
-        <w:t>-</w:t>
-      </w:r>
-      <w:r>
-        <w:rPr>
-          <w:color w:val="000000"/>
-        </w:rPr>
-        <w:t xml:space="preserve">J’s XSLT 3.0 implementation (ref,  </w:t>
+        <w:t xml:space="preserve"> XSLT 3.0 implementation (ref,  </w:t>
       </w:r>
     </w:p>
     <w:p>
@@ -5862,6 +5890,7 @@
       </w:pPr>
       <w:proofErr w:type="spellStart"/>
       <w:r>
+        <w:lastRenderedPageBreak/>
         <w:t>fn:years-from-duration</w:t>
       </w:r>
       <w:proofErr w:type="spellEnd"/>
@@ -5886,647 +5915,1195 @@
       </w:pPr>
       <w:proofErr w:type="spellStart"/>
       <w:r>
+        <w:t>fn:days-from-duration</w:t>
+      </w:r>
+      <w:proofErr w:type="spellEnd"/>
+    </w:p>
+    <w:p>
+      <w:pPr>
+        <w:rPr>
+          <w:rFonts w:hint="eastAsia"/>
+        </w:rPr>
+      </w:pPr>
+      <w:proofErr w:type="spellStart"/>
+      <w:r>
+        <w:t>fn:hours-from-duration</w:t>
+      </w:r>
+      <w:proofErr w:type="spellEnd"/>
+    </w:p>
+    <w:p>
+      <w:pPr>
+        <w:rPr>
+          <w:rFonts w:hint="eastAsia"/>
+        </w:rPr>
+      </w:pPr>
+      <w:proofErr w:type="spellStart"/>
+      <w:r>
+        <w:t>fn:minutes-from-duration</w:t>
+      </w:r>
+      <w:proofErr w:type="spellEnd"/>
+    </w:p>
+    <w:p>
+      <w:pPr>
+        <w:rPr>
+          <w:rFonts w:hint="eastAsia"/>
+        </w:rPr>
+      </w:pPr>
+      <w:proofErr w:type="spellStart"/>
+      <w:r>
+        <w:t>fn:seconds-from-duration</w:t>
+      </w:r>
+      <w:proofErr w:type="spellEnd"/>
+    </w:p>
+    <w:p>
+      <w:pPr>
+        <w:rPr>
+          <w:rFonts w:hint="eastAsia"/>
+        </w:rPr>
+      </w:pPr>
+    </w:p>
+    <w:p>
+      <w:pPr>
+        <w:rPr>
+          <w:rFonts w:hint="eastAsia"/>
+        </w:rPr>
+      </w:pPr>
+      <w:r>
+        <w:t>9</w:t>
+      </w:r>
+      <w:r>
+        <w:t>)</w:t>
+      </w:r>
+      <w:r>
+        <w:t xml:space="preserve"> Constructing </w:t>
+      </w:r>
+      <w:proofErr w:type="spellStart"/>
+      <w:r>
+        <w:t>xs:dateTime</w:t>
+      </w:r>
+      <w:proofErr w:type="spellEnd"/>
+      <w:r>
+        <w:t xml:space="preserve"> value</w:t>
+      </w:r>
+    </w:p>
+    <w:p>
+      <w:pPr>
+        <w:rPr>
+          <w:rFonts w:hint="eastAsia"/>
+        </w:rPr>
+      </w:pPr>
+    </w:p>
+    <w:p>
+      <w:pPr>
+        <w:rPr>
+          <w:rFonts w:hint="eastAsia"/>
+        </w:rPr>
+      </w:pPr>
+      <w:proofErr w:type="spellStart"/>
+      <w:r>
+        <w:rPr>
+          <w:rFonts w:hint="eastAsia"/>
+        </w:rPr>
+        <w:t>fn:dateTime</w:t>
+      </w:r>
+      <w:proofErr w:type="spellEnd"/>
+    </w:p>
+    <w:p>
+      <w:pPr>
+        <w:rPr>
+          <w:rFonts w:hint="eastAsia"/>
+        </w:rPr>
+      </w:pPr>
+    </w:p>
+    <w:p>
+      <w:pPr>
+        <w:rPr>
+          <w:rFonts w:hint="eastAsia"/>
+        </w:rPr>
+      </w:pPr>
+      <w:r>
+        <w:t>10</w:t>
+      </w:r>
+      <w:r>
+        <w:t>)</w:t>
+      </w:r>
+      <w:r>
+        <w:t xml:space="preserve"> Component extraction functions on dates and times</w:t>
+      </w:r>
+    </w:p>
+    <w:p>
+      <w:pPr>
+        <w:rPr>
+          <w:rFonts w:hint="eastAsia"/>
+        </w:rPr>
+      </w:pPr>
+    </w:p>
+    <w:p>
+      <w:pPr>
+        <w:rPr>
+          <w:rFonts w:hint="eastAsia"/>
+        </w:rPr>
+      </w:pPr>
+      <w:proofErr w:type="spellStart"/>
+      <w:r>
+        <w:rPr>
+          <w:rFonts w:hint="eastAsia"/>
+        </w:rPr>
+        <w:t>fn:year-from-dateTime</w:t>
+      </w:r>
+      <w:proofErr w:type="spellEnd"/>
+    </w:p>
+    <w:p>
+      <w:pPr>
+        <w:rPr>
+          <w:rFonts w:hint="eastAsia"/>
+        </w:rPr>
+      </w:pPr>
+      <w:proofErr w:type="spellStart"/>
+      <w:r>
+        <w:rPr>
+          <w:rFonts w:hint="eastAsia"/>
+        </w:rPr>
+        <w:t>fn:month-from-dateTime</w:t>
+      </w:r>
+      <w:proofErr w:type="spellEnd"/>
+    </w:p>
+    <w:p>
+      <w:pPr>
+        <w:rPr>
+          <w:rFonts w:hint="eastAsia"/>
+        </w:rPr>
+      </w:pPr>
+      <w:proofErr w:type="spellStart"/>
+      <w:r>
+        <w:rPr>
+          <w:rFonts w:hint="eastAsia"/>
+        </w:rPr>
+        <w:t>fn:day-from-dateTime</w:t>
+      </w:r>
+      <w:proofErr w:type="spellEnd"/>
+    </w:p>
+    <w:p>
+      <w:pPr>
+        <w:rPr>
+          <w:rFonts w:hint="eastAsia"/>
+        </w:rPr>
+      </w:pPr>
+      <w:proofErr w:type="spellStart"/>
+      <w:r>
+        <w:rPr>
+          <w:rFonts w:hint="eastAsia"/>
+        </w:rPr>
+        <w:t>fn:hours-from-dateTime</w:t>
+      </w:r>
+      <w:proofErr w:type="spellEnd"/>
+    </w:p>
+    <w:p>
+      <w:pPr>
+        <w:rPr>
+          <w:rFonts w:hint="eastAsia"/>
+        </w:rPr>
+      </w:pPr>
+      <w:proofErr w:type="spellStart"/>
+      <w:r>
+        <w:rPr>
+          <w:rFonts w:hint="eastAsia"/>
+        </w:rPr>
+        <w:t>fn:minutes-from-dateTime</w:t>
+      </w:r>
+      <w:proofErr w:type="spellEnd"/>
+    </w:p>
+    <w:p>
+      <w:pPr>
+        <w:rPr>
+          <w:rFonts w:hint="eastAsia"/>
+        </w:rPr>
+      </w:pPr>
+      <w:proofErr w:type="spellStart"/>
+      <w:r>
+        <w:rPr>
+          <w:rFonts w:hint="eastAsia"/>
+        </w:rPr>
+        <w:t>fn:seconds-from-dateTime</w:t>
+      </w:r>
+      <w:proofErr w:type="spellEnd"/>
+    </w:p>
+    <w:p>
+      <w:pPr>
+        <w:rPr>
+          <w:rFonts w:hint="eastAsia"/>
+        </w:rPr>
+      </w:pPr>
+      <w:proofErr w:type="spellStart"/>
+      <w:r>
+        <w:rPr>
+          <w:rFonts w:hint="eastAsia"/>
+        </w:rPr>
+        <w:t>fn:timezone-from-dateTime</w:t>
+      </w:r>
+      <w:proofErr w:type="spellEnd"/>
+    </w:p>
+    <w:p>
+      <w:pPr>
+        <w:rPr>
+          <w:rFonts w:hint="eastAsia"/>
+        </w:rPr>
+      </w:pPr>
+      <w:proofErr w:type="spellStart"/>
+      <w:r>
+        <w:rPr>
+          <w:rFonts w:hint="eastAsia"/>
+        </w:rPr>
+        <w:t>fn:year-from-date</w:t>
+      </w:r>
+      <w:proofErr w:type="spellEnd"/>
+    </w:p>
+    <w:p>
+      <w:pPr>
+        <w:rPr>
+          <w:rFonts w:hint="eastAsia"/>
+        </w:rPr>
+      </w:pPr>
+      <w:proofErr w:type="spellStart"/>
+      <w:r>
+        <w:rPr>
+          <w:rFonts w:hint="eastAsia"/>
+        </w:rPr>
+        <w:t>fn:month-from-date</w:t>
+      </w:r>
+      <w:proofErr w:type="spellEnd"/>
+    </w:p>
+    <w:p>
+      <w:pPr>
+        <w:rPr>
+          <w:rFonts w:hint="eastAsia"/>
+        </w:rPr>
+      </w:pPr>
+      <w:proofErr w:type="spellStart"/>
+      <w:r>
+        <w:rPr>
+          <w:rFonts w:hint="eastAsia"/>
+        </w:rPr>
+        <w:t>fn:day-from-date</w:t>
+      </w:r>
+      <w:proofErr w:type="spellEnd"/>
+    </w:p>
+    <w:p>
+      <w:pPr>
+        <w:rPr>
+          <w:rFonts w:hint="eastAsia"/>
+        </w:rPr>
+      </w:pPr>
+      <w:proofErr w:type="spellStart"/>
+      <w:r>
+        <w:rPr>
+          <w:rFonts w:hint="eastAsia"/>
+        </w:rPr>
+        <w:t>fn:timezone-from-date</w:t>
+      </w:r>
+      <w:proofErr w:type="spellEnd"/>
+    </w:p>
+    <w:p>
+      <w:pPr>
+        <w:rPr>
+          <w:rFonts w:hint="eastAsia"/>
+        </w:rPr>
+      </w:pPr>
+      <w:proofErr w:type="spellStart"/>
+      <w:r>
+        <w:rPr>
+          <w:rFonts w:hint="eastAsia"/>
+        </w:rPr>
+        <w:t>fn:hours-from-time</w:t>
+      </w:r>
+      <w:proofErr w:type="spellEnd"/>
+    </w:p>
+    <w:p>
+      <w:pPr>
+        <w:rPr>
+          <w:rFonts w:hint="eastAsia"/>
+        </w:rPr>
+      </w:pPr>
+      <w:proofErr w:type="spellStart"/>
+      <w:r>
+        <w:rPr>
+          <w:rFonts w:hint="eastAsia"/>
+        </w:rPr>
+        <w:t>fn:minutes-from-time</w:t>
+      </w:r>
+      <w:proofErr w:type="spellEnd"/>
+    </w:p>
+    <w:p>
+      <w:pPr>
+        <w:rPr>
+          <w:rFonts w:hint="eastAsia"/>
+        </w:rPr>
+      </w:pPr>
+      <w:proofErr w:type="spellStart"/>
+      <w:r>
+        <w:rPr>
+          <w:rFonts w:hint="eastAsia"/>
+        </w:rPr>
+        <w:t>fn:seconds-from-time</w:t>
+      </w:r>
+      <w:proofErr w:type="spellEnd"/>
+    </w:p>
+    <w:p>
+      <w:pPr>
+        <w:rPr>
+          <w:rFonts w:hint="eastAsia"/>
+        </w:rPr>
+      </w:pPr>
+      <w:proofErr w:type="spellStart"/>
+      <w:r>
+        <w:rPr>
+          <w:rFonts w:hint="eastAsia"/>
+        </w:rPr>
+        <w:t>fn:timezone-from-time</w:t>
+      </w:r>
+      <w:proofErr w:type="spellEnd"/>
+    </w:p>
+    <w:p>
+      <w:pPr>
+        <w:rPr>
+          <w:rFonts w:hint="eastAsia"/>
+        </w:rPr>
+      </w:pPr>
+    </w:p>
+    <w:p>
+      <w:pPr>
+        <w:rPr>
+          <w:rFonts w:hint="eastAsia"/>
+        </w:rPr>
+      </w:pPr>
+      <w:r>
+        <w:t>1</w:t>
+      </w:r>
+      <w:r>
+        <w:t>1</w:t>
+      </w:r>
+      <w:r>
+        <w:t>)</w:t>
+      </w:r>
+      <w:r>
+        <w:t xml:space="preserve"> </w:t>
+      </w:r>
+      <w:r>
+        <w:t>Built-in</w:t>
+      </w:r>
+      <w:r>
+        <w:t xml:space="preserve"> higher-order functions</w:t>
+      </w:r>
+    </w:p>
+    <w:p>
+      <w:pPr>
+        <w:rPr>
+          <w:rFonts w:hint="eastAsia"/>
+        </w:rPr>
+      </w:pPr>
+    </w:p>
+    <w:p>
+      <w:pPr>
+        <w:rPr>
+          <w:rFonts w:hint="eastAsia"/>
+        </w:rPr>
+      </w:pPr>
+      <w:proofErr w:type="spellStart"/>
+      <w:r>
+        <w:t>fn:for-each</w:t>
+      </w:r>
+      <w:proofErr w:type="spellEnd"/>
+    </w:p>
+    <w:p>
+      <w:pPr>
+        <w:rPr>
+          <w:rFonts w:hint="eastAsia"/>
+        </w:rPr>
+      </w:pPr>
+      <w:proofErr w:type="spellStart"/>
+      <w:r>
+        <w:t>fn:filter</w:t>
+      </w:r>
+      <w:proofErr w:type="spellEnd"/>
+    </w:p>
+    <w:p>
+      <w:pPr>
+        <w:rPr>
+          <w:rFonts w:hint="eastAsia"/>
+        </w:rPr>
+      </w:pPr>
+      <w:proofErr w:type="spellStart"/>
+      <w:r>
+        <w:t>fn:fold-left</w:t>
+      </w:r>
+      <w:proofErr w:type="spellEnd"/>
+    </w:p>
+    <w:p>
+      <w:pPr>
+        <w:rPr>
+          <w:rFonts w:hint="eastAsia"/>
+        </w:rPr>
+      </w:pPr>
+      <w:proofErr w:type="spellStart"/>
+      <w:r>
+        <w:t>fn:fold-right</w:t>
+      </w:r>
+      <w:proofErr w:type="spellEnd"/>
+    </w:p>
+    <w:p>
+      <w:pPr>
+        <w:rPr>
+          <w:rFonts w:hint="eastAsia"/>
+        </w:rPr>
+      </w:pPr>
+      <w:proofErr w:type="spellStart"/>
+      <w:r>
+        <w:t>fn:for-each-pair</w:t>
+      </w:r>
+      <w:proofErr w:type="spellEnd"/>
+    </w:p>
+    <w:p>
+      <w:pPr>
+        <w:rPr>
+          <w:rFonts w:hint="eastAsia"/>
+        </w:rPr>
+      </w:pPr>
+      <w:proofErr w:type="spellStart"/>
+      <w:r>
+        <w:t>fn:sort</w:t>
+      </w:r>
+      <w:proofErr w:type="spellEnd"/>
+      <w:r>
+        <w:t xml:space="preserve">                            (with support for collation argument)</w:t>
+      </w:r>
+    </w:p>
+    <w:p>
+      <w:pPr>
+        <w:rPr>
+          <w:rFonts w:hint="eastAsia"/>
+        </w:rPr>
+      </w:pPr>
+      <w:proofErr w:type="spellStart"/>
+      <w:r>
+        <w:t>fn:apply</w:t>
+      </w:r>
+      <w:proofErr w:type="spellEnd"/>
+    </w:p>
+    <w:p>
+      <w:pPr>
+        <w:rPr>
+          <w:rFonts w:hint="eastAsia"/>
+        </w:rPr>
+      </w:pPr>
+    </w:p>
+    <w:p>
+      <w:pPr>
+        <w:rPr>
+          <w:rFonts w:hint="eastAsia"/>
+        </w:rPr>
+      </w:pPr>
+      <w:r>
+        <w:t>D</w:t>
+      </w:r>
+      <w:r>
+        <w:t>ynamic loading and execution</w:t>
+      </w:r>
+      <w:r>
+        <w:t>, of XSLT stylesheets:</w:t>
+      </w:r>
+    </w:p>
+    <w:p>
+      <w:pPr>
+        <w:rPr>
+          <w:rFonts w:hint="eastAsia"/>
+        </w:rPr>
+      </w:pPr>
+      <w:proofErr w:type="spellStart"/>
+      <w:r>
+        <w:t>fn:transform</w:t>
+      </w:r>
+      <w:proofErr w:type="spellEnd"/>
+    </w:p>
+    <w:p>
+      <w:pPr>
+        <w:rPr>
+          <w:rFonts w:hint="eastAsia"/>
+        </w:rPr>
+      </w:pPr>
+    </w:p>
+    <w:p>
+      <w:pPr>
+        <w:rPr>
+          <w:rFonts w:hint="eastAsia"/>
+        </w:rPr>
+      </w:pPr>
+      <w:r>
+        <w:t>1</w:t>
+      </w:r>
+      <w:r>
+        <w:t>2</w:t>
+      </w:r>
+      <w:r>
+        <w:t>)</w:t>
+      </w:r>
+      <w:r>
+        <w:t xml:space="preserve"> Functions on sequences</w:t>
+      </w:r>
+    </w:p>
+    <w:p>
+      <w:pPr>
+        <w:rPr>
+          <w:rFonts w:hint="eastAsia"/>
+        </w:rPr>
+      </w:pPr>
+    </w:p>
+    <w:p>
+      <w:pPr>
+        <w:ind w:firstLine="270"/>
+        <w:rPr>
+          <w:rFonts w:hint="eastAsia"/>
+        </w:rPr>
+      </w:pPr>
+      <w:r>
+        <w:t>12.1</w:t>
+      </w:r>
+      <w:r>
+        <w:t xml:space="preserve"> </w:t>
+      </w:r>
+      <w:r>
+        <w:t>General functions on sequences</w:t>
+      </w:r>
+    </w:p>
+    <w:p>
+      <w:pPr>
+        <w:ind w:firstLine="270"/>
+        <w:rPr>
+          <w:rFonts w:hint="eastAsia"/>
+        </w:rPr>
+      </w:pPr>
+      <w:proofErr w:type="spellStart"/>
+      <w:r>
+        <w:t>fn:empty</w:t>
+      </w:r>
+      <w:proofErr w:type="spellEnd"/>
+    </w:p>
+    <w:p>
+      <w:pPr>
+        <w:ind w:firstLine="270"/>
+        <w:rPr>
+          <w:rFonts w:hint="eastAsia"/>
+        </w:rPr>
+      </w:pPr>
+      <w:proofErr w:type="spellStart"/>
+      <w:r>
+        <w:t>fn:exists</w:t>
+      </w:r>
+      <w:proofErr w:type="spellEnd"/>
+    </w:p>
+    <w:p>
+      <w:pPr>
+        <w:ind w:firstLine="270"/>
+        <w:rPr>
+          <w:rFonts w:hint="eastAsia"/>
+        </w:rPr>
+      </w:pPr>
+      <w:proofErr w:type="spellStart"/>
+      <w:r>
+        <w:t>fn:head</w:t>
+      </w:r>
+      <w:proofErr w:type="spellEnd"/>
+    </w:p>
+    <w:p>
+      <w:pPr>
+        <w:ind w:firstLine="270"/>
+        <w:rPr>
+          <w:rFonts w:hint="eastAsia"/>
+        </w:rPr>
+      </w:pPr>
+      <w:proofErr w:type="spellStart"/>
+      <w:r>
+        <w:t>fn:tail</w:t>
+      </w:r>
+      <w:proofErr w:type="spellEnd"/>
+    </w:p>
+    <w:p>
+      <w:pPr>
+        <w:ind w:firstLine="270"/>
+        <w:rPr>
+          <w:rFonts w:hint="eastAsia"/>
+        </w:rPr>
+      </w:pPr>
+      <w:proofErr w:type="spellStart"/>
+      <w:r>
         <w:lastRenderedPageBreak/>
-        <w:t>fn:days-from-duration</w:t>
-      </w:r>
-      <w:proofErr w:type="spellEnd"/>
-    </w:p>
-    <w:p>
-      <w:pPr>
-        <w:rPr>
-          <w:rFonts w:hint="eastAsia"/>
-        </w:rPr>
-      </w:pPr>
-      <w:proofErr w:type="spellStart"/>
-      <w:r>
-        <w:t>fn:hours-from-duration</w:t>
-      </w:r>
-      <w:proofErr w:type="spellEnd"/>
-    </w:p>
-    <w:p>
-      <w:pPr>
-        <w:rPr>
-          <w:rFonts w:hint="eastAsia"/>
-        </w:rPr>
-      </w:pPr>
-      <w:proofErr w:type="spellStart"/>
-      <w:r>
-        <w:t>fn:minutes-from-duration</w:t>
-      </w:r>
-      <w:proofErr w:type="spellEnd"/>
-    </w:p>
-    <w:p>
-      <w:pPr>
-        <w:rPr>
-          <w:rFonts w:hint="eastAsia"/>
-        </w:rPr>
-      </w:pPr>
-      <w:proofErr w:type="spellStart"/>
-      <w:r>
-        <w:t>fn:seconds-from-duration</w:t>
-      </w:r>
-      <w:proofErr w:type="spellEnd"/>
-    </w:p>
-    <w:p>
-      <w:pPr>
-        <w:rPr>
-          <w:rFonts w:hint="eastAsia"/>
-        </w:rPr>
-      </w:pPr>
-    </w:p>
-    <w:p>
-      <w:pPr>
-        <w:rPr>
-          <w:rFonts w:hint="eastAsia"/>
-        </w:rPr>
-      </w:pPr>
-      <w:r>
-        <w:t>9</w:t>
+        <w:t>fn:insert-before</w:t>
+      </w:r>
+      <w:proofErr w:type="spellEnd"/>
+    </w:p>
+    <w:p>
+      <w:pPr>
+        <w:ind w:firstLine="270"/>
+        <w:rPr>
+          <w:rFonts w:hint="eastAsia"/>
+        </w:rPr>
+      </w:pPr>
+      <w:proofErr w:type="spellStart"/>
+      <w:r>
+        <w:t>fn:remove</w:t>
+      </w:r>
+      <w:proofErr w:type="spellEnd"/>
+    </w:p>
+    <w:p>
+      <w:pPr>
+        <w:ind w:firstLine="270"/>
+        <w:rPr>
+          <w:rFonts w:hint="eastAsia"/>
+        </w:rPr>
+      </w:pPr>
+      <w:proofErr w:type="spellStart"/>
+      <w:r>
+        <w:t>fn:reverse</w:t>
+      </w:r>
+      <w:proofErr w:type="spellEnd"/>
+    </w:p>
+    <w:p>
+      <w:pPr>
+        <w:ind w:firstLine="270"/>
+        <w:rPr>
+          <w:rFonts w:hint="eastAsia"/>
+        </w:rPr>
+      </w:pPr>
+      <w:proofErr w:type="spellStart"/>
+      <w:r>
+        <w:t>fn:subsequence</w:t>
+      </w:r>
+      <w:proofErr w:type="spellEnd"/>
+    </w:p>
+    <w:p>
+      <w:pPr>
+        <w:ind w:firstLine="270"/>
+        <w:rPr>
+          <w:rFonts w:hint="eastAsia"/>
+        </w:rPr>
+      </w:pPr>
+      <w:proofErr w:type="spellStart"/>
+      <w:r>
+        <w:t>fn:unordered</w:t>
+      </w:r>
+      <w:proofErr w:type="spellEnd"/>
+    </w:p>
+    <w:p>
+      <w:pPr>
+        <w:ind w:firstLine="270"/>
+        <w:rPr>
+          <w:rFonts w:hint="eastAsia"/>
+        </w:rPr>
+      </w:pPr>
+    </w:p>
+    <w:p>
+      <w:pPr>
+        <w:ind w:left="270"/>
+        <w:rPr>
+          <w:rFonts w:hint="eastAsia"/>
+        </w:rPr>
+      </w:pPr>
+      <w:r>
+        <w:t>12.2</w:t>
+      </w:r>
+      <w:r>
+        <w:t xml:space="preserve"> </w:t>
+      </w:r>
+      <w:r>
+        <w:t>Aggregate functions</w:t>
+      </w:r>
+    </w:p>
+    <w:p>
+      <w:pPr>
+        <w:ind w:left="270"/>
+        <w:rPr>
+          <w:rFonts w:hint="eastAsia"/>
+        </w:rPr>
+      </w:pPr>
+      <w:proofErr w:type="spellStart"/>
+      <w:r>
+        <w:t>fn:avg</w:t>
+      </w:r>
+      <w:proofErr w:type="spellEnd"/>
+    </w:p>
+    <w:p>
+      <w:pPr>
+        <w:ind w:left="270"/>
+        <w:rPr>
+          <w:rFonts w:hint="eastAsia"/>
+        </w:rPr>
+      </w:pPr>
+      <w:proofErr w:type="spellStart"/>
+      <w:r>
+        <w:t>fn:max</w:t>
+      </w:r>
+      <w:proofErr w:type="spellEnd"/>
+    </w:p>
+    <w:p>
+      <w:pPr>
+        <w:ind w:left="270"/>
+        <w:rPr>
+          <w:rFonts w:hint="eastAsia"/>
+        </w:rPr>
+      </w:pPr>
+      <w:proofErr w:type="spellStart"/>
+      <w:r>
+        <w:t>fn:min</w:t>
+      </w:r>
+      <w:proofErr w:type="spellEnd"/>
+    </w:p>
+    <w:p>
+      <w:pPr>
+        <w:rPr>
+          <w:rFonts w:hint="eastAsia"/>
+        </w:rPr>
+      </w:pPr>
+    </w:p>
+    <w:p>
+      <w:pPr>
+        <w:rPr>
+          <w:rFonts w:hint="eastAsia"/>
+        </w:rPr>
+      </w:pPr>
+      <w:r>
+        <w:t>1</w:t>
+      </w:r>
+      <w:r>
+        <w:t>3</w:t>
       </w:r>
       <w:r>
         <w:t>)</w:t>
       </w:r>
       <w:r>
-        <w:t xml:space="preserve"> Constructing </w:t>
-      </w:r>
-      <w:proofErr w:type="spellStart"/>
-      <w:r>
-        <w:t>xs:dateTime</w:t>
-      </w:r>
-      <w:proofErr w:type="spellEnd"/>
-      <w:r>
-        <w:t xml:space="preserve"> value</w:t>
-      </w:r>
-    </w:p>
-    <w:p>
-      <w:pPr>
-        <w:rPr>
-          <w:rFonts w:hint="eastAsia"/>
-        </w:rPr>
-      </w:pPr>
-    </w:p>
-    <w:p>
-      <w:pPr>
-        <w:rPr>
-          <w:rFonts w:hint="eastAsia"/>
-        </w:rPr>
-      </w:pPr>
-      <w:proofErr w:type="spellStart"/>
-      <w:r>
-        <w:rPr>
-          <w:rFonts w:hint="eastAsia"/>
-        </w:rPr>
-        <w:t>fn:dateTime</w:t>
-      </w:r>
-      <w:proofErr w:type="spellEnd"/>
-    </w:p>
-    <w:p>
-      <w:pPr>
-        <w:rPr>
-          <w:rFonts w:hint="eastAsia"/>
-        </w:rPr>
-      </w:pPr>
-    </w:p>
-    <w:p>
-      <w:pPr>
-        <w:rPr>
-          <w:rFonts w:hint="eastAsia"/>
-        </w:rPr>
-      </w:pPr>
-      <w:r>
-        <w:t>10</w:t>
+        <w:t xml:space="preserve"> Parsing and serializing</w:t>
+      </w:r>
+    </w:p>
+    <w:p>
+      <w:pPr>
+        <w:rPr>
+          <w:rFonts w:hint="eastAsia"/>
+        </w:rPr>
+      </w:pPr>
+    </w:p>
+    <w:p>
+      <w:pPr>
+        <w:rPr>
+          <w:rFonts w:hint="eastAsia"/>
+        </w:rPr>
+      </w:pPr>
+      <w:proofErr w:type="spellStart"/>
+      <w:r>
+        <w:t>fn:parse-xml</w:t>
+      </w:r>
+      <w:proofErr w:type="spellEnd"/>
+    </w:p>
+    <w:p>
+      <w:pPr>
+        <w:rPr>
+          <w:rFonts w:hint="eastAsia"/>
+        </w:rPr>
+      </w:pPr>
+      <w:proofErr w:type="spellStart"/>
+      <w:r>
+        <w:t>fn:parse-xml-fragment</w:t>
+      </w:r>
+      <w:proofErr w:type="spellEnd"/>
+    </w:p>
+    <w:p>
+      <w:pPr>
+        <w:rPr>
+          <w:rFonts w:hint="eastAsia"/>
+        </w:rPr>
+      </w:pPr>
+    </w:p>
+    <w:p>
+      <w:pPr>
+        <w:rPr>
+          <w:rFonts w:hint="eastAsia"/>
+        </w:rPr>
+      </w:pPr>
+      <w:r>
+        <w:t>1</w:t>
+      </w:r>
+      <w:r>
+        <w:t>4</w:t>
       </w:r>
       <w:r>
         <w:t>)</w:t>
       </w:r>
       <w:r>
-        <w:t xml:space="preserve"> Component extraction functions on dates and times</w:t>
-      </w:r>
-    </w:p>
-    <w:p>
-      <w:pPr>
-        <w:rPr>
-          <w:rFonts w:hint="eastAsia"/>
-        </w:rPr>
-      </w:pPr>
-    </w:p>
-    <w:p>
-      <w:pPr>
-        <w:rPr>
-          <w:rFonts w:hint="eastAsia"/>
-        </w:rPr>
-      </w:pPr>
-      <w:proofErr w:type="spellStart"/>
-      <w:r>
-        <w:rPr>
-          <w:rFonts w:hint="eastAsia"/>
-        </w:rPr>
-        <w:t>fn:year-from-dateTime</w:t>
-      </w:r>
-      <w:proofErr w:type="spellEnd"/>
-    </w:p>
-    <w:p>
-      <w:pPr>
-        <w:rPr>
-          <w:rFonts w:hint="eastAsia"/>
-        </w:rPr>
-      </w:pPr>
-      <w:proofErr w:type="spellStart"/>
-      <w:r>
-        <w:rPr>
-          <w:rFonts w:hint="eastAsia"/>
-        </w:rPr>
-        <w:t>fn:month-from-dateTime</w:t>
-      </w:r>
-      <w:proofErr w:type="spellEnd"/>
-    </w:p>
-    <w:p>
-      <w:pPr>
-        <w:rPr>
-          <w:rFonts w:hint="eastAsia"/>
-        </w:rPr>
-      </w:pPr>
-      <w:proofErr w:type="spellStart"/>
-      <w:r>
-        <w:rPr>
-          <w:rFonts w:hint="eastAsia"/>
-        </w:rPr>
-        <w:t>fn:day-from-dateTime</w:t>
-      </w:r>
-      <w:proofErr w:type="spellEnd"/>
-    </w:p>
-    <w:p>
-      <w:pPr>
-        <w:rPr>
-          <w:rFonts w:hint="eastAsia"/>
-        </w:rPr>
-      </w:pPr>
-      <w:proofErr w:type="spellStart"/>
-      <w:r>
-        <w:rPr>
-          <w:rFonts w:hint="eastAsia"/>
-        </w:rPr>
-        <w:t>fn:hours-from-dateTime</w:t>
-      </w:r>
-      <w:proofErr w:type="spellEnd"/>
-    </w:p>
-    <w:p>
-      <w:pPr>
-        <w:rPr>
-          <w:rFonts w:hint="eastAsia"/>
-        </w:rPr>
-      </w:pPr>
-      <w:proofErr w:type="spellStart"/>
-      <w:r>
-        <w:rPr>
-          <w:rFonts w:hint="eastAsia"/>
-        </w:rPr>
-        <w:t>fn:minutes-from-dateTime</w:t>
-      </w:r>
-      <w:proofErr w:type="spellEnd"/>
-    </w:p>
-    <w:p>
-      <w:pPr>
-        <w:rPr>
-          <w:rFonts w:hint="eastAsia"/>
-        </w:rPr>
-      </w:pPr>
-      <w:proofErr w:type="spellStart"/>
-      <w:r>
-        <w:rPr>
-          <w:rFonts w:hint="eastAsia"/>
-        </w:rPr>
-        <w:t>fn:seconds-from-dateTime</w:t>
-      </w:r>
-      <w:proofErr w:type="spellEnd"/>
-    </w:p>
-    <w:p>
-      <w:pPr>
-        <w:rPr>
-          <w:rFonts w:hint="eastAsia"/>
-        </w:rPr>
-      </w:pPr>
-      <w:proofErr w:type="spellStart"/>
-      <w:r>
-        <w:rPr>
-          <w:rFonts w:hint="eastAsia"/>
-        </w:rPr>
-        <w:t>fn:timezone-from-dateTime</w:t>
-      </w:r>
-      <w:proofErr w:type="spellEnd"/>
-    </w:p>
-    <w:p>
-      <w:pPr>
-        <w:rPr>
-          <w:rFonts w:hint="eastAsia"/>
-        </w:rPr>
-      </w:pPr>
-      <w:proofErr w:type="spellStart"/>
-      <w:r>
-        <w:rPr>
-          <w:rFonts w:hint="eastAsia"/>
-        </w:rPr>
-        <w:t>fn:year-from-date</w:t>
-      </w:r>
-      <w:proofErr w:type="spellEnd"/>
-    </w:p>
-    <w:p>
-      <w:pPr>
-        <w:rPr>
-          <w:rFonts w:hint="eastAsia"/>
-        </w:rPr>
-      </w:pPr>
-      <w:proofErr w:type="spellStart"/>
-      <w:r>
-        <w:rPr>
-          <w:rFonts w:hint="eastAsia"/>
-        </w:rPr>
-        <w:t>fn:month-from-date</w:t>
-      </w:r>
-      <w:proofErr w:type="spellEnd"/>
-    </w:p>
-    <w:p>
-      <w:pPr>
-        <w:rPr>
-          <w:rFonts w:hint="eastAsia"/>
-        </w:rPr>
-      </w:pPr>
-      <w:proofErr w:type="spellStart"/>
-      <w:r>
-        <w:rPr>
-          <w:rFonts w:hint="eastAsia"/>
-        </w:rPr>
-        <w:t>fn:day-from-date</w:t>
-      </w:r>
-      <w:proofErr w:type="spellEnd"/>
-    </w:p>
-    <w:p>
-      <w:pPr>
-        <w:rPr>
-          <w:rFonts w:hint="eastAsia"/>
-        </w:rPr>
-      </w:pPr>
-      <w:proofErr w:type="spellStart"/>
-      <w:r>
-        <w:rPr>
-          <w:rFonts w:hint="eastAsia"/>
-        </w:rPr>
-        <w:t>fn:timezone-from-date</w:t>
-      </w:r>
-      <w:proofErr w:type="spellEnd"/>
-    </w:p>
-    <w:p>
-      <w:pPr>
-        <w:rPr>
-          <w:rFonts w:hint="eastAsia"/>
-        </w:rPr>
-      </w:pPr>
-      <w:proofErr w:type="spellStart"/>
-      <w:r>
-        <w:rPr>
-          <w:rFonts w:hint="eastAsia"/>
-        </w:rPr>
-        <w:t>fn:hours-from-time</w:t>
-      </w:r>
-      <w:proofErr w:type="spellEnd"/>
-    </w:p>
-    <w:p>
-      <w:pPr>
-        <w:rPr>
-          <w:rFonts w:hint="eastAsia"/>
-        </w:rPr>
-      </w:pPr>
-      <w:proofErr w:type="spellStart"/>
-      <w:r>
-        <w:rPr>
-          <w:rFonts w:hint="eastAsia"/>
-        </w:rPr>
-        <w:t>fn:minutes-from-time</w:t>
-      </w:r>
-      <w:proofErr w:type="spellEnd"/>
-    </w:p>
-    <w:p>
-      <w:pPr>
-        <w:rPr>
-          <w:rFonts w:hint="eastAsia"/>
-        </w:rPr>
-      </w:pPr>
-      <w:proofErr w:type="spellStart"/>
-      <w:r>
-        <w:rPr>
-          <w:rFonts w:hint="eastAsia"/>
-        </w:rPr>
-        <w:t>fn:seconds-from-time</w:t>
-      </w:r>
-      <w:proofErr w:type="spellEnd"/>
-    </w:p>
-    <w:p>
-      <w:pPr>
-        <w:rPr>
-          <w:rFonts w:hint="eastAsia"/>
-        </w:rPr>
-      </w:pPr>
-      <w:proofErr w:type="spellStart"/>
-      <w:r>
-        <w:rPr>
-          <w:rFonts w:hint="eastAsia"/>
-        </w:rPr>
-        <w:t>fn:timezone-from-time</w:t>
-      </w:r>
-      <w:proofErr w:type="spellEnd"/>
-    </w:p>
-    <w:p>
-      <w:pPr>
-        <w:rPr>
-          <w:rFonts w:hint="eastAsia"/>
-        </w:rPr>
-      </w:pPr>
-    </w:p>
-    <w:p>
-      <w:pPr>
-        <w:rPr>
-          <w:rFonts w:hint="eastAsia"/>
-        </w:rPr>
-      </w:pPr>
-      <w:r>
-        <w:t>1</w:t>
-      </w:r>
-      <w:r>
-        <w:t>1</w:t>
-      </w:r>
-      <w:r>
-        <w:t>)</w:t>
-      </w:r>
-      <w:r>
-        <w:t xml:space="preserve"> </w:t>
-      </w:r>
-      <w:r>
-        <w:t>Built-in</w:t>
-      </w:r>
-      <w:r>
-        <w:t xml:space="preserve"> higher-order functions</w:t>
-      </w:r>
-    </w:p>
-    <w:p>
-      <w:pPr>
-        <w:rPr>
-          <w:rFonts w:hint="eastAsia"/>
-        </w:rPr>
-      </w:pPr>
-    </w:p>
-    <w:p>
-      <w:pPr>
-        <w:rPr>
-          <w:rFonts w:hint="eastAsia"/>
-        </w:rPr>
-      </w:pPr>
-      <w:proofErr w:type="spellStart"/>
-      <w:r>
-        <w:t>fn:for-each</w:t>
-      </w:r>
-      <w:proofErr w:type="spellEnd"/>
-    </w:p>
-    <w:p>
-      <w:pPr>
-        <w:rPr>
-          <w:rFonts w:hint="eastAsia"/>
-        </w:rPr>
-      </w:pPr>
-      <w:proofErr w:type="spellStart"/>
-      <w:r>
-        <w:t>fn:filter</w:t>
-      </w:r>
-      <w:proofErr w:type="spellEnd"/>
-    </w:p>
-    <w:p>
-      <w:pPr>
-        <w:rPr>
-          <w:rFonts w:hint="eastAsia"/>
-        </w:rPr>
-      </w:pPr>
-      <w:proofErr w:type="spellStart"/>
-      <w:r>
-        <w:t>fn:fold-left</w:t>
-      </w:r>
-      <w:proofErr w:type="spellEnd"/>
-    </w:p>
-    <w:p>
-      <w:pPr>
-        <w:rPr>
-          <w:rFonts w:hint="eastAsia"/>
-        </w:rPr>
-      </w:pPr>
-      <w:proofErr w:type="spellStart"/>
-      <w:r>
-        <w:t>fn:fold-right</w:t>
-      </w:r>
-      <w:proofErr w:type="spellEnd"/>
-    </w:p>
-    <w:p>
-      <w:pPr>
-        <w:rPr>
-          <w:rFonts w:hint="eastAsia"/>
-        </w:rPr>
-      </w:pPr>
-      <w:proofErr w:type="spellStart"/>
-      <w:r>
-        <w:t>fn:for-each-pair</w:t>
-      </w:r>
-      <w:proofErr w:type="spellEnd"/>
-    </w:p>
-    <w:p>
-      <w:pPr>
-        <w:rPr>
-          <w:rFonts w:hint="eastAsia"/>
-        </w:rPr>
-      </w:pPr>
-      <w:proofErr w:type="spellStart"/>
-      <w:r>
-        <w:t>fn:sort</w:t>
-      </w:r>
-      <w:proofErr w:type="spellEnd"/>
-      <w:r>
-        <w:t xml:space="preserve">                            (with support for collation argument)</w:t>
-      </w:r>
-    </w:p>
-    <w:p>
-      <w:pPr>
-        <w:rPr>
-          <w:rFonts w:hint="eastAsia"/>
-        </w:rPr>
-      </w:pPr>
-      <w:proofErr w:type="spellStart"/>
-      <w:r>
-        <w:t>fn:apply</w:t>
-      </w:r>
-      <w:proofErr w:type="spellEnd"/>
-    </w:p>
-    <w:p>
-      <w:pPr>
-        <w:rPr>
-          <w:rFonts w:hint="eastAsia"/>
-        </w:rPr>
-      </w:pPr>
-    </w:p>
-    <w:p>
-      <w:pPr>
-        <w:rPr>
-          <w:rFonts w:hint="eastAsia"/>
-        </w:rPr>
-      </w:pPr>
-      <w:r>
-        <w:t>D</w:t>
-      </w:r>
-      <w:r>
-        <w:t>ynamic loading and execution</w:t>
-      </w:r>
-      <w:r>
-        <w:t>, of XSLT stylesheets:</w:t>
-      </w:r>
-    </w:p>
-    <w:p>
-      <w:pPr>
-        <w:rPr>
-          <w:rFonts w:hint="eastAsia"/>
-        </w:rPr>
-      </w:pPr>
-      <w:proofErr w:type="spellStart"/>
-      <w:r>
-        <w:t>fn:transform</w:t>
-      </w:r>
-      <w:proofErr w:type="spellEnd"/>
-    </w:p>
-    <w:p>
-      <w:pPr>
-        <w:rPr>
-          <w:rFonts w:hint="eastAsia"/>
-        </w:rPr>
-      </w:pPr>
-    </w:p>
-    <w:p>
-      <w:pPr>
-        <w:rPr>
-          <w:rFonts w:hint="eastAsia"/>
-        </w:rPr>
-      </w:pPr>
-      <w:r>
-        <w:t>1</w:t>
-      </w:r>
-      <w:r>
-        <w:t>2</w:t>
-      </w:r>
-      <w:r>
-        <w:t>)</w:t>
-      </w:r>
-      <w:r>
-        <w:t xml:space="preserve"> Functions on sequences</w:t>
-      </w:r>
-    </w:p>
-    <w:p>
-      <w:pPr>
-        <w:rPr>
-          <w:rFonts w:hint="eastAsia"/>
-        </w:rPr>
-      </w:pPr>
-    </w:p>
-    <w:p>
-      <w:pPr>
-        <w:ind w:firstLine="270"/>
-        <w:rPr>
-          <w:rFonts w:hint="eastAsia"/>
-        </w:rPr>
-      </w:pPr>
-      <w:r>
-        <w:t>12.1</w:t>
-      </w:r>
-      <w:r>
-        <w:t xml:space="preserve"> </w:t>
-      </w:r>
-      <w:r>
-        <w:t>General functions on sequences</w:t>
-      </w:r>
-    </w:p>
-    <w:p>
-      <w:pPr>
-        <w:ind w:firstLine="270"/>
-        <w:rPr>
-          <w:rFonts w:hint="eastAsia"/>
-        </w:rPr>
-      </w:pPr>
-      <w:proofErr w:type="spellStart"/>
-      <w:r>
-        <w:t>fn:empty</w:t>
-      </w:r>
-      <w:proofErr w:type="spellEnd"/>
-    </w:p>
-    <w:p>
-      <w:pPr>
-        <w:ind w:firstLine="270"/>
-        <w:rPr>
-          <w:rFonts w:hint="eastAsia"/>
-        </w:rPr>
-      </w:pPr>
-      <w:proofErr w:type="spellStart"/>
-      <w:r>
-        <w:t>fn:exists</w:t>
-      </w:r>
-      <w:proofErr w:type="spellEnd"/>
-    </w:p>
-    <w:p>
-      <w:pPr>
-        <w:ind w:firstLine="270"/>
-        <w:rPr>
-          <w:rFonts w:hint="eastAsia"/>
-        </w:rPr>
-      </w:pPr>
-      <w:proofErr w:type="spellStart"/>
-      <w:r>
-        <w:t>fn:head</w:t>
-      </w:r>
-      <w:proofErr w:type="spellEnd"/>
-    </w:p>
-    <w:p>
-      <w:pPr>
-        <w:ind w:firstLine="270"/>
-        <w:rPr>
-          <w:rFonts w:hint="eastAsia"/>
-        </w:rPr>
-      </w:pPr>
-      <w:proofErr w:type="spellStart"/>
-      <w:r>
-        <w:t>fn:tail</w:t>
-      </w:r>
-      <w:proofErr w:type="spellEnd"/>
-    </w:p>
-    <w:p>
-      <w:pPr>
-        <w:ind w:firstLine="270"/>
-        <w:rPr>
-          <w:rFonts w:hint="eastAsia"/>
-        </w:rPr>
-      </w:pPr>
-      <w:proofErr w:type="spellStart"/>
-      <w:r>
-        <w:t>fn:insert-before</w:t>
-      </w:r>
-      <w:proofErr w:type="spellEnd"/>
-    </w:p>
-    <w:p>
-      <w:pPr>
-        <w:ind w:firstLine="270"/>
-        <w:rPr>
-          <w:rFonts w:hint="eastAsia"/>
-        </w:rPr>
-      </w:pPr>
-      <w:proofErr w:type="spellStart"/>
-      <w:r>
-        <w:t>fn:remove</w:t>
-      </w:r>
-      <w:proofErr w:type="spellEnd"/>
-    </w:p>
-    <w:p>
-      <w:pPr>
-        <w:ind w:firstLine="270"/>
+        <w:t xml:space="preserve"> Accessors</w:t>
+      </w:r>
+    </w:p>
+    <w:p>
+      <w:pPr>
+        <w:rPr>
+          <w:rFonts w:hint="eastAsia"/>
+        </w:rPr>
+      </w:pPr>
+    </w:p>
+    <w:p>
+      <w:pPr>
+        <w:rPr>
+          <w:rFonts w:hint="eastAsia"/>
+        </w:rPr>
+      </w:pPr>
+      <w:proofErr w:type="spellStart"/>
+      <w:r>
+        <w:t>fn:node-name</w:t>
+      </w:r>
+      <w:proofErr w:type="spellEnd"/>
+    </w:p>
+    <w:p>
+      <w:pPr>
+        <w:rPr>
+          <w:rFonts w:hint="eastAsia"/>
+        </w:rPr>
+      </w:pPr>
+      <w:proofErr w:type="spellStart"/>
+      <w:r>
+        <w:t>fn:string</w:t>
+      </w:r>
+      <w:proofErr w:type="spellEnd"/>
+    </w:p>
+    <w:p>
+      <w:pPr>
+        <w:rPr>
+          <w:rFonts w:hint="eastAsia"/>
+        </w:rPr>
+      </w:pPr>
+      <w:proofErr w:type="spellStart"/>
+      <w:r>
+        <w:t>fn:data</w:t>
+      </w:r>
+      <w:proofErr w:type="spellEnd"/>
+    </w:p>
+    <w:p>
+      <w:pPr>
+        <w:rPr>
+          <w:rFonts w:hint="eastAsia"/>
+        </w:rPr>
+      </w:pPr>
+      <w:proofErr w:type="spellStart"/>
+      <w:r>
+        <w:t>fn:base-uri</w:t>
+      </w:r>
+      <w:proofErr w:type="spellEnd"/>
+    </w:p>
+    <w:p>
+      <w:pPr>
+        <w:rPr>
+          <w:rFonts w:hint="eastAsia"/>
+        </w:rPr>
+      </w:pPr>
+      <w:proofErr w:type="spellStart"/>
+      <w:r>
+        <w:t>fn:document-uri</w:t>
+      </w:r>
+      <w:proofErr w:type="spellEnd"/>
+    </w:p>
+    <w:p>
+      <w:pPr>
+        <w:rPr>
+          <w:rFonts w:hint="eastAsia"/>
+        </w:rPr>
+      </w:pPr>
+    </w:p>
+    <w:p>
+      <w:pPr>
+        <w:rPr>
+          <w:rFonts w:hint="eastAsia"/>
+        </w:rPr>
+      </w:pPr>
+      <w:r>
+        <w:t xml:space="preserve">15) </w:t>
+      </w:r>
+      <w:r>
+        <w:rPr>
+          <w:rFonts w:hint="eastAsia"/>
+        </w:rPr>
+        <w:t xml:space="preserve">Functions related to </w:t>
+      </w:r>
+      <w:proofErr w:type="spellStart"/>
+      <w:r>
+        <w:rPr>
+          <w:rFonts w:hint="eastAsia"/>
+        </w:rPr>
+        <w:t>QNames</w:t>
+      </w:r>
+      <w:proofErr w:type="spellEnd"/>
+    </w:p>
+    <w:p>
+      <w:pPr>
+        <w:rPr>
+          <w:rFonts w:hint="eastAsia"/>
+        </w:rPr>
+      </w:pPr>
+    </w:p>
+    <w:p>
+      <w:pPr>
+        <w:rPr>
+          <w:rFonts w:hint="eastAsia"/>
+        </w:rPr>
+      </w:pPr>
+      <w:proofErr w:type="spellStart"/>
+      <w:r>
+        <w:rPr>
+          <w:rFonts w:hint="eastAsia"/>
+        </w:rPr>
+        <w:t>fn:resolve-QName</w:t>
+      </w:r>
+      <w:proofErr w:type="spellEnd"/>
+    </w:p>
+    <w:p>
+      <w:pPr>
+        <w:rPr>
+          <w:rFonts w:hint="eastAsia"/>
+        </w:rPr>
+      </w:pPr>
+      <w:proofErr w:type="spellStart"/>
+      <w:r>
+        <w:rPr>
+          <w:rFonts w:hint="eastAsia"/>
+        </w:rPr>
+        <w:t>fn:QName</w:t>
+      </w:r>
+      <w:proofErr w:type="spellEnd"/>
+    </w:p>
+    <w:p>
+      <w:pPr>
+        <w:rPr>
+          <w:rFonts w:hint="eastAsia"/>
+        </w:rPr>
+      </w:pPr>
+    </w:p>
+    <w:p>
+      <w:pPr>
+        <w:rPr>
+          <w:rFonts w:hint="eastAsia"/>
+        </w:rPr>
+      </w:pPr>
+      <w:r>
+        <w:t>16) Functions related to maps</w:t>
+      </w:r>
+    </w:p>
+    <w:p>
+      <w:pPr>
+        <w:rPr>
+          <w:rFonts w:hint="eastAsia"/>
+        </w:rPr>
+      </w:pPr>
+    </w:p>
+    <w:p>
+      <w:pPr>
+        <w:rPr>
+          <w:rFonts w:hint="eastAsia"/>
+        </w:rPr>
+      </w:pPr>
+      <w:proofErr w:type="spellStart"/>
+      <w:r>
+        <w:t>map:merge</w:t>
+      </w:r>
+      <w:proofErr w:type="spellEnd"/>
+    </w:p>
+    <w:p>
+      <w:pPr>
+        <w:rPr>
+          <w:rFonts w:hint="eastAsia"/>
+        </w:rPr>
+      </w:pPr>
+      <w:proofErr w:type="spellStart"/>
+      <w:r>
+        <w:t>map:size</w:t>
+      </w:r>
+      <w:proofErr w:type="spellEnd"/>
+    </w:p>
+    <w:p>
+      <w:pPr>
+        <w:rPr>
+          <w:rFonts w:hint="eastAsia"/>
+        </w:rPr>
+      </w:pPr>
+      <w:proofErr w:type="spellStart"/>
+      <w:r>
+        <w:t>map:keys</w:t>
+      </w:r>
+      <w:proofErr w:type="spellEnd"/>
+    </w:p>
+    <w:p>
+      <w:pPr>
+        <w:rPr>
+          <w:rFonts w:hint="eastAsia"/>
+        </w:rPr>
+      </w:pPr>
+      <w:proofErr w:type="spellStart"/>
+      <w:r>
+        <w:t>map:contains</w:t>
+      </w:r>
+      <w:proofErr w:type="spellEnd"/>
+    </w:p>
+    <w:p>
+      <w:pPr>
+        <w:rPr>
+          <w:rFonts w:hint="eastAsia"/>
+        </w:rPr>
+      </w:pPr>
+      <w:proofErr w:type="spellStart"/>
+      <w:r>
+        <w:t>map:get</w:t>
+      </w:r>
+      <w:proofErr w:type="spellEnd"/>
+    </w:p>
+    <w:p>
+      <w:pPr>
+        <w:rPr>
+          <w:rFonts w:hint="eastAsia"/>
+        </w:rPr>
+      </w:pPr>
+      <w:proofErr w:type="spellStart"/>
+      <w:r>
+        <w:t>map:find</w:t>
+      </w:r>
+      <w:proofErr w:type="spellEnd"/>
+    </w:p>
+    <w:p>
+      <w:pPr>
+        <w:rPr>
+          <w:rFonts w:hint="eastAsia"/>
+        </w:rPr>
+      </w:pPr>
+      <w:proofErr w:type="spellStart"/>
+      <w:r>
+        <w:t>map:put</w:t>
+      </w:r>
+      <w:proofErr w:type="spellEnd"/>
+    </w:p>
+    <w:p>
+      <w:pPr>
+        <w:rPr>
+          <w:rFonts w:hint="eastAsia"/>
+        </w:rPr>
+      </w:pPr>
+      <w:proofErr w:type="spellStart"/>
+      <w:r>
+        <w:t>map:entry</w:t>
+      </w:r>
+      <w:proofErr w:type="spellEnd"/>
+    </w:p>
+    <w:p>
+      <w:pPr>
+        <w:rPr>
+          <w:rFonts w:hint="eastAsia"/>
+        </w:rPr>
+      </w:pPr>
+      <w:proofErr w:type="spellStart"/>
+      <w:r>
+        <w:t>map:remove</w:t>
+      </w:r>
+      <w:proofErr w:type="spellEnd"/>
+    </w:p>
+    <w:p>
+      <w:pPr>
+        <w:rPr>
+          <w:rFonts w:hint="eastAsia"/>
+        </w:rPr>
+      </w:pPr>
+      <w:proofErr w:type="spellStart"/>
+      <w:r>
+        <w:t>map:for-each</w:t>
+      </w:r>
+      <w:proofErr w:type="spellEnd"/>
+    </w:p>
+    <w:p>
+      <w:pPr>
+        <w:rPr>
+          <w:rFonts w:hint="eastAsia"/>
+        </w:rPr>
+      </w:pPr>
+    </w:p>
+    <w:p>
+      <w:pPr>
+        <w:rPr>
+          <w:rFonts w:hint="eastAsia"/>
+        </w:rPr>
+      </w:pPr>
+      <w:r>
+        <w:t>17) Functions related to arrays</w:t>
+      </w:r>
+    </w:p>
+    <w:p>
+      <w:pPr>
+        <w:rPr>
+          <w:rFonts w:hint="eastAsia"/>
+        </w:rPr>
+      </w:pPr>
+    </w:p>
+    <w:p>
+      <w:pPr>
+        <w:rPr>
+          <w:rFonts w:hint="eastAsia"/>
+        </w:rPr>
+      </w:pPr>
+      <w:proofErr w:type="spellStart"/>
+      <w:r>
+        <w:t>array:size</w:t>
+      </w:r>
+      <w:proofErr w:type="spellEnd"/>
+    </w:p>
+    <w:p>
+      <w:pPr>
+        <w:rPr>
+          <w:rFonts w:hint="eastAsia"/>
+        </w:rPr>
+      </w:pPr>
+      <w:proofErr w:type="spellStart"/>
+      <w:r>
+        <w:t>array:get</w:t>
+      </w:r>
+      <w:proofErr w:type="spellEnd"/>
+    </w:p>
+    <w:p>
+      <w:pPr>
+        <w:rPr>
+          <w:rFonts w:hint="eastAsia"/>
+        </w:rPr>
+      </w:pPr>
+      <w:proofErr w:type="spellStart"/>
+      <w:r>
+        <w:t>array:put</w:t>
+      </w:r>
+      <w:proofErr w:type="spellEnd"/>
+    </w:p>
+    <w:p>
+      <w:pPr>
+        <w:rPr>
+          <w:rFonts w:hint="eastAsia"/>
+        </w:rPr>
+      </w:pPr>
+      <w:proofErr w:type="spellStart"/>
+      <w:r>
+        <w:t>array:append</w:t>
+      </w:r>
+      <w:proofErr w:type="spellEnd"/>
+    </w:p>
+    <w:p>
+      <w:pPr>
+        <w:rPr>
+          <w:rFonts w:hint="eastAsia"/>
+        </w:rPr>
+      </w:pPr>
+      <w:proofErr w:type="spellStart"/>
+      <w:r>
+        <w:t>array:subarray</w:t>
+      </w:r>
+      <w:proofErr w:type="spellEnd"/>
+    </w:p>
+    <w:p>
+      <w:pPr>
         <w:rPr>
           <w:rFonts w:hint="eastAsia"/>
         </w:rPr>
@@ -6534,554 +7111,6 @@
       <w:proofErr w:type="spellStart"/>
       <w:r>
         <w:lastRenderedPageBreak/>
-        <w:t>fn:reverse</w:t>
-      </w:r>
-      <w:proofErr w:type="spellEnd"/>
-    </w:p>
-    <w:p>
-      <w:pPr>
-        <w:ind w:firstLine="270"/>
-        <w:rPr>
-          <w:rFonts w:hint="eastAsia"/>
-        </w:rPr>
-      </w:pPr>
-      <w:proofErr w:type="spellStart"/>
-      <w:r>
-        <w:t>fn:subsequence</w:t>
-      </w:r>
-      <w:proofErr w:type="spellEnd"/>
-    </w:p>
-    <w:p>
-      <w:pPr>
-        <w:ind w:firstLine="270"/>
-        <w:rPr>
-          <w:rFonts w:hint="eastAsia"/>
-        </w:rPr>
-      </w:pPr>
-      <w:proofErr w:type="spellStart"/>
-      <w:r>
-        <w:t>fn:unordered</w:t>
-      </w:r>
-      <w:proofErr w:type="spellEnd"/>
-    </w:p>
-    <w:p>
-      <w:pPr>
-        <w:ind w:firstLine="270"/>
-        <w:rPr>
-          <w:rFonts w:hint="eastAsia"/>
-        </w:rPr>
-      </w:pPr>
-    </w:p>
-    <w:p>
-      <w:pPr>
-        <w:ind w:left="270"/>
-        <w:rPr>
-          <w:rFonts w:hint="eastAsia"/>
-        </w:rPr>
-      </w:pPr>
-      <w:r>
-        <w:t>12.2</w:t>
-      </w:r>
-      <w:r>
-        <w:t xml:space="preserve"> </w:t>
-      </w:r>
-      <w:r>
-        <w:t>Aggregate functions</w:t>
-      </w:r>
-    </w:p>
-    <w:p>
-      <w:pPr>
-        <w:ind w:left="270"/>
-        <w:rPr>
-          <w:rFonts w:hint="eastAsia"/>
-        </w:rPr>
-      </w:pPr>
-      <w:proofErr w:type="spellStart"/>
-      <w:r>
-        <w:t>fn:avg</w:t>
-      </w:r>
-      <w:proofErr w:type="spellEnd"/>
-    </w:p>
-    <w:p>
-      <w:pPr>
-        <w:ind w:left="270"/>
-        <w:rPr>
-          <w:rFonts w:hint="eastAsia"/>
-        </w:rPr>
-      </w:pPr>
-      <w:proofErr w:type="spellStart"/>
-      <w:r>
-        <w:t>fn:max</w:t>
-      </w:r>
-      <w:proofErr w:type="spellEnd"/>
-    </w:p>
-    <w:p>
-      <w:pPr>
-        <w:ind w:left="270"/>
-        <w:rPr>
-          <w:rFonts w:hint="eastAsia"/>
-        </w:rPr>
-      </w:pPr>
-      <w:proofErr w:type="spellStart"/>
-      <w:r>
-        <w:t>fn:min</w:t>
-      </w:r>
-      <w:proofErr w:type="spellEnd"/>
-    </w:p>
-    <w:p>
-      <w:pPr>
-        <w:rPr>
-          <w:rFonts w:hint="eastAsia"/>
-        </w:rPr>
-      </w:pPr>
-    </w:p>
-    <w:p>
-      <w:pPr>
-        <w:rPr>
-          <w:rFonts w:hint="eastAsia"/>
-        </w:rPr>
-      </w:pPr>
-      <w:r>
-        <w:t>1</w:t>
-      </w:r>
-      <w:r>
-        <w:t>3</w:t>
-      </w:r>
-      <w:r>
-        <w:t>)</w:t>
-      </w:r>
-      <w:r>
-        <w:t xml:space="preserve"> Parsing and serializing</w:t>
-      </w:r>
-    </w:p>
-    <w:p>
-      <w:pPr>
-        <w:rPr>
-          <w:rFonts w:hint="eastAsia"/>
-        </w:rPr>
-      </w:pPr>
-    </w:p>
-    <w:p>
-      <w:pPr>
-        <w:rPr>
-          <w:rFonts w:hint="eastAsia"/>
-        </w:rPr>
-      </w:pPr>
-      <w:proofErr w:type="spellStart"/>
-      <w:r>
-        <w:t>fn:parse-xml</w:t>
-      </w:r>
-      <w:proofErr w:type="spellEnd"/>
-    </w:p>
-    <w:p>
-      <w:pPr>
-        <w:rPr>
-          <w:rFonts w:hint="eastAsia"/>
-        </w:rPr>
-      </w:pPr>
-      <w:proofErr w:type="spellStart"/>
-      <w:r>
-        <w:t>fn:parse-xml-fragment</w:t>
-      </w:r>
-      <w:proofErr w:type="spellEnd"/>
-    </w:p>
-    <w:p>
-      <w:pPr>
-        <w:rPr>
-          <w:rFonts w:hint="eastAsia"/>
-        </w:rPr>
-      </w:pPr>
-    </w:p>
-    <w:p>
-      <w:pPr>
-        <w:rPr>
-          <w:rFonts w:hint="eastAsia"/>
-        </w:rPr>
-      </w:pPr>
-      <w:r>
-        <w:t>1</w:t>
-      </w:r>
-      <w:r>
-        <w:t>4</w:t>
-      </w:r>
-      <w:r>
-        <w:t>)</w:t>
-      </w:r>
-      <w:r>
-        <w:t xml:space="preserve"> Accessors</w:t>
-      </w:r>
-    </w:p>
-    <w:p>
-      <w:pPr>
-        <w:rPr>
-          <w:rFonts w:hint="eastAsia"/>
-        </w:rPr>
-      </w:pPr>
-    </w:p>
-    <w:p>
-      <w:pPr>
-        <w:rPr>
-          <w:rFonts w:hint="eastAsia"/>
-        </w:rPr>
-      </w:pPr>
-      <w:proofErr w:type="spellStart"/>
-      <w:r>
-        <w:t>fn:node-name</w:t>
-      </w:r>
-      <w:proofErr w:type="spellEnd"/>
-    </w:p>
-    <w:p>
-      <w:pPr>
-        <w:rPr>
-          <w:rFonts w:hint="eastAsia"/>
-        </w:rPr>
-      </w:pPr>
-      <w:proofErr w:type="spellStart"/>
-      <w:r>
-        <w:t>fn:string</w:t>
-      </w:r>
-      <w:proofErr w:type="spellEnd"/>
-    </w:p>
-    <w:p>
-      <w:pPr>
-        <w:rPr>
-          <w:rFonts w:hint="eastAsia"/>
-        </w:rPr>
-      </w:pPr>
-      <w:proofErr w:type="spellStart"/>
-      <w:r>
-        <w:t>fn:data</w:t>
-      </w:r>
-      <w:proofErr w:type="spellEnd"/>
-    </w:p>
-    <w:p>
-      <w:pPr>
-        <w:rPr>
-          <w:rFonts w:hint="eastAsia"/>
-        </w:rPr>
-      </w:pPr>
-      <w:proofErr w:type="spellStart"/>
-      <w:r>
-        <w:t>fn:base-uri</w:t>
-      </w:r>
-      <w:proofErr w:type="spellEnd"/>
-    </w:p>
-    <w:p>
-      <w:pPr>
-        <w:rPr>
-          <w:rFonts w:hint="eastAsia"/>
-        </w:rPr>
-      </w:pPr>
-      <w:proofErr w:type="spellStart"/>
-      <w:r>
-        <w:t>fn:document-uri</w:t>
-      </w:r>
-      <w:proofErr w:type="spellEnd"/>
-    </w:p>
-    <w:p>
-      <w:pPr>
-        <w:rPr>
-          <w:rFonts w:hint="eastAsia"/>
-        </w:rPr>
-      </w:pPr>
-    </w:p>
-    <w:p>
-      <w:pPr>
-        <w:rPr>
-          <w:rFonts w:hint="eastAsia"/>
-        </w:rPr>
-      </w:pPr>
-      <w:r>
-        <w:t xml:space="preserve">15) </w:t>
-      </w:r>
-      <w:r>
-        <w:rPr>
-          <w:rFonts w:hint="eastAsia"/>
-        </w:rPr>
-        <w:t xml:space="preserve">Functions related to </w:t>
-      </w:r>
-      <w:proofErr w:type="spellStart"/>
-      <w:r>
-        <w:rPr>
-          <w:rFonts w:hint="eastAsia"/>
-        </w:rPr>
-        <w:t>QNames</w:t>
-      </w:r>
-      <w:proofErr w:type="spellEnd"/>
-    </w:p>
-    <w:p>
-      <w:pPr>
-        <w:rPr>
-          <w:rFonts w:hint="eastAsia"/>
-        </w:rPr>
-      </w:pPr>
-    </w:p>
-    <w:p>
-      <w:pPr>
-        <w:rPr>
-          <w:rFonts w:hint="eastAsia"/>
-        </w:rPr>
-      </w:pPr>
-      <w:proofErr w:type="spellStart"/>
-      <w:r>
-        <w:rPr>
-          <w:rFonts w:hint="eastAsia"/>
-        </w:rPr>
-        <w:t>fn:resolve-QName</w:t>
-      </w:r>
-      <w:proofErr w:type="spellEnd"/>
-    </w:p>
-    <w:p>
-      <w:pPr>
-        <w:rPr>
-          <w:rFonts w:hint="eastAsia"/>
-        </w:rPr>
-      </w:pPr>
-      <w:proofErr w:type="spellStart"/>
-      <w:r>
-        <w:rPr>
-          <w:rFonts w:hint="eastAsia"/>
-        </w:rPr>
-        <w:t>fn:QName</w:t>
-      </w:r>
-      <w:proofErr w:type="spellEnd"/>
-    </w:p>
-    <w:p>
-      <w:pPr>
-        <w:rPr>
-          <w:rFonts w:hint="eastAsia"/>
-        </w:rPr>
-      </w:pPr>
-    </w:p>
-    <w:p>
-      <w:pPr>
-        <w:rPr>
-          <w:rFonts w:hint="eastAsia"/>
-        </w:rPr>
-      </w:pPr>
-      <w:r>
-        <w:t>16) Functions related to maps</w:t>
-      </w:r>
-    </w:p>
-    <w:p>
-      <w:pPr>
-        <w:rPr>
-          <w:rFonts w:hint="eastAsia"/>
-        </w:rPr>
-      </w:pPr>
-    </w:p>
-    <w:p>
-      <w:pPr>
-        <w:rPr>
-          <w:rFonts w:hint="eastAsia"/>
-        </w:rPr>
-      </w:pPr>
-      <w:proofErr w:type="spellStart"/>
-      <w:r>
-        <w:t>map:merge</w:t>
-      </w:r>
-      <w:proofErr w:type="spellEnd"/>
-    </w:p>
-    <w:p>
-      <w:pPr>
-        <w:rPr>
-          <w:rFonts w:hint="eastAsia"/>
-        </w:rPr>
-      </w:pPr>
-      <w:proofErr w:type="spellStart"/>
-      <w:r>
-        <w:t>map:size</w:t>
-      </w:r>
-      <w:proofErr w:type="spellEnd"/>
-    </w:p>
-    <w:p>
-      <w:pPr>
-        <w:rPr>
-          <w:rFonts w:hint="eastAsia"/>
-        </w:rPr>
-      </w:pPr>
-      <w:proofErr w:type="spellStart"/>
-      <w:r>
-        <w:t>map:keys</w:t>
-      </w:r>
-      <w:proofErr w:type="spellEnd"/>
-    </w:p>
-    <w:p>
-      <w:pPr>
-        <w:rPr>
-          <w:rFonts w:hint="eastAsia"/>
-        </w:rPr>
-      </w:pPr>
-      <w:proofErr w:type="spellStart"/>
-      <w:r>
-        <w:t>map:contains</w:t>
-      </w:r>
-      <w:proofErr w:type="spellEnd"/>
-    </w:p>
-    <w:p>
-      <w:pPr>
-        <w:rPr>
-          <w:rFonts w:hint="eastAsia"/>
-        </w:rPr>
-      </w:pPr>
-      <w:proofErr w:type="spellStart"/>
-      <w:r>
-        <w:t>map:get</w:t>
-      </w:r>
-      <w:proofErr w:type="spellEnd"/>
-    </w:p>
-    <w:p>
-      <w:pPr>
-        <w:rPr>
-          <w:rFonts w:hint="eastAsia"/>
-        </w:rPr>
-      </w:pPr>
-      <w:proofErr w:type="spellStart"/>
-      <w:r>
-        <w:t>map:find</w:t>
-      </w:r>
-      <w:proofErr w:type="spellEnd"/>
-    </w:p>
-    <w:p>
-      <w:pPr>
-        <w:rPr>
-          <w:rFonts w:hint="eastAsia"/>
-        </w:rPr>
-      </w:pPr>
-      <w:proofErr w:type="spellStart"/>
-      <w:r>
-        <w:t>map:put</w:t>
-      </w:r>
-      <w:proofErr w:type="spellEnd"/>
-    </w:p>
-    <w:p>
-      <w:pPr>
-        <w:rPr>
-          <w:rFonts w:hint="eastAsia"/>
-        </w:rPr>
-      </w:pPr>
-      <w:proofErr w:type="spellStart"/>
-      <w:r>
-        <w:t>map:entry</w:t>
-      </w:r>
-      <w:proofErr w:type="spellEnd"/>
-    </w:p>
-    <w:p>
-      <w:pPr>
-        <w:rPr>
-          <w:rFonts w:hint="eastAsia"/>
-        </w:rPr>
-      </w:pPr>
-      <w:proofErr w:type="spellStart"/>
-      <w:r>
-        <w:t>map:remove</w:t>
-      </w:r>
-      <w:proofErr w:type="spellEnd"/>
-    </w:p>
-    <w:p>
-      <w:pPr>
-        <w:rPr>
-          <w:rFonts w:hint="eastAsia"/>
-        </w:rPr>
-      </w:pPr>
-      <w:proofErr w:type="spellStart"/>
-      <w:r>
-        <w:t>map:for-each</w:t>
-      </w:r>
-      <w:proofErr w:type="spellEnd"/>
-    </w:p>
-    <w:p>
-      <w:pPr>
-        <w:rPr>
-          <w:rFonts w:hint="eastAsia"/>
-        </w:rPr>
-      </w:pPr>
-    </w:p>
-    <w:p>
-      <w:pPr>
-        <w:rPr>
-          <w:rFonts w:hint="eastAsia"/>
-        </w:rPr>
-      </w:pPr>
-      <w:r>
-        <w:t>17) Functions related to arrays</w:t>
-      </w:r>
-    </w:p>
-    <w:p>
-      <w:pPr>
-        <w:rPr>
-          <w:rFonts w:hint="eastAsia"/>
-        </w:rPr>
-      </w:pPr>
-    </w:p>
-    <w:p>
-      <w:pPr>
-        <w:rPr>
-          <w:rFonts w:hint="eastAsia"/>
-        </w:rPr>
-      </w:pPr>
-      <w:proofErr w:type="spellStart"/>
-      <w:r>
-        <w:t>array:size</w:t>
-      </w:r>
-      <w:proofErr w:type="spellEnd"/>
-    </w:p>
-    <w:p>
-      <w:pPr>
-        <w:rPr>
-          <w:rFonts w:hint="eastAsia"/>
-        </w:rPr>
-      </w:pPr>
-      <w:proofErr w:type="spellStart"/>
-      <w:r>
-        <w:t>array:get</w:t>
-      </w:r>
-      <w:proofErr w:type="spellEnd"/>
-    </w:p>
-    <w:p>
-      <w:pPr>
-        <w:rPr>
-          <w:rFonts w:hint="eastAsia"/>
-        </w:rPr>
-      </w:pPr>
-      <w:proofErr w:type="spellStart"/>
-      <w:r>
-        <w:t>array:put</w:t>
-      </w:r>
-      <w:proofErr w:type="spellEnd"/>
-    </w:p>
-    <w:p>
-      <w:pPr>
-        <w:rPr>
-          <w:rFonts w:hint="eastAsia"/>
-        </w:rPr>
-      </w:pPr>
-      <w:proofErr w:type="spellStart"/>
-      <w:r>
-        <w:t>array:append</w:t>
-      </w:r>
-      <w:proofErr w:type="spellEnd"/>
-    </w:p>
-    <w:p>
-      <w:pPr>
-        <w:rPr>
-          <w:rFonts w:hint="eastAsia"/>
-        </w:rPr>
-      </w:pPr>
-      <w:proofErr w:type="spellStart"/>
-      <w:r>
-        <w:t>array:subarray</w:t>
-      </w:r>
-      <w:proofErr w:type="spellEnd"/>
-    </w:p>
-    <w:p>
-      <w:pPr>
-        <w:rPr>
-          <w:rFonts w:hint="eastAsia"/>
-        </w:rPr>
-      </w:pPr>
-      <w:proofErr w:type="spellStart"/>
-      <w:r>
         <w:t>array:remove</w:t>
       </w:r>
       <w:proofErr w:type="spellEnd"/>
@@ -7106,7 +7135,6 @@
       </w:pPr>
       <w:proofErr w:type="spellStart"/>
       <w:r>
-        <w:lastRenderedPageBreak/>
         <w:t>array:head</w:t>
       </w:r>
       <w:proofErr w:type="spellEnd"/>
@@ -7382,7 +7410,7 @@
           <w:b/>
           <w:bCs/>
         </w:rPr>
-        <w:t>Xalan</w:t>
+        <w:t>Xalan’s</w:t>
       </w:r>
       <w:proofErr w:type="spellEnd"/>
       <w:r>
@@ -7390,14 +7418,7 @@
           <w:b/>
           <w:bCs/>
         </w:rPr>
-        <w:t>-</w:t>
-      </w:r>
-      <w:r>
-        <w:rPr>
-          <w:b/>
-          <w:bCs/>
-        </w:rPr>
-        <w:t>J’s XPath 3.1 implementation as well</w:t>
+        <w:t xml:space="preserve"> XPath 3.1 implementation as well</w:t>
       </w:r>
       <w:r>
         <w:rPr>
@@ -7627,217 +7648,197 @@
         </w:rPr>
       </w:pPr>
       <w:r>
-        <w:t xml:space="preserve">b) </w:t>
-      </w:r>
-      <w:proofErr w:type="spellStart"/>
-      <w:r>
-        <w:t>xsl:mode</w:t>
-      </w:r>
-      <w:proofErr w:type="spellEnd"/>
-    </w:p>
-    <w:p>
-      <w:pPr>
-        <w:rPr>
-          <w:rFonts w:hint="eastAsia"/>
-        </w:rPr>
-      </w:pPr>
-    </w:p>
-    <w:p>
-      <w:pPr>
-        <w:rPr>
-          <w:rFonts w:hint="eastAsia"/>
-        </w:rPr>
-      </w:pPr>
-      <w:r>
-        <w:t xml:space="preserve">Within </w:t>
-      </w:r>
-      <w:proofErr w:type="spellStart"/>
-      <w:r>
+        <w:t>b</w:t>
+      </w:r>
+      <w:r>
+        <w:t xml:space="preserve">) </w:t>
+      </w:r>
+      <w:r>
+        <w:t>“</w:t>
+      </w:r>
+      <w:r>
+        <w:t xml:space="preserve">Conditional </w:t>
+      </w:r>
+      <w:r>
+        <w:t>C</w:t>
+      </w:r>
+      <w:r>
+        <w:t xml:space="preserve">ontent </w:t>
+      </w:r>
+      <w:r>
+        <w:t>C</w:t>
+      </w:r>
+      <w:r>
+        <w:t>onstruction</w:t>
+      </w:r>
+      <w:r>
+        <w:t>”</w:t>
+      </w:r>
+      <w:r>
+        <w:t xml:space="preserve"> instructions </w:t>
+      </w:r>
+      <w:proofErr w:type="spellStart"/>
+      <w:r>
+        <w:t>xsl:where-populated</w:t>
+      </w:r>
+      <w:proofErr w:type="spellEnd"/>
+      <w:r>
+        <w:t xml:space="preserve">, </w:t>
+      </w:r>
+      <w:proofErr w:type="spellStart"/>
+      <w:r>
+        <w:t>xsl:on-empty</w:t>
+      </w:r>
+      <w:proofErr w:type="spellEnd"/>
+      <w:r>
+        <w:t xml:space="preserve">, </w:t>
+      </w:r>
+      <w:proofErr w:type="spellStart"/>
+      <w:r>
+        <w:t>xsl:on-non-empty</w:t>
+      </w:r>
+      <w:proofErr w:type="spellEnd"/>
+      <w:r>
+        <w:t xml:space="preserve">. </w:t>
+      </w:r>
+      <w:r>
+        <w:rPr>
+          <w:b/>
+          <w:bCs/>
+        </w:rPr>
+        <w:t>XSLT 3.0 spec, ref</w:t>
+      </w:r>
+      <w:r>
+        <w:t xml:space="preserve"> : </w:t>
+      </w:r>
+      <w:r>
+        <w:t>These facilities are available whether or not streaming is in use, but they are introduced to the language specifically to make streaming easier.</w:t>
+      </w:r>
+    </w:p>
+    <w:p>
+      <w:pPr>
+        <w:rPr>
+          <w:rFonts w:hint="eastAsia"/>
+        </w:rPr>
+      </w:pPr>
+    </w:p>
+    <w:p>
+      <w:pPr>
+        <w:rPr>
+          <w:rFonts w:hint="eastAsia"/>
+        </w:rPr>
+      </w:pPr>
+      <w:r>
+        <w:t>c) XSLT 3.0 map instructions</w:t>
+      </w:r>
+    </w:p>
+    <w:p>
+      <w:pPr>
+        <w:rPr>
+          <w:rFonts w:hint="eastAsia"/>
+        </w:rPr>
+      </w:pPr>
+    </w:p>
+    <w:p>
+      <w:pPr>
+        <w:rPr>
+          <w:rFonts w:hint="eastAsia"/>
+        </w:rPr>
+      </w:pPr>
+      <w:r>
+        <w:rPr>
+          <w:b/>
+          <w:bCs/>
+        </w:rPr>
+        <w:t>XSLT 3.0 spec, ref</w:t>
+      </w:r>
+      <w:r>
+        <w:t xml:space="preserve"> (section 21) : </w:t>
+      </w:r>
+      <w:r>
+        <w:t>When XSLT 3.0 is used with XPath 3.0, it extends the type system and data model of XPath 3.0 with an additional datatype: the map.</w:t>
+      </w:r>
+      <w:r>
+        <w:t xml:space="preserve"> </w:t>
+      </w:r>
+      <w:r>
+        <w:t xml:space="preserve">The extensions to XPath 3.0 defined </w:t>
+      </w:r>
+      <w:r>
+        <w:t>within XSLT 3.0 specification</w:t>
+      </w:r>
+      <w:r>
+        <w:t xml:space="preserve"> section</w:t>
+      </w:r>
+      <w:r>
+        <w:t xml:space="preserve"> 21</w:t>
+      </w:r>
+      <w:r>
+        <w:t xml:space="preserve"> have been incorporated into XPath 3.1. Therefore, when an XSLT 3.0 processor implements the </w:t>
+      </w:r>
+      <w:r>
+        <w:t>XPath 3.1 Feature</w:t>
+      </w:r>
+      <w:r>
+        <w:t xml:space="preserve">, the relevant parts of </w:t>
+      </w:r>
+      <w:r>
+        <w:t xml:space="preserve">XSLT 3.0 spec </w:t>
+      </w:r>
+      <w:r>
+        <w:t xml:space="preserve">section </w:t>
+      </w:r>
+      <w:r>
+        <w:t xml:space="preserve">21 </w:t>
+      </w:r>
+      <w:r>
+        <w:t>can be ignored.</w:t>
+      </w:r>
+      <w:r>
+        <w:t xml:space="preserve"> </w:t>
+      </w:r>
+      <w:proofErr w:type="spellStart"/>
+      <w:r>
+        <w:rPr>
+          <w:b/>
+          <w:bCs/>
+        </w:rPr>
         <w:t>Xalan</w:t>
       </w:r>
       <w:proofErr w:type="spellEnd"/>
       <w:r>
-        <w:t>-J</w:t>
-      </w:r>
-      <w:r>
-        <w:t>,</w:t>
-      </w:r>
-      <w:r>
-        <w:t xml:space="preserve"> a partial workaround is to use template’s mode</w:t>
-      </w:r>
-      <w:r>
-        <w:t xml:space="preserve"> name</w:t>
-      </w:r>
-      <w:r>
-        <w:t xml:space="preserve"> as follows: </w:t>
-      </w:r>
-      <w:proofErr w:type="spellStart"/>
-      <w:r>
-        <w:t>xsl:template</w:t>
-      </w:r>
-      <w:proofErr w:type="spellEnd"/>
-      <w:r>
-        <w:t xml:space="preserve"> match=</w:t>
-      </w:r>
-      <w:r>
-        <w:t>”</w:t>
-      </w:r>
-      <w:r>
-        <w:t>…</w:t>
-      </w:r>
-      <w:r>
-        <w:t>”</w:t>
-      </w:r>
-      <w:r>
-        <w:t xml:space="preserve"> mode=”mode</w:t>
-      </w:r>
-      <w:r>
-        <w:t xml:space="preserve"> </w:t>
-      </w:r>
-      <w:r>
-        <w:t>name”</w:t>
-      </w:r>
-      <w:r>
-        <w:t xml:space="preserve"> with an XSLT 1.0 defined semantics.</w:t>
-      </w:r>
-    </w:p>
-    <w:p>
-      <w:pPr>
-        <w:rPr>
-          <w:rFonts w:hint="eastAsia"/>
-        </w:rPr>
-      </w:pPr>
-    </w:p>
-    <w:p>
-      <w:pPr>
-        <w:rPr>
-          <w:rFonts w:hint="eastAsia"/>
-        </w:rPr>
-      </w:pPr>
-      <w:r>
-        <w:t xml:space="preserve">c) </w:t>
-      </w:r>
-      <w:r>
-        <w:t xml:space="preserve">Conditional content construction instructions </w:t>
-      </w:r>
-      <w:proofErr w:type="spellStart"/>
-      <w:r>
-        <w:t>xsl:where-populated</w:t>
-      </w:r>
-      <w:proofErr w:type="spellEnd"/>
-      <w:r>
-        <w:t xml:space="preserve">, </w:t>
-      </w:r>
-      <w:proofErr w:type="spellStart"/>
-      <w:r>
-        <w:t>xsl:on-empty</w:t>
-      </w:r>
-      <w:proofErr w:type="spellEnd"/>
-      <w:r>
-        <w:t xml:space="preserve">, </w:t>
-      </w:r>
-      <w:proofErr w:type="spellStart"/>
-      <w:r>
-        <w:t>xsl:on-non-empty</w:t>
-      </w:r>
-      <w:proofErr w:type="spellEnd"/>
-    </w:p>
-    <w:p>
-      <w:pPr>
-        <w:rPr>
-          <w:rFonts w:hint="eastAsia"/>
-        </w:rPr>
-      </w:pPr>
-    </w:p>
-    <w:p>
-      <w:pPr>
-        <w:rPr>
-          <w:rFonts w:hint="eastAsia"/>
-        </w:rPr>
-      </w:pPr>
-      <w:r>
-        <w:t xml:space="preserve">d) </w:t>
-      </w:r>
-      <w:r>
-        <w:t xml:space="preserve">Various aspects of </w:t>
-      </w:r>
-      <w:r>
-        <w:t xml:space="preserve">XSLT 3.0 </w:t>
-      </w:r>
-      <w:r>
-        <w:t>streaming</w:t>
-      </w:r>
-      <w:r>
-        <w:t xml:space="preserve"> specifications</w:t>
-      </w:r>
-    </w:p>
-    <w:p>
-      <w:pPr>
-        <w:rPr>
-          <w:rFonts w:hint="eastAsia"/>
-        </w:rPr>
-      </w:pPr>
-    </w:p>
-    <w:p>
-      <w:pPr>
-        <w:rPr>
-          <w:rFonts w:hint="eastAsia"/>
-        </w:rPr>
-      </w:pPr>
-      <w:r>
-        <w:t>Partial</w:t>
-      </w:r>
-      <w:r>
-        <w:t xml:space="preserve"> implementation</w:t>
-      </w:r>
-      <w:r>
-        <w:t>:</w:t>
-      </w:r>
-    </w:p>
-    <w:p>
-      <w:pPr>
-        <w:rPr>
-          <w:rFonts w:hint="eastAsia"/>
-        </w:rPr>
-      </w:pPr>
-    </w:p>
-    <w:p>
-      <w:pPr>
-        <w:pStyle w:val="ListParagraph"/>
-        <w:numPr>
-          <w:ilvl w:val="0"/>
-          <w:numId w:val="10"/>
-        </w:numPr>
-        <w:ind w:left="284" w:hanging="284"/>
-        <w:rPr>
-          <w:rFonts w:hint="eastAsia"/>
-        </w:rPr>
-      </w:pPr>
-      <w:proofErr w:type="spellStart"/>
-      <w:r>
-        <w:t>x</w:t>
-      </w:r>
-      <w:r>
-        <w:t>sl:sort</w:t>
-      </w:r>
-      <w:proofErr w:type="spellEnd"/>
-      <w:r>
-        <w:t xml:space="preserve"> </w:t>
-      </w:r>
-      <w:r>
-        <w:t xml:space="preserve">instruction’s </w:t>
-      </w:r>
-      <w:r>
-        <w:t xml:space="preserve">data-type value </w:t>
-      </w:r>
-      <w:proofErr w:type="spellStart"/>
-      <w:r>
-        <w:t>eqname</w:t>
-      </w:r>
-      <w:proofErr w:type="spellEnd"/>
-      <w:r>
-        <w:t>, and ‘collation’ attribute are yet not implemented</w:t>
-      </w:r>
+        <w:rPr>
+          <w:b/>
+          <w:bCs/>
+        </w:rPr>
+        <w:t xml:space="preserve"> shall not implement this XSLT 3.0 language feature, because </w:t>
+      </w:r>
+      <w:proofErr w:type="spellStart"/>
+      <w:r>
+        <w:rPr>
+          <w:b/>
+          <w:bCs/>
+        </w:rPr>
+        <w:t>Xalan</w:t>
+      </w:r>
+      <w:proofErr w:type="spellEnd"/>
+      <w:r>
+        <w:rPr>
+          <w:b/>
+          <w:bCs/>
+        </w:rPr>
+        <w:t xml:space="preserve"> implements XPath 3.1 maps</w:t>
+      </w:r>
+      <w:r>
+        <w:t>.</w:t>
+      </w:r>
+    </w:p>
+    <w:p>
+      <w:pPr>
+        <w:rPr>
+          <w:rFonts w:hint="eastAsia"/>
+        </w:rPr>
+      </w:pPr>
     </w:p>
     <w:p>
       <w:pPr>
@@ -7954,7 +7955,7 @@
       </w:r>
       <w:proofErr w:type="spellEnd"/>
       <w:r>
-        <w:t xml:space="preserve">-J, are described within this document’s section </w:t>
+        <w:t xml:space="preserve">, are described within this document’s section </w:t>
       </w:r>
       <w:r>
         <w:rPr>
@@ -8023,75 +8024,61 @@
         </w:rPr>
         <w:t>Xalan</w:t>
       </w:r>
-      <w:proofErr w:type="spellEnd"/>
       <w:r>
         <w:rPr>
           <w:b/>
           <w:bCs/>
         </w:rPr>
-        <w:t>-</w:t>
-      </w:r>
+        <w:t>’s</w:t>
+      </w:r>
+      <w:proofErr w:type="spellEnd"/>
       <w:r>
         <w:rPr>
           <w:b/>
           <w:bCs/>
         </w:rPr>
-        <w:t>J</w:t>
+        <w:t xml:space="preserve"> XSLT 3.0 </w:t>
       </w:r>
       <w:r>
         <w:rPr>
           <w:b/>
           <w:bCs/>
         </w:rPr>
-        <w:t>’s</w:t>
+        <w:t xml:space="preserve">and </w:t>
       </w:r>
       <w:r>
         <w:rPr>
           <w:b/>
           <w:bCs/>
         </w:rPr>
-        <w:t xml:space="preserve"> XSLT 3.0 </w:t>
+        <w:t xml:space="preserve">XPath 3.1 </w:t>
       </w:r>
       <w:r>
         <w:rPr>
           <w:b/>
           <w:bCs/>
         </w:rPr>
-        <w:t xml:space="preserve">and </w:t>
+        <w:t>test</w:t>
       </w:r>
       <w:r>
         <w:rPr>
           <w:b/>
           <w:bCs/>
         </w:rPr>
-        <w:t xml:space="preserve">XPath 3.1 </w:t>
+        <w:t xml:space="preserve"> </w:t>
       </w:r>
       <w:r>
         <w:rPr>
           <w:b/>
           <w:bCs/>
         </w:rPr>
-        <w:t>test</w:t>
+        <w:t>suite</w:t>
       </w:r>
       <w:r>
         <w:rPr>
           <w:b/>
           <w:bCs/>
         </w:rPr>
-        <w:t xml:space="preserve"> </w:t>
-      </w:r>
-      <w:r>
-        <w:rPr>
-          <w:b/>
-          <w:bCs/>
-        </w:rPr>
-        <w:t>suite</w:t>
-      </w:r>
-      <w:r>
-        <w:rPr>
-          <w:b/>
-          <w:bCs/>
-        </w:rPr>
         <w:t xml:space="preserve"> details</w:t>
       </w:r>
     </w:p>
@@ -8114,7 +8101,7 @@
       </w:r>
       <w:proofErr w:type="spellEnd"/>
       <w:r>
-        <w:t xml:space="preserve">-J XSLT 3.0 development code’s latest conformance results with W3C XSLT 3.0 test suite is available </w:t>
+        <w:t xml:space="preserve"> XSLT 3.0 development code’s latest conformance results with W3C XSLT 3.0 test suite is available </w:t>
       </w:r>
       <w:r>
         <w:t>here</w:t>
@@ -8151,9 +8138,6 @@
       </w:r>
       <w:proofErr w:type="spellEnd"/>
       <w:r>
-        <w:t>-J</w:t>
-      </w:r>
-      <w:r>
         <w:t xml:space="preserve"> </w:t>
       </w:r>
       <w:r>
@@ -8163,7 +8147,10 @@
         <w:t xml:space="preserve"> development code’s own </w:t>
       </w:r>
       <w:r>
-        <w:t xml:space="preserve">test suite is available </w:t>
+        <w:t>XSL t</w:t>
+      </w:r>
+      <w:r>
+        <w:t xml:space="preserve">est suite is available </w:t>
       </w:r>
       <w:r>
         <w:t>here</w:t>
@@ -8184,19 +8171,37 @@
         <w:t xml:space="preserve"> </w:t>
       </w:r>
       <w:r>
-        <w:t>and the results of these</w:t>
+        <w:t xml:space="preserve">and the </w:t>
+      </w:r>
+      <w:r>
+        <w:t xml:space="preserve">latest </w:t>
+      </w:r>
+      <w:r>
+        <w:t>results of these</w:t>
       </w:r>
       <w:r>
         <w:t xml:space="preserve"> </w:t>
       </w:r>
       <w:r>
-        <w:t>XSL tests are available at</w:t>
+        <w:t>XS</w:t>
+      </w:r>
+      <w:r>
+        <w:t xml:space="preserve">L </w:t>
+      </w:r>
+      <w:r>
+        <w:t>tests are available at</w:t>
       </w:r>
       <w:r>
         <w:t xml:space="preserve"> </w:t>
       </w:r>
       <w:r>
-        <w:t xml:space="preserve">locations </w:t>
+        <w:t>locations</w:t>
+      </w:r>
+      <w:r>
+        <w:t>,</w:t>
+      </w:r>
+      <w:r>
+        <w:t xml:space="preserve"> </w:t>
       </w:r>
       <w:hyperlink r:id="rId11" w:history="1">
         <w:r>

</xml_diff>

<commit_message>
committing xalan-j xslt 3.0 implementation status document
</commit_message>
<xml_diff>
--- a/xalan-j/xsl3/xalanj_xslt3.0_implementation_status.docx
+++ b/xalan-j/xsl3/xalanj_xslt3.0_implementation_status.docx
@@ -18,49 +18,63 @@
           <w:bCs/>
         </w:rPr>
       </w:pPr>
-      <w:proofErr w:type="spellStart"/>
       <w:r>
         <w:rPr>
           <w:b/>
           <w:bCs/>
         </w:rPr>
-        <w:t>Xalan</w:t>
-      </w:r>
-      <w:proofErr w:type="spellEnd"/>
+        <w:t xml:space="preserve">Apache </w:t>
+      </w:r>
+      <w:proofErr w:type="spellStart"/>
       <w:r>
         <w:rPr>
           <w:b/>
           <w:bCs/>
         </w:rPr>
-        <w:t xml:space="preserve"> </w:t>
-      </w:r>
+        <w:t>Xalan</w:t>
+      </w:r>
+      <w:proofErr w:type="spellEnd"/>
       <w:r>
         <w:rPr>
           <w:b/>
           <w:bCs/>
         </w:rPr>
-        <w:t>XSLT 3</w:t>
+        <w:t xml:space="preserve"> Java,</w:t>
       </w:r>
       <w:r>
         <w:rPr>
           <w:b/>
           <w:bCs/>
         </w:rPr>
-        <w:t>.0</w:t>
+        <w:t xml:space="preserve"> </w:t>
       </w:r>
       <w:r>
         <w:rPr>
           <w:b/>
           <w:bCs/>
         </w:rPr>
-        <w:t xml:space="preserve"> </w:t>
+        <w:t>XSLT 3</w:t>
       </w:r>
       <w:r>
         <w:rPr>
           <w:b/>
           <w:bCs/>
         </w:rPr>
-        <w:t xml:space="preserve">specification </w:t>
+        <w:t>.0</w:t>
+      </w:r>
+      <w:r>
+        <w:rPr>
+          <w:b/>
+          <w:bCs/>
+        </w:rPr>
+        <w:t xml:space="preserve"> </w:t>
+      </w:r>
+      <w:r>
+        <w:rPr>
+          <w:b/>
+          <w:bCs/>
+        </w:rPr>
+        <w:t xml:space="preserve">and XPath 3.1 </w:t>
       </w:r>
       <w:r>
         <w:rPr>
@@ -109,14 +123,14 @@
           <w:color w:val="404040" w:themeColor="text1" w:themeTint="BF"/>
           <w:lang w:val="en-IN"/>
         </w:rPr>
-        <w:t xml:space="preserve">Document </w:t>
+        <w:t>L</w:t>
       </w:r>
       <w:r>
         <w:rPr>
           <w:color w:val="404040" w:themeColor="text1" w:themeTint="BF"/>
           <w:lang w:val="en-IN"/>
         </w:rPr>
-        <w:t xml:space="preserve">last </w:t>
+        <w:t xml:space="preserve">ast </w:t>
       </w:r>
       <w:r>
         <w:rPr>
@@ -137,7 +151,7 @@
           <w:color w:val="404040" w:themeColor="text1" w:themeTint="BF"/>
           <w:lang w:val="en-IN"/>
         </w:rPr>
-        <w:t>5</w:t>
+        <w:t>6</w:t>
       </w:r>
       <w:r>
         <w:rPr>
@@ -151,7 +165,7 @@
           <w:color w:val="404040" w:themeColor="text1" w:themeTint="BF"/>
           <w:lang w:val="en-IN"/>
         </w:rPr>
-        <w:t>11</w:t>
+        <w:t>01</w:t>
       </w:r>
       <w:r>
         <w:rPr>
@@ -165,7 +179,7 @@
           <w:color w:val="404040" w:themeColor="text1" w:themeTint="BF"/>
           <w:lang w:val="en-IN"/>
         </w:rPr>
-        <w:t>04</w:t>
+        <w:t>01</w:t>
       </w:r>
     </w:p>
     <w:p>
@@ -392,7 +406,6 @@
     <w:p>
       <w:pPr>
         <w:rPr>
-          <w:rFonts w:hint="eastAsia"/>
           <w:color w:val="404040" w:themeColor="text1" w:themeTint="BF"/>
           <w:lang w:val="de-DE"/>
         </w:rPr>
@@ -2540,8 +2553,21 @@
       </w:r>
       <w:proofErr w:type="spellEnd"/>
       <w:r>
-        <w:t>, fn:current-group, fn:regex-group</w:t>
-      </w:r>
+        <w:t xml:space="preserve">, </w:t>
+      </w:r>
+      <w:proofErr w:type="spellStart"/>
+      <w:r>
+        <w:t>fn:current-group</w:t>
+      </w:r>
+      <w:proofErr w:type="spellEnd"/>
+      <w:r>
+        <w:t xml:space="preserve">, </w:t>
+      </w:r>
+      <w:proofErr w:type="spellStart"/>
+      <w:r>
+        <w:t>fn:regex-group</w:t>
+      </w:r>
+      <w:proofErr w:type="spellEnd"/>
       <w:r>
         <w:t xml:space="preserve">, </w:t>
       </w:r>
@@ -2679,6 +2705,17 @@
       <w:proofErr w:type="spellStart"/>
       <w:r>
         <w:t>xsl:mode</w:t>
+      </w:r>
+      <w:proofErr w:type="spellEnd"/>
+      <w:r>
+        <w:t xml:space="preserve"> instruction</w:t>
+      </w:r>
+      <w:r>
+        <w:t xml:space="preserve">, </w:t>
+      </w:r>
+      <w:proofErr w:type="spellStart"/>
+      <w:r>
+        <w:t>xsl:perform-sort</w:t>
       </w:r>
       <w:proofErr w:type="spellEnd"/>
       <w:r>
@@ -5025,7 +5062,10 @@
         <w:t xml:space="preserve">Implementation of XPath built-in array functions namespace </w:t>
       </w:r>
       <w:r>
-        <w:t>: http://www.w3.org/2005/xpath-functions/array</w:t>
+        <w:t xml:space="preserve">: </w:t>
+      </w:r>
+      <w:r>
+        <w:t>http://www.w3.org/2005/xpath-functions/array</w:t>
       </w:r>
     </w:p>
     <w:p>
@@ -5078,6 +5118,30 @@
       </w:pPr>
       <w:proofErr w:type="spellStart"/>
       <w:r>
+        <w:t>fn:ceiling</w:t>
+      </w:r>
+      <w:proofErr w:type="spellEnd"/>
+    </w:p>
+    <w:p>
+      <w:pPr>
+        <w:rPr>
+          <w:rFonts w:hint="eastAsia"/>
+        </w:rPr>
+      </w:pPr>
+      <w:proofErr w:type="spellStart"/>
+      <w:r>
+        <w:t>fn:floor</w:t>
+      </w:r>
+      <w:proofErr w:type="spellEnd"/>
+    </w:p>
+    <w:p>
+      <w:pPr>
+        <w:rPr>
+          <w:rFonts w:hint="eastAsia"/>
+        </w:rPr>
+      </w:pPr>
+      <w:proofErr w:type="spellStart"/>
+      <w:r>
         <w:t>fn:round</w:t>
       </w:r>
       <w:proofErr w:type="spellEnd"/>
@@ -5091,6 +5155,74 @@
           <w:rFonts w:hint="eastAsia"/>
         </w:rPr>
       </w:pPr>
+      <w:proofErr w:type="spellStart"/>
+      <w:r>
+        <w:t>fn:round-half-to-even</w:t>
+      </w:r>
+      <w:proofErr w:type="spellEnd"/>
+    </w:p>
+    <w:p>
+      <w:pPr>
+        <w:rPr>
+          <w:rFonts w:hint="eastAsia"/>
+        </w:rPr>
+      </w:pPr>
+    </w:p>
+    <w:p>
+      <w:pPr>
+        <w:rPr>
+          <w:rFonts w:hint="eastAsia"/>
+          <w:lang w:val="en-IN"/>
+        </w:rPr>
+      </w:pPr>
+      <w:r>
+        <w:rPr>
+          <w:lang w:val="en-IN"/>
+        </w:rPr>
+        <w:t>Formatting integer</w:t>
+      </w:r>
+    </w:p>
+    <w:p>
+      <w:pPr>
+        <w:rPr>
+          <w:rFonts w:hint="eastAsia"/>
+          <w:lang w:val="en-IN"/>
+        </w:rPr>
+      </w:pPr>
+      <w:r>
+        <w:rPr>
+          <w:lang w:val="en-IN"/>
+        </w:rPr>
+        <w:t xml:space="preserve">     </w:t>
+      </w:r>
+      <w:r>
+        <w:rPr>
+          <w:lang w:val="en-IN"/>
+        </w:rPr>
+        <w:t xml:space="preserve"> </w:t>
+      </w:r>
+      <w:proofErr w:type="spellStart"/>
+      <w:r>
+        <w:rPr>
+          <w:lang w:val="en-IN"/>
+        </w:rPr>
+        <w:t>fn:format-integer</w:t>
+      </w:r>
+      <w:proofErr w:type="spellEnd"/>
+      <w:r>
+        <w:rPr>
+          <w:lang w:val="en-IN"/>
+        </w:rPr>
+        <w:t xml:space="preserve"> </w:t>
+      </w:r>
+    </w:p>
+    <w:p>
+      <w:pPr>
+        <w:rPr>
+          <w:rFonts w:hint="eastAsia"/>
+          <w:lang w:val="en-IN"/>
+        </w:rPr>
+      </w:pPr>
     </w:p>
     <w:p>
       <w:pPr>
@@ -5826,6 +5958,7 @@
       </w:pPr>
       <w:proofErr w:type="spellStart"/>
       <w:r>
+        <w:lastRenderedPageBreak/>
         <w:t>math:acos</w:t>
       </w:r>
       <w:proofErr w:type="spellEnd"/>
@@ -5866,21 +5999,1212 @@
         </w:rPr>
       </w:pPr>
       <w:r>
+        <w:t xml:space="preserve">8) </w:t>
+      </w:r>
+      <w:r>
+        <w:t>Random numbers</w:t>
+      </w:r>
+    </w:p>
+    <w:p>
+      <w:pPr>
+        <w:rPr>
+          <w:rFonts w:hint="eastAsia"/>
+        </w:rPr>
+      </w:pPr>
+    </w:p>
+    <w:p>
+      <w:pPr>
+        <w:rPr>
+          <w:rFonts w:hint="eastAsia"/>
+        </w:rPr>
+      </w:pPr>
+      <w:proofErr w:type="spellStart"/>
+      <w:r>
+        <w:t>fn:random-number-generator</w:t>
+      </w:r>
+      <w:proofErr w:type="spellEnd"/>
+    </w:p>
+    <w:p>
+      <w:pPr>
+        <w:rPr>
+          <w:rFonts w:hint="eastAsia"/>
+        </w:rPr>
+      </w:pPr>
+    </w:p>
+    <w:p>
+      <w:pPr>
+        <w:rPr>
+          <w:rFonts w:hint="eastAsia"/>
+        </w:rPr>
+      </w:pPr>
+      <w:r>
+        <w:t>9</w:t>
+      </w:r>
+      <w:r>
+        <w:t>)</w:t>
+      </w:r>
+      <w:r>
+        <w:t xml:space="preserve"> Component extraction functions on durations</w:t>
+      </w:r>
+    </w:p>
+    <w:p>
+      <w:pPr>
+        <w:rPr>
+          <w:rFonts w:hint="eastAsia"/>
+        </w:rPr>
+      </w:pPr>
+    </w:p>
+    <w:p>
+      <w:pPr>
+        <w:rPr>
+          <w:rFonts w:hint="eastAsia"/>
+        </w:rPr>
+      </w:pPr>
+      <w:proofErr w:type="spellStart"/>
+      <w:r>
+        <w:t>fn:years-from-duration</w:t>
+      </w:r>
+      <w:proofErr w:type="spellEnd"/>
+    </w:p>
+    <w:p>
+      <w:pPr>
+        <w:rPr>
+          <w:rFonts w:hint="eastAsia"/>
+        </w:rPr>
+      </w:pPr>
+      <w:proofErr w:type="spellStart"/>
+      <w:r>
+        <w:t>fn:months-from-duration</w:t>
+      </w:r>
+      <w:proofErr w:type="spellEnd"/>
+    </w:p>
+    <w:p>
+      <w:pPr>
+        <w:rPr>
+          <w:rFonts w:hint="eastAsia"/>
+        </w:rPr>
+      </w:pPr>
+      <w:proofErr w:type="spellStart"/>
+      <w:r>
+        <w:t>fn:days-from-duration</w:t>
+      </w:r>
+      <w:proofErr w:type="spellEnd"/>
+    </w:p>
+    <w:p>
+      <w:pPr>
+        <w:rPr>
+          <w:rFonts w:hint="eastAsia"/>
+        </w:rPr>
+      </w:pPr>
+      <w:proofErr w:type="spellStart"/>
+      <w:r>
+        <w:t>fn:hours-from-duration</w:t>
+      </w:r>
+      <w:proofErr w:type="spellEnd"/>
+    </w:p>
+    <w:p>
+      <w:pPr>
+        <w:rPr>
+          <w:rFonts w:hint="eastAsia"/>
+        </w:rPr>
+      </w:pPr>
+      <w:proofErr w:type="spellStart"/>
+      <w:r>
+        <w:t>fn:minutes-from-duration</w:t>
+      </w:r>
+      <w:proofErr w:type="spellEnd"/>
+    </w:p>
+    <w:p>
+      <w:pPr>
+        <w:rPr>
+          <w:rFonts w:hint="eastAsia"/>
+        </w:rPr>
+      </w:pPr>
+      <w:proofErr w:type="spellStart"/>
+      <w:r>
+        <w:t>fn:seconds-from-duration</w:t>
+      </w:r>
+      <w:proofErr w:type="spellEnd"/>
+    </w:p>
+    <w:p>
+      <w:pPr>
+        <w:rPr>
+          <w:rFonts w:hint="eastAsia"/>
+        </w:rPr>
+      </w:pPr>
+    </w:p>
+    <w:p>
+      <w:pPr>
+        <w:rPr>
+          <w:rFonts w:hint="eastAsia"/>
+        </w:rPr>
+      </w:pPr>
+      <w:r>
+        <w:t>10</w:t>
+      </w:r>
+      <w:r>
+        <w:t>)</w:t>
+      </w:r>
+      <w:r>
+        <w:t xml:space="preserve"> Constructing </w:t>
+      </w:r>
+      <w:proofErr w:type="spellStart"/>
+      <w:r>
+        <w:t>xs:dateTime</w:t>
+      </w:r>
+      <w:proofErr w:type="spellEnd"/>
+      <w:r>
+        <w:t xml:space="preserve"> value</w:t>
+      </w:r>
+    </w:p>
+    <w:p>
+      <w:pPr>
+        <w:rPr>
+          <w:rFonts w:hint="eastAsia"/>
+        </w:rPr>
+      </w:pPr>
+    </w:p>
+    <w:p>
+      <w:pPr>
+        <w:rPr>
+          <w:rFonts w:hint="eastAsia"/>
+        </w:rPr>
+      </w:pPr>
+      <w:proofErr w:type="spellStart"/>
+      <w:r>
+        <w:rPr>
+          <w:rFonts w:hint="eastAsia"/>
+        </w:rPr>
+        <w:t>fn:dateTime</w:t>
+      </w:r>
+      <w:proofErr w:type="spellEnd"/>
+    </w:p>
+    <w:p>
+      <w:pPr>
+        <w:rPr>
+          <w:rFonts w:hint="eastAsia"/>
+        </w:rPr>
+      </w:pPr>
+    </w:p>
+    <w:p>
+      <w:pPr>
+        <w:rPr>
+          <w:rFonts w:hint="eastAsia"/>
+        </w:rPr>
+      </w:pPr>
+      <w:r>
+        <w:t>1</w:t>
+      </w:r>
+      <w:r>
+        <w:t>1</w:t>
+      </w:r>
+      <w:r>
+        <w:t>)</w:t>
+      </w:r>
+      <w:r>
+        <w:t xml:space="preserve"> Component extraction functions on dates and times</w:t>
+      </w:r>
+    </w:p>
+    <w:p>
+      <w:pPr>
+        <w:rPr>
+          <w:rFonts w:hint="eastAsia"/>
+        </w:rPr>
+      </w:pPr>
+    </w:p>
+    <w:p>
+      <w:pPr>
+        <w:rPr>
+          <w:rFonts w:hint="eastAsia"/>
+        </w:rPr>
+      </w:pPr>
+      <w:proofErr w:type="spellStart"/>
+      <w:r>
+        <w:rPr>
+          <w:rFonts w:hint="eastAsia"/>
+        </w:rPr>
+        <w:t>fn:year-from-dateTime</w:t>
+      </w:r>
+      <w:proofErr w:type="spellEnd"/>
+    </w:p>
+    <w:p>
+      <w:pPr>
+        <w:rPr>
+          <w:rFonts w:hint="eastAsia"/>
+        </w:rPr>
+      </w:pPr>
+      <w:proofErr w:type="spellStart"/>
+      <w:r>
+        <w:rPr>
+          <w:rFonts w:hint="eastAsia"/>
+        </w:rPr>
+        <w:t>fn:month-from-dateTime</w:t>
+      </w:r>
+      <w:proofErr w:type="spellEnd"/>
+    </w:p>
+    <w:p>
+      <w:pPr>
+        <w:rPr>
+          <w:rFonts w:hint="eastAsia"/>
+        </w:rPr>
+      </w:pPr>
+      <w:proofErr w:type="spellStart"/>
+      <w:r>
+        <w:rPr>
+          <w:rFonts w:hint="eastAsia"/>
+        </w:rPr>
+        <w:t>fn:day-from-dateTime</w:t>
+      </w:r>
+      <w:proofErr w:type="spellEnd"/>
+    </w:p>
+    <w:p>
+      <w:pPr>
+        <w:rPr>
+          <w:rFonts w:hint="eastAsia"/>
+        </w:rPr>
+      </w:pPr>
+      <w:proofErr w:type="spellStart"/>
+      <w:r>
+        <w:rPr>
+          <w:rFonts w:hint="eastAsia"/>
+        </w:rPr>
+        <w:t>fn:hours-from-dateTime</w:t>
+      </w:r>
+      <w:proofErr w:type="spellEnd"/>
+    </w:p>
+    <w:p>
+      <w:pPr>
+        <w:rPr>
+          <w:rFonts w:hint="eastAsia"/>
+        </w:rPr>
+      </w:pPr>
+      <w:proofErr w:type="spellStart"/>
+      <w:r>
+        <w:rPr>
+          <w:rFonts w:hint="eastAsia"/>
+        </w:rPr>
+        <w:t>fn:minutes-from-dateTime</w:t>
+      </w:r>
+      <w:proofErr w:type="spellEnd"/>
+    </w:p>
+    <w:p>
+      <w:pPr>
+        <w:rPr>
+          <w:rFonts w:hint="eastAsia"/>
+        </w:rPr>
+      </w:pPr>
+      <w:proofErr w:type="spellStart"/>
+      <w:r>
+        <w:rPr>
+          <w:rFonts w:hint="eastAsia"/>
+        </w:rPr>
+        <w:t>fn:seconds-from-dateTime</w:t>
+      </w:r>
+      <w:proofErr w:type="spellEnd"/>
+    </w:p>
+    <w:p>
+      <w:pPr>
+        <w:rPr>
+          <w:rFonts w:hint="eastAsia"/>
+        </w:rPr>
+      </w:pPr>
+      <w:proofErr w:type="spellStart"/>
+      <w:r>
+        <w:rPr>
+          <w:rFonts w:hint="eastAsia"/>
+        </w:rPr>
+        <w:t>fn:timezone-from-dateTime</w:t>
+      </w:r>
+      <w:proofErr w:type="spellEnd"/>
+    </w:p>
+    <w:p>
+      <w:pPr>
+        <w:rPr>
+          <w:rFonts w:hint="eastAsia"/>
+        </w:rPr>
+      </w:pPr>
+      <w:proofErr w:type="spellStart"/>
+      <w:r>
+        <w:rPr>
+          <w:rFonts w:hint="eastAsia"/>
+        </w:rPr>
+        <w:t>fn:year-from-date</w:t>
+      </w:r>
+      <w:proofErr w:type="spellEnd"/>
+    </w:p>
+    <w:p>
+      <w:pPr>
+        <w:rPr>
+          <w:rFonts w:hint="eastAsia"/>
+        </w:rPr>
+      </w:pPr>
+      <w:proofErr w:type="spellStart"/>
+      <w:r>
+        <w:rPr>
+          <w:rFonts w:hint="eastAsia"/>
+        </w:rPr>
+        <w:t>fn:month-from-date</w:t>
+      </w:r>
+      <w:proofErr w:type="spellEnd"/>
+    </w:p>
+    <w:p>
+      <w:pPr>
+        <w:rPr>
+          <w:rFonts w:hint="eastAsia"/>
+        </w:rPr>
+      </w:pPr>
+      <w:proofErr w:type="spellStart"/>
+      <w:r>
+        <w:rPr>
+          <w:rFonts w:hint="eastAsia"/>
+        </w:rPr>
+        <w:t>fn:day-from-date</w:t>
+      </w:r>
+      <w:proofErr w:type="spellEnd"/>
+    </w:p>
+    <w:p>
+      <w:pPr>
+        <w:rPr>
+          <w:rFonts w:hint="eastAsia"/>
+        </w:rPr>
+      </w:pPr>
+      <w:proofErr w:type="spellStart"/>
+      <w:r>
+        <w:rPr>
+          <w:rFonts w:hint="eastAsia"/>
+        </w:rPr>
+        <w:t>fn:timezone-from-date</w:t>
+      </w:r>
+      <w:proofErr w:type="spellEnd"/>
+    </w:p>
+    <w:p>
+      <w:pPr>
+        <w:rPr>
+          <w:rFonts w:hint="eastAsia"/>
+        </w:rPr>
+      </w:pPr>
+      <w:proofErr w:type="spellStart"/>
+      <w:r>
+        <w:rPr>
+          <w:rFonts w:hint="eastAsia"/>
+        </w:rPr>
+        <w:t>fn:hours-from-time</w:t>
+      </w:r>
+      <w:proofErr w:type="spellEnd"/>
+    </w:p>
+    <w:p>
+      <w:pPr>
+        <w:rPr>
+          <w:rFonts w:hint="eastAsia"/>
+        </w:rPr>
+      </w:pPr>
+      <w:proofErr w:type="spellStart"/>
+      <w:r>
+        <w:rPr>
+          <w:rFonts w:hint="eastAsia"/>
+        </w:rPr>
+        <w:t>fn:minutes-from-time</w:t>
+      </w:r>
+      <w:proofErr w:type="spellEnd"/>
+    </w:p>
+    <w:p>
+      <w:pPr>
+        <w:rPr>
+          <w:rFonts w:hint="eastAsia"/>
+        </w:rPr>
+      </w:pPr>
+      <w:proofErr w:type="spellStart"/>
+      <w:r>
+        <w:rPr>
+          <w:rFonts w:hint="eastAsia"/>
+        </w:rPr>
+        <w:t>fn:seconds-from-time</w:t>
+      </w:r>
+      <w:proofErr w:type="spellEnd"/>
+    </w:p>
+    <w:p>
+      <w:pPr>
+        <w:rPr>
+          <w:rFonts w:hint="eastAsia"/>
+        </w:rPr>
+      </w:pPr>
+      <w:proofErr w:type="spellStart"/>
+      <w:r>
+        <w:rPr>
+          <w:rFonts w:hint="eastAsia"/>
+        </w:rPr>
+        <w:t>fn:timezone-from-time</w:t>
+      </w:r>
+      <w:proofErr w:type="spellEnd"/>
+    </w:p>
+    <w:p>
+      <w:pPr>
+        <w:rPr>
+          <w:rFonts w:hint="eastAsia"/>
+        </w:rPr>
+      </w:pPr>
+    </w:p>
+    <w:p>
+      <w:pPr>
+        <w:pStyle w:val="ListParagraph"/>
+        <w:numPr>
+          <w:ilvl w:val="0"/>
+          <w:numId w:val="2"/>
+        </w:numPr>
+        <w:ind w:left="360"/>
+        <w:rPr>
+          <w:rFonts w:hint="eastAsia"/>
+        </w:rPr>
+      </w:pPr>
+      <w:proofErr w:type="spellStart"/>
+      <w:r>
+        <w:rPr>
+          <w:rFonts w:hint="eastAsia"/>
+        </w:rPr>
+        <w:t>Timezone</w:t>
+      </w:r>
+      <w:proofErr w:type="spellEnd"/>
+      <w:r>
+        <w:rPr>
+          <w:rFonts w:hint="eastAsia"/>
+        </w:rPr>
+        <w:t xml:space="preserve"> adjustment functions on dates and time values</w:t>
+      </w:r>
+    </w:p>
+    <w:p>
+      <w:pPr>
+        <w:rPr>
+          <w:rFonts w:hint="eastAsia"/>
+        </w:rPr>
+      </w:pPr>
+    </w:p>
+    <w:p>
+      <w:pPr>
+        <w:rPr>
+          <w:rFonts w:hint="eastAsia"/>
+        </w:rPr>
+      </w:pPr>
+      <w:proofErr w:type="spellStart"/>
+      <w:r>
+        <w:rPr>
+          <w:rFonts w:hint="eastAsia"/>
+        </w:rPr>
+        <w:t>fn:adjust-dateTime-to-timezone</w:t>
+      </w:r>
+      <w:proofErr w:type="spellEnd"/>
+    </w:p>
+    <w:p>
+      <w:pPr>
+        <w:rPr>
+          <w:rFonts w:hint="eastAsia"/>
+        </w:rPr>
+      </w:pPr>
+      <w:proofErr w:type="spellStart"/>
+      <w:r>
+        <w:rPr>
+          <w:rFonts w:hint="eastAsia"/>
+        </w:rPr>
+        <w:t>fn:adjust-date-to-timezone</w:t>
+      </w:r>
+      <w:proofErr w:type="spellEnd"/>
+    </w:p>
+    <w:p>
+      <w:pPr>
+        <w:rPr>
+          <w:rFonts w:hint="eastAsia"/>
+        </w:rPr>
+      </w:pPr>
+      <w:proofErr w:type="spellStart"/>
+      <w:r>
+        <w:rPr>
+          <w:rFonts w:hint="eastAsia"/>
+        </w:rPr>
+        <w:t>fn:adjust-time-to-timezone</w:t>
+      </w:r>
+      <w:proofErr w:type="spellEnd"/>
+    </w:p>
+    <w:p>
+      <w:pPr>
+        <w:rPr>
+          <w:rFonts w:hint="eastAsia"/>
+        </w:rPr>
+      </w:pPr>
+    </w:p>
+    <w:p>
+      <w:pPr>
+        <w:rPr>
+          <w:rFonts w:hint="eastAsia"/>
+        </w:rPr>
+      </w:pPr>
+      <w:r>
+        <w:t>1</w:t>
+      </w:r>
+      <w:r>
+        <w:t>3</w:t>
+      </w:r>
+      <w:r>
+        <w:t>)</w:t>
+      </w:r>
+      <w:r>
+        <w:t xml:space="preserve"> </w:t>
+      </w:r>
+      <w:r>
+        <w:t>Built-in</w:t>
+      </w:r>
+      <w:r>
+        <w:t xml:space="preserve"> higher-order functions</w:t>
+      </w:r>
+    </w:p>
+    <w:p>
+      <w:pPr>
+        <w:rPr>
+          <w:rFonts w:hint="eastAsia"/>
+        </w:rPr>
+      </w:pPr>
+    </w:p>
+    <w:p>
+      <w:pPr>
+        <w:rPr>
+          <w:rFonts w:hint="eastAsia"/>
+        </w:rPr>
+      </w:pPr>
+      <w:proofErr w:type="spellStart"/>
+      <w:r>
+        <w:t>fn:for-each</w:t>
+      </w:r>
+      <w:proofErr w:type="spellEnd"/>
+    </w:p>
+    <w:p>
+      <w:pPr>
+        <w:rPr>
+          <w:rFonts w:hint="eastAsia"/>
+        </w:rPr>
+      </w:pPr>
+      <w:proofErr w:type="spellStart"/>
+      <w:r>
+        <w:t>fn:filter</w:t>
+      </w:r>
+      <w:proofErr w:type="spellEnd"/>
+    </w:p>
+    <w:p>
+      <w:pPr>
+        <w:rPr>
+          <w:rFonts w:hint="eastAsia"/>
+        </w:rPr>
+      </w:pPr>
+      <w:proofErr w:type="spellStart"/>
+      <w:r>
+        <w:lastRenderedPageBreak/>
+        <w:t>fn:fold-left</w:t>
+      </w:r>
+      <w:proofErr w:type="spellEnd"/>
+    </w:p>
+    <w:p>
+      <w:pPr>
+        <w:rPr>
+          <w:rFonts w:hint="eastAsia"/>
+        </w:rPr>
+      </w:pPr>
+      <w:proofErr w:type="spellStart"/>
+      <w:r>
+        <w:t>fn:fold-right</w:t>
+      </w:r>
+      <w:proofErr w:type="spellEnd"/>
+    </w:p>
+    <w:p>
+      <w:pPr>
+        <w:rPr>
+          <w:rFonts w:hint="eastAsia"/>
+        </w:rPr>
+      </w:pPr>
+      <w:proofErr w:type="spellStart"/>
+      <w:r>
+        <w:t>fn:for-each-pair</w:t>
+      </w:r>
+      <w:proofErr w:type="spellEnd"/>
+    </w:p>
+    <w:p>
+      <w:pPr>
+        <w:rPr>
+          <w:rFonts w:hint="eastAsia"/>
+        </w:rPr>
+      </w:pPr>
+      <w:proofErr w:type="spellStart"/>
+      <w:r>
+        <w:t>fn:sort</w:t>
+      </w:r>
+      <w:proofErr w:type="spellEnd"/>
+      <w:r>
+        <w:t xml:space="preserve">                            (with support for collation argument)</w:t>
+      </w:r>
+    </w:p>
+    <w:p>
+      <w:pPr>
+        <w:rPr>
+          <w:rFonts w:hint="eastAsia"/>
+        </w:rPr>
+      </w:pPr>
+      <w:proofErr w:type="spellStart"/>
+      <w:r>
+        <w:t>fn:apply</w:t>
+      </w:r>
+      <w:proofErr w:type="spellEnd"/>
+    </w:p>
+    <w:p>
+      <w:pPr>
+        <w:rPr>
+          <w:rFonts w:hint="eastAsia"/>
+        </w:rPr>
+      </w:pPr>
+    </w:p>
+    <w:p>
+      <w:pPr>
+        <w:rPr>
+          <w:rFonts w:hint="eastAsia"/>
+        </w:rPr>
+      </w:pPr>
+      <w:r>
+        <w:t>D</w:t>
+      </w:r>
+      <w:r>
+        <w:t>ynamic loading and execution</w:t>
+      </w:r>
+      <w:r>
+        <w:t>, of XSLT stylesheets:</w:t>
+      </w:r>
+    </w:p>
+    <w:p>
+      <w:pPr>
+        <w:rPr>
+          <w:rFonts w:hint="eastAsia"/>
+        </w:rPr>
+      </w:pPr>
+      <w:proofErr w:type="spellStart"/>
+      <w:r>
+        <w:t>fn:transform</w:t>
+      </w:r>
+      <w:proofErr w:type="spellEnd"/>
+    </w:p>
+    <w:p>
+      <w:pPr>
+        <w:rPr>
+          <w:rFonts w:hint="eastAsia"/>
+        </w:rPr>
+      </w:pPr>
+    </w:p>
+    <w:p>
+      <w:pPr>
+        <w:rPr>
+          <w:rFonts w:hint="eastAsia"/>
+        </w:rPr>
+      </w:pPr>
+      <w:r>
+        <w:t>1</w:t>
+      </w:r>
+      <w:r>
+        <w:t>4</w:t>
+      </w:r>
+      <w:r>
+        <w:t>)</w:t>
+      </w:r>
+      <w:r>
+        <w:t xml:space="preserve"> Functions on sequences</w:t>
+      </w:r>
+    </w:p>
+    <w:p>
+      <w:pPr>
+        <w:rPr>
+          <w:rFonts w:hint="eastAsia"/>
+        </w:rPr>
+      </w:pPr>
+    </w:p>
+    <w:p>
+      <w:pPr>
+        <w:ind w:firstLine="270"/>
+        <w:rPr>
+          <w:rFonts w:hint="eastAsia"/>
+        </w:rPr>
+      </w:pPr>
+      <w:r>
+        <w:t>1</w:t>
+      </w:r>
+      <w:r>
+        <w:t>4</w:t>
+      </w:r>
+      <w:r>
+        <w:t>.1</w:t>
+      </w:r>
+      <w:r>
+        <w:t xml:space="preserve"> </w:t>
+      </w:r>
+      <w:r>
+        <w:t>General functions on sequences</w:t>
+      </w:r>
+    </w:p>
+    <w:p>
+      <w:pPr>
+        <w:ind w:firstLine="270"/>
+        <w:rPr>
+          <w:rFonts w:hint="eastAsia"/>
+        </w:rPr>
+      </w:pPr>
+      <w:proofErr w:type="spellStart"/>
+      <w:r>
+        <w:t>fn:empty</w:t>
+      </w:r>
+      <w:proofErr w:type="spellEnd"/>
+    </w:p>
+    <w:p>
+      <w:pPr>
+        <w:ind w:firstLine="270"/>
+        <w:rPr>
+          <w:rFonts w:hint="eastAsia"/>
+        </w:rPr>
+      </w:pPr>
+      <w:proofErr w:type="spellStart"/>
+      <w:r>
+        <w:t>fn:exists</w:t>
+      </w:r>
+      <w:proofErr w:type="spellEnd"/>
+    </w:p>
+    <w:p>
+      <w:pPr>
+        <w:ind w:firstLine="270"/>
+        <w:rPr>
+          <w:rFonts w:hint="eastAsia"/>
+        </w:rPr>
+      </w:pPr>
+      <w:proofErr w:type="spellStart"/>
+      <w:r>
+        <w:t>fn:head</w:t>
+      </w:r>
+      <w:proofErr w:type="spellEnd"/>
+    </w:p>
+    <w:p>
+      <w:pPr>
+        <w:ind w:firstLine="270"/>
+        <w:rPr>
+          <w:rFonts w:hint="eastAsia"/>
+        </w:rPr>
+      </w:pPr>
+      <w:proofErr w:type="spellStart"/>
+      <w:r>
+        <w:t>fn:tail</w:t>
+      </w:r>
+      <w:proofErr w:type="spellEnd"/>
+    </w:p>
+    <w:p>
+      <w:pPr>
+        <w:ind w:firstLine="270"/>
+        <w:rPr>
+          <w:rFonts w:hint="eastAsia"/>
+        </w:rPr>
+      </w:pPr>
+      <w:proofErr w:type="spellStart"/>
+      <w:r>
+        <w:t>fn:insert-before</w:t>
+      </w:r>
+      <w:proofErr w:type="spellEnd"/>
+    </w:p>
+    <w:p>
+      <w:pPr>
+        <w:ind w:firstLine="270"/>
+        <w:rPr>
+          <w:rFonts w:hint="eastAsia"/>
+        </w:rPr>
+      </w:pPr>
+      <w:proofErr w:type="spellStart"/>
+      <w:r>
+        <w:t>fn:remove</w:t>
+      </w:r>
+      <w:proofErr w:type="spellEnd"/>
+    </w:p>
+    <w:p>
+      <w:pPr>
+        <w:ind w:firstLine="270"/>
+        <w:rPr>
+          <w:rFonts w:hint="eastAsia"/>
+        </w:rPr>
+      </w:pPr>
+      <w:proofErr w:type="spellStart"/>
+      <w:r>
+        <w:t>fn:reverse</w:t>
+      </w:r>
+      <w:proofErr w:type="spellEnd"/>
+    </w:p>
+    <w:p>
+      <w:pPr>
+        <w:ind w:firstLine="270"/>
+        <w:rPr>
+          <w:rFonts w:hint="eastAsia"/>
+        </w:rPr>
+      </w:pPr>
+      <w:proofErr w:type="spellStart"/>
+      <w:r>
+        <w:t>fn:subsequence</w:t>
+      </w:r>
+      <w:proofErr w:type="spellEnd"/>
+    </w:p>
+    <w:p>
+      <w:pPr>
+        <w:ind w:firstLine="270"/>
+        <w:rPr>
+          <w:rFonts w:hint="eastAsia"/>
+        </w:rPr>
+      </w:pPr>
+      <w:proofErr w:type="spellStart"/>
+      <w:r>
+        <w:t>fn:unordered</w:t>
+      </w:r>
+      <w:proofErr w:type="spellEnd"/>
+    </w:p>
+    <w:p>
+      <w:pPr>
+        <w:ind w:firstLine="270"/>
+        <w:rPr>
+          <w:rFonts w:hint="eastAsia"/>
+        </w:rPr>
+      </w:pPr>
+    </w:p>
+    <w:p>
+      <w:pPr>
+        <w:ind w:left="270"/>
+        <w:rPr>
+          <w:rFonts w:hint="eastAsia"/>
+        </w:rPr>
+      </w:pPr>
+      <w:r>
+        <w:t>1</w:t>
+      </w:r>
+      <w:r>
+        <w:t>4</w:t>
+      </w:r>
+      <w:r>
+        <w:t>.2</w:t>
+      </w:r>
+      <w:r>
+        <w:t xml:space="preserve"> </w:t>
+      </w:r>
+      <w:r>
+        <w:t>Aggregate functions</w:t>
+      </w:r>
+    </w:p>
+    <w:p>
+      <w:pPr>
+        <w:ind w:left="270"/>
+        <w:rPr>
+          <w:rFonts w:hint="eastAsia"/>
+        </w:rPr>
+      </w:pPr>
+      <w:proofErr w:type="spellStart"/>
+      <w:r>
+        <w:t>fn:avg</w:t>
+      </w:r>
+      <w:proofErr w:type="spellEnd"/>
+    </w:p>
+    <w:p>
+      <w:pPr>
+        <w:ind w:left="270"/>
+        <w:rPr>
+          <w:rFonts w:hint="eastAsia"/>
+        </w:rPr>
+      </w:pPr>
+      <w:proofErr w:type="spellStart"/>
+      <w:r>
+        <w:t>fn:max</w:t>
+      </w:r>
+      <w:proofErr w:type="spellEnd"/>
+    </w:p>
+    <w:p>
+      <w:pPr>
+        <w:ind w:left="270"/>
+        <w:rPr>
+          <w:rFonts w:hint="eastAsia"/>
+        </w:rPr>
+      </w:pPr>
+      <w:proofErr w:type="spellStart"/>
+      <w:r>
+        <w:t>fn:min</w:t>
+      </w:r>
+      <w:proofErr w:type="spellEnd"/>
+    </w:p>
+    <w:p>
+      <w:pPr>
+        <w:rPr>
+          <w:rFonts w:hint="eastAsia"/>
+        </w:rPr>
+      </w:pPr>
+    </w:p>
+    <w:p>
+      <w:pPr>
+        <w:rPr>
+          <w:rFonts w:hint="eastAsia"/>
+        </w:rPr>
+      </w:pPr>
+      <w:r>
+        <w:t>1</w:t>
+      </w:r>
+      <w:r>
+        <w:t>5</w:t>
+      </w:r>
+      <w:r>
+        <w:t>)</w:t>
+      </w:r>
+      <w:r>
+        <w:t xml:space="preserve"> Parsing and serializing</w:t>
+      </w:r>
+    </w:p>
+    <w:p>
+      <w:pPr>
+        <w:rPr>
+          <w:rFonts w:hint="eastAsia"/>
+        </w:rPr>
+      </w:pPr>
+    </w:p>
+    <w:p>
+      <w:pPr>
+        <w:rPr>
+          <w:rFonts w:hint="eastAsia"/>
+        </w:rPr>
+      </w:pPr>
+      <w:proofErr w:type="spellStart"/>
+      <w:r>
+        <w:t>fn:parse-xml</w:t>
+      </w:r>
+      <w:proofErr w:type="spellEnd"/>
+    </w:p>
+    <w:p>
+      <w:pPr>
+        <w:rPr>
+          <w:rFonts w:hint="eastAsia"/>
+        </w:rPr>
+      </w:pPr>
+      <w:proofErr w:type="spellStart"/>
+      <w:r>
+        <w:t>fn:parse-xml-fragment</w:t>
+      </w:r>
+      <w:proofErr w:type="spellEnd"/>
+    </w:p>
+    <w:p>
+      <w:pPr>
+        <w:rPr>
+          <w:rFonts w:hint="eastAsia"/>
+        </w:rPr>
+      </w:pPr>
+    </w:p>
+    <w:p>
+      <w:pPr>
+        <w:rPr>
+          <w:rFonts w:hint="eastAsia"/>
+        </w:rPr>
+      </w:pPr>
+      <w:r>
+        <w:t>1</w:t>
+      </w:r>
+      <w:r>
+        <w:t>6</w:t>
+      </w:r>
+      <w:r>
+        <w:t>)</w:t>
+      </w:r>
+      <w:r>
+        <w:t xml:space="preserve"> Accessors</w:t>
+      </w:r>
+    </w:p>
+    <w:p>
+      <w:pPr>
+        <w:rPr>
+          <w:rFonts w:hint="eastAsia"/>
+        </w:rPr>
+      </w:pPr>
+    </w:p>
+    <w:p>
+      <w:pPr>
+        <w:rPr>
+          <w:rFonts w:hint="eastAsia"/>
+        </w:rPr>
+      </w:pPr>
+      <w:proofErr w:type="spellStart"/>
+      <w:r>
+        <w:t>fn:node-name</w:t>
+      </w:r>
+      <w:proofErr w:type="spellEnd"/>
+    </w:p>
+    <w:p>
+      <w:pPr>
+        <w:rPr>
+          <w:rFonts w:hint="eastAsia"/>
+        </w:rPr>
+      </w:pPr>
+      <w:proofErr w:type="spellStart"/>
+      <w:r>
+        <w:t>fn:string</w:t>
+      </w:r>
+      <w:proofErr w:type="spellEnd"/>
+    </w:p>
+    <w:p>
+      <w:pPr>
+        <w:rPr>
+          <w:rFonts w:hint="eastAsia"/>
+        </w:rPr>
+      </w:pPr>
+      <w:proofErr w:type="spellStart"/>
+      <w:r>
+        <w:t>fn:data</w:t>
+      </w:r>
+      <w:proofErr w:type="spellEnd"/>
+    </w:p>
+    <w:p>
+      <w:pPr>
+        <w:rPr>
+          <w:rFonts w:hint="eastAsia"/>
+        </w:rPr>
+      </w:pPr>
+      <w:proofErr w:type="spellStart"/>
+      <w:r>
+        <w:t>fn:base-uri</w:t>
+      </w:r>
+      <w:proofErr w:type="spellEnd"/>
+    </w:p>
+    <w:p>
+      <w:pPr>
+        <w:rPr>
+          <w:rFonts w:hint="eastAsia"/>
+        </w:rPr>
+      </w:pPr>
+      <w:proofErr w:type="spellStart"/>
+      <w:r>
+        <w:t>fn:document-uri</w:t>
+      </w:r>
+      <w:proofErr w:type="spellEnd"/>
+    </w:p>
+    <w:p>
+      <w:pPr>
+        <w:rPr>
+          <w:rFonts w:hint="eastAsia"/>
+        </w:rPr>
+      </w:pPr>
+    </w:p>
+    <w:p>
+      <w:pPr>
+        <w:rPr>
+          <w:rFonts w:hint="eastAsia"/>
+        </w:rPr>
+      </w:pPr>
+      <w:r>
+        <w:t>1</w:t>
+      </w:r>
+      <w:r>
+        <w:t>7</w:t>
+      </w:r>
+      <w:r>
+        <w:t xml:space="preserve">) </w:t>
+      </w:r>
+      <w:r>
+        <w:rPr>
+          <w:rFonts w:hint="eastAsia"/>
+        </w:rPr>
+        <w:t xml:space="preserve">Functions related to </w:t>
+      </w:r>
+      <w:proofErr w:type="spellStart"/>
+      <w:r>
+        <w:rPr>
+          <w:rFonts w:hint="eastAsia"/>
+        </w:rPr>
+        <w:t>QNames</w:t>
+      </w:r>
+      <w:proofErr w:type="spellEnd"/>
+    </w:p>
+    <w:p>
+      <w:pPr>
+        <w:rPr>
+          <w:rFonts w:hint="eastAsia"/>
+        </w:rPr>
+      </w:pPr>
+    </w:p>
+    <w:p>
+      <w:pPr>
+        <w:rPr>
+          <w:rFonts w:hint="eastAsia"/>
+        </w:rPr>
+      </w:pPr>
+      <w:proofErr w:type="spellStart"/>
+      <w:r>
+        <w:rPr>
+          <w:rFonts w:hint="eastAsia"/>
+        </w:rPr>
+        <w:t>fn:resolve-QName</w:t>
+      </w:r>
+      <w:proofErr w:type="spellEnd"/>
+    </w:p>
+    <w:p>
+      <w:pPr>
+        <w:rPr>
+          <w:rFonts w:hint="eastAsia"/>
+        </w:rPr>
+      </w:pPr>
+      <w:proofErr w:type="spellStart"/>
+      <w:r>
+        <w:rPr>
+          <w:rFonts w:hint="eastAsia"/>
+        </w:rPr>
+        <w:t>fn:QName</w:t>
+      </w:r>
+      <w:proofErr w:type="spellEnd"/>
+    </w:p>
+    <w:p>
+      <w:pPr>
+        <w:rPr>
+          <w:rFonts w:hint="eastAsia"/>
+        </w:rPr>
+      </w:pPr>
+    </w:p>
+    <w:p>
+      <w:pPr>
+        <w:rPr>
+          <w:rFonts w:hint="eastAsia"/>
+        </w:rPr>
+      </w:pPr>
+      <w:r>
+        <w:t>1</w:t>
+      </w:r>
+      <w:r>
         <w:t>8</w:t>
       </w:r>
       <w:r>
-        <w:t>)</w:t>
-      </w:r>
-      <w:r>
-        <w:t xml:space="preserve"> Component extraction functions on durations</w:t>
-      </w:r>
-    </w:p>
-    <w:p>
-      <w:pPr>
-        <w:rPr>
-          <w:rFonts w:hint="eastAsia"/>
-        </w:rPr>
-      </w:pPr>
+        <w:t>) Functions related to maps</w:t>
+      </w:r>
+    </w:p>
+    <w:p>
+      <w:pPr>
+        <w:rPr>
+          <w:rFonts w:hint="eastAsia"/>
+        </w:rPr>
+      </w:pPr>
+    </w:p>
+    <w:p>
+      <w:pPr>
+        <w:rPr>
+          <w:rFonts w:hint="eastAsia"/>
+        </w:rPr>
+      </w:pPr>
+      <w:proofErr w:type="spellStart"/>
+      <w:r>
+        <w:t>map:merge</w:t>
+      </w:r>
+      <w:proofErr w:type="spellEnd"/>
+    </w:p>
+    <w:p>
+      <w:pPr>
+        <w:rPr>
+          <w:rFonts w:hint="eastAsia"/>
+        </w:rPr>
+      </w:pPr>
+      <w:proofErr w:type="spellStart"/>
+      <w:r>
+        <w:t>map:size</w:t>
+      </w:r>
+      <w:proofErr w:type="spellEnd"/>
     </w:p>
     <w:p>
       <w:pPr>
@@ -5891,1148 +7215,115 @@
       <w:proofErr w:type="spellStart"/>
       <w:r>
         <w:lastRenderedPageBreak/>
-        <w:t>fn:years-from-duration</w:t>
-      </w:r>
-      <w:proofErr w:type="spellEnd"/>
-    </w:p>
-    <w:p>
-      <w:pPr>
-        <w:rPr>
-          <w:rFonts w:hint="eastAsia"/>
-        </w:rPr>
-      </w:pPr>
-      <w:proofErr w:type="spellStart"/>
-      <w:r>
-        <w:t>fn:months-from-duration</w:t>
-      </w:r>
-      <w:proofErr w:type="spellEnd"/>
-    </w:p>
-    <w:p>
-      <w:pPr>
-        <w:rPr>
-          <w:rFonts w:hint="eastAsia"/>
-        </w:rPr>
-      </w:pPr>
-      <w:proofErr w:type="spellStart"/>
-      <w:r>
-        <w:t>fn:days-from-duration</w:t>
-      </w:r>
-      <w:proofErr w:type="spellEnd"/>
-    </w:p>
-    <w:p>
-      <w:pPr>
-        <w:rPr>
-          <w:rFonts w:hint="eastAsia"/>
-        </w:rPr>
-      </w:pPr>
-      <w:proofErr w:type="spellStart"/>
-      <w:r>
-        <w:t>fn:hours-from-duration</w:t>
-      </w:r>
-      <w:proofErr w:type="spellEnd"/>
-    </w:p>
-    <w:p>
-      <w:pPr>
-        <w:rPr>
-          <w:rFonts w:hint="eastAsia"/>
-        </w:rPr>
-      </w:pPr>
-      <w:proofErr w:type="spellStart"/>
-      <w:r>
-        <w:t>fn:minutes-from-duration</w:t>
-      </w:r>
-      <w:proofErr w:type="spellEnd"/>
-    </w:p>
-    <w:p>
-      <w:pPr>
-        <w:rPr>
-          <w:rFonts w:hint="eastAsia"/>
-        </w:rPr>
-      </w:pPr>
-      <w:proofErr w:type="spellStart"/>
-      <w:r>
-        <w:t>fn:seconds-from-duration</w:t>
-      </w:r>
-      <w:proofErr w:type="spellEnd"/>
-    </w:p>
-    <w:p>
-      <w:pPr>
-        <w:rPr>
-          <w:rFonts w:hint="eastAsia"/>
-        </w:rPr>
-      </w:pPr>
-    </w:p>
-    <w:p>
-      <w:pPr>
-        <w:rPr>
-          <w:rFonts w:hint="eastAsia"/>
-        </w:rPr>
-      </w:pPr>
+        <w:t>map:keys</w:t>
+      </w:r>
+      <w:proofErr w:type="spellEnd"/>
+    </w:p>
+    <w:p>
+      <w:pPr>
+        <w:rPr>
+          <w:rFonts w:hint="eastAsia"/>
+        </w:rPr>
+      </w:pPr>
+      <w:proofErr w:type="spellStart"/>
+      <w:r>
+        <w:t>map:contains</w:t>
+      </w:r>
+      <w:proofErr w:type="spellEnd"/>
+    </w:p>
+    <w:p>
+      <w:pPr>
+        <w:rPr>
+          <w:rFonts w:hint="eastAsia"/>
+        </w:rPr>
+      </w:pPr>
+      <w:proofErr w:type="spellStart"/>
+      <w:r>
+        <w:t>map:get</w:t>
+      </w:r>
+      <w:proofErr w:type="spellEnd"/>
+    </w:p>
+    <w:p>
+      <w:pPr>
+        <w:rPr>
+          <w:rFonts w:hint="eastAsia"/>
+        </w:rPr>
+      </w:pPr>
+      <w:proofErr w:type="spellStart"/>
+      <w:r>
+        <w:t>map:find</w:t>
+      </w:r>
+      <w:proofErr w:type="spellEnd"/>
+    </w:p>
+    <w:p>
+      <w:pPr>
+        <w:rPr>
+          <w:rFonts w:hint="eastAsia"/>
+        </w:rPr>
+      </w:pPr>
+      <w:proofErr w:type="spellStart"/>
+      <w:r>
+        <w:t>map:put</w:t>
+      </w:r>
+      <w:proofErr w:type="spellEnd"/>
+    </w:p>
+    <w:p>
+      <w:pPr>
+        <w:rPr>
+          <w:rFonts w:hint="eastAsia"/>
+        </w:rPr>
+      </w:pPr>
+      <w:proofErr w:type="spellStart"/>
+      <w:r>
+        <w:t>map:entry</w:t>
+      </w:r>
+      <w:proofErr w:type="spellEnd"/>
+    </w:p>
+    <w:p>
+      <w:pPr>
+        <w:rPr>
+          <w:rFonts w:hint="eastAsia"/>
+        </w:rPr>
+      </w:pPr>
+      <w:proofErr w:type="spellStart"/>
+      <w:r>
+        <w:t>map:remove</w:t>
+      </w:r>
+      <w:proofErr w:type="spellEnd"/>
+    </w:p>
+    <w:p>
+      <w:pPr>
+        <w:rPr>
+          <w:rFonts w:hint="eastAsia"/>
+        </w:rPr>
+      </w:pPr>
+      <w:proofErr w:type="spellStart"/>
+      <w:r>
+        <w:t>map:for-each</w:t>
+      </w:r>
+      <w:proofErr w:type="spellEnd"/>
+    </w:p>
+    <w:p>
+      <w:pPr>
+        <w:rPr>
+          <w:rFonts w:hint="eastAsia"/>
+        </w:rPr>
+      </w:pPr>
+    </w:p>
+    <w:p>
+      <w:pPr>
+        <w:rPr>
+          <w:rFonts w:hint="eastAsia"/>
+        </w:rPr>
+      </w:pPr>
+      <w:r>
+        <w:t>1</w:t>
+      </w:r>
       <w:r>
         <w:t>9</w:t>
       </w:r>
       <w:r>
-        <w:t>)</w:t>
-      </w:r>
-      <w:r>
-        <w:t xml:space="preserve"> Constructing </w:t>
-      </w:r>
-      <w:proofErr w:type="spellStart"/>
-      <w:r>
-        <w:t>xs:dateTime</w:t>
-      </w:r>
-      <w:proofErr w:type="spellEnd"/>
-      <w:r>
-        <w:t xml:space="preserve"> value</w:t>
-      </w:r>
-    </w:p>
-    <w:p>
-      <w:pPr>
-        <w:rPr>
-          <w:rFonts w:hint="eastAsia"/>
-        </w:rPr>
-      </w:pPr>
-    </w:p>
-    <w:p>
-      <w:pPr>
-        <w:rPr>
-          <w:rFonts w:hint="eastAsia"/>
-        </w:rPr>
-      </w:pPr>
-      <w:proofErr w:type="spellStart"/>
-      <w:r>
-        <w:rPr>
-          <w:rFonts w:hint="eastAsia"/>
-        </w:rPr>
-        <w:t>fn:dateTime</w:t>
-      </w:r>
-      <w:proofErr w:type="spellEnd"/>
-    </w:p>
-    <w:p>
-      <w:pPr>
-        <w:rPr>
-          <w:rFonts w:hint="eastAsia"/>
-        </w:rPr>
-      </w:pPr>
-    </w:p>
-    <w:p>
-      <w:pPr>
-        <w:rPr>
-          <w:rFonts w:hint="eastAsia"/>
-        </w:rPr>
-      </w:pPr>
-      <w:r>
-        <w:t>10</w:t>
-      </w:r>
-      <w:r>
-        <w:t>)</w:t>
-      </w:r>
-      <w:r>
-        <w:t xml:space="preserve"> Component extraction functions on dates and times</w:t>
-      </w:r>
-    </w:p>
-    <w:p>
-      <w:pPr>
-        <w:rPr>
-          <w:rFonts w:hint="eastAsia"/>
-        </w:rPr>
-      </w:pPr>
-    </w:p>
-    <w:p>
-      <w:pPr>
-        <w:rPr>
-          <w:rFonts w:hint="eastAsia"/>
-        </w:rPr>
-      </w:pPr>
-      <w:proofErr w:type="spellStart"/>
-      <w:r>
-        <w:rPr>
-          <w:rFonts w:hint="eastAsia"/>
-        </w:rPr>
-        <w:t>fn:year-from-dateTime</w:t>
-      </w:r>
-      <w:proofErr w:type="spellEnd"/>
-    </w:p>
-    <w:p>
-      <w:pPr>
-        <w:rPr>
-          <w:rFonts w:hint="eastAsia"/>
-        </w:rPr>
-      </w:pPr>
-      <w:proofErr w:type="spellStart"/>
-      <w:r>
-        <w:rPr>
-          <w:rFonts w:hint="eastAsia"/>
-        </w:rPr>
-        <w:t>fn:month-from-dateTime</w:t>
-      </w:r>
-      <w:proofErr w:type="spellEnd"/>
-    </w:p>
-    <w:p>
-      <w:pPr>
-        <w:rPr>
-          <w:rFonts w:hint="eastAsia"/>
-        </w:rPr>
-      </w:pPr>
-      <w:proofErr w:type="spellStart"/>
-      <w:r>
-        <w:rPr>
-          <w:rFonts w:hint="eastAsia"/>
-        </w:rPr>
-        <w:t>fn:day-from-dateTime</w:t>
-      </w:r>
-      <w:proofErr w:type="spellEnd"/>
-    </w:p>
-    <w:p>
-      <w:pPr>
-        <w:rPr>
-          <w:rFonts w:hint="eastAsia"/>
-        </w:rPr>
-      </w:pPr>
-      <w:proofErr w:type="spellStart"/>
-      <w:r>
-        <w:rPr>
-          <w:rFonts w:hint="eastAsia"/>
-        </w:rPr>
-        <w:t>fn:hours-from-dateTime</w:t>
-      </w:r>
-      <w:proofErr w:type="spellEnd"/>
-    </w:p>
-    <w:p>
-      <w:pPr>
-        <w:rPr>
-          <w:rFonts w:hint="eastAsia"/>
-        </w:rPr>
-      </w:pPr>
-      <w:proofErr w:type="spellStart"/>
-      <w:r>
-        <w:rPr>
-          <w:rFonts w:hint="eastAsia"/>
-        </w:rPr>
-        <w:t>fn:minutes-from-dateTime</w:t>
-      </w:r>
-      <w:proofErr w:type="spellEnd"/>
-    </w:p>
-    <w:p>
-      <w:pPr>
-        <w:rPr>
-          <w:rFonts w:hint="eastAsia"/>
-        </w:rPr>
-      </w:pPr>
-      <w:proofErr w:type="spellStart"/>
-      <w:r>
-        <w:rPr>
-          <w:rFonts w:hint="eastAsia"/>
-        </w:rPr>
-        <w:t>fn:seconds-from-dateTime</w:t>
-      </w:r>
-      <w:proofErr w:type="spellEnd"/>
-    </w:p>
-    <w:p>
-      <w:pPr>
-        <w:rPr>
-          <w:rFonts w:hint="eastAsia"/>
-        </w:rPr>
-      </w:pPr>
-      <w:proofErr w:type="spellStart"/>
-      <w:r>
-        <w:rPr>
-          <w:rFonts w:hint="eastAsia"/>
-        </w:rPr>
-        <w:t>fn:timezone-from-dateTime</w:t>
-      </w:r>
-      <w:proofErr w:type="spellEnd"/>
-    </w:p>
-    <w:p>
-      <w:pPr>
-        <w:rPr>
-          <w:rFonts w:hint="eastAsia"/>
-        </w:rPr>
-      </w:pPr>
-      <w:proofErr w:type="spellStart"/>
-      <w:r>
-        <w:rPr>
-          <w:rFonts w:hint="eastAsia"/>
-        </w:rPr>
-        <w:t>fn:year-from-date</w:t>
-      </w:r>
-      <w:proofErr w:type="spellEnd"/>
-    </w:p>
-    <w:p>
-      <w:pPr>
-        <w:rPr>
-          <w:rFonts w:hint="eastAsia"/>
-        </w:rPr>
-      </w:pPr>
-      <w:proofErr w:type="spellStart"/>
-      <w:r>
-        <w:rPr>
-          <w:rFonts w:hint="eastAsia"/>
-        </w:rPr>
-        <w:t>fn:month-from-date</w:t>
-      </w:r>
-      <w:proofErr w:type="spellEnd"/>
-    </w:p>
-    <w:p>
-      <w:pPr>
-        <w:rPr>
-          <w:rFonts w:hint="eastAsia"/>
-        </w:rPr>
-      </w:pPr>
-      <w:proofErr w:type="spellStart"/>
-      <w:r>
-        <w:rPr>
-          <w:rFonts w:hint="eastAsia"/>
-        </w:rPr>
-        <w:t>fn:day-from-date</w:t>
-      </w:r>
-      <w:proofErr w:type="spellEnd"/>
-    </w:p>
-    <w:p>
-      <w:pPr>
-        <w:rPr>
-          <w:rFonts w:hint="eastAsia"/>
-        </w:rPr>
-      </w:pPr>
-      <w:proofErr w:type="spellStart"/>
-      <w:r>
-        <w:rPr>
-          <w:rFonts w:hint="eastAsia"/>
-        </w:rPr>
-        <w:t>fn:timezone-from-date</w:t>
-      </w:r>
-      <w:proofErr w:type="spellEnd"/>
-    </w:p>
-    <w:p>
-      <w:pPr>
-        <w:rPr>
-          <w:rFonts w:hint="eastAsia"/>
-        </w:rPr>
-      </w:pPr>
-      <w:proofErr w:type="spellStart"/>
-      <w:r>
-        <w:rPr>
-          <w:rFonts w:hint="eastAsia"/>
-        </w:rPr>
-        <w:t>fn:hours-from-time</w:t>
-      </w:r>
-      <w:proofErr w:type="spellEnd"/>
-    </w:p>
-    <w:p>
-      <w:pPr>
-        <w:rPr>
-          <w:rFonts w:hint="eastAsia"/>
-        </w:rPr>
-      </w:pPr>
-      <w:proofErr w:type="spellStart"/>
-      <w:r>
-        <w:rPr>
-          <w:rFonts w:hint="eastAsia"/>
-        </w:rPr>
-        <w:t>fn:minutes-from-time</w:t>
-      </w:r>
-      <w:proofErr w:type="spellEnd"/>
-    </w:p>
-    <w:p>
-      <w:pPr>
-        <w:rPr>
-          <w:rFonts w:hint="eastAsia"/>
-        </w:rPr>
-      </w:pPr>
-      <w:proofErr w:type="spellStart"/>
-      <w:r>
-        <w:rPr>
-          <w:rFonts w:hint="eastAsia"/>
-        </w:rPr>
-        <w:t>fn:seconds-from-time</w:t>
-      </w:r>
-      <w:proofErr w:type="spellEnd"/>
-    </w:p>
-    <w:p>
-      <w:pPr>
-        <w:rPr>
-          <w:rFonts w:hint="eastAsia"/>
-        </w:rPr>
-      </w:pPr>
-      <w:proofErr w:type="spellStart"/>
-      <w:r>
-        <w:rPr>
-          <w:rFonts w:hint="eastAsia"/>
-        </w:rPr>
-        <w:t>fn:timezone-from-time</w:t>
-      </w:r>
-      <w:proofErr w:type="spellEnd"/>
-    </w:p>
-    <w:p>
-      <w:pPr>
-        <w:rPr>
-          <w:rFonts w:hint="eastAsia"/>
-        </w:rPr>
-      </w:pPr>
-    </w:p>
-    <w:p>
-      <w:pPr>
-        <w:rPr>
-          <w:rFonts w:hint="eastAsia"/>
-        </w:rPr>
-      </w:pPr>
-      <w:r>
-        <w:t>1</w:t>
-      </w:r>
-      <w:r>
-        <w:t>1</w:t>
-      </w:r>
-      <w:r>
-        <w:t>)</w:t>
-      </w:r>
-      <w:r>
-        <w:t xml:space="preserve"> </w:t>
-      </w:r>
-      <w:r>
-        <w:t>Built-in</w:t>
-      </w:r>
-      <w:r>
-        <w:t xml:space="preserve"> higher-order functions</w:t>
-      </w:r>
-    </w:p>
-    <w:p>
-      <w:pPr>
-        <w:rPr>
-          <w:rFonts w:hint="eastAsia"/>
-        </w:rPr>
-      </w:pPr>
-    </w:p>
-    <w:p>
-      <w:pPr>
-        <w:rPr>
-          <w:rFonts w:hint="eastAsia"/>
-        </w:rPr>
-      </w:pPr>
-      <w:proofErr w:type="spellStart"/>
-      <w:r>
-        <w:t>fn:for-each</w:t>
-      </w:r>
-      <w:proofErr w:type="spellEnd"/>
-    </w:p>
-    <w:p>
-      <w:pPr>
-        <w:rPr>
-          <w:rFonts w:hint="eastAsia"/>
-        </w:rPr>
-      </w:pPr>
-      <w:proofErr w:type="spellStart"/>
-      <w:r>
-        <w:t>fn:filter</w:t>
-      </w:r>
-      <w:proofErr w:type="spellEnd"/>
-    </w:p>
-    <w:p>
-      <w:pPr>
-        <w:rPr>
-          <w:rFonts w:hint="eastAsia"/>
-        </w:rPr>
-      </w:pPr>
-      <w:proofErr w:type="spellStart"/>
-      <w:r>
-        <w:t>fn:fold-left</w:t>
-      </w:r>
-      <w:proofErr w:type="spellEnd"/>
-    </w:p>
-    <w:p>
-      <w:pPr>
-        <w:rPr>
-          <w:rFonts w:hint="eastAsia"/>
-        </w:rPr>
-      </w:pPr>
-      <w:proofErr w:type="spellStart"/>
-      <w:r>
-        <w:t>fn:fold-right</w:t>
-      </w:r>
-      <w:proofErr w:type="spellEnd"/>
-    </w:p>
-    <w:p>
-      <w:pPr>
-        <w:rPr>
-          <w:rFonts w:hint="eastAsia"/>
-        </w:rPr>
-      </w:pPr>
-      <w:proofErr w:type="spellStart"/>
-      <w:r>
-        <w:t>fn:for-each-pair</w:t>
-      </w:r>
-      <w:proofErr w:type="spellEnd"/>
-    </w:p>
-    <w:p>
-      <w:pPr>
-        <w:rPr>
-          <w:rFonts w:hint="eastAsia"/>
-        </w:rPr>
-      </w:pPr>
-      <w:proofErr w:type="spellStart"/>
-      <w:r>
-        <w:t>fn:sort</w:t>
-      </w:r>
-      <w:proofErr w:type="spellEnd"/>
-      <w:r>
-        <w:t xml:space="preserve">                            (with support for collation argument)</w:t>
-      </w:r>
-    </w:p>
-    <w:p>
-      <w:pPr>
-        <w:rPr>
-          <w:rFonts w:hint="eastAsia"/>
-        </w:rPr>
-      </w:pPr>
-      <w:proofErr w:type="spellStart"/>
-      <w:r>
-        <w:t>fn:apply</w:t>
-      </w:r>
-      <w:proofErr w:type="spellEnd"/>
-    </w:p>
-    <w:p>
-      <w:pPr>
-        <w:rPr>
-          <w:rFonts w:hint="eastAsia"/>
-        </w:rPr>
-      </w:pPr>
-    </w:p>
-    <w:p>
-      <w:pPr>
-        <w:rPr>
-          <w:rFonts w:hint="eastAsia"/>
-        </w:rPr>
-      </w:pPr>
-      <w:r>
-        <w:t>D</w:t>
-      </w:r>
-      <w:r>
-        <w:t>ynamic loading and execution</w:t>
-      </w:r>
-      <w:r>
-        <w:t>, of XSLT stylesheets:</w:t>
-      </w:r>
-    </w:p>
-    <w:p>
-      <w:pPr>
-        <w:rPr>
-          <w:rFonts w:hint="eastAsia"/>
-        </w:rPr>
-      </w:pPr>
-      <w:proofErr w:type="spellStart"/>
-      <w:r>
-        <w:t>fn:transform</w:t>
-      </w:r>
-      <w:proofErr w:type="spellEnd"/>
-    </w:p>
-    <w:p>
-      <w:pPr>
-        <w:rPr>
-          <w:rFonts w:hint="eastAsia"/>
-        </w:rPr>
-      </w:pPr>
-    </w:p>
-    <w:p>
-      <w:pPr>
-        <w:rPr>
-          <w:rFonts w:hint="eastAsia"/>
-        </w:rPr>
-      </w:pPr>
-      <w:r>
-        <w:t>1</w:t>
-      </w:r>
-      <w:r>
-        <w:t>2</w:t>
-      </w:r>
-      <w:r>
-        <w:t>)</w:t>
-      </w:r>
-      <w:r>
-        <w:t xml:space="preserve"> Functions on sequences</w:t>
-      </w:r>
-    </w:p>
-    <w:p>
-      <w:pPr>
-        <w:rPr>
-          <w:rFonts w:hint="eastAsia"/>
-        </w:rPr>
-      </w:pPr>
-    </w:p>
-    <w:p>
-      <w:pPr>
-        <w:ind w:firstLine="270"/>
-        <w:rPr>
-          <w:rFonts w:hint="eastAsia"/>
-        </w:rPr>
-      </w:pPr>
-      <w:r>
-        <w:t>12.1</w:t>
-      </w:r>
-      <w:r>
-        <w:t xml:space="preserve"> </w:t>
-      </w:r>
-      <w:r>
-        <w:t>General functions on sequences</w:t>
-      </w:r>
-    </w:p>
-    <w:p>
-      <w:pPr>
-        <w:ind w:firstLine="270"/>
-        <w:rPr>
-          <w:rFonts w:hint="eastAsia"/>
-        </w:rPr>
-      </w:pPr>
-      <w:proofErr w:type="spellStart"/>
-      <w:r>
-        <w:t>fn:empty</w:t>
-      </w:r>
-      <w:proofErr w:type="spellEnd"/>
-    </w:p>
-    <w:p>
-      <w:pPr>
-        <w:ind w:firstLine="270"/>
-        <w:rPr>
-          <w:rFonts w:hint="eastAsia"/>
-        </w:rPr>
-      </w:pPr>
-      <w:proofErr w:type="spellStart"/>
-      <w:r>
-        <w:t>fn:exists</w:t>
-      </w:r>
-      <w:proofErr w:type="spellEnd"/>
-    </w:p>
-    <w:p>
-      <w:pPr>
-        <w:ind w:firstLine="270"/>
-        <w:rPr>
-          <w:rFonts w:hint="eastAsia"/>
-        </w:rPr>
-      </w:pPr>
-      <w:proofErr w:type="spellStart"/>
-      <w:r>
-        <w:t>fn:head</w:t>
-      </w:r>
-      <w:proofErr w:type="spellEnd"/>
-    </w:p>
-    <w:p>
-      <w:pPr>
-        <w:ind w:firstLine="270"/>
-        <w:rPr>
-          <w:rFonts w:hint="eastAsia"/>
-        </w:rPr>
-      </w:pPr>
-      <w:proofErr w:type="spellStart"/>
-      <w:r>
-        <w:t>fn:tail</w:t>
-      </w:r>
-      <w:proofErr w:type="spellEnd"/>
-    </w:p>
-    <w:p>
-      <w:pPr>
-        <w:ind w:firstLine="270"/>
-        <w:rPr>
-          <w:rFonts w:hint="eastAsia"/>
-        </w:rPr>
-      </w:pPr>
-      <w:proofErr w:type="spellStart"/>
-      <w:r>
-        <w:lastRenderedPageBreak/>
-        <w:t>fn:insert-before</w:t>
-      </w:r>
-      <w:proofErr w:type="spellEnd"/>
-    </w:p>
-    <w:p>
-      <w:pPr>
-        <w:ind w:firstLine="270"/>
-        <w:rPr>
-          <w:rFonts w:hint="eastAsia"/>
-        </w:rPr>
-      </w:pPr>
-      <w:proofErr w:type="spellStart"/>
-      <w:r>
-        <w:t>fn:remove</w:t>
-      </w:r>
-      <w:proofErr w:type="spellEnd"/>
-    </w:p>
-    <w:p>
-      <w:pPr>
-        <w:ind w:firstLine="270"/>
-        <w:rPr>
-          <w:rFonts w:hint="eastAsia"/>
-        </w:rPr>
-      </w:pPr>
-      <w:proofErr w:type="spellStart"/>
-      <w:r>
-        <w:t>fn:reverse</w:t>
-      </w:r>
-      <w:proofErr w:type="spellEnd"/>
-    </w:p>
-    <w:p>
-      <w:pPr>
-        <w:ind w:firstLine="270"/>
-        <w:rPr>
-          <w:rFonts w:hint="eastAsia"/>
-        </w:rPr>
-      </w:pPr>
-      <w:proofErr w:type="spellStart"/>
-      <w:r>
-        <w:t>fn:subsequence</w:t>
-      </w:r>
-      <w:proofErr w:type="spellEnd"/>
-    </w:p>
-    <w:p>
-      <w:pPr>
-        <w:ind w:firstLine="270"/>
-        <w:rPr>
-          <w:rFonts w:hint="eastAsia"/>
-        </w:rPr>
-      </w:pPr>
-      <w:proofErr w:type="spellStart"/>
-      <w:r>
-        <w:t>fn:unordered</w:t>
-      </w:r>
-      <w:proofErr w:type="spellEnd"/>
-    </w:p>
-    <w:p>
-      <w:pPr>
-        <w:ind w:firstLine="270"/>
-        <w:rPr>
-          <w:rFonts w:hint="eastAsia"/>
-        </w:rPr>
-      </w:pPr>
-    </w:p>
-    <w:p>
-      <w:pPr>
-        <w:ind w:left="270"/>
-        <w:rPr>
-          <w:rFonts w:hint="eastAsia"/>
-        </w:rPr>
-      </w:pPr>
-      <w:r>
-        <w:t>12.2</w:t>
-      </w:r>
-      <w:r>
-        <w:t xml:space="preserve"> </w:t>
-      </w:r>
-      <w:r>
-        <w:t>Aggregate functions</w:t>
-      </w:r>
-    </w:p>
-    <w:p>
-      <w:pPr>
-        <w:ind w:left="270"/>
-        <w:rPr>
-          <w:rFonts w:hint="eastAsia"/>
-        </w:rPr>
-      </w:pPr>
-      <w:proofErr w:type="spellStart"/>
-      <w:r>
-        <w:t>fn:avg</w:t>
-      </w:r>
-      <w:proofErr w:type="spellEnd"/>
-    </w:p>
-    <w:p>
-      <w:pPr>
-        <w:ind w:left="270"/>
-        <w:rPr>
-          <w:rFonts w:hint="eastAsia"/>
-        </w:rPr>
-      </w:pPr>
-      <w:proofErr w:type="spellStart"/>
-      <w:r>
-        <w:t>fn:max</w:t>
-      </w:r>
-      <w:proofErr w:type="spellEnd"/>
-    </w:p>
-    <w:p>
-      <w:pPr>
-        <w:ind w:left="270"/>
-        <w:rPr>
-          <w:rFonts w:hint="eastAsia"/>
-        </w:rPr>
-      </w:pPr>
-      <w:proofErr w:type="spellStart"/>
-      <w:r>
-        <w:t>fn:min</w:t>
-      </w:r>
-      <w:proofErr w:type="spellEnd"/>
-    </w:p>
-    <w:p>
-      <w:pPr>
-        <w:rPr>
-          <w:rFonts w:hint="eastAsia"/>
-        </w:rPr>
-      </w:pPr>
-    </w:p>
-    <w:p>
-      <w:pPr>
-        <w:rPr>
-          <w:rFonts w:hint="eastAsia"/>
-        </w:rPr>
-      </w:pPr>
-      <w:r>
-        <w:t>1</w:t>
-      </w:r>
-      <w:r>
-        <w:t>3</w:t>
-      </w:r>
-      <w:r>
-        <w:t>)</w:t>
-      </w:r>
-      <w:r>
-        <w:t xml:space="preserve"> Parsing and serializing</w:t>
-      </w:r>
-    </w:p>
-    <w:p>
-      <w:pPr>
-        <w:rPr>
-          <w:rFonts w:hint="eastAsia"/>
-        </w:rPr>
-      </w:pPr>
-    </w:p>
-    <w:p>
-      <w:pPr>
-        <w:rPr>
-          <w:rFonts w:hint="eastAsia"/>
-        </w:rPr>
-      </w:pPr>
-      <w:proofErr w:type="spellStart"/>
-      <w:r>
-        <w:t>fn:parse-xml</w:t>
-      </w:r>
-      <w:proofErr w:type="spellEnd"/>
-    </w:p>
-    <w:p>
-      <w:pPr>
-        <w:rPr>
-          <w:rFonts w:hint="eastAsia"/>
-        </w:rPr>
-      </w:pPr>
-      <w:proofErr w:type="spellStart"/>
-      <w:r>
-        <w:t>fn:parse-xml-fragment</w:t>
-      </w:r>
-      <w:proofErr w:type="spellEnd"/>
-    </w:p>
-    <w:p>
-      <w:pPr>
-        <w:rPr>
-          <w:rFonts w:hint="eastAsia"/>
-        </w:rPr>
-      </w:pPr>
-    </w:p>
-    <w:p>
-      <w:pPr>
-        <w:rPr>
-          <w:rFonts w:hint="eastAsia"/>
-        </w:rPr>
-      </w:pPr>
-      <w:r>
-        <w:t>1</w:t>
-      </w:r>
-      <w:r>
-        <w:t>4</w:t>
-      </w:r>
-      <w:r>
-        <w:t>)</w:t>
-      </w:r>
-      <w:r>
-        <w:t xml:space="preserve"> Accessors</w:t>
-      </w:r>
-    </w:p>
-    <w:p>
-      <w:pPr>
-        <w:rPr>
-          <w:rFonts w:hint="eastAsia"/>
-        </w:rPr>
-      </w:pPr>
-    </w:p>
-    <w:p>
-      <w:pPr>
-        <w:rPr>
-          <w:rFonts w:hint="eastAsia"/>
-        </w:rPr>
-      </w:pPr>
-      <w:proofErr w:type="spellStart"/>
-      <w:r>
-        <w:t>fn:node-name</w:t>
-      </w:r>
-      <w:proofErr w:type="spellEnd"/>
-    </w:p>
-    <w:p>
-      <w:pPr>
-        <w:rPr>
-          <w:rFonts w:hint="eastAsia"/>
-        </w:rPr>
-      </w:pPr>
-      <w:proofErr w:type="spellStart"/>
-      <w:r>
-        <w:t>fn:string</w:t>
-      </w:r>
-      <w:proofErr w:type="spellEnd"/>
-    </w:p>
-    <w:p>
-      <w:pPr>
-        <w:rPr>
-          <w:rFonts w:hint="eastAsia"/>
-        </w:rPr>
-      </w:pPr>
-      <w:proofErr w:type="spellStart"/>
-      <w:r>
-        <w:t>fn:data</w:t>
-      </w:r>
-      <w:proofErr w:type="spellEnd"/>
-    </w:p>
-    <w:p>
-      <w:pPr>
-        <w:rPr>
-          <w:rFonts w:hint="eastAsia"/>
-        </w:rPr>
-      </w:pPr>
-      <w:proofErr w:type="spellStart"/>
-      <w:r>
-        <w:t>fn:base-uri</w:t>
-      </w:r>
-      <w:proofErr w:type="spellEnd"/>
-    </w:p>
-    <w:p>
-      <w:pPr>
-        <w:rPr>
-          <w:rFonts w:hint="eastAsia"/>
-        </w:rPr>
-      </w:pPr>
-      <w:proofErr w:type="spellStart"/>
-      <w:r>
-        <w:t>fn:document-uri</w:t>
-      </w:r>
-      <w:proofErr w:type="spellEnd"/>
-    </w:p>
-    <w:p>
-      <w:pPr>
-        <w:rPr>
-          <w:rFonts w:hint="eastAsia"/>
-        </w:rPr>
-      </w:pPr>
-    </w:p>
-    <w:p>
-      <w:pPr>
-        <w:rPr>
-          <w:rFonts w:hint="eastAsia"/>
-        </w:rPr>
-      </w:pPr>
-      <w:r>
-        <w:t xml:space="preserve">15) </w:t>
-      </w:r>
-      <w:r>
-        <w:rPr>
-          <w:rFonts w:hint="eastAsia"/>
-        </w:rPr>
-        <w:t xml:space="preserve">Functions related to </w:t>
-      </w:r>
-      <w:proofErr w:type="spellStart"/>
-      <w:r>
-        <w:rPr>
-          <w:rFonts w:hint="eastAsia"/>
-        </w:rPr>
-        <w:t>QNames</w:t>
-      </w:r>
-      <w:proofErr w:type="spellEnd"/>
-    </w:p>
-    <w:p>
-      <w:pPr>
-        <w:rPr>
-          <w:rFonts w:hint="eastAsia"/>
-        </w:rPr>
-      </w:pPr>
-    </w:p>
-    <w:p>
-      <w:pPr>
-        <w:rPr>
-          <w:rFonts w:hint="eastAsia"/>
-        </w:rPr>
-      </w:pPr>
-      <w:proofErr w:type="spellStart"/>
-      <w:r>
-        <w:rPr>
-          <w:rFonts w:hint="eastAsia"/>
-        </w:rPr>
-        <w:t>fn:resolve-QName</w:t>
-      </w:r>
-      <w:proofErr w:type="spellEnd"/>
-    </w:p>
-    <w:p>
-      <w:pPr>
-        <w:rPr>
-          <w:rFonts w:hint="eastAsia"/>
-        </w:rPr>
-      </w:pPr>
-      <w:proofErr w:type="spellStart"/>
-      <w:r>
-        <w:rPr>
-          <w:rFonts w:hint="eastAsia"/>
-        </w:rPr>
-        <w:t>fn:QName</w:t>
-      </w:r>
-      <w:proofErr w:type="spellEnd"/>
-    </w:p>
-    <w:p>
-      <w:pPr>
-        <w:rPr>
-          <w:rFonts w:hint="eastAsia"/>
-        </w:rPr>
-      </w:pPr>
-    </w:p>
-    <w:p>
-      <w:pPr>
-        <w:rPr>
-          <w:rFonts w:hint="eastAsia"/>
-        </w:rPr>
-      </w:pPr>
-      <w:r>
-        <w:t>16) Functions related to maps</w:t>
-      </w:r>
-    </w:p>
-    <w:p>
-      <w:pPr>
-        <w:rPr>
-          <w:rFonts w:hint="eastAsia"/>
-        </w:rPr>
-      </w:pPr>
-    </w:p>
-    <w:p>
-      <w:pPr>
-        <w:rPr>
-          <w:rFonts w:hint="eastAsia"/>
-        </w:rPr>
-      </w:pPr>
-      <w:proofErr w:type="spellStart"/>
-      <w:r>
-        <w:t>map:merge</w:t>
-      </w:r>
-      <w:proofErr w:type="spellEnd"/>
-    </w:p>
-    <w:p>
-      <w:pPr>
-        <w:rPr>
-          <w:rFonts w:hint="eastAsia"/>
-        </w:rPr>
-      </w:pPr>
-      <w:proofErr w:type="spellStart"/>
-      <w:r>
-        <w:t>map:size</w:t>
-      </w:r>
-      <w:proofErr w:type="spellEnd"/>
-    </w:p>
-    <w:p>
-      <w:pPr>
-        <w:rPr>
-          <w:rFonts w:hint="eastAsia"/>
-        </w:rPr>
-      </w:pPr>
-      <w:proofErr w:type="spellStart"/>
-      <w:r>
-        <w:t>map:keys</w:t>
-      </w:r>
-      <w:proofErr w:type="spellEnd"/>
-    </w:p>
-    <w:p>
-      <w:pPr>
-        <w:rPr>
-          <w:rFonts w:hint="eastAsia"/>
-        </w:rPr>
-      </w:pPr>
-      <w:proofErr w:type="spellStart"/>
-      <w:r>
-        <w:t>map:contains</w:t>
-      </w:r>
-      <w:proofErr w:type="spellEnd"/>
-    </w:p>
-    <w:p>
-      <w:pPr>
-        <w:rPr>
-          <w:rFonts w:hint="eastAsia"/>
-        </w:rPr>
-      </w:pPr>
-      <w:proofErr w:type="spellStart"/>
-      <w:r>
-        <w:t>map:get</w:t>
-      </w:r>
-      <w:proofErr w:type="spellEnd"/>
-    </w:p>
-    <w:p>
-      <w:pPr>
-        <w:rPr>
-          <w:rFonts w:hint="eastAsia"/>
-        </w:rPr>
-      </w:pPr>
-      <w:proofErr w:type="spellStart"/>
-      <w:r>
-        <w:t>map:find</w:t>
-      </w:r>
-      <w:proofErr w:type="spellEnd"/>
-    </w:p>
-    <w:p>
-      <w:pPr>
-        <w:rPr>
-          <w:rFonts w:hint="eastAsia"/>
-        </w:rPr>
-      </w:pPr>
-      <w:proofErr w:type="spellStart"/>
-      <w:r>
-        <w:t>map:put</w:t>
-      </w:r>
-      <w:proofErr w:type="spellEnd"/>
-    </w:p>
-    <w:p>
-      <w:pPr>
-        <w:rPr>
-          <w:rFonts w:hint="eastAsia"/>
-        </w:rPr>
-      </w:pPr>
-      <w:proofErr w:type="spellStart"/>
-      <w:r>
-        <w:t>map:entry</w:t>
-      </w:r>
-      <w:proofErr w:type="spellEnd"/>
-    </w:p>
-    <w:p>
-      <w:pPr>
-        <w:rPr>
-          <w:rFonts w:hint="eastAsia"/>
-        </w:rPr>
-      </w:pPr>
-      <w:proofErr w:type="spellStart"/>
-      <w:r>
-        <w:t>map:remove</w:t>
-      </w:r>
-      <w:proofErr w:type="spellEnd"/>
-    </w:p>
-    <w:p>
-      <w:pPr>
-        <w:rPr>
-          <w:rFonts w:hint="eastAsia"/>
-        </w:rPr>
-      </w:pPr>
-      <w:proofErr w:type="spellStart"/>
-      <w:r>
-        <w:t>map:for-each</w:t>
-      </w:r>
-      <w:proofErr w:type="spellEnd"/>
-    </w:p>
-    <w:p>
-      <w:pPr>
-        <w:rPr>
-          <w:rFonts w:hint="eastAsia"/>
-        </w:rPr>
-      </w:pPr>
-    </w:p>
-    <w:p>
-      <w:pPr>
-        <w:rPr>
-          <w:rFonts w:hint="eastAsia"/>
-        </w:rPr>
-      </w:pPr>
-      <w:r>
-        <w:t>17) Functions related to arrays</w:t>
+        <w:t>) Functions related to arrays</w:t>
       </w:r>
     </w:p>
     <w:p>
@@ -7110,7 +7401,6 @@
       </w:pPr>
       <w:proofErr w:type="spellStart"/>
       <w:r>
-        <w:lastRenderedPageBreak/>
         <w:t>array:remove</w:t>
       </w:r>
       <w:proofErr w:type="spellEnd"/>
@@ -7276,7 +7566,10 @@
         </w:rPr>
       </w:pPr>
       <w:r>
-        <w:t xml:space="preserve">18) Functions on JSON </w:t>
+        <w:t>20</w:t>
+      </w:r>
+      <w:r>
+        <w:t xml:space="preserve">) Functions on JSON </w:t>
       </w:r>
       <w:r>
         <w:t>d</w:t>
@@ -7339,168 +7632,6 @@
         <w:t>fn:xml-to-json</w:t>
       </w:r>
       <w:proofErr w:type="spellEnd"/>
-    </w:p>
-    <w:p>
-      <w:pPr>
-        <w:rPr>
-          <w:rFonts w:hint="eastAsia"/>
-        </w:rPr>
-      </w:pPr>
-    </w:p>
-    <w:p>
-      <w:pPr>
-        <w:rPr>
-          <w:rFonts w:hint="eastAsia"/>
-        </w:rPr>
-      </w:pPr>
-    </w:p>
-    <w:p>
-      <w:pPr>
-        <w:rPr>
-          <w:rFonts w:hint="eastAsia"/>
-          <w:b/>
-          <w:bCs/>
-        </w:rPr>
-      </w:pPr>
-      <w:r>
-        <w:rPr>
-          <w:b/>
-          <w:bCs/>
-        </w:rPr>
-        <w:t xml:space="preserve">Other than the above mentioned newly implemented XPath 3.1 functions, all the functions that are </w:t>
-      </w:r>
-      <w:r>
-        <w:rPr>
-          <w:b/>
-          <w:bCs/>
-        </w:rPr>
-        <w:t xml:space="preserve">specified for </w:t>
-      </w:r>
-      <w:r>
-        <w:rPr>
-          <w:b/>
-          <w:bCs/>
-        </w:rPr>
-        <w:t>XPath 1.0</w:t>
-      </w:r>
-      <w:r>
-        <w:rPr>
-          <w:b/>
-          <w:bCs/>
-        </w:rPr>
-        <w:t xml:space="preserve"> </w:t>
-      </w:r>
-      <w:r>
-        <w:rPr>
-          <w:b/>
-          <w:bCs/>
-        </w:rPr>
-        <w:t>are available with</w:t>
-      </w:r>
-      <w:r>
-        <w:rPr>
-          <w:b/>
-          <w:bCs/>
-        </w:rPr>
-        <w:t xml:space="preserve"> </w:t>
-      </w:r>
-      <w:proofErr w:type="spellStart"/>
-      <w:r>
-        <w:rPr>
-          <w:b/>
-          <w:bCs/>
-        </w:rPr>
-        <w:t>Xalan’s</w:t>
-      </w:r>
-      <w:proofErr w:type="spellEnd"/>
-      <w:r>
-        <w:rPr>
-          <w:b/>
-          <w:bCs/>
-        </w:rPr>
-        <w:t xml:space="preserve"> XPath 3.1 implementation as well</w:t>
-      </w:r>
-      <w:r>
-        <w:rPr>
-          <w:b/>
-          <w:bCs/>
-        </w:rPr>
-        <w:t>.</w:t>
-      </w:r>
-    </w:p>
-    <w:p>
-      <w:pPr>
-        <w:rPr>
-          <w:rFonts w:hint="eastAsia"/>
-        </w:rPr>
-      </w:pPr>
-    </w:p>
-    <w:p>
-      <w:pPr>
-        <w:rPr>
-          <w:rFonts w:hint="eastAsia"/>
-        </w:rPr>
-      </w:pPr>
-      <w:r>
-        <w:t>Please refer to</w:t>
-      </w:r>
-      <w:r>
-        <w:t xml:space="preserve"> the </w:t>
-      </w:r>
-      <w:r>
-        <w:t xml:space="preserve">link </w:t>
-      </w:r>
-      <w:hyperlink r:id="rId8" w:history="1">
-        <w:r>
-          <w:rPr>
-            <w:rStyle w:val="Hyperlink"/>
-            <w:rFonts w:hint="eastAsia"/>
-          </w:rPr>
-          <w:t>https://www.w3.org/TR/1999/REC-xpath-19991116</w:t>
-        </w:r>
-        <w:r>
-          <w:rPr>
-            <w:rStyle w:val="Hyperlink"/>
-          </w:rPr>
-          <w:t>/</w:t>
-        </w:r>
-      </w:hyperlink>
-      <w:r>
-        <w:t xml:space="preserve"> (section “</w:t>
-      </w:r>
-      <w:r>
-        <w:rPr>
-          <w:rFonts w:hint="eastAsia"/>
-        </w:rPr>
-        <w:t>4 Core Function Library</w:t>
-      </w:r>
-      <w:r>
-        <w:t>”)</w:t>
-      </w:r>
-      <w:r>
-        <w:t xml:space="preserve"> </w:t>
-      </w:r>
-      <w:r>
-        <w:t xml:space="preserve">for </w:t>
-      </w:r>
-      <w:r>
-        <w:t xml:space="preserve">the details about </w:t>
-      </w:r>
-      <w:r>
-        <w:t>XPath</w:t>
-      </w:r>
-      <w:r>
-        <w:t xml:space="preserve"> 1.0 </w:t>
-      </w:r>
-      <w:r>
-        <w:t>function</w:t>
-      </w:r>
-      <w:r>
-        <w:t>s</w:t>
-      </w:r>
-      <w:r>
-        <w:t>.</w:t>
-      </w:r>
     </w:p>
     <w:p>
       <w:pPr>
@@ -7553,7 +7684,25 @@
           <w:bCs/>
           <w:szCs w:val="24"/>
         </w:rPr>
-        <w:t>Features yet not implemented, or partially implemented</w:t>
+        <w:t xml:space="preserve">Features </w:t>
+      </w:r>
+      <w:r>
+        <w:rPr>
+          <w:rFonts w:cs="Lucida Sans"/>
+          <w:b/>
+          <w:bCs/>
+          <w:szCs w:val="24"/>
+        </w:rPr>
+        <w:t xml:space="preserve">yet </w:t>
+      </w:r>
+      <w:r>
+        <w:rPr>
+          <w:rFonts w:cs="Lucida Sans"/>
+          <w:b/>
+          <w:bCs/>
+          <w:szCs w:val="24"/>
+        </w:rPr>
+        <w:t>not implemented, or partially implemented</w:t>
       </w:r>
     </w:p>
     <w:p>
@@ -7603,29 +7752,6 @@
         </w:rPr>
       </w:pPr>
       <w:r>
-        <w:t xml:space="preserve">Not yet </w:t>
-      </w:r>
-      <w:r>
-        <w:t>implemented</w:t>
-      </w:r>
-      <w:r>
-        <w:t>:</w:t>
-      </w:r>
-    </w:p>
-    <w:p>
-      <w:pPr>
-        <w:rPr>
-          <w:rFonts w:hint="eastAsia"/>
-        </w:rPr>
-      </w:pPr>
-    </w:p>
-    <w:p>
-      <w:pPr>
-        <w:rPr>
-          <w:rFonts w:hint="eastAsia"/>
-        </w:rPr>
-      </w:pPr>
-      <w:r>
         <w:t xml:space="preserve">a) </w:t>
       </w:r>
       <w:proofErr w:type="spellStart"/>
@@ -7648,6 +7774,26 @@
         </w:rPr>
       </w:pPr>
       <w:r>
+        <w:t>Not implemented</w:t>
+      </w:r>
+      <w:r>
+        <w:t>.</w:t>
+      </w:r>
+    </w:p>
+    <w:p>
+      <w:pPr>
+        <w:rPr>
+          <w:rFonts w:hint="eastAsia"/>
+        </w:rPr>
+      </w:pPr>
+    </w:p>
+    <w:p>
+      <w:pPr>
+        <w:rPr>
+          <w:rFonts w:hint="eastAsia"/>
+        </w:rPr>
+      </w:pPr>
+      <w:r>
         <w:t>b</w:t>
       </w:r>
       <w:r>
@@ -7698,9 +7844,44 @@
         <w:t>xsl:on-non-empty</w:t>
       </w:r>
       <w:proofErr w:type="spellEnd"/>
-      <w:r>
-        <w:t xml:space="preserve">. </w:t>
-      </w:r>
+    </w:p>
+    <w:p>
+      <w:pPr>
+        <w:rPr>
+          <w:rFonts w:hint="eastAsia"/>
+        </w:rPr>
+      </w:pPr>
+    </w:p>
+    <w:p>
+      <w:pPr>
+        <w:rPr>
+          <w:rFonts w:hint="eastAsia"/>
+        </w:rPr>
+      </w:pPr>
+      <w:r>
+        <w:rPr>
+          <w:rFonts w:hint="eastAsia"/>
+        </w:rPr>
+        <w:lastRenderedPageBreak/>
+        <w:t>N</w:t>
+      </w:r>
+      <w:r>
+        <w:t>ot implemented.</w:t>
+      </w:r>
+    </w:p>
+    <w:p>
+      <w:pPr>
+        <w:rPr>
+          <w:rFonts w:hint="eastAsia"/>
+        </w:rPr>
+      </w:pPr>
+    </w:p>
+    <w:p>
+      <w:pPr>
+        <w:rPr>
+          <w:rFonts w:hint="eastAsia"/>
+        </w:rPr>
+      </w:pPr>
       <w:r>
         <w:rPr>
           <w:b/>
@@ -7746,6 +7927,23 @@
         </w:rPr>
       </w:pPr>
       <w:r>
+        <w:t>Not implemented.</w:t>
+      </w:r>
+    </w:p>
+    <w:p>
+      <w:pPr>
+        <w:rPr>
+          <w:rFonts w:hint="eastAsia"/>
+        </w:rPr>
+      </w:pPr>
+    </w:p>
+    <w:p>
+      <w:pPr>
+        <w:rPr>
+          <w:rFonts w:hint="eastAsia"/>
+        </w:rPr>
+      </w:pPr>
+      <w:r>
         <w:rPr>
           <w:b/>
           <w:bCs/>
@@ -7794,51 +7992,6 @@
       <w:r>
         <w:t>can be ignored.</w:t>
       </w:r>
-      <w:r>
-        <w:t xml:space="preserve"> </w:t>
-      </w:r>
-      <w:proofErr w:type="spellStart"/>
-      <w:r>
-        <w:rPr>
-          <w:b/>
-          <w:bCs/>
-        </w:rPr>
-        <w:t>Xalan</w:t>
-      </w:r>
-      <w:proofErr w:type="spellEnd"/>
-      <w:r>
-        <w:rPr>
-          <w:b/>
-          <w:bCs/>
-        </w:rPr>
-        <w:t xml:space="preserve"> shall not implement this XSLT 3.0 language feature, because </w:t>
-      </w:r>
-      <w:proofErr w:type="spellStart"/>
-      <w:r>
-        <w:rPr>
-          <w:b/>
-          <w:bCs/>
-        </w:rPr>
-        <w:t>Xalan</w:t>
-      </w:r>
-      <w:proofErr w:type="spellEnd"/>
-      <w:r>
-        <w:rPr>
-          <w:b/>
-          <w:bCs/>
-        </w:rPr>
-        <w:t xml:space="preserve"> implements XPath 3.1 maps</w:t>
-      </w:r>
-      <w:r>
-        <w:t>.</w:t>
-      </w:r>
-    </w:p>
-    <w:p>
-      <w:pPr>
-        <w:rPr>
-          <w:rFonts w:hint="eastAsia"/>
-        </w:rPr>
-      </w:pPr>
     </w:p>
     <w:p>
       <w:pPr>
@@ -7881,10 +8034,16 @@
         </w:rPr>
       </w:pPr>
       <w:r>
-        <w:t>Partial implementation</w:t>
-      </w:r>
-      <w:r>
-        <w:t>:</w:t>
+        <w:t>Partial</w:t>
+      </w:r>
+      <w:r>
+        <w:t>ly</w:t>
+      </w:r>
+      <w:r>
+        <w:t xml:space="preserve"> implement</w:t>
+      </w:r>
+      <w:r>
+        <w:t>ed features:</w:t>
       </w:r>
     </w:p>
     <w:p>
@@ -7928,6 +8087,9 @@
       <w:r>
         <w:t xml:space="preserve"> are yet not supported</w:t>
       </w:r>
+      <w:r>
+        <w:t>.</w:t>
+      </w:r>
     </w:p>
     <w:p>
       <w:pPr>
@@ -7949,11 +8111,17 @@
       <w:r>
         <w:t xml:space="preserve">The list of supported XML Schema data types with </w:t>
       </w:r>
+      <w:r>
+        <w:t xml:space="preserve">Apache </w:t>
+      </w:r>
       <w:proofErr w:type="spellStart"/>
       <w:r>
         <w:t>Xalan</w:t>
       </w:r>
       <w:proofErr w:type="spellEnd"/>
+      <w:r>
+        <w:t xml:space="preserve"> Java</w:t>
+      </w:r>
       <w:r>
         <w:t xml:space="preserve">, are described within this document’s section </w:t>
       </w:r>
@@ -8109,7 +8277,7 @@
       <w:r>
         <w:t xml:space="preserve"> : </w:t>
       </w:r>
-      <w:hyperlink r:id="rId9" w:history="1">
+      <w:hyperlink r:id="rId8" w:history="1">
         <w:r>
           <w:rPr>
             <w:rStyle w:val="Hyperlink"/>
@@ -8158,7 +8326,7 @@
       <w:r>
         <w:t xml:space="preserve"> : </w:t>
       </w:r>
-      <w:hyperlink r:id="rId10" w:history="1">
+      <w:hyperlink r:id="rId9" w:history="1">
         <w:r>
           <w:rPr>
             <w:rStyle w:val="Hyperlink"/>
@@ -8203,7 +8371,7 @@
       <w:r>
         <w:t xml:space="preserve"> </w:t>
       </w:r>
-      <w:hyperlink r:id="rId11" w:history="1">
+      <w:hyperlink r:id="rId10" w:history="1">
         <w:r>
           <w:rPr>
             <w:rStyle w:val="Hyperlink"/>
@@ -8227,7 +8395,7 @@
       <w:r>
         <w:t xml:space="preserve"> &amp; </w:t>
       </w:r>
-      <w:hyperlink r:id="rId12" w:history="1">
+      <w:hyperlink r:id="rId11" w:history="1">
         <w:r>
           <w:rPr>
             <w:rStyle w:val="Hyperlink"/>
@@ -8296,7 +8464,7 @@
           <w:rFonts w:hint="eastAsia"/>
         </w:rPr>
       </w:pPr>
-      <w:hyperlink r:id="rId13" w:history="1">
+      <w:hyperlink r:id="rId12" w:history="1">
         <w:r>
           <w:rPr>
             <w:rStyle w:val="Hyperlink"/>

</xml_diff>

<commit_message>
committing xalan-j xslt 3.0 latest implementation status information
</commit_message>
<xml_diff>
--- a/xalan-j/xsl3/xalanj_xslt3.0_implementation_status.docx
+++ b/xalan-j/xsl3/xalanj_xslt3.0_implementation_status.docx
@@ -170,7 +170,7 @@
           <w:color w:val="404040" w:themeColor="text1" w:themeTint="BF"/>
           <w:lang w:val="en-IN"/>
         </w:rPr>
-        <w:t>7</w:t>
+        <w:t>2</w:t>
       </w:r>
       <w:r>
         <w:rPr>
@@ -184,79 +184,73 @@
           <w:color w:val="404040" w:themeColor="text1" w:themeTint="BF"/>
           <w:lang w:val="en-IN"/>
         </w:rPr>
-        <w:t>0</w:t>
-      </w:r>
-      <w:r>
-        <w:rPr>
+        <w:t>15</w:t>
+      </w:r>
+    </w:p>
+    <w:p>
+      <w:pPr>
+        <w:rPr>
+          <w:rFonts w:hint="eastAsia"/>
+          <w:b/>
+          <w:bCs/>
+        </w:rPr>
+      </w:pPr>
+      <w:r>
+        <w:rPr>
+          <w:b/>
+          <w:bCs/>
+        </w:rPr>
+        <w:t xml:space="preserve">                                                </w:t>
+      </w:r>
+      <w:r>
+        <w:rPr>
+          <w:b/>
+          <w:bCs/>
+        </w:rPr>
+        <w:t xml:space="preserve">                                                                         </w:t>
+      </w:r>
+    </w:p>
+    <w:p>
+      <w:pPr>
+        <w:rPr>
+          <w:rFonts w:hint="eastAsia"/>
           <w:color w:val="404040" w:themeColor="text1" w:themeTint="BF"/>
           <w:lang w:val="en-IN"/>
         </w:rPr>
-        <w:t>2</w:t>
-      </w:r>
-    </w:p>
-    <w:p>
-      <w:pPr>
-        <w:rPr>
-          <w:rFonts w:hint="eastAsia"/>
-          <w:b/>
-          <w:bCs/>
-        </w:rPr>
-      </w:pPr>
-      <w:r>
-        <w:rPr>
-          <w:b/>
-          <w:bCs/>
-        </w:rPr>
-        <w:t xml:space="preserve">                                                </w:t>
-      </w:r>
-      <w:r>
-        <w:rPr>
-          <w:b/>
-          <w:bCs/>
-        </w:rPr>
-        <w:t xml:space="preserve">                                                                         </w:t>
-      </w:r>
-    </w:p>
-    <w:p>
-      <w:pPr>
-        <w:rPr>
-          <w:rFonts w:hint="eastAsia"/>
+      </w:pPr>
+      <w:r>
+        <w:rPr>
           <w:color w:val="404040" w:themeColor="text1" w:themeTint="BF"/>
           <w:lang w:val="en-IN"/>
         </w:rPr>
-      </w:pPr>
+        <w:t xml:space="preserve">       </w:t>
+      </w:r>
       <w:r>
         <w:rPr>
           <w:color w:val="404040" w:themeColor="text1" w:themeTint="BF"/>
           <w:lang w:val="en-IN"/>
         </w:rPr>
-        <w:t xml:space="preserve">       </w:t>
+        <w:t xml:space="preserve">                                                 </w:t>
       </w:r>
       <w:r>
         <w:rPr>
           <w:color w:val="404040" w:themeColor="text1" w:themeTint="BF"/>
           <w:lang w:val="en-IN"/>
         </w:rPr>
-        <w:t xml:space="preserve">                                                 </w:t>
+        <w:t>Authors</w:t>
       </w:r>
       <w:r>
         <w:rPr>
           <w:color w:val="404040" w:themeColor="text1" w:themeTint="BF"/>
           <w:lang w:val="en-IN"/>
         </w:rPr>
-        <w:t>Authors</w:t>
-      </w:r>
-      <w:r>
-        <w:rPr>
-          <w:color w:val="404040" w:themeColor="text1" w:themeTint="BF"/>
-          <w:lang w:val="en-IN"/>
-        </w:rPr>
         <w:t>:</w:t>
       </w:r>
     </w:p>
     <w:p>
       <w:pPr>
         <w:rPr>
+          <w:rFonts w:hint="eastAsia"/>
           <w:color w:val="404040" w:themeColor="text1" w:themeTint="BF"/>
           <w:lang w:val="en-IN"/>
         </w:rPr>
@@ -344,6 +338,7 @@
     <w:p>
       <w:pPr>
         <w:rPr>
+          <w:rFonts w:hint="eastAsia"/>
           <w:color w:val="404040" w:themeColor="text1" w:themeTint="BF"/>
           <w:lang w:val="en-IN"/>
         </w:rPr>
@@ -417,6 +412,7 @@
     <w:p>
       <w:pPr>
         <w:rPr>
+          <w:rFonts w:hint="eastAsia"/>
           <w:color w:val="404040" w:themeColor="text1" w:themeTint="BF"/>
           <w:lang w:val="en-IN"/>
         </w:rPr>
@@ -505,6 +501,7 @@
     <w:p>
       <w:pPr>
         <w:rPr>
+          <w:rFonts w:hint="eastAsia"/>
           <w:color w:val="404040" w:themeColor="text1" w:themeTint="BF"/>
           <w:lang w:val="en-IN"/>
         </w:rPr>
@@ -592,6 +589,7 @@
     <w:p>
       <w:pPr>
         <w:rPr>
+          <w:rFonts w:hint="eastAsia"/>
           <w:color w:val="404040" w:themeColor="text1" w:themeTint="BF"/>
           <w:lang w:val="en-IN"/>
         </w:rPr>
@@ -689,14 +687,7 @@
           <w:color w:val="404040" w:themeColor="text1" w:themeTint="BF"/>
           <w:lang w:val="en-IN"/>
         </w:rPr>
-        <w:t>(</w:t>
-      </w:r>
-      <w:r>
-        <w:rPr>
-          <w:color w:val="404040" w:themeColor="text1" w:themeTint="BF"/>
-          <w:lang w:val="en-IN"/>
-        </w:rPr>
-        <w:t>Apache Xalan</w:t>
+        <w:t>(Apache Xalan</w:t>
       </w:r>
       <w:r>
         <w:rPr>
@@ -1258,6 +1249,7 @@
         <w:pStyle w:val="ListParagraph"/>
         <w:ind w:left="426"/>
         <w:rPr>
+          <w:rFonts w:hint="eastAsia"/>
           <w:sz w:val="22"/>
           <w:szCs w:val="22"/>
         </w:rPr>
@@ -1303,6 +1295,7 @@
         <w:pStyle w:val="ListParagraph"/>
         <w:ind w:left="426"/>
         <w:rPr>
+          <w:rFonts w:hint="eastAsia"/>
           <w:sz w:val="22"/>
           <w:szCs w:val="22"/>
         </w:rPr>
@@ -1500,6 +1493,7 @@
         <w:pStyle w:val="ListParagraph"/>
         <w:ind w:left="426"/>
         <w:rPr>
+          <w:rFonts w:hint="eastAsia"/>
           <w:sz w:val="22"/>
           <w:szCs w:val="22"/>
         </w:rPr>
@@ -1552,6 +1546,7 @@
         <w:pStyle w:val="ListParagraph"/>
         <w:ind w:left="426"/>
         <w:rPr>
+          <w:rFonts w:hint="eastAsia"/>
           <w:sz w:val="22"/>
           <w:szCs w:val="22"/>
         </w:rPr>
@@ -2210,17 +2205,23 @@
           <w:tab w:val="left" w:pos="360"/>
         </w:tabs>
         <w:ind w:hanging="720"/>
-        <w:rPr>
-          <w:rFonts w:hint="eastAsia"/>
-        </w:rPr>
       </w:pPr>
       <w:r>
         <w:t>xsl:sequence instruction</w:t>
       </w:r>
     </w:p>
     <w:p>
-      <w:pPr>
-        <w:pStyle w:val="ListParagraph"/>
+      <w:r>
+        <w:t xml:space="preserve">      xsl:variable and xsl:param instruction’s attribute “static”</w:t>
+      </w:r>
+    </w:p>
+    <w:p>
+      <w:r>
+        <w:t xml:space="preserve">      XSL stylesheet instruction attribute “use-when” implementation </w:t>
+      </w:r>
+    </w:p>
+    <w:p>
+      <w:pPr>
         <w:rPr>
           <w:rFonts w:hint="eastAsia"/>
         </w:rPr>
@@ -2526,6 +2527,7 @@
         </w:rPr>
       </w:pPr>
       <w:r>
+        <w:lastRenderedPageBreak/>
         <w:t>xsl:merge instruction</w:t>
       </w:r>
     </w:p>
@@ -2550,7 +2552,6 @@
         </w:rPr>
       </w:pPr>
       <w:r>
-        <w:lastRenderedPageBreak/>
         <w:t>xsl:fork instruction</w:t>
       </w:r>
     </w:p>
@@ -2826,6 +2827,9 @@
           <w:numId w:val="13"/>
         </w:numPr>
         <w:ind w:left="426" w:hanging="426"/>
+        <w:rPr>
+          <w:rFonts w:hint="eastAsia"/>
+        </w:rPr>
       </w:pPr>
       <w:r>
         <w:t>xsl:mode instruction</w:t>
@@ -2834,6 +2838,9 @@
     <w:p>
       <w:pPr>
         <w:pStyle w:val="ListParagraph"/>
+        <w:rPr>
+          <w:rFonts w:hint="eastAsia"/>
+        </w:rPr>
       </w:pPr>
     </w:p>
     <w:p>
@@ -2844,6 +2851,9 @@
           <w:numId w:val="13"/>
         </w:numPr>
         <w:ind w:left="426" w:hanging="426"/>
+        <w:rPr>
+          <w:rFonts w:hint="eastAsia"/>
+        </w:rPr>
       </w:pPr>
       <w:r>
         <w:t>xsl:perform-sort instruction</w:t>
@@ -2852,6 +2862,9 @@
     <w:p>
       <w:pPr>
         <w:pStyle w:val="ListParagraph"/>
+        <w:rPr>
+          <w:rFonts w:hint="eastAsia"/>
+        </w:rPr>
       </w:pPr>
     </w:p>
     <w:p>
@@ -3156,6 +3169,7 @@
         </w:rPr>
       </w:pPr>
       <w:r>
+        <w:lastRenderedPageBreak/>
         <w:t>3) Function item "inline function expression"</w:t>
       </w:r>
     </w:p>
@@ -3173,7 +3187,6 @@
         </w:rPr>
       </w:pPr>
       <w:r>
-        <w:lastRenderedPageBreak/>
         <w:t>4</w:t>
       </w:r>
       <w:r>
@@ -3740,6 +3753,7 @@
         </w:rPr>
       </w:pPr>
       <w:r>
+        <w:lastRenderedPageBreak/>
         <w:t xml:space="preserve">               xs:double               </w:t>
       </w:r>
     </w:p>
@@ -3773,688 +3787,687 @@
         </w:rPr>
       </w:pPr>
       <w:r>
+        <w:t xml:space="preserve">              xs:date</w:t>
+      </w:r>
+    </w:p>
+    <w:p>
+      <w:pPr>
+        <w:rPr>
+          <w:rFonts w:hint="eastAsia"/>
+        </w:rPr>
+      </w:pPr>
+      <w:r>
+        <w:t xml:space="preserve">              xs:dateTime</w:t>
+      </w:r>
+    </w:p>
+    <w:p>
+      <w:pPr>
+        <w:ind w:left="990" w:hanging="990"/>
+        <w:rPr>
+          <w:rFonts w:hint="eastAsia"/>
+        </w:rPr>
+      </w:pPr>
+      <w:r>
+        <w:t xml:space="preserve">            </w:t>
+      </w:r>
+      <w:r>
+        <w:t xml:space="preserve">  </w:t>
+      </w:r>
+      <w:r>
+        <w:t>xs:time</w:t>
+      </w:r>
+    </w:p>
+    <w:p>
+      <w:pPr>
+        <w:ind w:left="900" w:hanging="900"/>
+        <w:rPr>
+          <w:rFonts w:hint="eastAsia"/>
+        </w:rPr>
+      </w:pPr>
+      <w:r>
+        <w:t xml:space="preserve">              xs:duration</w:t>
+      </w:r>
+    </w:p>
+    <w:p>
+      <w:pPr>
+        <w:rPr>
+          <w:rFonts w:hint="eastAsia"/>
+        </w:rPr>
+      </w:pPr>
+      <w:r>
+        <w:t xml:space="preserve">                   xs:dayTimeDuration</w:t>
+      </w:r>
+    </w:p>
+    <w:p>
+      <w:pPr>
+        <w:rPr>
+          <w:rFonts w:hint="eastAsia"/>
+        </w:rPr>
+      </w:pPr>
+      <w:r>
+        <w:t xml:space="preserve">                   xs:yearMonthDuration</w:t>
+      </w:r>
+    </w:p>
+    <w:p>
+      <w:pPr>
+        <w:ind w:left="990" w:hanging="990"/>
+        <w:rPr>
+          <w:rFonts w:hint="eastAsia"/>
+        </w:rPr>
+      </w:pPr>
+      <w:r>
+        <w:t xml:space="preserve">              xs:g</w:t>
+      </w:r>
+      <w:r>
+        <w:t>Day</w:t>
+      </w:r>
+    </w:p>
+    <w:p>
+      <w:pPr>
+        <w:ind w:left="990" w:hanging="990"/>
+        <w:rPr>
+          <w:rFonts w:hint="eastAsia"/>
+        </w:rPr>
+      </w:pPr>
+      <w:r>
+        <w:t xml:space="preserve">              xs:g</w:t>
+      </w:r>
+      <w:r>
+        <w:t>Month</w:t>
+      </w:r>
+    </w:p>
+    <w:p>
+      <w:pPr>
+        <w:ind w:left="990" w:hanging="990"/>
+        <w:rPr>
+          <w:rFonts w:hint="eastAsia"/>
+        </w:rPr>
+      </w:pPr>
+      <w:r>
+        <w:t xml:space="preserve">              xs:gMonthDay</w:t>
+      </w:r>
+    </w:p>
+    <w:p>
+      <w:pPr>
+        <w:ind w:left="990" w:hanging="990"/>
+        <w:rPr>
+          <w:rFonts w:hint="eastAsia"/>
+        </w:rPr>
+      </w:pPr>
+      <w:r>
+        <w:t xml:space="preserve">              xs:g</w:t>
+      </w:r>
+      <w:r>
+        <w:t>Year</w:t>
+      </w:r>
+    </w:p>
+    <w:p>
+      <w:pPr>
+        <w:ind w:left="990" w:hanging="990"/>
+        <w:rPr>
+          <w:rFonts w:hint="eastAsia"/>
+        </w:rPr>
+      </w:pPr>
+      <w:r>
+        <w:t xml:space="preserve">              xs:</w:t>
+      </w:r>
+      <w:r>
+        <w:t>g</w:t>
+      </w:r>
+      <w:r>
+        <w:t>YearMonth</w:t>
+      </w:r>
+    </w:p>
+    <w:p>
+      <w:pPr>
+        <w:ind w:left="990" w:hanging="990"/>
+        <w:rPr>
+          <w:rFonts w:hint="eastAsia"/>
+        </w:rPr>
+      </w:pPr>
+      <w:r>
+        <w:t xml:space="preserve">              xs:hexBinary</w:t>
+      </w:r>
+    </w:p>
+    <w:p>
+      <w:pPr>
+        <w:ind w:left="990" w:hanging="990"/>
+        <w:rPr>
+          <w:rFonts w:hint="eastAsia"/>
+        </w:rPr>
+      </w:pPr>
+      <w:r>
+        <w:t xml:space="preserve">              xs:QName</w:t>
+      </w:r>
+    </w:p>
+    <w:p>
+      <w:pPr>
+        <w:ind w:left="900" w:hanging="900"/>
+        <w:rPr>
+          <w:rFonts w:hint="eastAsia"/>
+        </w:rPr>
+      </w:pPr>
+      <w:r>
+        <w:t xml:space="preserve">              xs:string</w:t>
+      </w:r>
+    </w:p>
+    <w:p>
+      <w:pPr>
+        <w:ind w:left="990" w:hanging="990"/>
+        <w:rPr>
+          <w:rFonts w:hint="eastAsia"/>
+        </w:rPr>
+      </w:pPr>
+      <w:r>
+        <w:t xml:space="preserve">                  xs:normalizedString</w:t>
+      </w:r>
+    </w:p>
+    <w:p>
+      <w:pPr>
+        <w:ind w:left="990" w:hanging="990"/>
+        <w:rPr>
+          <w:rFonts w:hint="eastAsia"/>
+        </w:rPr>
+      </w:pPr>
+      <w:r>
+        <w:t xml:space="preserve">                  </w:t>
+      </w:r>
+      <w:r>
+        <w:t xml:space="preserve">     </w:t>
+      </w:r>
+      <w:r>
+        <w:t>xs:token</w:t>
+      </w:r>
+    </w:p>
+    <w:p>
+      <w:pPr>
+        <w:ind w:left="990" w:hanging="990"/>
+        <w:rPr>
+          <w:rFonts w:hint="eastAsia"/>
+        </w:rPr>
+      </w:pPr>
+      <w:r>
+        <w:t xml:space="preserve">                             xs:language</w:t>
+      </w:r>
+    </w:p>
+    <w:p>
+      <w:pPr>
+        <w:ind w:left="990" w:hanging="990"/>
+        <w:rPr>
+          <w:rFonts w:hint="eastAsia"/>
+        </w:rPr>
+      </w:pPr>
+      <w:r>
+        <w:t xml:space="preserve">                             xs:Name</w:t>
+      </w:r>
+    </w:p>
+    <w:p>
+      <w:pPr>
+        <w:ind w:left="990" w:hanging="990"/>
+        <w:rPr>
+          <w:rFonts w:hint="eastAsia"/>
+        </w:rPr>
+      </w:pPr>
+      <w:r>
+        <w:t xml:space="preserve">                                  xs:NCName</w:t>
+      </w:r>
+    </w:p>
+    <w:p>
+      <w:pPr>
+        <w:ind w:left="990" w:hanging="990"/>
+        <w:rPr>
+          <w:rFonts w:hint="eastAsia"/>
+        </w:rPr>
+      </w:pPr>
+      <w:r>
+        <w:t xml:space="preserve">                                      xs:ID</w:t>
+      </w:r>
+    </w:p>
+    <w:p>
+      <w:pPr>
+        <w:ind w:left="990" w:hanging="990"/>
+        <w:rPr>
+          <w:rFonts w:hint="eastAsia"/>
+        </w:rPr>
+      </w:pPr>
+      <w:r>
+        <w:t xml:space="preserve">                                      xs:IDREF</w:t>
+      </w:r>
+    </w:p>
+    <w:p>
+      <w:pPr>
+        <w:ind w:left="990" w:hanging="990"/>
+        <w:rPr>
+          <w:rFonts w:hint="eastAsia"/>
+        </w:rPr>
+      </w:pPr>
+      <w:r>
+        <w:t xml:space="preserve">                            xs:NMTOKEN</w:t>
+      </w:r>
+      <w:r>
+        <w:t xml:space="preserve">                      </w:t>
+      </w:r>
+    </w:p>
+    <w:p>
+      <w:pPr>
+        <w:ind w:left="990" w:hanging="990"/>
+        <w:rPr>
+          <w:rFonts w:hint="eastAsia"/>
+        </w:rPr>
+      </w:pPr>
+    </w:p>
+    <w:p>
+      <w:pPr>
+        <w:rPr>
+          <w:rFonts w:hint="eastAsia"/>
+        </w:rPr>
+      </w:pPr>
+    </w:p>
+    <w:p>
+      <w:pPr>
+        <w:rPr>
+          <w:rFonts w:hint="eastAsia"/>
+        </w:rPr>
+      </w:pPr>
+      <w:r>
+        <w:t xml:space="preserve">In addition to above </w:t>
+      </w:r>
+      <w:r>
+        <w:t xml:space="preserve">mentioned </w:t>
+      </w:r>
+      <w:r>
+        <w:t>XML Schema built-in data types,</w:t>
+      </w:r>
+      <w:r>
+        <w:t xml:space="preserve"> a</w:t>
+      </w:r>
+      <w:r>
+        <w:t>n</w:t>
+      </w:r>
+      <w:r>
+        <w:t xml:space="preserve"> </w:t>
+      </w:r>
+      <w:r>
+        <w:t>XML S</w:t>
+      </w:r>
+      <w:r>
+        <w:t>chema type xs:untyped</w:t>
+      </w:r>
+      <w:r>
+        <w:t xml:space="preserve"> </w:t>
+      </w:r>
+      <w:r>
+        <w:t>specified by XPath 3.1 specification has also been implemented.</w:t>
+      </w:r>
+    </w:p>
+    <w:p>
+      <w:pPr>
+        <w:rPr>
+          <w:rFonts w:hint="eastAsia"/>
+        </w:rPr>
+      </w:pPr>
+    </w:p>
+    <w:p>
+      <w:pPr>
+        <w:rPr>
+          <w:rFonts w:hint="eastAsia"/>
+        </w:rPr>
+      </w:pPr>
+      <w:r>
+        <w:t>15</w:t>
+      </w:r>
+      <w:r>
+        <w:t>)</w:t>
+      </w:r>
+      <w:r>
+        <w:t xml:space="preserve"> Collation support</w:t>
+      </w:r>
+    </w:p>
+    <w:p>
+      <w:pPr>
+        <w:rPr>
+          <w:rFonts w:hint="eastAsia"/>
+        </w:rPr>
+      </w:pPr>
+    </w:p>
+    <w:p>
+      <w:pPr>
+        <w:rPr>
+          <w:rFonts w:hint="eastAsia"/>
+        </w:rPr>
+      </w:pPr>
+      <w:r>
+        <w:t xml:space="preserve">     </w:t>
+      </w:r>
+      <w:r>
+        <w:t xml:space="preserve"> </w:t>
+      </w:r>
+      <w:r>
+        <w:t>Within the context of XSL languages, a</w:t>
+      </w:r>
+      <w:r>
+        <w:t xml:space="preserve"> collation is a method</w:t>
+      </w:r>
+      <w:r>
+        <w:t xml:space="preserve"> </w:t>
+      </w:r>
+      <w:r>
+        <w:t xml:space="preserve">by which text information is </w:t>
+      </w:r>
+      <w:r>
+        <w:t xml:space="preserve"> </w:t>
+      </w:r>
+    </w:p>
+    <w:p>
+      <w:pPr>
+        <w:rPr>
+          <w:rFonts w:hint="eastAsia"/>
+        </w:rPr>
+      </w:pPr>
+      <w:r>
+        <w:t xml:space="preserve">      </w:t>
+      </w:r>
+      <w:r>
+        <w:t>compared and sorted.</w:t>
+      </w:r>
+    </w:p>
+    <w:p>
+      <w:pPr>
+        <w:rPr>
+          <w:rFonts w:hint="eastAsia"/>
+        </w:rPr>
+      </w:pPr>
+    </w:p>
+    <w:p>
+      <w:pPr>
+        <w:rPr>
+          <w:rFonts w:hint="eastAsia"/>
+        </w:rPr>
+      </w:pPr>
+      <w:r>
+        <w:t xml:space="preserve">     As specified by XPath 3.1 F&amp;O spec, </w:t>
+      </w:r>
+      <w:r>
+        <w:t xml:space="preserve">implementations of </w:t>
+      </w:r>
+      <w:r>
+        <w:t>following collation</w:t>
+      </w:r>
+      <w:r>
+        <w:t xml:space="preserve">s </w:t>
+      </w:r>
+      <w:r>
+        <w:t xml:space="preserve">are </w:t>
+      </w:r>
+      <w:r>
+        <w:t>available</w:t>
+      </w:r>
+      <w:r>
+        <w:t>:</w:t>
+      </w:r>
+    </w:p>
+    <w:p>
+      <w:pPr>
+        <w:rPr>
+          <w:rFonts w:hint="eastAsia"/>
+        </w:rPr>
+      </w:pPr>
+    </w:p>
+    <w:p>
+      <w:pPr>
+        <w:rPr>
+          <w:rFonts w:hint="eastAsia"/>
+        </w:rPr>
+      </w:pPr>
+      <w:r>
+        <w:t xml:space="preserve">     </w:t>
+      </w:r>
+      <w:r>
+        <w:t>15.1</w:t>
+      </w:r>
+      <w:r>
+        <w:t xml:space="preserve">) </w:t>
+      </w:r>
+      <w:r>
+        <w:rPr>
+          <w:color w:val="000000"/>
+        </w:rPr>
+        <w:t>The Unicode Codepoint Collation</w:t>
+      </w:r>
+    </w:p>
+    <w:p>
+      <w:pPr>
+        <w:rPr>
+          <w:rFonts w:hint="eastAsia"/>
+          <w:color w:val="000000"/>
+        </w:rPr>
+      </w:pPr>
+    </w:p>
+    <w:p>
+      <w:pPr>
+        <w:rPr>
+          <w:rFonts w:hint="eastAsia"/>
+        </w:rPr>
+      </w:pPr>
+      <w:r>
+        <w:t xml:space="preserve">     </w:t>
+      </w:r>
+      <w:r>
+        <w:t>15.2</w:t>
+      </w:r>
+      <w:r>
+        <w:t xml:space="preserve">) </w:t>
+      </w:r>
+      <w:r>
+        <w:rPr>
+          <w:color w:val="000000"/>
+        </w:rPr>
+        <w:t>The Unicode Collation Algorithm</w:t>
+      </w:r>
+    </w:p>
+    <w:p>
+      <w:pPr>
+        <w:rPr>
+          <w:rFonts w:hint="eastAsia"/>
+          <w:color w:val="000000"/>
+        </w:rPr>
+      </w:pPr>
+    </w:p>
+    <w:p>
+      <w:pPr>
+        <w:rPr>
+          <w:rFonts w:hint="eastAsia"/>
+        </w:rPr>
+      </w:pPr>
+      <w:r>
+        <w:rPr>
+          <w:color w:val="000000"/>
+        </w:rPr>
+        <w:t xml:space="preserve">     Support for following collation uri query parameters is available : 'fallback', 'lang', 'strength'</w:t>
+      </w:r>
+    </w:p>
+    <w:p>
+      <w:pPr>
+        <w:rPr>
+          <w:rFonts w:hint="eastAsia"/>
+          <w:color w:val="000000"/>
+        </w:rPr>
+      </w:pPr>
+    </w:p>
+    <w:p>
+      <w:pPr>
+        <w:rPr>
+          <w:rFonts w:hint="eastAsia"/>
+          <w:color w:val="000000"/>
+        </w:rPr>
+      </w:pPr>
+      <w:r>
+        <w:rPr>
+          <w:color w:val="000000"/>
+        </w:rPr>
+        <w:t xml:space="preserve">     For the collation’s query “lang” parameter, all languages as </w:t>
+      </w:r>
+      <w:r>
+        <w:rPr>
+          <w:color w:val="000000"/>
+        </w:rPr>
+        <w:t xml:space="preserve">those </w:t>
+      </w:r>
+      <w:r>
+        <w:rPr>
+          <w:color w:val="000000"/>
+        </w:rPr>
+        <w:t xml:space="preserve">supported by Java’s   </w:t>
+      </w:r>
+    </w:p>
+    <w:p>
+      <w:pPr>
+        <w:rPr>
+          <w:rFonts w:hint="eastAsia"/>
+          <w:color w:val="000000"/>
+        </w:rPr>
+      </w:pPr>
+      <w:r>
+        <w:rPr>
+          <w:color w:val="000000"/>
+        </w:rPr>
+        <w:t xml:space="preserve">     </w:t>
+      </w:r>
+      <w:r>
+        <w:rPr>
+          <w:color w:val="000000"/>
+        </w:rPr>
+        <w:t>‘</w:t>
+      </w:r>
+      <w:r>
+        <w:rPr>
+          <w:rFonts w:hint="eastAsia"/>
+          <w:color w:val="000000"/>
+        </w:rPr>
+        <w:t>java.util.Locale</w:t>
+      </w:r>
+      <w:r>
+        <w:rPr>
+          <w:color w:val="000000"/>
+        </w:rPr>
+        <w:t xml:space="preserve">’ </w:t>
+      </w:r>
+      <w:r>
+        <w:rPr>
+          <w:color w:val="000000"/>
+        </w:rPr>
+        <w:t xml:space="preserve">class are available within Xalan’s XSLT 3.0 implementation (ref,  </w:t>
+      </w:r>
+    </w:p>
+    <w:p>
+      <w:pPr>
+        <w:rPr>
+          <w:rFonts w:hint="eastAsia"/>
+        </w:rPr>
+      </w:pPr>
+      <w:r>
+        <w:rPr>
+          <w:color w:val="000000"/>
+        </w:rPr>
+        <w:t xml:space="preserve">     https://docs.oracle.com/javase/8/docs/api/java/util/Locale.html).</w:t>
+      </w:r>
+    </w:p>
+    <w:p>
+      <w:pPr>
+        <w:rPr>
+          <w:rFonts w:hint="eastAsia"/>
+          <w:color w:val="000000"/>
+        </w:rPr>
+      </w:pPr>
+    </w:p>
+    <w:p>
+      <w:pPr>
+        <w:rPr>
+          <w:rFonts w:hint="eastAsia"/>
+          <w:color w:val="000000"/>
+        </w:rPr>
+      </w:pPr>
+      <w:r>
+        <w:rPr>
+          <w:color w:val="000000"/>
+        </w:rPr>
+        <w:t xml:space="preserve">    </w:t>
+      </w:r>
+      <w:r>
+        <w:rPr>
+          <w:color w:val="000000"/>
+        </w:rPr>
+        <w:t xml:space="preserve"> </w:t>
+      </w:r>
+      <w:r>
+        <w:rPr>
+          <w:color w:val="000000"/>
+        </w:rPr>
+        <w:t xml:space="preserve">For the collation’s query “strength” parameter, following values are supported : 'primary', </w:t>
+      </w:r>
+    </w:p>
+    <w:p>
+      <w:pPr>
+        <w:rPr>
+          <w:rFonts w:hint="eastAsia"/>
+          <w:color w:val="000000"/>
+        </w:rPr>
+      </w:pPr>
+      <w:r>
+        <w:rPr>
+          <w:color w:val="000000"/>
+        </w:rPr>
+        <w:t xml:space="preserve">     'secondary', 'tertiary', 'identical'.   </w:t>
+      </w:r>
+    </w:p>
+    <w:p>
+      <w:pPr>
+        <w:rPr>
+          <w:rFonts w:hint="eastAsia"/>
+          <w:color w:val="000000"/>
+        </w:rPr>
+      </w:pPr>
+    </w:p>
+    <w:p>
+      <w:pPr>
+        <w:rPr>
+          <w:rFonts w:hint="eastAsia"/>
+        </w:rPr>
+      </w:pPr>
+      <w:r>
         <w:lastRenderedPageBreak/>
-        <w:t xml:space="preserve">              xs:date</w:t>
-      </w:r>
-    </w:p>
-    <w:p>
-      <w:pPr>
-        <w:rPr>
-          <w:rFonts w:hint="eastAsia"/>
-        </w:rPr>
-      </w:pPr>
-      <w:r>
-        <w:t xml:space="preserve">              xs:dateTime</w:t>
-      </w:r>
-    </w:p>
-    <w:p>
-      <w:pPr>
-        <w:ind w:left="990" w:hanging="990"/>
-        <w:rPr>
-          <w:rFonts w:hint="eastAsia"/>
-        </w:rPr>
-      </w:pPr>
-      <w:r>
-        <w:t xml:space="preserve">            </w:t>
-      </w:r>
-      <w:r>
-        <w:t xml:space="preserve">  </w:t>
-      </w:r>
-      <w:r>
-        <w:t>xs:time</w:t>
-      </w:r>
-    </w:p>
-    <w:p>
-      <w:pPr>
-        <w:ind w:left="900" w:hanging="900"/>
-        <w:rPr>
-          <w:rFonts w:hint="eastAsia"/>
-        </w:rPr>
-      </w:pPr>
-      <w:r>
-        <w:t xml:space="preserve">              xs:duration</w:t>
-      </w:r>
-    </w:p>
-    <w:p>
-      <w:pPr>
-        <w:rPr>
-          <w:rFonts w:hint="eastAsia"/>
-        </w:rPr>
-      </w:pPr>
-      <w:r>
-        <w:t xml:space="preserve">                   xs:dayTimeDuration</w:t>
-      </w:r>
-    </w:p>
-    <w:p>
-      <w:pPr>
-        <w:rPr>
-          <w:rFonts w:hint="eastAsia"/>
-        </w:rPr>
-      </w:pPr>
-      <w:r>
-        <w:t xml:space="preserve">                   xs:yearMonthDuration</w:t>
-      </w:r>
-    </w:p>
-    <w:p>
-      <w:pPr>
-        <w:ind w:left="990" w:hanging="990"/>
-        <w:rPr>
-          <w:rFonts w:hint="eastAsia"/>
-        </w:rPr>
-      </w:pPr>
-      <w:r>
-        <w:t xml:space="preserve">              xs:g</w:t>
-      </w:r>
-      <w:r>
-        <w:t>Day</w:t>
-      </w:r>
-    </w:p>
-    <w:p>
-      <w:pPr>
-        <w:ind w:left="990" w:hanging="990"/>
-        <w:rPr>
-          <w:rFonts w:hint="eastAsia"/>
-        </w:rPr>
-      </w:pPr>
-      <w:r>
-        <w:t xml:space="preserve">              xs:g</w:t>
-      </w:r>
-      <w:r>
-        <w:t>Month</w:t>
-      </w:r>
-    </w:p>
-    <w:p>
-      <w:pPr>
-        <w:ind w:left="990" w:hanging="990"/>
-        <w:rPr>
-          <w:rFonts w:hint="eastAsia"/>
-        </w:rPr>
-      </w:pPr>
-      <w:r>
-        <w:t xml:space="preserve">              xs:gMonthDay</w:t>
-      </w:r>
-    </w:p>
-    <w:p>
-      <w:pPr>
-        <w:ind w:left="990" w:hanging="990"/>
-        <w:rPr>
-          <w:rFonts w:hint="eastAsia"/>
-        </w:rPr>
-      </w:pPr>
-      <w:r>
-        <w:t xml:space="preserve">              xs:g</w:t>
-      </w:r>
-      <w:r>
-        <w:t>Year</w:t>
-      </w:r>
-    </w:p>
-    <w:p>
-      <w:pPr>
-        <w:ind w:left="990" w:hanging="990"/>
-        <w:rPr>
-          <w:rFonts w:hint="eastAsia"/>
-        </w:rPr>
-      </w:pPr>
-      <w:r>
-        <w:t xml:space="preserve">              xs:</w:t>
-      </w:r>
-      <w:r>
-        <w:t>g</w:t>
-      </w:r>
-      <w:r>
-        <w:t>YearMonth</w:t>
-      </w:r>
-    </w:p>
-    <w:p>
-      <w:pPr>
-        <w:ind w:left="990" w:hanging="990"/>
-        <w:rPr>
-          <w:rFonts w:hint="eastAsia"/>
-        </w:rPr>
-      </w:pPr>
-      <w:r>
-        <w:t xml:space="preserve">              xs:hexBinary</w:t>
-      </w:r>
-    </w:p>
-    <w:p>
-      <w:pPr>
-        <w:ind w:left="990" w:hanging="990"/>
-        <w:rPr>
-          <w:rFonts w:hint="eastAsia"/>
-        </w:rPr>
-      </w:pPr>
-      <w:r>
-        <w:t xml:space="preserve">              xs:QName</w:t>
-      </w:r>
-    </w:p>
-    <w:p>
-      <w:pPr>
-        <w:ind w:left="900" w:hanging="900"/>
-        <w:rPr>
-          <w:rFonts w:hint="eastAsia"/>
-        </w:rPr>
-      </w:pPr>
-      <w:r>
-        <w:t xml:space="preserve">              xs:string</w:t>
-      </w:r>
-    </w:p>
-    <w:p>
-      <w:pPr>
-        <w:ind w:left="990" w:hanging="990"/>
-        <w:rPr>
-          <w:rFonts w:hint="eastAsia"/>
-        </w:rPr>
-      </w:pPr>
-      <w:r>
-        <w:t xml:space="preserve">                  xs:normalizedString</w:t>
-      </w:r>
-    </w:p>
-    <w:p>
-      <w:pPr>
-        <w:ind w:left="990" w:hanging="990"/>
-        <w:rPr>
-          <w:rFonts w:hint="eastAsia"/>
-        </w:rPr>
-      </w:pPr>
-      <w:r>
-        <w:t xml:space="preserve">                  </w:t>
-      </w:r>
-      <w:r>
-        <w:t xml:space="preserve">     </w:t>
-      </w:r>
-      <w:r>
-        <w:t>xs:token</w:t>
-      </w:r>
-    </w:p>
-    <w:p>
-      <w:pPr>
-        <w:ind w:left="990" w:hanging="990"/>
-        <w:rPr>
-          <w:rFonts w:hint="eastAsia"/>
-        </w:rPr>
-      </w:pPr>
-      <w:r>
-        <w:t xml:space="preserve">                             xs:language</w:t>
-      </w:r>
-    </w:p>
-    <w:p>
-      <w:pPr>
-        <w:ind w:left="990" w:hanging="990"/>
-        <w:rPr>
-          <w:rFonts w:hint="eastAsia"/>
-        </w:rPr>
-      </w:pPr>
-      <w:r>
-        <w:t xml:space="preserve">                             xs:Name</w:t>
-      </w:r>
-    </w:p>
-    <w:p>
-      <w:pPr>
-        <w:ind w:left="990" w:hanging="990"/>
-        <w:rPr>
-          <w:rFonts w:hint="eastAsia"/>
-        </w:rPr>
-      </w:pPr>
-      <w:r>
-        <w:t xml:space="preserve">                                  xs:NCName</w:t>
-      </w:r>
-    </w:p>
-    <w:p>
-      <w:pPr>
-        <w:ind w:left="990" w:hanging="990"/>
-        <w:rPr>
-          <w:rFonts w:hint="eastAsia"/>
-        </w:rPr>
-      </w:pPr>
-      <w:r>
-        <w:t xml:space="preserve">                                      xs:ID</w:t>
-      </w:r>
-    </w:p>
-    <w:p>
-      <w:pPr>
-        <w:ind w:left="990" w:hanging="990"/>
-        <w:rPr>
-          <w:rFonts w:hint="eastAsia"/>
-        </w:rPr>
-      </w:pPr>
-      <w:r>
-        <w:t xml:space="preserve">                                      xs:IDREF</w:t>
-      </w:r>
-    </w:p>
-    <w:p>
-      <w:pPr>
-        <w:ind w:left="990" w:hanging="990"/>
-        <w:rPr>
-          <w:rFonts w:hint="eastAsia"/>
-        </w:rPr>
-      </w:pPr>
-      <w:r>
-        <w:t xml:space="preserve">                            xs:NMTOKEN</w:t>
-      </w:r>
-      <w:r>
-        <w:t xml:space="preserve">                      </w:t>
-      </w:r>
-    </w:p>
-    <w:p>
-      <w:pPr>
-        <w:ind w:left="990" w:hanging="990"/>
-        <w:rPr>
-          <w:rFonts w:hint="eastAsia"/>
-        </w:rPr>
-      </w:pPr>
-    </w:p>
-    <w:p>
-      <w:pPr>
-        <w:rPr>
-          <w:rFonts w:hint="eastAsia"/>
-        </w:rPr>
-      </w:pPr>
-    </w:p>
-    <w:p>
-      <w:pPr>
-        <w:rPr>
-          <w:rFonts w:hint="eastAsia"/>
-        </w:rPr>
-      </w:pPr>
-      <w:r>
-        <w:t xml:space="preserve">In addition to above </w:t>
-      </w:r>
-      <w:r>
-        <w:t xml:space="preserve">mentioned </w:t>
-      </w:r>
-      <w:r>
-        <w:t>XML Schema built-in data types,</w:t>
-      </w:r>
-      <w:r>
-        <w:t xml:space="preserve"> a</w:t>
-      </w:r>
-      <w:r>
-        <w:t>n</w:t>
+        <w:t xml:space="preserve">    </w:t>
+      </w:r>
+      <w:r>
+        <w:t>15.3</w:t>
+      </w:r>
+      <w:r>
+        <w:t xml:space="preserve">) </w:t>
+      </w:r>
+      <w:r>
+        <w:rPr>
+          <w:color w:val="000000"/>
+        </w:rPr>
+        <w:t>The HTML ASCII Case-Insensitive Collation</w:t>
       </w:r>
       <w:r>
         <w:t xml:space="preserve"> </w:t>
       </w:r>
-      <w:r>
-        <w:t>XML S</w:t>
-      </w:r>
-      <w:r>
-        <w:t>chema type xs:untyped</w:t>
-      </w:r>
-      <w:r>
-        <w:t xml:space="preserve"> </w:t>
-      </w:r>
-      <w:r>
-        <w:t>specified by XPath 3.1 specification has also been implemented.</w:t>
-      </w:r>
-    </w:p>
-    <w:p>
-      <w:pPr>
-        <w:rPr>
-          <w:rFonts w:hint="eastAsia"/>
-        </w:rPr>
-      </w:pPr>
-    </w:p>
-    <w:p>
-      <w:pPr>
-        <w:rPr>
-          <w:rFonts w:hint="eastAsia"/>
-        </w:rPr>
-      </w:pPr>
-      <w:r>
-        <w:t>15</w:t>
-      </w:r>
-      <w:r>
-        <w:t>)</w:t>
-      </w:r>
-      <w:r>
-        <w:t xml:space="preserve"> Collation support</w:t>
-      </w:r>
-    </w:p>
-    <w:p>
-      <w:pPr>
-        <w:rPr>
-          <w:rFonts w:hint="eastAsia"/>
-        </w:rPr>
-      </w:pPr>
-    </w:p>
-    <w:p>
-      <w:pPr>
-        <w:rPr>
-          <w:rFonts w:hint="eastAsia"/>
-        </w:rPr>
-      </w:pPr>
-      <w:r>
-        <w:t xml:space="preserve">     </w:t>
-      </w:r>
-      <w:r>
-        <w:t xml:space="preserve"> </w:t>
-      </w:r>
-      <w:r>
-        <w:t>Within the context of XSL languages, a</w:t>
-      </w:r>
-      <w:r>
-        <w:t xml:space="preserve"> collation is a method</w:t>
-      </w:r>
-      <w:r>
-        <w:t xml:space="preserve"> </w:t>
-      </w:r>
-      <w:r>
-        <w:t xml:space="preserve">by which text information is </w:t>
-      </w:r>
-      <w:r>
-        <w:t xml:space="preserve"> </w:t>
-      </w:r>
-    </w:p>
-    <w:p>
-      <w:pPr>
-        <w:rPr>
-          <w:rFonts w:hint="eastAsia"/>
-        </w:rPr>
-      </w:pPr>
-      <w:r>
-        <w:t xml:space="preserve">      </w:t>
-      </w:r>
-      <w:r>
-        <w:t>compared and sorted.</w:t>
-      </w:r>
-    </w:p>
-    <w:p>
-      <w:pPr>
-        <w:rPr>
-          <w:rFonts w:hint="eastAsia"/>
-        </w:rPr>
-      </w:pPr>
-    </w:p>
-    <w:p>
-      <w:pPr>
-        <w:rPr>
-          <w:rFonts w:hint="eastAsia"/>
-        </w:rPr>
-      </w:pPr>
-      <w:r>
-        <w:t xml:space="preserve">     As specified by XPath 3.1 F&amp;O spec, </w:t>
-      </w:r>
-      <w:r>
-        <w:t xml:space="preserve">implementations of </w:t>
-      </w:r>
-      <w:r>
-        <w:t>following collation</w:t>
-      </w:r>
-      <w:r>
-        <w:t xml:space="preserve">s </w:t>
-      </w:r>
-      <w:r>
-        <w:t xml:space="preserve">are </w:t>
-      </w:r>
-      <w:r>
-        <w:t>available</w:t>
-      </w:r>
-      <w:r>
-        <w:t>:</w:t>
-      </w:r>
-    </w:p>
-    <w:p>
-      <w:pPr>
-        <w:rPr>
-          <w:rFonts w:hint="eastAsia"/>
-        </w:rPr>
-      </w:pPr>
-    </w:p>
-    <w:p>
-      <w:pPr>
-        <w:rPr>
-          <w:rFonts w:hint="eastAsia"/>
-        </w:rPr>
-      </w:pPr>
-      <w:r>
-        <w:t xml:space="preserve">     </w:t>
-      </w:r>
-      <w:r>
-        <w:t>15.1</w:t>
-      </w:r>
-      <w:r>
-        <w:t xml:space="preserve">) </w:t>
-      </w:r>
-      <w:r>
-        <w:rPr>
-          <w:color w:val="000000"/>
-        </w:rPr>
-        <w:t>The Unicode Codepoint Collation</w:t>
-      </w:r>
-    </w:p>
-    <w:p>
-      <w:pPr>
-        <w:rPr>
-          <w:rFonts w:hint="eastAsia"/>
-          <w:color w:val="000000"/>
-        </w:rPr>
-      </w:pPr>
-    </w:p>
-    <w:p>
-      <w:pPr>
-        <w:rPr>
-          <w:rFonts w:hint="eastAsia"/>
-        </w:rPr>
-      </w:pPr>
-      <w:r>
-        <w:t xml:space="preserve">     </w:t>
-      </w:r>
-      <w:r>
-        <w:t>15.2</w:t>
-      </w:r>
-      <w:r>
-        <w:t xml:space="preserve">) </w:t>
-      </w:r>
-      <w:r>
-        <w:rPr>
-          <w:color w:val="000000"/>
-        </w:rPr>
-        <w:t>The Unicode Collation Algorithm</w:t>
-      </w:r>
-    </w:p>
-    <w:p>
-      <w:pPr>
-        <w:rPr>
-          <w:rFonts w:hint="eastAsia"/>
-          <w:color w:val="000000"/>
-        </w:rPr>
-      </w:pPr>
-    </w:p>
-    <w:p>
-      <w:pPr>
-        <w:rPr>
-          <w:rFonts w:hint="eastAsia"/>
-        </w:rPr>
-      </w:pPr>
-      <w:r>
-        <w:rPr>
-          <w:color w:val="000000"/>
-        </w:rPr>
-        <w:t xml:space="preserve">     Support for following collation uri query parameters is available : 'fallback', 'lang', 'strength'</w:t>
-      </w:r>
-    </w:p>
-    <w:p>
-      <w:pPr>
-        <w:rPr>
-          <w:rFonts w:hint="eastAsia"/>
-          <w:color w:val="000000"/>
-        </w:rPr>
-      </w:pPr>
-    </w:p>
-    <w:p>
-      <w:pPr>
-        <w:rPr>
-          <w:rFonts w:hint="eastAsia"/>
-          <w:color w:val="000000"/>
-        </w:rPr>
-      </w:pPr>
-      <w:r>
-        <w:rPr>
-          <w:color w:val="000000"/>
-        </w:rPr>
-        <w:t xml:space="preserve">     For the collation’s query “lang” parameter, all languages as </w:t>
-      </w:r>
-      <w:r>
-        <w:rPr>
-          <w:color w:val="000000"/>
-        </w:rPr>
-        <w:t xml:space="preserve">those </w:t>
-      </w:r>
-      <w:r>
-        <w:rPr>
-          <w:color w:val="000000"/>
-        </w:rPr>
-        <w:t xml:space="preserve">supported by Java’s   </w:t>
-      </w:r>
-    </w:p>
-    <w:p>
-      <w:pPr>
-        <w:rPr>
-          <w:rFonts w:hint="eastAsia"/>
-          <w:color w:val="000000"/>
-        </w:rPr>
-      </w:pPr>
-      <w:r>
-        <w:rPr>
-          <w:color w:val="000000"/>
-        </w:rPr>
-        <w:t xml:space="preserve">     </w:t>
-      </w:r>
-      <w:r>
-        <w:rPr>
-          <w:color w:val="000000"/>
-        </w:rPr>
-        <w:t>‘</w:t>
-      </w:r>
-      <w:r>
-        <w:rPr>
-          <w:rFonts w:hint="eastAsia"/>
-          <w:color w:val="000000"/>
-        </w:rPr>
-        <w:t>java.util.Locale</w:t>
-      </w:r>
-      <w:r>
-        <w:rPr>
-          <w:color w:val="000000"/>
-        </w:rPr>
-        <w:t xml:space="preserve">’ </w:t>
-      </w:r>
-      <w:r>
-        <w:rPr>
-          <w:color w:val="000000"/>
-        </w:rPr>
-        <w:t xml:space="preserve">class are available within Xalan’s XSLT 3.0 implementation (ref,  </w:t>
-      </w:r>
-    </w:p>
-    <w:p>
-      <w:pPr>
-        <w:rPr>
-          <w:rFonts w:hint="eastAsia"/>
-        </w:rPr>
-      </w:pPr>
-      <w:r>
-        <w:rPr>
-          <w:color w:val="000000"/>
-        </w:rPr>
-        <w:t xml:space="preserve">     https://docs.oracle.com/javase/8/docs/api/java/util/Locale.html).</w:t>
-      </w:r>
-    </w:p>
-    <w:p>
-      <w:pPr>
-        <w:rPr>
-          <w:rFonts w:hint="eastAsia"/>
-          <w:color w:val="000000"/>
-        </w:rPr>
-      </w:pPr>
-    </w:p>
-    <w:p>
-      <w:pPr>
-        <w:rPr>
-          <w:rFonts w:hint="eastAsia"/>
-          <w:color w:val="000000"/>
-        </w:rPr>
-      </w:pPr>
-      <w:r>
-        <w:rPr>
-          <w:color w:val="000000"/>
-        </w:rPr>
-        <w:t xml:space="preserve">    </w:t>
-      </w:r>
-      <w:r>
-        <w:rPr>
-          <w:color w:val="000000"/>
-        </w:rPr>
-        <w:t xml:space="preserve"> </w:t>
-      </w:r>
-      <w:r>
-        <w:rPr>
-          <w:color w:val="000000"/>
-        </w:rPr>
-        <w:t xml:space="preserve">For the collation’s query “strength” parameter, following values are supported : 'primary', </w:t>
-      </w:r>
-    </w:p>
-    <w:p>
-      <w:pPr>
-        <w:rPr>
-          <w:rFonts w:hint="eastAsia"/>
-          <w:color w:val="000000"/>
-        </w:rPr>
-      </w:pPr>
-      <w:r>
-        <w:rPr>
-          <w:color w:val="000000"/>
-        </w:rPr>
-        <w:t xml:space="preserve">     'secondary', 'tertiary', 'identical'.   </w:t>
-      </w:r>
-    </w:p>
-    <w:p>
-      <w:pPr>
-        <w:rPr>
-          <w:rFonts w:hint="eastAsia"/>
-          <w:color w:val="000000"/>
-        </w:rPr>
-      </w:pPr>
-    </w:p>
-    <w:p>
-      <w:pPr>
-        <w:rPr>
-          <w:rFonts w:hint="eastAsia"/>
-        </w:rPr>
-      </w:pPr>
-      <w:r>
-        <w:t xml:space="preserve">    </w:t>
-      </w:r>
-      <w:r>
-        <w:t>15.3</w:t>
-      </w:r>
-      <w:r>
-        <w:t xml:space="preserve">) </w:t>
-      </w:r>
-      <w:r>
-        <w:rPr>
-          <w:color w:val="000000"/>
-        </w:rPr>
-        <w:t>The HTML ASCII Case-Insensitive Collation</w:t>
-      </w:r>
-      <w:r>
-        <w:t xml:space="preserve"> </w:t>
-      </w:r>
-    </w:p>
-    <w:p>
-      <w:pPr>
-        <w:rPr>
-          <w:rFonts w:hint="eastAsia"/>
-        </w:rPr>
-      </w:pPr>
-    </w:p>
-    <w:p>
-      <w:pPr>
-        <w:rPr>
-          <w:rFonts w:hint="eastAsia"/>
-        </w:rPr>
-      </w:pPr>
-      <w:r>
-        <w:lastRenderedPageBreak/>
+    </w:p>
+    <w:p>
+      <w:pPr>
+        <w:rPr>
+          <w:rFonts w:hint="eastAsia"/>
+        </w:rPr>
+      </w:pPr>
+    </w:p>
+    <w:p>
+      <w:pPr>
+        <w:rPr>
+          <w:rFonts w:hint="eastAsia"/>
+        </w:rPr>
+      </w:pPr>
+      <w:r>
         <w:t>16</w:t>
       </w:r>
       <w:r>
@@ -4992,6 +5005,7 @@
         <w:rPr>
           <w:lang w:val="en-IN"/>
         </w:rPr>
+        <w:lastRenderedPageBreak/>
         <w:t xml:space="preserve">     </w:t>
       </w:r>
       <w:r>
@@ -5022,519 +5036,519 @@
         </w:rPr>
       </w:pPr>
       <w:r>
+        <w:t>2) Context functions</w:t>
+      </w:r>
+    </w:p>
+    <w:p>
+      <w:pPr>
+        <w:rPr>
+          <w:rFonts w:hint="eastAsia"/>
+        </w:rPr>
+      </w:pPr>
+    </w:p>
+    <w:p>
+      <w:pPr>
+        <w:rPr>
+          <w:rFonts w:hint="eastAsia"/>
+        </w:rPr>
+      </w:pPr>
+      <w:r>
+        <w:t>fn:current-dateTime</w:t>
+      </w:r>
+    </w:p>
+    <w:p>
+      <w:pPr>
+        <w:rPr>
+          <w:rFonts w:hint="eastAsia"/>
+        </w:rPr>
+      </w:pPr>
+      <w:r>
+        <w:t>fn:current-date</w:t>
+      </w:r>
+    </w:p>
+    <w:p>
+      <w:pPr>
+        <w:rPr>
+          <w:rFonts w:hint="eastAsia"/>
+        </w:rPr>
+      </w:pPr>
+      <w:r>
+        <w:t>fn:current-time</w:t>
+      </w:r>
+    </w:p>
+    <w:p>
+      <w:pPr>
+        <w:rPr>
+          <w:rFonts w:hint="eastAsia"/>
+        </w:rPr>
+      </w:pPr>
+      <w:r>
+        <w:t>fn:implicit-timezone</w:t>
+      </w:r>
+    </w:p>
+    <w:p>
+      <w:pPr>
+        <w:rPr>
+          <w:rFonts w:hint="eastAsia"/>
+        </w:rPr>
+      </w:pPr>
+      <w:r>
+        <w:rPr>
+          <w:rFonts w:hint="eastAsia"/>
+        </w:rPr>
+        <w:t>fn:default-collation</w:t>
+      </w:r>
+    </w:p>
+    <w:p>
+      <w:pPr>
+        <w:rPr>
+          <w:rFonts w:hint="eastAsia"/>
+        </w:rPr>
+      </w:pPr>
+    </w:p>
+    <w:p>
+      <w:pPr>
+        <w:rPr>
+          <w:rFonts w:hint="eastAsia"/>
+        </w:rPr>
+      </w:pPr>
+      <w:r>
+        <w:t>3</w:t>
+      </w:r>
+      <w:r>
+        <w:t>)</w:t>
+      </w:r>
+      <w:r>
+        <w:t xml:space="preserve"> Functions giving access to external information</w:t>
+      </w:r>
+    </w:p>
+    <w:p>
+      <w:pPr>
+        <w:rPr>
+          <w:rFonts w:hint="eastAsia"/>
+        </w:rPr>
+      </w:pPr>
+    </w:p>
+    <w:p>
+      <w:pPr>
+        <w:rPr>
+          <w:rFonts w:hint="eastAsia"/>
+        </w:rPr>
+      </w:pPr>
+      <w:r>
+        <w:t>fn:doc</w:t>
+      </w:r>
+    </w:p>
+    <w:p>
+      <w:pPr>
+        <w:rPr>
+          <w:rFonts w:hint="eastAsia"/>
+        </w:rPr>
+      </w:pPr>
+      <w:r>
+        <w:t>fn:doc-available</w:t>
+      </w:r>
+    </w:p>
+    <w:p>
+      <w:pPr>
+        <w:rPr>
+          <w:rFonts w:hint="eastAsia"/>
+        </w:rPr>
+      </w:pPr>
+      <w:r>
+        <w:t>fn:collection</w:t>
+      </w:r>
+    </w:p>
+    <w:p>
+      <w:pPr>
+        <w:rPr>
+          <w:rFonts w:hint="eastAsia"/>
+        </w:rPr>
+      </w:pPr>
+      <w:r>
+        <w:t>fn:unparsed-text</w:t>
+      </w:r>
+    </w:p>
+    <w:p>
+      <w:pPr>
+        <w:rPr>
+          <w:rFonts w:hint="eastAsia"/>
+        </w:rPr>
+      </w:pPr>
+      <w:r>
+        <w:t>fn:unparsed-text-lines</w:t>
+      </w:r>
+    </w:p>
+    <w:p>
+      <w:pPr>
+        <w:rPr>
+          <w:rFonts w:hint="eastAsia"/>
+        </w:rPr>
+      </w:pPr>
+    </w:p>
+    <w:p>
+      <w:pPr>
+        <w:rPr>
+          <w:rFonts w:hint="eastAsia"/>
+        </w:rPr>
+      </w:pPr>
+      <w:r>
+        <w:t>4</w:t>
+      </w:r>
+      <w:r>
+        <w:t>)</w:t>
+      </w:r>
+      <w:r>
+        <w:t xml:space="preserve"> Functions on strings</w:t>
+      </w:r>
+    </w:p>
+    <w:p>
+      <w:pPr>
+        <w:rPr>
+          <w:rFonts w:hint="eastAsia"/>
+        </w:rPr>
+      </w:pPr>
+    </w:p>
+    <w:p>
+      <w:pPr>
+        <w:rPr>
+          <w:rFonts w:hint="eastAsia"/>
+        </w:rPr>
+      </w:pPr>
+      <w:r>
+        <w:t>fn:string-join</w:t>
+      </w:r>
+    </w:p>
+    <w:p>
+      <w:pPr>
+        <w:rPr>
+          <w:rFonts w:hint="eastAsia"/>
+        </w:rPr>
+      </w:pPr>
+      <w:r>
+        <w:t>fn:upper-case</w:t>
+      </w:r>
+    </w:p>
+    <w:p>
+      <w:pPr>
+        <w:rPr>
+          <w:rFonts w:hint="eastAsia"/>
+        </w:rPr>
+      </w:pPr>
+      <w:r>
+        <w:t>fn:lower-case</w:t>
+      </w:r>
+    </w:p>
+    <w:p>
+      <w:pPr>
+        <w:rPr>
+          <w:rFonts w:hint="eastAsia"/>
+        </w:rPr>
+      </w:pPr>
+      <w:r>
+        <w:t>fn:codepoints-to-string</w:t>
+      </w:r>
+    </w:p>
+    <w:p>
+      <w:pPr>
+        <w:rPr>
+          <w:rFonts w:hint="eastAsia"/>
+        </w:rPr>
+      </w:pPr>
+      <w:r>
+        <w:t>fn:string-to-codepoints</w:t>
+      </w:r>
+    </w:p>
+    <w:p>
+      <w:pPr>
+        <w:rPr>
+          <w:rFonts w:hint="eastAsia"/>
+        </w:rPr>
+      </w:pPr>
+      <w:r>
+        <w:t>fn:compare                           (with support for collation argument)</w:t>
+      </w:r>
+    </w:p>
+    <w:p>
+      <w:pPr>
+        <w:rPr>
+          <w:rFonts w:hint="eastAsia"/>
+        </w:rPr>
+      </w:pPr>
+      <w:r>
+        <w:t>fn:codepoint-equal</w:t>
+      </w:r>
+    </w:p>
+    <w:p>
+      <w:pPr>
+        <w:rPr>
+          <w:rFonts w:hint="eastAsia"/>
+        </w:rPr>
+      </w:pPr>
+      <w:r>
+        <w:t>fn:contains-token                 (with support for collation argument)</w:t>
+      </w:r>
+    </w:p>
+    <w:p>
+      <w:pPr>
+        <w:rPr>
+          <w:rFonts w:hint="eastAsia"/>
+        </w:rPr>
+      </w:pPr>
+      <w:r>
+        <w:t>fn:contains                           (added support for collation argument)</w:t>
+      </w:r>
+    </w:p>
+    <w:p>
+      <w:pPr>
+        <w:rPr>
+          <w:rFonts w:hint="eastAsia"/>
+        </w:rPr>
+      </w:pPr>
+      <w:r>
+        <w:t>fn:starts-with                        (added support for collation argument)</w:t>
+      </w:r>
+    </w:p>
+    <w:p>
+      <w:pPr>
+        <w:rPr>
+          <w:rFonts w:hint="eastAsia"/>
+        </w:rPr>
+      </w:pPr>
+      <w:r>
+        <w:t>fn:ends-with                         (with support for collation argument)</w:t>
+      </w:r>
+    </w:p>
+    <w:p>
+      <w:pPr>
+        <w:rPr>
+          <w:rFonts w:hint="eastAsia"/>
+        </w:rPr>
+      </w:pPr>
+      <w:r>
+        <w:t>fn:substring-before               (added support for collation argument)</w:t>
+      </w:r>
+    </w:p>
+    <w:p>
+      <w:pPr>
+        <w:rPr>
+          <w:rFonts w:hint="eastAsia"/>
+        </w:rPr>
+      </w:pPr>
+      <w:r>
+        <w:t>fn:substring-after                  (added support for collation argument)</w:t>
+      </w:r>
+    </w:p>
+    <w:p>
+      <w:pPr>
+        <w:rPr>
+          <w:rFonts w:hint="eastAsia"/>
+        </w:rPr>
+      </w:pPr>
+    </w:p>
+    <w:p>
+      <w:pPr>
+        <w:rPr>
+          <w:rFonts w:hint="eastAsia"/>
+        </w:rPr>
+      </w:pPr>
+      <w:r>
+        <w:t>5) String functions that use regular expressions</w:t>
+      </w:r>
+    </w:p>
+    <w:p>
+      <w:pPr>
+        <w:rPr>
+          <w:rFonts w:hint="eastAsia"/>
+        </w:rPr>
+      </w:pPr>
+    </w:p>
+    <w:p>
+      <w:pPr>
+        <w:rPr>
+          <w:rFonts w:hint="eastAsia"/>
+        </w:rPr>
+      </w:pPr>
+      <w:r>
+        <w:t xml:space="preserve">fn:matches </w:t>
+      </w:r>
+    </w:p>
+    <w:p>
+      <w:pPr>
+        <w:rPr>
+          <w:rFonts w:hint="eastAsia"/>
+        </w:rPr>
+      </w:pPr>
+      <w:r>
+        <w:t>fn:replace</w:t>
+      </w:r>
+    </w:p>
+    <w:p>
+      <w:pPr>
+        <w:rPr>
+          <w:rFonts w:hint="eastAsia"/>
+        </w:rPr>
+      </w:pPr>
+      <w:r>
+        <w:t>fn:tokenize</w:t>
+      </w:r>
+    </w:p>
+    <w:p>
+      <w:pPr>
+        <w:rPr>
+          <w:rFonts w:hint="eastAsia"/>
+        </w:rPr>
+      </w:pPr>
+      <w:r>
+        <w:t>fn:analyze-string</w:t>
+      </w:r>
+    </w:p>
+    <w:p>
+      <w:pPr>
+        <w:rPr>
+          <w:rFonts w:hint="eastAsia"/>
+        </w:rPr>
+      </w:pPr>
+    </w:p>
+    <w:p>
+      <w:pPr>
+        <w:rPr>
+          <w:rFonts w:hint="eastAsia"/>
+        </w:rPr>
+      </w:pPr>
+      <w:r>
+        <w:t>6</w:t>
+      </w:r>
+      <w:r>
+        <w:t>)</w:t>
+      </w:r>
+      <w:r>
+        <w:t xml:space="preserve"> Functions that compare values in sequences</w:t>
+      </w:r>
+    </w:p>
+    <w:p>
+      <w:pPr>
+        <w:rPr>
+          <w:rFonts w:hint="eastAsia"/>
+        </w:rPr>
+      </w:pPr>
+    </w:p>
+    <w:p>
+      <w:pPr>
+        <w:rPr>
+          <w:rFonts w:hint="eastAsia"/>
+        </w:rPr>
+      </w:pPr>
+      <w:r>
+        <w:t>fn:distinct-values</w:t>
+      </w:r>
+      <w:r>
+        <w:t xml:space="preserve">            </w:t>
+      </w:r>
+      <w:r>
+        <w:t xml:space="preserve">  </w:t>
+      </w:r>
+      <w:r>
+        <w:t xml:space="preserve"> </w:t>
+      </w:r>
+      <w:r>
+        <w:t>(with support for collation argument)</w:t>
+      </w:r>
+    </w:p>
+    <w:p>
+      <w:pPr>
+        <w:rPr>
+          <w:rFonts w:hint="eastAsia"/>
+        </w:rPr>
+      </w:pPr>
+      <w:r>
+        <w:t>fn:index-of</w:t>
+      </w:r>
+      <w:r>
+        <w:t xml:space="preserve">                      </w:t>
+      </w:r>
+      <w:r>
+        <w:t xml:space="preserve">  </w:t>
+      </w:r>
+      <w:r>
+        <w:t xml:space="preserve"> </w:t>
+      </w:r>
+      <w:r>
+        <w:t>(with support for collation argument)</w:t>
+      </w:r>
+    </w:p>
+    <w:p>
+      <w:pPr>
+        <w:rPr>
+          <w:rFonts w:hint="eastAsia"/>
+        </w:rPr>
+      </w:pPr>
+      <w:r>
+        <w:t>fn:deep-equal</w:t>
+      </w:r>
+      <w:r>
+        <w:t xml:space="preserve">                  </w:t>
+      </w:r>
+      <w:r>
+        <w:t xml:space="preserve">  </w:t>
+      </w:r>
+      <w:r>
+        <w:t xml:space="preserve"> </w:t>
+      </w:r>
+      <w:r>
+        <w:t>(with support for collation argument)</w:t>
+      </w:r>
+    </w:p>
+    <w:p>
+      <w:pPr>
+        <w:rPr>
+          <w:rFonts w:hint="eastAsia"/>
+        </w:rPr>
+      </w:pPr>
+    </w:p>
+    <w:p>
+      <w:pPr>
+        <w:rPr>
+          <w:rFonts w:hint="eastAsia"/>
+        </w:rPr>
+      </w:pPr>
+      <w:r>
+        <w:t>7</w:t>
+      </w:r>
+      <w:r>
+        <w:t>)</w:t>
+      </w:r>
+      <w:r>
+        <w:t xml:space="preserve"> </w:t>
+      </w:r>
+      <w:r>
+        <w:t>Math</w:t>
+      </w:r>
+      <w:r>
+        <w:t>s</w:t>
+      </w:r>
+      <w:r>
+        <w:t xml:space="preserve"> t</w:t>
+      </w:r>
+      <w:r>
+        <w:t>rigonometric and exponential functions</w:t>
+      </w:r>
+    </w:p>
+    <w:p>
+      <w:pPr>
+        <w:rPr>
+          <w:rFonts w:hint="eastAsia"/>
+        </w:rPr>
+      </w:pPr>
+    </w:p>
+    <w:p>
+      <w:pPr>
+        <w:rPr>
+          <w:rFonts w:hint="eastAsia"/>
+        </w:rPr>
+      </w:pPr>
+      <w:r>
         <w:lastRenderedPageBreak/>
-        <w:t>2) Context functions</w:t>
-      </w:r>
-    </w:p>
-    <w:p>
-      <w:pPr>
-        <w:rPr>
-          <w:rFonts w:hint="eastAsia"/>
-        </w:rPr>
-      </w:pPr>
-    </w:p>
-    <w:p>
-      <w:pPr>
-        <w:rPr>
-          <w:rFonts w:hint="eastAsia"/>
-        </w:rPr>
-      </w:pPr>
-      <w:r>
-        <w:t>fn:current-dateTime</w:t>
-      </w:r>
-    </w:p>
-    <w:p>
-      <w:pPr>
-        <w:rPr>
-          <w:rFonts w:hint="eastAsia"/>
-        </w:rPr>
-      </w:pPr>
-      <w:r>
-        <w:t>fn:current-date</w:t>
-      </w:r>
-    </w:p>
-    <w:p>
-      <w:pPr>
-        <w:rPr>
-          <w:rFonts w:hint="eastAsia"/>
-        </w:rPr>
-      </w:pPr>
-      <w:r>
-        <w:t>fn:current-time</w:t>
-      </w:r>
-    </w:p>
-    <w:p>
-      <w:pPr>
-        <w:rPr>
-          <w:rFonts w:hint="eastAsia"/>
-        </w:rPr>
-      </w:pPr>
-      <w:r>
-        <w:t>fn:implicit-timezone</w:t>
-      </w:r>
-    </w:p>
-    <w:p>
-      <w:pPr>
-        <w:rPr>
-          <w:rFonts w:hint="eastAsia"/>
-        </w:rPr>
-      </w:pPr>
-      <w:r>
-        <w:rPr>
-          <w:rFonts w:hint="eastAsia"/>
-        </w:rPr>
-        <w:t>fn:default-collation</w:t>
-      </w:r>
-    </w:p>
-    <w:p>
-      <w:pPr>
-        <w:rPr>
-          <w:rFonts w:hint="eastAsia"/>
-        </w:rPr>
-      </w:pPr>
-    </w:p>
-    <w:p>
-      <w:pPr>
-        <w:rPr>
-          <w:rFonts w:hint="eastAsia"/>
-        </w:rPr>
-      </w:pPr>
-      <w:r>
-        <w:t>3</w:t>
-      </w:r>
-      <w:r>
-        <w:t>)</w:t>
-      </w:r>
-      <w:r>
-        <w:t xml:space="preserve"> Functions giving access to external information</w:t>
-      </w:r>
-    </w:p>
-    <w:p>
-      <w:pPr>
-        <w:rPr>
-          <w:rFonts w:hint="eastAsia"/>
-        </w:rPr>
-      </w:pPr>
-    </w:p>
-    <w:p>
-      <w:pPr>
-        <w:rPr>
-          <w:rFonts w:hint="eastAsia"/>
-        </w:rPr>
-      </w:pPr>
-      <w:r>
-        <w:t>fn:doc</w:t>
-      </w:r>
-    </w:p>
-    <w:p>
-      <w:pPr>
-        <w:rPr>
-          <w:rFonts w:hint="eastAsia"/>
-        </w:rPr>
-      </w:pPr>
-      <w:r>
-        <w:t>fn:doc-available</w:t>
-      </w:r>
-    </w:p>
-    <w:p>
-      <w:pPr>
-        <w:rPr>
-          <w:rFonts w:hint="eastAsia"/>
-        </w:rPr>
-      </w:pPr>
-      <w:r>
-        <w:t>fn:collection</w:t>
-      </w:r>
-    </w:p>
-    <w:p>
-      <w:pPr>
-        <w:rPr>
-          <w:rFonts w:hint="eastAsia"/>
-        </w:rPr>
-      </w:pPr>
-      <w:r>
-        <w:t>fn:unparsed-text</w:t>
-      </w:r>
-    </w:p>
-    <w:p>
-      <w:pPr>
-        <w:rPr>
-          <w:rFonts w:hint="eastAsia"/>
-        </w:rPr>
-      </w:pPr>
-      <w:r>
-        <w:t>fn:unparsed-text-lines</w:t>
-      </w:r>
-    </w:p>
-    <w:p>
-      <w:pPr>
-        <w:rPr>
-          <w:rFonts w:hint="eastAsia"/>
-        </w:rPr>
-      </w:pPr>
-    </w:p>
-    <w:p>
-      <w:pPr>
-        <w:rPr>
-          <w:rFonts w:hint="eastAsia"/>
-        </w:rPr>
-      </w:pPr>
-      <w:r>
-        <w:t>4</w:t>
-      </w:r>
-      <w:r>
-        <w:t>)</w:t>
-      </w:r>
-      <w:r>
-        <w:t xml:space="preserve"> Functions on strings</w:t>
-      </w:r>
-    </w:p>
-    <w:p>
-      <w:pPr>
-        <w:rPr>
-          <w:rFonts w:hint="eastAsia"/>
-        </w:rPr>
-      </w:pPr>
-    </w:p>
-    <w:p>
-      <w:pPr>
-        <w:rPr>
-          <w:rFonts w:hint="eastAsia"/>
-        </w:rPr>
-      </w:pPr>
-      <w:r>
-        <w:t>fn:string-join</w:t>
-      </w:r>
-    </w:p>
-    <w:p>
-      <w:pPr>
-        <w:rPr>
-          <w:rFonts w:hint="eastAsia"/>
-        </w:rPr>
-      </w:pPr>
-      <w:r>
-        <w:t>fn:upper-case</w:t>
-      </w:r>
-    </w:p>
-    <w:p>
-      <w:pPr>
-        <w:rPr>
-          <w:rFonts w:hint="eastAsia"/>
-        </w:rPr>
-      </w:pPr>
-      <w:r>
-        <w:t>fn:lower-case</w:t>
-      </w:r>
-    </w:p>
-    <w:p>
-      <w:pPr>
-        <w:rPr>
-          <w:rFonts w:hint="eastAsia"/>
-        </w:rPr>
-      </w:pPr>
-      <w:r>
-        <w:t>fn:codepoints-to-string</w:t>
-      </w:r>
-    </w:p>
-    <w:p>
-      <w:pPr>
-        <w:rPr>
-          <w:rFonts w:hint="eastAsia"/>
-        </w:rPr>
-      </w:pPr>
-      <w:r>
-        <w:t>fn:string-to-codepoints</w:t>
-      </w:r>
-    </w:p>
-    <w:p>
-      <w:pPr>
-        <w:rPr>
-          <w:rFonts w:hint="eastAsia"/>
-        </w:rPr>
-      </w:pPr>
-      <w:r>
-        <w:t>fn:compare                           (with support for collation argument)</w:t>
-      </w:r>
-    </w:p>
-    <w:p>
-      <w:pPr>
-        <w:rPr>
-          <w:rFonts w:hint="eastAsia"/>
-        </w:rPr>
-      </w:pPr>
-      <w:r>
-        <w:t>fn:codepoint-equal</w:t>
-      </w:r>
-    </w:p>
-    <w:p>
-      <w:pPr>
-        <w:rPr>
-          <w:rFonts w:hint="eastAsia"/>
-        </w:rPr>
-      </w:pPr>
-      <w:r>
-        <w:t>fn:contains-token                 (with support for collation argument)</w:t>
-      </w:r>
-    </w:p>
-    <w:p>
-      <w:pPr>
-        <w:rPr>
-          <w:rFonts w:hint="eastAsia"/>
-        </w:rPr>
-      </w:pPr>
-      <w:r>
-        <w:t>fn:contains                           (added support for collation argument)</w:t>
-      </w:r>
-    </w:p>
-    <w:p>
-      <w:pPr>
-        <w:rPr>
-          <w:rFonts w:hint="eastAsia"/>
-        </w:rPr>
-      </w:pPr>
-      <w:r>
-        <w:t>fn:starts-with                        (added support for collation argument)</w:t>
-      </w:r>
-    </w:p>
-    <w:p>
-      <w:pPr>
-        <w:rPr>
-          <w:rFonts w:hint="eastAsia"/>
-        </w:rPr>
-      </w:pPr>
-      <w:r>
-        <w:t>fn:ends-with                         (with support for collation argument)</w:t>
-      </w:r>
-    </w:p>
-    <w:p>
-      <w:pPr>
-        <w:rPr>
-          <w:rFonts w:hint="eastAsia"/>
-        </w:rPr>
-      </w:pPr>
-      <w:r>
-        <w:t>fn:substring-before               (added support for collation argument)</w:t>
-      </w:r>
-    </w:p>
-    <w:p>
-      <w:pPr>
-        <w:rPr>
-          <w:rFonts w:hint="eastAsia"/>
-        </w:rPr>
-      </w:pPr>
-      <w:r>
-        <w:t>fn:substring-after                  (added support for collation argument)</w:t>
-      </w:r>
-    </w:p>
-    <w:p>
-      <w:pPr>
-        <w:rPr>
-          <w:rFonts w:hint="eastAsia"/>
-        </w:rPr>
-      </w:pPr>
-    </w:p>
-    <w:p>
-      <w:pPr>
-        <w:rPr>
-          <w:rFonts w:hint="eastAsia"/>
-        </w:rPr>
-      </w:pPr>
-      <w:r>
-        <w:t>5) String functions that use regular expressions</w:t>
-      </w:r>
-    </w:p>
-    <w:p>
-      <w:pPr>
-        <w:rPr>
-          <w:rFonts w:hint="eastAsia"/>
-        </w:rPr>
-      </w:pPr>
-    </w:p>
-    <w:p>
-      <w:pPr>
-        <w:rPr>
-          <w:rFonts w:hint="eastAsia"/>
-        </w:rPr>
-      </w:pPr>
-      <w:r>
-        <w:t xml:space="preserve">fn:matches </w:t>
-      </w:r>
-    </w:p>
-    <w:p>
-      <w:pPr>
-        <w:rPr>
-          <w:rFonts w:hint="eastAsia"/>
-        </w:rPr>
-      </w:pPr>
-      <w:r>
-        <w:t>fn:replace</w:t>
-      </w:r>
-    </w:p>
-    <w:p>
-      <w:pPr>
-        <w:rPr>
-          <w:rFonts w:hint="eastAsia"/>
-        </w:rPr>
-      </w:pPr>
-      <w:r>
-        <w:t>fn:tokenize</w:t>
-      </w:r>
-    </w:p>
-    <w:p>
-      <w:pPr>
-        <w:rPr>
-          <w:rFonts w:hint="eastAsia"/>
-        </w:rPr>
-      </w:pPr>
-      <w:r>
-        <w:t>fn:analyze-string</w:t>
-      </w:r>
-    </w:p>
-    <w:p>
-      <w:pPr>
-        <w:rPr>
-          <w:rFonts w:hint="eastAsia"/>
-        </w:rPr>
-      </w:pPr>
-    </w:p>
-    <w:p>
-      <w:pPr>
-        <w:rPr>
-          <w:rFonts w:hint="eastAsia"/>
-        </w:rPr>
-      </w:pPr>
-      <w:r>
-        <w:t>6</w:t>
-      </w:r>
-      <w:r>
-        <w:t>)</w:t>
-      </w:r>
-      <w:r>
-        <w:t xml:space="preserve"> Functions that compare values in sequences</w:t>
-      </w:r>
-    </w:p>
-    <w:p>
-      <w:pPr>
-        <w:rPr>
-          <w:rFonts w:hint="eastAsia"/>
-        </w:rPr>
-      </w:pPr>
-    </w:p>
-    <w:p>
-      <w:pPr>
-        <w:rPr>
-          <w:rFonts w:hint="eastAsia"/>
-        </w:rPr>
-      </w:pPr>
-      <w:r>
-        <w:t>fn:distinct-values</w:t>
-      </w:r>
-      <w:r>
-        <w:t xml:space="preserve">            </w:t>
-      </w:r>
-      <w:r>
-        <w:t xml:space="preserve">  </w:t>
-      </w:r>
-      <w:r>
-        <w:t xml:space="preserve"> </w:t>
-      </w:r>
-      <w:r>
-        <w:t>(with support for collation argument)</w:t>
-      </w:r>
-    </w:p>
-    <w:p>
-      <w:pPr>
-        <w:rPr>
-          <w:rFonts w:hint="eastAsia"/>
-        </w:rPr>
-      </w:pPr>
-      <w:r>
-        <w:t>fn:index-of</w:t>
-      </w:r>
-      <w:r>
-        <w:t xml:space="preserve">                      </w:t>
-      </w:r>
-      <w:r>
-        <w:t xml:space="preserve">  </w:t>
-      </w:r>
-      <w:r>
-        <w:t xml:space="preserve"> </w:t>
-      </w:r>
-      <w:r>
-        <w:t>(with support for collation argument)</w:t>
-      </w:r>
-    </w:p>
-    <w:p>
-      <w:pPr>
-        <w:rPr>
-          <w:rFonts w:hint="eastAsia"/>
-        </w:rPr>
-      </w:pPr>
-      <w:r>
-        <w:t>fn:deep-equal</w:t>
-      </w:r>
-      <w:r>
-        <w:t xml:space="preserve">                  </w:t>
-      </w:r>
-      <w:r>
-        <w:t xml:space="preserve">  </w:t>
-      </w:r>
-      <w:r>
-        <w:t xml:space="preserve"> </w:t>
-      </w:r>
-      <w:r>
-        <w:t>(with support for collation argument)</w:t>
-      </w:r>
-    </w:p>
-    <w:p>
-      <w:pPr>
-        <w:rPr>
-          <w:rFonts w:hint="eastAsia"/>
-        </w:rPr>
-      </w:pPr>
-    </w:p>
-    <w:p>
-      <w:pPr>
-        <w:rPr>
-          <w:rFonts w:hint="eastAsia"/>
-        </w:rPr>
-      </w:pPr>
-      <w:r>
-        <w:t>7</w:t>
-      </w:r>
-      <w:r>
-        <w:t>)</w:t>
-      </w:r>
-      <w:r>
-        <w:t xml:space="preserve"> </w:t>
-      </w:r>
-      <w:r>
-        <w:t>Math</w:t>
-      </w:r>
-      <w:r>
-        <w:t>s</w:t>
-      </w:r>
-      <w:r>
-        <w:t xml:space="preserve"> t</w:t>
-      </w:r>
-      <w:r>
-        <w:t>rigonometric and exponential functions</w:t>
-      </w:r>
-    </w:p>
-    <w:p>
-      <w:pPr>
-        <w:rPr>
-          <w:rFonts w:hint="eastAsia"/>
-        </w:rPr>
-      </w:pPr>
-    </w:p>
-    <w:p>
-      <w:pPr>
-        <w:rPr>
-          <w:rFonts w:hint="eastAsia"/>
-        </w:rPr>
-      </w:pPr>
-      <w:r>
         <w:t>math:pi</w:t>
       </w:r>
     </w:p>
@@ -5555,7 +5569,6 @@
         </w:rPr>
       </w:pPr>
       <w:r>
-        <w:lastRenderedPageBreak/>
         <w:t>math:exp10</w:t>
       </w:r>
     </w:p>
@@ -6633,6 +6646,7 @@
         </w:rPr>
       </w:pPr>
       <w:r>
+        <w:lastRenderedPageBreak/>
         <w:t>fn:document-uri</w:t>
       </w:r>
     </w:p>
@@ -6650,7 +6664,6 @@
         </w:rPr>
       </w:pPr>
       <w:r>
-        <w:lastRenderedPageBreak/>
         <w:t>1</w:t>
       </w:r>
       <w:r>
@@ -7157,6 +7170,7 @@
           <w:bCs/>
           <w:szCs w:val="24"/>
         </w:rPr>
+        <w:lastRenderedPageBreak/>
         <w:t xml:space="preserve"> </w:t>
       </w:r>
       <w:r>
@@ -7210,7 +7224,6 @@
           <w:b/>
           <w:bCs/>
         </w:rPr>
-        <w:lastRenderedPageBreak/>
         <w:t xml:space="preserve">XSLT 3.0 </w:t>
       </w:r>
       <w:r>
@@ -7854,6 +7867,7 @@
         </w:rPr>
       </w:pPr>
       <w:r>
+        <w:lastRenderedPageBreak/>
         <w:t xml:space="preserve">Apache Xalan-J </w:t>
       </w:r>
       <w:r>

</xml_diff>

<commit_message>
committing xalan-j xslt 3.0 alpha1 release information
</commit_message>
<xml_diff>
--- a/xalan-j/xsl3/xalanj_xslt3.0_implementation_status.docx
+++ b/xalan-j/xsl3/xalanj_xslt3.0_implementation_status.docx
@@ -170,7 +170,7 @@
           <w:color w:val="404040" w:themeColor="text1" w:themeTint="BF"/>
           <w:lang w:val="en-IN"/>
         </w:rPr>
-        <w:t>2</w:t>
+        <w:t>3</w:t>
       </w:r>
       <w:r>
         <w:rPr>
@@ -184,7 +184,7 @@
           <w:color w:val="404040" w:themeColor="text1" w:themeTint="BF"/>
           <w:lang w:val="en-IN"/>
         </w:rPr>
-        <w:t>15</w:t>
+        <w:t>03</w:t>
       </w:r>
     </w:p>
     <w:p>
@@ -2205,17 +2205,30 @@
           <w:tab w:val="left" w:pos="360"/>
         </w:tabs>
         <w:ind w:hanging="720"/>
+        <w:rPr>
+          <w:rFonts w:hint="eastAsia"/>
+        </w:rPr>
       </w:pPr>
       <w:r>
         <w:t>xsl:sequence instruction</w:t>
       </w:r>
     </w:p>
     <w:p>
+      <w:pPr>
+        <w:rPr>
+          <w:rFonts w:hint="eastAsia"/>
+        </w:rPr>
+      </w:pPr>
       <w:r>
         <w:t xml:space="preserve">      xsl:variable and xsl:param instruction’s attribute “static”</w:t>
       </w:r>
     </w:p>
     <w:p>
+      <w:pPr>
+        <w:rPr>
+          <w:rFonts w:hint="eastAsia"/>
+        </w:rPr>
+      </w:pPr>
       <w:r>
         <w:t xml:space="preserve">      XSL stylesheet instruction attribute “use-when” implementation </w:t>
       </w:r>
@@ -7928,7 +7941,7 @@
         <w:t xml:space="preserve">   Copyright © 1999-202</w:t>
       </w:r>
       <w:r>
-        <w:t>5</w:t>
+        <w:t>6</w:t>
       </w:r>
       <w:r>
         <w:t xml:space="preserve"> The Apache Software Foundation</w:t>

</xml_diff>

<commit_message>
committing updates to xalan-j xslt 3.0 development status document
</commit_message>
<xml_diff>
--- a/xalan-j/xsl3/xalanj_xslt3.0_implementation_status.docx
+++ b/xalan-j/xsl3/xalanj_xslt3.0_implementation_status.docx
@@ -170,7 +170,7 @@
           <w:color w:val="404040" w:themeColor="text1" w:themeTint="BF"/>
           <w:lang w:val="en-IN"/>
         </w:rPr>
-        <w:t>3</w:t>
+        <w:t>4</w:t>
       </w:r>
       <w:r>
         <w:rPr>
@@ -184,7 +184,7 @@
           <w:color w:val="404040" w:themeColor="text1" w:themeTint="BF"/>
           <w:lang w:val="en-IN"/>
         </w:rPr>
-        <w:t>03</w:t>
+        <w:t>17</w:t>
       </w:r>
     </w:p>
     <w:p>
@@ -2210,6 +2210,9 @@
         </w:rPr>
       </w:pPr>
       <w:r>
+        <w:t xml:space="preserve">&gt; </w:t>
+      </w:r>
+      <w:r>
         <w:t>xsl:sequence instruction</w:t>
       </w:r>
     </w:p>
@@ -2220,17 +2223,37 @@
         </w:rPr>
       </w:pPr>
       <w:r>
-        <w:t xml:space="preserve">      xsl:variable and xsl:param instruction’s attribute “static”</w:t>
-      </w:r>
-    </w:p>
-    <w:p>
-      <w:pPr>
-        <w:rPr>
-          <w:rFonts w:hint="eastAsia"/>
-        </w:rPr>
-      </w:pPr>
-      <w:r>
-        <w:t xml:space="preserve">      XSL stylesheet instruction attribute “use-when” implementation </w:t>
+        <w:t xml:space="preserve">      </w:t>
+      </w:r>
+      <w:r>
+        <w:t xml:space="preserve">&gt; </w:t>
+      </w:r>
+      <w:r>
+        <w:t>xsl:variable and xsl:param instruction’s attribute “static”</w:t>
+      </w:r>
+    </w:p>
+    <w:p>
+      <w:r>
+        <w:t xml:space="preserve">      </w:t>
+      </w:r>
+      <w:r>
+        <w:t xml:space="preserve">&gt; </w:t>
+      </w:r>
+      <w:r>
+        <w:t>XSL stylesheet instruction attribute “use-when” implementation</w:t>
+      </w:r>
+    </w:p>
+    <w:p>
+      <w:pPr>
+        <w:rPr>
+          <w:rFonts w:hint="eastAsia"/>
+        </w:rPr>
+      </w:pPr>
+      <w:r>
+        <w:t xml:space="preserve">      &gt; xsl:next-match instruction</w:t>
+      </w:r>
+      <w:r>
+        <w:t xml:space="preserve"> </w:t>
       </w:r>
     </w:p>
     <w:p>
@@ -2540,7 +2563,6 @@
         </w:rPr>
       </w:pPr>
       <w:r>
-        <w:lastRenderedPageBreak/>
         <w:t>xsl:merge instruction</w:t>
       </w:r>
     </w:p>
@@ -2661,7 +2683,19 @@
         </w:rPr>
       </w:pPr>
       <w:r>
-        <w:t xml:space="preserve">Specifying XSL transformation’s initial template name and support for </w:t>
+        <w:t>Specifying XSL transformation’s initial template name</w:t>
+      </w:r>
+      <w:r>
+        <w:t>, or initial function name. Specification</w:t>
+      </w:r>
+      <w:r>
+        <w:t xml:space="preserve"> </w:t>
+      </w:r>
+      <w:r>
+        <w:t xml:space="preserve">of </w:t>
+      </w:r>
+      <w:r>
+        <w:t xml:space="preserve">XSL stylesheet </w:t>
       </w:r>
       <w:r>
         <w:t xml:space="preserve">initial template’s </w:t>
@@ -2748,6 +2782,9 @@
       </w:pPr>
       <w:r>
         <w:t xml:space="preserve">                                                                   fn:current-merge-group, fn:current-merge-key</w:t>
+      </w:r>
+      <w:r>
+        <w:t>, fn:copy-of</w:t>
       </w:r>
     </w:p>
     <w:p>
@@ -3182,7 +3219,6 @@
         </w:rPr>
       </w:pPr>
       <w:r>
-        <w:lastRenderedPageBreak/>
         <w:t>3) Function item "inline function expression"</w:t>
       </w:r>
     </w:p>
@@ -3756,6 +3792,7 @@
         </w:rPr>
       </w:pPr>
       <w:r>
+        <w:lastRenderedPageBreak/>
         <w:t xml:space="preserve">                            xs:negativeInteger</w:t>
       </w:r>
     </w:p>
@@ -3766,7 +3803,6 @@
         </w:rPr>
       </w:pPr>
       <w:r>
-        <w:lastRenderedPageBreak/>
         <w:t xml:space="preserve">               xs:double               </w:t>
       </w:r>
     </w:p>
@@ -4448,7 +4484,6 @@
         </w:rPr>
       </w:pPr>
       <w:r>
-        <w:lastRenderedPageBreak/>
         <w:t xml:space="preserve">    </w:t>
       </w:r>
       <w:r>
@@ -5004,6 +5039,7 @@
         <w:rPr>
           <w:lang w:val="en-IN"/>
         </w:rPr>
+        <w:lastRenderedPageBreak/>
         <w:t>Formatting integer</w:t>
       </w:r>
     </w:p>
@@ -5018,1039 +5054,1062 @@
         <w:rPr>
           <w:lang w:val="en-IN"/>
         </w:rPr>
+        <w:t xml:space="preserve">     </w:t>
+      </w:r>
+      <w:r>
+        <w:rPr>
+          <w:lang w:val="en-IN"/>
+        </w:rPr>
+        <w:t xml:space="preserve"> </w:t>
+      </w:r>
+      <w:r>
+        <w:rPr>
+          <w:lang w:val="en-IN"/>
+        </w:rPr>
+        <w:t xml:space="preserve">fn:format-integer </w:t>
+      </w:r>
+    </w:p>
+    <w:p>
+      <w:pPr>
+        <w:rPr>
+          <w:rFonts w:hint="eastAsia"/>
+          <w:lang w:val="en-IN"/>
+        </w:rPr>
+      </w:pPr>
+    </w:p>
+    <w:p>
+      <w:pPr>
+        <w:rPr>
+          <w:rFonts w:hint="eastAsia"/>
+        </w:rPr>
+      </w:pPr>
+      <w:r>
+        <w:t>2) Context functions</w:t>
+      </w:r>
+    </w:p>
+    <w:p>
+      <w:pPr>
+        <w:rPr>
+          <w:rFonts w:hint="eastAsia"/>
+        </w:rPr>
+      </w:pPr>
+    </w:p>
+    <w:p>
+      <w:pPr>
+        <w:rPr>
+          <w:rFonts w:hint="eastAsia"/>
+        </w:rPr>
+      </w:pPr>
+      <w:r>
+        <w:t>fn:current-dateTime</w:t>
+      </w:r>
+    </w:p>
+    <w:p>
+      <w:pPr>
+        <w:rPr>
+          <w:rFonts w:hint="eastAsia"/>
+        </w:rPr>
+      </w:pPr>
+      <w:r>
+        <w:t>fn:current-date</w:t>
+      </w:r>
+    </w:p>
+    <w:p>
+      <w:pPr>
+        <w:rPr>
+          <w:rFonts w:hint="eastAsia"/>
+        </w:rPr>
+      </w:pPr>
+      <w:r>
+        <w:t>fn:current-time</w:t>
+      </w:r>
+    </w:p>
+    <w:p>
+      <w:pPr>
+        <w:rPr>
+          <w:rFonts w:hint="eastAsia"/>
+        </w:rPr>
+      </w:pPr>
+      <w:r>
+        <w:t>fn:implicit-timezone</w:t>
+      </w:r>
+    </w:p>
+    <w:p>
+      <w:pPr>
+        <w:rPr>
+          <w:rFonts w:hint="eastAsia"/>
+        </w:rPr>
+      </w:pPr>
+      <w:r>
+        <w:rPr>
+          <w:rFonts w:hint="eastAsia"/>
+        </w:rPr>
+        <w:t>fn:default-collation</w:t>
+      </w:r>
+    </w:p>
+    <w:p>
+      <w:pPr>
+        <w:rPr>
+          <w:rFonts w:hint="eastAsia"/>
+        </w:rPr>
+      </w:pPr>
+    </w:p>
+    <w:p>
+      <w:pPr>
+        <w:rPr>
+          <w:rFonts w:hint="eastAsia"/>
+        </w:rPr>
+      </w:pPr>
+      <w:r>
+        <w:t>3</w:t>
+      </w:r>
+      <w:r>
+        <w:t>)</w:t>
+      </w:r>
+      <w:r>
+        <w:t xml:space="preserve"> Functions giving access to external information</w:t>
+      </w:r>
+    </w:p>
+    <w:p>
+      <w:pPr>
+        <w:rPr>
+          <w:rFonts w:hint="eastAsia"/>
+        </w:rPr>
+      </w:pPr>
+    </w:p>
+    <w:p>
+      <w:pPr>
+        <w:rPr>
+          <w:rFonts w:hint="eastAsia"/>
+        </w:rPr>
+      </w:pPr>
+      <w:r>
+        <w:t>fn:doc</w:t>
+      </w:r>
+    </w:p>
+    <w:p>
+      <w:pPr>
+        <w:rPr>
+          <w:rFonts w:hint="eastAsia"/>
+        </w:rPr>
+      </w:pPr>
+      <w:r>
+        <w:t>fn:doc-available</w:t>
+      </w:r>
+    </w:p>
+    <w:p>
+      <w:pPr>
+        <w:rPr>
+          <w:rFonts w:hint="eastAsia"/>
+        </w:rPr>
+      </w:pPr>
+      <w:r>
+        <w:t>fn:collection</w:t>
+      </w:r>
+    </w:p>
+    <w:p>
+      <w:pPr>
+        <w:rPr>
+          <w:rFonts w:hint="eastAsia"/>
+        </w:rPr>
+      </w:pPr>
+      <w:r>
+        <w:t>fn:unparsed-text</w:t>
+      </w:r>
+    </w:p>
+    <w:p>
+      <w:r>
+        <w:t>fn:unparsed-text-lines</w:t>
+      </w:r>
+    </w:p>
+    <w:p>
+      <w:hyperlink r:id="rId11" w:anchor="func-unparsed-text-available" w:history="1">
+        <w:r>
+          <w:t>fn:unparsed-text-available</w:t>
+        </w:r>
+      </w:hyperlink>
+    </w:p>
+    <w:p>
+      <w:r>
+        <w:rPr>
+          <w:rFonts w:hint="eastAsia"/>
+        </w:rPr>
+        <w:t>fn:environment-variable</w:t>
+      </w:r>
+    </w:p>
+    <w:p>
+      <w:pPr>
+        <w:rPr>
+          <w:rFonts w:hint="eastAsia"/>
+        </w:rPr>
+      </w:pPr>
+      <w:r>
+        <w:rPr>
+          <w:rFonts w:hint="eastAsia"/>
+        </w:rPr>
+        <w:t>fn:available-environment-variables</w:t>
+      </w:r>
+    </w:p>
+    <w:p>
+      <w:pPr>
+        <w:rPr>
+          <w:rFonts w:hint="eastAsia"/>
+        </w:rPr>
+      </w:pPr>
+    </w:p>
+    <w:p>
+      <w:pPr>
+        <w:rPr>
+          <w:rFonts w:hint="eastAsia"/>
+        </w:rPr>
+      </w:pPr>
+      <w:r>
+        <w:t>4</w:t>
+      </w:r>
+      <w:r>
+        <w:t>)</w:t>
+      </w:r>
+      <w:r>
+        <w:t xml:space="preserve"> Functions on strings</w:t>
+      </w:r>
+    </w:p>
+    <w:p>
+      <w:pPr>
+        <w:rPr>
+          <w:rFonts w:hint="eastAsia"/>
+        </w:rPr>
+      </w:pPr>
+    </w:p>
+    <w:p>
+      <w:pPr>
+        <w:rPr>
+          <w:rFonts w:hint="eastAsia"/>
+        </w:rPr>
+      </w:pPr>
+      <w:r>
+        <w:t>fn:string-join</w:t>
+      </w:r>
+    </w:p>
+    <w:p>
+      <w:pPr>
+        <w:rPr>
+          <w:rFonts w:hint="eastAsia"/>
+        </w:rPr>
+      </w:pPr>
+      <w:r>
+        <w:t>fn:upper-case</w:t>
+      </w:r>
+    </w:p>
+    <w:p>
+      <w:pPr>
+        <w:rPr>
+          <w:rFonts w:hint="eastAsia"/>
+        </w:rPr>
+      </w:pPr>
+      <w:r>
+        <w:t>fn:lower-case</w:t>
+      </w:r>
+    </w:p>
+    <w:p>
+      <w:pPr>
+        <w:rPr>
+          <w:rFonts w:hint="eastAsia"/>
+        </w:rPr>
+      </w:pPr>
+      <w:r>
+        <w:t>fn:codepoints-to-string</w:t>
+      </w:r>
+    </w:p>
+    <w:p>
+      <w:pPr>
+        <w:rPr>
+          <w:rFonts w:hint="eastAsia"/>
+        </w:rPr>
+      </w:pPr>
+      <w:r>
+        <w:t>fn:string-to-codepoints</w:t>
+      </w:r>
+    </w:p>
+    <w:p>
+      <w:pPr>
+        <w:rPr>
+          <w:rFonts w:hint="eastAsia"/>
+        </w:rPr>
+      </w:pPr>
+      <w:r>
+        <w:t>fn:compare                           (with support for collation argument)</w:t>
+      </w:r>
+    </w:p>
+    <w:p>
+      <w:pPr>
+        <w:rPr>
+          <w:rFonts w:hint="eastAsia"/>
+        </w:rPr>
+      </w:pPr>
+      <w:r>
+        <w:t>fn:codepoint-equal</w:t>
+      </w:r>
+    </w:p>
+    <w:p>
+      <w:pPr>
+        <w:rPr>
+          <w:rFonts w:hint="eastAsia"/>
+        </w:rPr>
+      </w:pPr>
+      <w:r>
+        <w:t>fn:contains-token                 (with support for collation argument)</w:t>
+      </w:r>
+    </w:p>
+    <w:p>
+      <w:pPr>
+        <w:rPr>
+          <w:rFonts w:hint="eastAsia"/>
+        </w:rPr>
+      </w:pPr>
+      <w:r>
+        <w:t>fn:contains                           (added support for collation argument)</w:t>
+      </w:r>
+    </w:p>
+    <w:p>
+      <w:pPr>
+        <w:rPr>
+          <w:rFonts w:hint="eastAsia"/>
+        </w:rPr>
+      </w:pPr>
+      <w:r>
+        <w:t>fn:starts-with                        (added support for collation argument)</w:t>
+      </w:r>
+    </w:p>
+    <w:p>
+      <w:pPr>
+        <w:rPr>
+          <w:rFonts w:hint="eastAsia"/>
+        </w:rPr>
+      </w:pPr>
+      <w:r>
+        <w:t>fn:ends-with                         (with support for collation argument)</w:t>
+      </w:r>
+    </w:p>
+    <w:p>
+      <w:pPr>
+        <w:rPr>
+          <w:rFonts w:hint="eastAsia"/>
+        </w:rPr>
+      </w:pPr>
+      <w:r>
+        <w:t>fn:substring-before               (added support for collation argument)</w:t>
+      </w:r>
+    </w:p>
+    <w:p>
+      <w:pPr>
+        <w:rPr>
+          <w:rFonts w:hint="eastAsia"/>
+        </w:rPr>
+      </w:pPr>
+      <w:r>
+        <w:t>fn:substring-after                  (added support for collation argument)</w:t>
+      </w:r>
+    </w:p>
+    <w:p>
+      <w:pPr>
+        <w:rPr>
+          <w:rFonts w:hint="eastAsia"/>
+        </w:rPr>
+      </w:pPr>
+    </w:p>
+    <w:p>
+      <w:pPr>
+        <w:rPr>
+          <w:rFonts w:hint="eastAsia"/>
+        </w:rPr>
+      </w:pPr>
+      <w:r>
+        <w:t>5) String functions that use regular expressions</w:t>
+      </w:r>
+    </w:p>
+    <w:p>
+      <w:pPr>
+        <w:rPr>
+          <w:rFonts w:hint="eastAsia"/>
+        </w:rPr>
+      </w:pPr>
+    </w:p>
+    <w:p>
+      <w:pPr>
+        <w:rPr>
+          <w:rFonts w:hint="eastAsia"/>
+        </w:rPr>
+      </w:pPr>
+      <w:r>
+        <w:t xml:space="preserve">fn:matches </w:t>
+      </w:r>
+    </w:p>
+    <w:p>
+      <w:pPr>
+        <w:rPr>
+          <w:rFonts w:hint="eastAsia"/>
+        </w:rPr>
+      </w:pPr>
+      <w:r>
+        <w:t>fn:replace</w:t>
+      </w:r>
+    </w:p>
+    <w:p>
+      <w:pPr>
+        <w:rPr>
+          <w:rFonts w:hint="eastAsia"/>
+        </w:rPr>
+      </w:pPr>
+      <w:r>
+        <w:t>fn:tokenize</w:t>
+      </w:r>
+    </w:p>
+    <w:p>
+      <w:pPr>
+        <w:rPr>
+          <w:rFonts w:hint="eastAsia"/>
+        </w:rPr>
+      </w:pPr>
+      <w:r>
+        <w:t>fn:analyze-string</w:t>
+      </w:r>
+    </w:p>
+    <w:p>
+      <w:pPr>
+        <w:rPr>
+          <w:rFonts w:hint="eastAsia"/>
+        </w:rPr>
+      </w:pPr>
+    </w:p>
+    <w:p>
+      <w:pPr>
+        <w:rPr>
+          <w:rFonts w:hint="eastAsia"/>
+        </w:rPr>
+      </w:pPr>
+      <w:r>
+        <w:t>6</w:t>
+      </w:r>
+      <w:r>
+        <w:t>)</w:t>
+      </w:r>
+      <w:r>
+        <w:t xml:space="preserve"> Functions that compare values in sequences</w:t>
+      </w:r>
+    </w:p>
+    <w:p>
+      <w:pPr>
+        <w:rPr>
+          <w:rFonts w:hint="eastAsia"/>
+        </w:rPr>
+      </w:pPr>
+    </w:p>
+    <w:p>
+      <w:pPr>
+        <w:rPr>
+          <w:rFonts w:hint="eastAsia"/>
+        </w:rPr>
+      </w:pPr>
+      <w:r>
+        <w:t>fn:distinct-values</w:t>
+      </w:r>
+      <w:r>
+        <w:t xml:space="preserve">            </w:t>
+      </w:r>
+      <w:r>
+        <w:t xml:space="preserve">  </w:t>
+      </w:r>
+      <w:r>
+        <w:t xml:space="preserve"> </w:t>
+      </w:r>
+      <w:r>
+        <w:t>(with support for collation argument)</w:t>
+      </w:r>
+    </w:p>
+    <w:p>
+      <w:pPr>
+        <w:rPr>
+          <w:rFonts w:hint="eastAsia"/>
+        </w:rPr>
+      </w:pPr>
+      <w:r>
+        <w:t>fn:index-of</w:t>
+      </w:r>
+      <w:r>
+        <w:t xml:space="preserve">                      </w:t>
+      </w:r>
+      <w:r>
+        <w:t xml:space="preserve">  </w:t>
+      </w:r>
+      <w:r>
+        <w:t xml:space="preserve"> </w:t>
+      </w:r>
+      <w:r>
+        <w:t>(with support for collation argument)</w:t>
+      </w:r>
+    </w:p>
+    <w:p>
+      <w:pPr>
+        <w:rPr>
+          <w:rFonts w:hint="eastAsia"/>
+        </w:rPr>
+      </w:pPr>
+      <w:r>
         <w:lastRenderedPageBreak/>
-        <w:t xml:space="preserve">     </w:t>
-      </w:r>
-      <w:r>
-        <w:rPr>
-          <w:lang w:val="en-IN"/>
-        </w:rPr>
+        <w:t>fn:deep-equal</w:t>
+      </w:r>
+      <w:r>
+        <w:t xml:space="preserve">                  </w:t>
+      </w:r>
+      <w:r>
+        <w:t xml:space="preserve">  </w:t>
+      </w:r>
+      <w:r>
         <w:t xml:space="preserve"> </w:t>
       </w:r>
       <w:r>
-        <w:rPr>
-          <w:lang w:val="en-IN"/>
-        </w:rPr>
-        <w:t xml:space="preserve">fn:format-integer </w:t>
-      </w:r>
-    </w:p>
-    <w:p>
-      <w:pPr>
-        <w:rPr>
-          <w:rFonts w:hint="eastAsia"/>
-          <w:lang w:val="en-IN"/>
-        </w:rPr>
-      </w:pPr>
-    </w:p>
-    <w:p>
-      <w:pPr>
-        <w:rPr>
-          <w:rFonts w:hint="eastAsia"/>
-        </w:rPr>
-      </w:pPr>
-      <w:r>
-        <w:t>2) Context functions</w:t>
-      </w:r>
-    </w:p>
-    <w:p>
-      <w:pPr>
-        <w:rPr>
-          <w:rFonts w:hint="eastAsia"/>
-        </w:rPr>
-      </w:pPr>
-    </w:p>
-    <w:p>
-      <w:pPr>
-        <w:rPr>
-          <w:rFonts w:hint="eastAsia"/>
-        </w:rPr>
-      </w:pPr>
-      <w:r>
-        <w:t>fn:current-dateTime</w:t>
-      </w:r>
-    </w:p>
-    <w:p>
-      <w:pPr>
-        <w:rPr>
-          <w:rFonts w:hint="eastAsia"/>
-        </w:rPr>
-      </w:pPr>
-      <w:r>
-        <w:t>fn:current-date</w:t>
-      </w:r>
-    </w:p>
-    <w:p>
-      <w:pPr>
-        <w:rPr>
-          <w:rFonts w:hint="eastAsia"/>
-        </w:rPr>
-      </w:pPr>
-      <w:r>
-        <w:t>fn:current-time</w:t>
-      </w:r>
-    </w:p>
-    <w:p>
-      <w:pPr>
-        <w:rPr>
-          <w:rFonts w:hint="eastAsia"/>
-        </w:rPr>
-      </w:pPr>
-      <w:r>
-        <w:t>fn:implicit-timezone</w:t>
-      </w:r>
-    </w:p>
-    <w:p>
-      <w:pPr>
-        <w:rPr>
-          <w:rFonts w:hint="eastAsia"/>
-        </w:rPr>
-      </w:pPr>
-      <w:r>
-        <w:rPr>
-          <w:rFonts w:hint="eastAsia"/>
-        </w:rPr>
-        <w:t>fn:default-collation</w:t>
-      </w:r>
-    </w:p>
-    <w:p>
-      <w:pPr>
-        <w:rPr>
-          <w:rFonts w:hint="eastAsia"/>
-        </w:rPr>
-      </w:pPr>
-    </w:p>
-    <w:p>
-      <w:pPr>
-        <w:rPr>
-          <w:rFonts w:hint="eastAsia"/>
-        </w:rPr>
-      </w:pPr>
-      <w:r>
-        <w:t>3</w:t>
+        <w:t>(with support for collation argument)</w:t>
+      </w:r>
+    </w:p>
+    <w:p>
+      <w:pPr>
+        <w:rPr>
+          <w:rFonts w:hint="eastAsia"/>
+        </w:rPr>
+      </w:pPr>
+    </w:p>
+    <w:p>
+      <w:pPr>
+        <w:rPr>
+          <w:rFonts w:hint="eastAsia"/>
+        </w:rPr>
+      </w:pPr>
+      <w:r>
+        <w:t>7</w:t>
       </w:r>
       <w:r>
         <w:t>)</w:t>
       </w:r>
       <w:r>
-        <w:t xml:space="preserve"> Functions giving access to external information</w:t>
-      </w:r>
-    </w:p>
-    <w:p>
-      <w:pPr>
-        <w:rPr>
-          <w:rFonts w:hint="eastAsia"/>
-        </w:rPr>
-      </w:pPr>
-    </w:p>
-    <w:p>
-      <w:pPr>
-        <w:rPr>
-          <w:rFonts w:hint="eastAsia"/>
-        </w:rPr>
-      </w:pPr>
-      <w:r>
-        <w:t>fn:doc</w:t>
-      </w:r>
-    </w:p>
-    <w:p>
-      <w:pPr>
-        <w:rPr>
-          <w:rFonts w:hint="eastAsia"/>
-        </w:rPr>
-      </w:pPr>
-      <w:r>
-        <w:t>fn:doc-available</w:t>
-      </w:r>
-    </w:p>
-    <w:p>
-      <w:pPr>
-        <w:rPr>
-          <w:rFonts w:hint="eastAsia"/>
-        </w:rPr>
-      </w:pPr>
-      <w:r>
-        <w:t>fn:collection</w:t>
-      </w:r>
-    </w:p>
-    <w:p>
-      <w:pPr>
-        <w:rPr>
-          <w:rFonts w:hint="eastAsia"/>
-        </w:rPr>
-      </w:pPr>
-      <w:r>
-        <w:t>fn:unparsed-text</w:t>
-      </w:r>
-    </w:p>
-    <w:p>
-      <w:pPr>
-        <w:rPr>
-          <w:rFonts w:hint="eastAsia"/>
-        </w:rPr>
-      </w:pPr>
-      <w:r>
-        <w:t>fn:unparsed-text-lines</w:t>
-      </w:r>
-    </w:p>
-    <w:p>
-      <w:pPr>
-        <w:rPr>
-          <w:rFonts w:hint="eastAsia"/>
-        </w:rPr>
-      </w:pPr>
-    </w:p>
-    <w:p>
-      <w:pPr>
-        <w:rPr>
-          <w:rFonts w:hint="eastAsia"/>
-        </w:rPr>
-      </w:pPr>
-      <w:r>
-        <w:t>4</w:t>
+        <w:t xml:space="preserve"> </w:t>
+      </w:r>
+      <w:r>
+        <w:t>Math</w:t>
+      </w:r>
+      <w:r>
+        <w:t>s</w:t>
+      </w:r>
+      <w:r>
+        <w:t xml:space="preserve"> t</w:t>
+      </w:r>
+      <w:r>
+        <w:t>rigonometric and exponential functions</w:t>
+      </w:r>
+    </w:p>
+    <w:p>
+      <w:pPr>
+        <w:rPr>
+          <w:rFonts w:hint="eastAsia"/>
+        </w:rPr>
+      </w:pPr>
+    </w:p>
+    <w:p>
+      <w:pPr>
+        <w:rPr>
+          <w:rFonts w:hint="eastAsia"/>
+        </w:rPr>
+      </w:pPr>
+      <w:r>
+        <w:t>math:pi</w:t>
+      </w:r>
+    </w:p>
+    <w:p>
+      <w:pPr>
+        <w:rPr>
+          <w:rFonts w:hint="eastAsia"/>
+        </w:rPr>
+      </w:pPr>
+      <w:r>
+        <w:t>math:exp</w:t>
+      </w:r>
+    </w:p>
+    <w:p>
+      <w:pPr>
+        <w:rPr>
+          <w:rFonts w:hint="eastAsia"/>
+        </w:rPr>
+      </w:pPr>
+      <w:r>
+        <w:t>math:exp10</w:t>
+      </w:r>
+    </w:p>
+    <w:p>
+      <w:pPr>
+        <w:rPr>
+          <w:rFonts w:hint="eastAsia"/>
+        </w:rPr>
+      </w:pPr>
+      <w:r>
+        <w:t>math:log</w:t>
+      </w:r>
+    </w:p>
+    <w:p>
+      <w:pPr>
+        <w:rPr>
+          <w:rFonts w:hint="eastAsia"/>
+        </w:rPr>
+      </w:pPr>
+      <w:r>
+        <w:t>math:log10</w:t>
+      </w:r>
+    </w:p>
+    <w:p>
+      <w:pPr>
+        <w:rPr>
+          <w:rFonts w:hint="eastAsia"/>
+        </w:rPr>
+      </w:pPr>
+      <w:r>
+        <w:t>math:pow</w:t>
+      </w:r>
+    </w:p>
+    <w:p>
+      <w:pPr>
+        <w:rPr>
+          <w:rFonts w:hint="eastAsia"/>
+        </w:rPr>
+      </w:pPr>
+      <w:r>
+        <w:t>math:sqrt</w:t>
+      </w:r>
+    </w:p>
+    <w:p>
+      <w:pPr>
+        <w:rPr>
+          <w:rFonts w:hint="eastAsia"/>
+        </w:rPr>
+      </w:pPr>
+      <w:r>
+        <w:t>math:sin</w:t>
+      </w:r>
+    </w:p>
+    <w:p>
+      <w:pPr>
+        <w:rPr>
+          <w:rFonts w:hint="eastAsia"/>
+        </w:rPr>
+      </w:pPr>
+      <w:r>
+        <w:t>math:cos</w:t>
+      </w:r>
+    </w:p>
+    <w:p>
+      <w:pPr>
+        <w:rPr>
+          <w:rFonts w:hint="eastAsia"/>
+        </w:rPr>
+      </w:pPr>
+      <w:r>
+        <w:t>math:tan</w:t>
+      </w:r>
+    </w:p>
+    <w:p>
+      <w:pPr>
+        <w:rPr>
+          <w:rFonts w:hint="eastAsia"/>
+        </w:rPr>
+      </w:pPr>
+      <w:r>
+        <w:t>math:asin</w:t>
+      </w:r>
+    </w:p>
+    <w:p>
+      <w:pPr>
+        <w:rPr>
+          <w:rFonts w:hint="eastAsia"/>
+        </w:rPr>
+      </w:pPr>
+      <w:r>
+        <w:t>math:acos</w:t>
+      </w:r>
+    </w:p>
+    <w:p>
+      <w:pPr>
+        <w:rPr>
+          <w:rFonts w:hint="eastAsia"/>
+        </w:rPr>
+      </w:pPr>
+      <w:r>
+        <w:t>math:atan</w:t>
+      </w:r>
+    </w:p>
+    <w:p>
+      <w:pPr>
+        <w:rPr>
+          <w:rFonts w:hint="eastAsia"/>
+        </w:rPr>
+      </w:pPr>
+      <w:r>
+        <w:t>math:atan2</w:t>
+      </w:r>
+    </w:p>
+    <w:p>
+      <w:pPr>
+        <w:rPr>
+          <w:rFonts w:hint="eastAsia"/>
+        </w:rPr>
+      </w:pPr>
+    </w:p>
+    <w:p>
+      <w:pPr>
+        <w:rPr>
+          <w:rFonts w:hint="eastAsia"/>
+        </w:rPr>
+      </w:pPr>
+      <w:r>
+        <w:t xml:space="preserve">8) </w:t>
+      </w:r>
+      <w:r>
+        <w:t>Random numbers</w:t>
+      </w:r>
+    </w:p>
+    <w:p>
+      <w:pPr>
+        <w:rPr>
+          <w:rFonts w:hint="eastAsia"/>
+        </w:rPr>
+      </w:pPr>
+    </w:p>
+    <w:p>
+      <w:pPr>
+        <w:rPr>
+          <w:rFonts w:hint="eastAsia"/>
+        </w:rPr>
+      </w:pPr>
+      <w:r>
+        <w:t>fn:random-number-generator</w:t>
+      </w:r>
+    </w:p>
+    <w:p>
+      <w:pPr>
+        <w:rPr>
+          <w:rFonts w:hint="eastAsia"/>
+        </w:rPr>
+      </w:pPr>
+    </w:p>
+    <w:p>
+      <w:pPr>
+        <w:rPr>
+          <w:rFonts w:hint="eastAsia"/>
+        </w:rPr>
+      </w:pPr>
+      <w:r>
+        <w:t>9</w:t>
       </w:r>
       <w:r>
         <w:t>)</w:t>
       </w:r>
       <w:r>
-        <w:t xml:space="preserve"> Functions on strings</w:t>
-      </w:r>
-    </w:p>
-    <w:p>
-      <w:pPr>
-        <w:rPr>
-          <w:rFonts w:hint="eastAsia"/>
-        </w:rPr>
-      </w:pPr>
-    </w:p>
-    <w:p>
-      <w:pPr>
-        <w:rPr>
-          <w:rFonts w:hint="eastAsia"/>
-        </w:rPr>
-      </w:pPr>
-      <w:r>
-        <w:t>fn:string-join</w:t>
-      </w:r>
-    </w:p>
-    <w:p>
-      <w:pPr>
-        <w:rPr>
-          <w:rFonts w:hint="eastAsia"/>
-        </w:rPr>
-      </w:pPr>
-      <w:r>
-        <w:t>fn:upper-case</w:t>
-      </w:r>
-    </w:p>
-    <w:p>
-      <w:pPr>
-        <w:rPr>
-          <w:rFonts w:hint="eastAsia"/>
-        </w:rPr>
-      </w:pPr>
-      <w:r>
-        <w:t>fn:lower-case</w:t>
-      </w:r>
-    </w:p>
-    <w:p>
-      <w:pPr>
-        <w:rPr>
-          <w:rFonts w:hint="eastAsia"/>
-        </w:rPr>
-      </w:pPr>
-      <w:r>
-        <w:t>fn:codepoints-to-string</w:t>
-      </w:r>
-    </w:p>
-    <w:p>
-      <w:pPr>
-        <w:rPr>
-          <w:rFonts w:hint="eastAsia"/>
-        </w:rPr>
-      </w:pPr>
-      <w:r>
-        <w:t>fn:string-to-codepoints</w:t>
-      </w:r>
-    </w:p>
-    <w:p>
-      <w:pPr>
-        <w:rPr>
-          <w:rFonts w:hint="eastAsia"/>
-        </w:rPr>
-      </w:pPr>
-      <w:r>
-        <w:t>fn:compare                           (with support for collation argument)</w:t>
-      </w:r>
-    </w:p>
-    <w:p>
-      <w:pPr>
-        <w:rPr>
-          <w:rFonts w:hint="eastAsia"/>
-        </w:rPr>
-      </w:pPr>
-      <w:r>
-        <w:t>fn:codepoint-equal</w:t>
-      </w:r>
-    </w:p>
-    <w:p>
-      <w:pPr>
-        <w:rPr>
-          <w:rFonts w:hint="eastAsia"/>
-        </w:rPr>
-      </w:pPr>
-      <w:r>
-        <w:t>fn:contains-token                 (with support for collation argument)</w:t>
-      </w:r>
-    </w:p>
-    <w:p>
-      <w:pPr>
-        <w:rPr>
-          <w:rFonts w:hint="eastAsia"/>
-        </w:rPr>
-      </w:pPr>
-      <w:r>
-        <w:t>fn:contains                           (added support for collation argument)</w:t>
-      </w:r>
-    </w:p>
-    <w:p>
-      <w:pPr>
-        <w:rPr>
-          <w:rFonts w:hint="eastAsia"/>
-        </w:rPr>
-      </w:pPr>
-      <w:r>
-        <w:t>fn:starts-with                        (added support for collation argument)</w:t>
-      </w:r>
-    </w:p>
-    <w:p>
-      <w:pPr>
-        <w:rPr>
-          <w:rFonts w:hint="eastAsia"/>
-        </w:rPr>
-      </w:pPr>
-      <w:r>
-        <w:t>fn:ends-with                         (with support for collation argument)</w:t>
-      </w:r>
-    </w:p>
-    <w:p>
-      <w:pPr>
-        <w:rPr>
-          <w:rFonts w:hint="eastAsia"/>
-        </w:rPr>
-      </w:pPr>
-      <w:r>
-        <w:t>fn:substring-before               (added support for collation argument)</w:t>
-      </w:r>
-    </w:p>
-    <w:p>
-      <w:pPr>
-        <w:rPr>
-          <w:rFonts w:hint="eastAsia"/>
-        </w:rPr>
-      </w:pPr>
-      <w:r>
-        <w:t>fn:substring-after                  (added support for collation argument)</w:t>
-      </w:r>
-    </w:p>
-    <w:p>
-      <w:pPr>
-        <w:rPr>
-          <w:rFonts w:hint="eastAsia"/>
-        </w:rPr>
-      </w:pPr>
-    </w:p>
-    <w:p>
-      <w:pPr>
-        <w:rPr>
-          <w:rFonts w:hint="eastAsia"/>
-        </w:rPr>
-      </w:pPr>
-      <w:r>
-        <w:t>5) String functions that use regular expressions</w:t>
-      </w:r>
-    </w:p>
-    <w:p>
-      <w:pPr>
-        <w:rPr>
-          <w:rFonts w:hint="eastAsia"/>
-        </w:rPr>
-      </w:pPr>
-    </w:p>
-    <w:p>
-      <w:pPr>
-        <w:rPr>
-          <w:rFonts w:hint="eastAsia"/>
-        </w:rPr>
-      </w:pPr>
-      <w:r>
-        <w:t xml:space="preserve">fn:matches </w:t>
-      </w:r>
-    </w:p>
-    <w:p>
-      <w:pPr>
-        <w:rPr>
-          <w:rFonts w:hint="eastAsia"/>
-        </w:rPr>
-      </w:pPr>
-      <w:r>
-        <w:t>fn:replace</w:t>
-      </w:r>
-    </w:p>
-    <w:p>
-      <w:pPr>
-        <w:rPr>
-          <w:rFonts w:hint="eastAsia"/>
-        </w:rPr>
-      </w:pPr>
-      <w:r>
-        <w:t>fn:tokenize</w:t>
-      </w:r>
-    </w:p>
-    <w:p>
-      <w:pPr>
-        <w:rPr>
-          <w:rFonts w:hint="eastAsia"/>
-        </w:rPr>
-      </w:pPr>
-      <w:r>
-        <w:t>fn:analyze-string</w:t>
-      </w:r>
-    </w:p>
-    <w:p>
-      <w:pPr>
-        <w:rPr>
-          <w:rFonts w:hint="eastAsia"/>
-        </w:rPr>
-      </w:pPr>
-    </w:p>
-    <w:p>
-      <w:pPr>
-        <w:rPr>
-          <w:rFonts w:hint="eastAsia"/>
-        </w:rPr>
-      </w:pPr>
-      <w:r>
-        <w:t>6</w:t>
+        <w:t xml:space="preserve"> Component extraction functions on durations</w:t>
+      </w:r>
+    </w:p>
+    <w:p>
+      <w:pPr>
+        <w:rPr>
+          <w:rFonts w:hint="eastAsia"/>
+        </w:rPr>
+      </w:pPr>
+    </w:p>
+    <w:p>
+      <w:pPr>
+        <w:rPr>
+          <w:rFonts w:hint="eastAsia"/>
+        </w:rPr>
+      </w:pPr>
+      <w:r>
+        <w:t>fn:years-from-duration</w:t>
+      </w:r>
+    </w:p>
+    <w:p>
+      <w:pPr>
+        <w:rPr>
+          <w:rFonts w:hint="eastAsia"/>
+        </w:rPr>
+      </w:pPr>
+      <w:r>
+        <w:t>fn:months-from-duration</w:t>
+      </w:r>
+    </w:p>
+    <w:p>
+      <w:pPr>
+        <w:rPr>
+          <w:rFonts w:hint="eastAsia"/>
+        </w:rPr>
+      </w:pPr>
+      <w:r>
+        <w:t>fn:days-from-duration</w:t>
+      </w:r>
+    </w:p>
+    <w:p>
+      <w:pPr>
+        <w:rPr>
+          <w:rFonts w:hint="eastAsia"/>
+        </w:rPr>
+      </w:pPr>
+      <w:r>
+        <w:t>fn:hours-from-duration</w:t>
+      </w:r>
+    </w:p>
+    <w:p>
+      <w:pPr>
+        <w:rPr>
+          <w:rFonts w:hint="eastAsia"/>
+        </w:rPr>
+      </w:pPr>
+      <w:r>
+        <w:t>fn:minutes-from-duration</w:t>
+      </w:r>
+    </w:p>
+    <w:p>
+      <w:pPr>
+        <w:rPr>
+          <w:rFonts w:hint="eastAsia"/>
+        </w:rPr>
+      </w:pPr>
+      <w:r>
+        <w:t>fn:seconds-from-duration</w:t>
+      </w:r>
+    </w:p>
+    <w:p>
+      <w:pPr>
+        <w:rPr>
+          <w:rFonts w:hint="eastAsia"/>
+        </w:rPr>
+      </w:pPr>
+    </w:p>
+    <w:p>
+      <w:pPr>
+        <w:rPr>
+          <w:rFonts w:hint="eastAsia"/>
+        </w:rPr>
+      </w:pPr>
+      <w:r>
+        <w:t>10</w:t>
       </w:r>
       <w:r>
         <w:t>)</w:t>
       </w:r>
       <w:r>
-        <w:t xml:space="preserve"> Functions that compare values in sequences</w:t>
-      </w:r>
-    </w:p>
-    <w:p>
-      <w:pPr>
-        <w:rPr>
-          <w:rFonts w:hint="eastAsia"/>
-        </w:rPr>
-      </w:pPr>
-    </w:p>
-    <w:p>
-      <w:pPr>
-        <w:rPr>
-          <w:rFonts w:hint="eastAsia"/>
-        </w:rPr>
-      </w:pPr>
-      <w:r>
-        <w:t>fn:distinct-values</w:t>
-      </w:r>
-      <w:r>
-        <w:t xml:space="preserve">            </w:t>
-      </w:r>
-      <w:r>
-        <w:t xml:space="preserve">  </w:t>
-      </w:r>
-      <w:r>
-        <w:t xml:space="preserve"> </w:t>
-      </w:r>
-      <w:r>
-        <w:t>(with support for collation argument)</w:t>
-      </w:r>
-    </w:p>
-    <w:p>
-      <w:pPr>
-        <w:rPr>
-          <w:rFonts w:hint="eastAsia"/>
-        </w:rPr>
-      </w:pPr>
-      <w:r>
-        <w:t>fn:index-of</w:t>
-      </w:r>
-      <w:r>
-        <w:t xml:space="preserve">                      </w:t>
-      </w:r>
-      <w:r>
-        <w:t xml:space="preserve">  </w:t>
-      </w:r>
-      <w:r>
-        <w:t xml:space="preserve"> </w:t>
-      </w:r>
-      <w:r>
-        <w:t>(with support for collation argument)</w:t>
-      </w:r>
-    </w:p>
-    <w:p>
-      <w:pPr>
-        <w:rPr>
-          <w:rFonts w:hint="eastAsia"/>
-        </w:rPr>
-      </w:pPr>
-      <w:r>
-        <w:t>fn:deep-equal</w:t>
-      </w:r>
-      <w:r>
-        <w:t xml:space="preserve">                  </w:t>
-      </w:r>
-      <w:r>
-        <w:t xml:space="preserve">  </w:t>
-      </w:r>
-      <w:r>
-        <w:t xml:space="preserve"> </w:t>
-      </w:r>
-      <w:r>
-        <w:t>(with support for collation argument)</w:t>
-      </w:r>
-    </w:p>
-    <w:p>
-      <w:pPr>
-        <w:rPr>
-          <w:rFonts w:hint="eastAsia"/>
-        </w:rPr>
-      </w:pPr>
-    </w:p>
-    <w:p>
-      <w:pPr>
-        <w:rPr>
-          <w:rFonts w:hint="eastAsia"/>
-        </w:rPr>
-      </w:pPr>
-      <w:r>
-        <w:t>7</w:t>
+        <w:t xml:space="preserve"> Constructing xs:dateTime value</w:t>
+      </w:r>
+    </w:p>
+    <w:p>
+      <w:pPr>
+        <w:rPr>
+          <w:rFonts w:hint="eastAsia"/>
+        </w:rPr>
+      </w:pPr>
+    </w:p>
+    <w:p>
+      <w:pPr>
+        <w:rPr>
+          <w:rFonts w:hint="eastAsia"/>
+        </w:rPr>
+      </w:pPr>
+      <w:r>
+        <w:rPr>
+          <w:rFonts w:hint="eastAsia"/>
+        </w:rPr>
+        <w:t>fn:dateTime</w:t>
+      </w:r>
+    </w:p>
+    <w:p>
+      <w:pPr>
+        <w:rPr>
+          <w:rFonts w:hint="eastAsia"/>
+        </w:rPr>
+      </w:pPr>
+    </w:p>
+    <w:p>
+      <w:pPr>
+        <w:rPr>
+          <w:rFonts w:hint="eastAsia"/>
+        </w:rPr>
+      </w:pPr>
+      <w:r>
+        <w:t>1</w:t>
+      </w:r>
+      <w:r>
+        <w:t>1</w:t>
       </w:r>
       <w:r>
         <w:t>)</w:t>
       </w:r>
       <w:r>
-        <w:t xml:space="preserve"> </w:t>
-      </w:r>
-      <w:r>
-        <w:t>Math</w:t>
-      </w:r>
-      <w:r>
-        <w:t>s</w:t>
-      </w:r>
-      <w:r>
-        <w:t xml:space="preserve"> t</w:t>
-      </w:r>
-      <w:r>
-        <w:t>rigonometric and exponential functions</w:t>
-      </w:r>
-    </w:p>
-    <w:p>
-      <w:pPr>
-        <w:rPr>
-          <w:rFonts w:hint="eastAsia"/>
-        </w:rPr>
-      </w:pPr>
-    </w:p>
-    <w:p>
-      <w:pPr>
-        <w:rPr>
-          <w:rFonts w:hint="eastAsia"/>
-        </w:rPr>
-      </w:pPr>
-      <w:r>
+        <w:t xml:space="preserve"> Component extraction functions on dates and times</w:t>
+      </w:r>
+    </w:p>
+    <w:p>
+      <w:pPr>
+        <w:rPr>
+          <w:rFonts w:hint="eastAsia"/>
+        </w:rPr>
+      </w:pPr>
+    </w:p>
+    <w:p>
+      <w:pPr>
+        <w:rPr>
+          <w:rFonts w:hint="eastAsia"/>
+        </w:rPr>
+      </w:pPr>
+      <w:r>
+        <w:rPr>
+          <w:rFonts w:hint="eastAsia"/>
+        </w:rPr>
+        <w:t>fn:year-from-dateTime</w:t>
+      </w:r>
+    </w:p>
+    <w:p>
+      <w:pPr>
+        <w:rPr>
+          <w:rFonts w:hint="eastAsia"/>
+        </w:rPr>
+      </w:pPr>
+      <w:r>
+        <w:rPr>
+          <w:rFonts w:hint="eastAsia"/>
+        </w:rPr>
+        <w:t>fn:month-from-dateTime</w:t>
+      </w:r>
+    </w:p>
+    <w:p>
+      <w:pPr>
+        <w:rPr>
+          <w:rFonts w:hint="eastAsia"/>
+        </w:rPr>
+      </w:pPr>
+      <w:r>
+        <w:rPr>
+          <w:rFonts w:hint="eastAsia"/>
+        </w:rPr>
+        <w:t>fn:day-from-dateTime</w:t>
+      </w:r>
+    </w:p>
+    <w:p>
+      <w:pPr>
+        <w:rPr>
+          <w:rFonts w:hint="eastAsia"/>
+        </w:rPr>
+      </w:pPr>
+      <w:r>
+        <w:rPr>
+          <w:rFonts w:hint="eastAsia"/>
+        </w:rPr>
+        <w:t>fn:hours-from-dateTime</w:t>
+      </w:r>
+    </w:p>
+    <w:p>
+      <w:pPr>
+        <w:rPr>
+          <w:rFonts w:hint="eastAsia"/>
+        </w:rPr>
+      </w:pPr>
+      <w:r>
+        <w:rPr>
+          <w:rFonts w:hint="eastAsia"/>
+        </w:rPr>
+        <w:t>fn:minutes-from-dateTime</w:t>
+      </w:r>
+    </w:p>
+    <w:p>
+      <w:pPr>
+        <w:rPr>
+          <w:rFonts w:hint="eastAsia"/>
+        </w:rPr>
+      </w:pPr>
+      <w:r>
+        <w:rPr>
+          <w:rFonts w:hint="eastAsia"/>
+        </w:rPr>
+        <w:t>fn:seconds-from-dateTime</w:t>
+      </w:r>
+    </w:p>
+    <w:p>
+      <w:pPr>
+        <w:rPr>
+          <w:rFonts w:hint="eastAsia"/>
+        </w:rPr>
+      </w:pPr>
+      <w:r>
+        <w:rPr>
+          <w:rFonts w:hint="eastAsia"/>
+        </w:rPr>
+        <w:t>fn:timezone-from-dateTime</w:t>
+      </w:r>
+    </w:p>
+    <w:p>
+      <w:pPr>
+        <w:rPr>
+          <w:rFonts w:hint="eastAsia"/>
+        </w:rPr>
+      </w:pPr>
+      <w:r>
+        <w:rPr>
+          <w:rFonts w:hint="eastAsia"/>
+        </w:rPr>
+        <w:t>fn:year-from-date</w:t>
+      </w:r>
+    </w:p>
+    <w:p>
+      <w:pPr>
+        <w:rPr>
+          <w:rFonts w:hint="eastAsia"/>
+        </w:rPr>
+      </w:pPr>
+      <w:r>
+        <w:rPr>
+          <w:rFonts w:hint="eastAsia"/>
+        </w:rPr>
+        <w:t>fn:month-from-date</w:t>
+      </w:r>
+    </w:p>
+    <w:p>
+      <w:pPr>
+        <w:rPr>
+          <w:rFonts w:hint="eastAsia"/>
+        </w:rPr>
+      </w:pPr>
+      <w:r>
+        <w:rPr>
+          <w:rFonts w:hint="eastAsia"/>
+        </w:rPr>
+        <w:t>fn:day-from-date</w:t>
+      </w:r>
+    </w:p>
+    <w:p>
+      <w:pPr>
+        <w:rPr>
+          <w:rFonts w:hint="eastAsia"/>
+        </w:rPr>
+      </w:pPr>
+      <w:r>
+        <w:rPr>
+          <w:rFonts w:hint="eastAsia"/>
+        </w:rPr>
+        <w:t>fn:timezone-from-date</w:t>
+      </w:r>
+    </w:p>
+    <w:p>
+      <w:pPr>
+        <w:rPr>
+          <w:rFonts w:hint="eastAsia"/>
+        </w:rPr>
+      </w:pPr>
+      <w:r>
+        <w:rPr>
+          <w:rFonts w:hint="eastAsia"/>
+        </w:rPr>
         <w:lastRenderedPageBreak/>
-        <w:t>math:pi</w:t>
-      </w:r>
-    </w:p>
-    <w:p>
-      <w:pPr>
-        <w:rPr>
-          <w:rFonts w:hint="eastAsia"/>
-        </w:rPr>
-      </w:pPr>
-      <w:r>
-        <w:t>math:exp</w:t>
-      </w:r>
-    </w:p>
-    <w:p>
-      <w:pPr>
-        <w:rPr>
-          <w:rFonts w:hint="eastAsia"/>
-        </w:rPr>
-      </w:pPr>
-      <w:r>
-        <w:t>math:exp10</w:t>
-      </w:r>
-    </w:p>
-    <w:p>
-      <w:pPr>
-        <w:rPr>
-          <w:rFonts w:hint="eastAsia"/>
-        </w:rPr>
-      </w:pPr>
-      <w:r>
-        <w:t>math:log</w:t>
-      </w:r>
-    </w:p>
-    <w:p>
-      <w:pPr>
-        <w:rPr>
-          <w:rFonts w:hint="eastAsia"/>
-        </w:rPr>
-      </w:pPr>
-      <w:r>
-        <w:t>math:log10</w:t>
-      </w:r>
-    </w:p>
-    <w:p>
-      <w:pPr>
-        <w:rPr>
-          <w:rFonts w:hint="eastAsia"/>
-        </w:rPr>
-      </w:pPr>
-      <w:r>
-        <w:t>math:pow</w:t>
-      </w:r>
-    </w:p>
-    <w:p>
-      <w:pPr>
-        <w:rPr>
-          <w:rFonts w:hint="eastAsia"/>
-        </w:rPr>
-      </w:pPr>
-      <w:r>
-        <w:t>math:sqrt</w:t>
-      </w:r>
-    </w:p>
-    <w:p>
-      <w:pPr>
-        <w:rPr>
-          <w:rFonts w:hint="eastAsia"/>
-        </w:rPr>
-      </w:pPr>
-      <w:r>
-        <w:t>math:sin</w:t>
-      </w:r>
-    </w:p>
-    <w:p>
-      <w:pPr>
-        <w:rPr>
-          <w:rFonts w:hint="eastAsia"/>
-        </w:rPr>
-      </w:pPr>
-      <w:r>
-        <w:t>math:cos</w:t>
-      </w:r>
-    </w:p>
-    <w:p>
-      <w:pPr>
-        <w:rPr>
-          <w:rFonts w:hint="eastAsia"/>
-        </w:rPr>
-      </w:pPr>
-      <w:r>
-        <w:t>math:tan</w:t>
-      </w:r>
-    </w:p>
-    <w:p>
-      <w:pPr>
-        <w:rPr>
-          <w:rFonts w:hint="eastAsia"/>
-        </w:rPr>
-      </w:pPr>
-      <w:r>
-        <w:t>math:asin</w:t>
-      </w:r>
-    </w:p>
-    <w:p>
-      <w:pPr>
-        <w:rPr>
-          <w:rFonts w:hint="eastAsia"/>
-        </w:rPr>
-      </w:pPr>
-      <w:r>
-        <w:t>math:acos</w:t>
-      </w:r>
-    </w:p>
-    <w:p>
-      <w:pPr>
-        <w:rPr>
-          <w:rFonts w:hint="eastAsia"/>
-        </w:rPr>
-      </w:pPr>
-      <w:r>
-        <w:t>math:atan</w:t>
-      </w:r>
-    </w:p>
-    <w:p>
-      <w:pPr>
-        <w:rPr>
-          <w:rFonts w:hint="eastAsia"/>
-        </w:rPr>
-      </w:pPr>
-      <w:r>
-        <w:t>math:atan2</w:t>
-      </w:r>
-    </w:p>
-    <w:p>
-      <w:pPr>
-        <w:rPr>
-          <w:rFonts w:hint="eastAsia"/>
-        </w:rPr>
-      </w:pPr>
-    </w:p>
-    <w:p>
-      <w:pPr>
-        <w:rPr>
-          <w:rFonts w:hint="eastAsia"/>
-        </w:rPr>
-      </w:pPr>
-      <w:r>
-        <w:t xml:space="preserve">8) </w:t>
-      </w:r>
-      <w:r>
-        <w:t>Random numbers</w:t>
-      </w:r>
-    </w:p>
-    <w:p>
-      <w:pPr>
-        <w:rPr>
-          <w:rFonts w:hint="eastAsia"/>
-        </w:rPr>
-      </w:pPr>
-    </w:p>
-    <w:p>
-      <w:pPr>
-        <w:rPr>
-          <w:rFonts w:hint="eastAsia"/>
-        </w:rPr>
-      </w:pPr>
-      <w:r>
-        <w:t>fn:random-number-generator</w:t>
-      </w:r>
-    </w:p>
-    <w:p>
-      <w:pPr>
-        <w:rPr>
-          <w:rFonts w:hint="eastAsia"/>
-        </w:rPr>
-      </w:pPr>
-    </w:p>
-    <w:p>
-      <w:pPr>
-        <w:rPr>
-          <w:rFonts w:hint="eastAsia"/>
-        </w:rPr>
-      </w:pPr>
-      <w:r>
-        <w:t>9</w:t>
-      </w:r>
-      <w:r>
-        <w:t>)</w:t>
-      </w:r>
-      <w:r>
-        <w:t xml:space="preserve"> Component extraction functions on durations</w:t>
-      </w:r>
-    </w:p>
-    <w:p>
-      <w:pPr>
-        <w:rPr>
-          <w:rFonts w:hint="eastAsia"/>
-        </w:rPr>
-      </w:pPr>
-    </w:p>
-    <w:p>
-      <w:pPr>
-        <w:rPr>
-          <w:rFonts w:hint="eastAsia"/>
-        </w:rPr>
-      </w:pPr>
-      <w:r>
-        <w:t>fn:years-from-duration</w:t>
-      </w:r>
-    </w:p>
-    <w:p>
-      <w:pPr>
-        <w:rPr>
-          <w:rFonts w:hint="eastAsia"/>
-        </w:rPr>
-      </w:pPr>
-      <w:r>
-        <w:t>fn:months-from-duration</w:t>
-      </w:r>
-    </w:p>
-    <w:p>
-      <w:pPr>
-        <w:rPr>
-          <w:rFonts w:hint="eastAsia"/>
-        </w:rPr>
-      </w:pPr>
-      <w:r>
-        <w:t>fn:days-from-duration</w:t>
-      </w:r>
-    </w:p>
-    <w:p>
-      <w:pPr>
-        <w:rPr>
-          <w:rFonts w:hint="eastAsia"/>
-        </w:rPr>
-      </w:pPr>
-      <w:r>
-        <w:t>fn:hours-from-duration</w:t>
-      </w:r>
-    </w:p>
-    <w:p>
-      <w:pPr>
-        <w:rPr>
-          <w:rFonts w:hint="eastAsia"/>
-        </w:rPr>
-      </w:pPr>
-      <w:r>
-        <w:t>fn:minutes-from-duration</w:t>
-      </w:r>
-    </w:p>
-    <w:p>
-      <w:pPr>
-        <w:rPr>
-          <w:rFonts w:hint="eastAsia"/>
-        </w:rPr>
-      </w:pPr>
-      <w:r>
-        <w:t>fn:seconds-from-duration</w:t>
-      </w:r>
-    </w:p>
-    <w:p>
-      <w:pPr>
-        <w:rPr>
-          <w:rFonts w:hint="eastAsia"/>
-        </w:rPr>
-      </w:pPr>
-    </w:p>
-    <w:p>
-      <w:pPr>
-        <w:rPr>
-          <w:rFonts w:hint="eastAsia"/>
-        </w:rPr>
-      </w:pPr>
-      <w:r>
-        <w:t>10</w:t>
-      </w:r>
-      <w:r>
-        <w:t>)</w:t>
-      </w:r>
-      <w:r>
-        <w:t xml:space="preserve"> Constructing xs:dateTime value</w:t>
-      </w:r>
-    </w:p>
-    <w:p>
-      <w:pPr>
-        <w:rPr>
-          <w:rFonts w:hint="eastAsia"/>
-        </w:rPr>
-      </w:pPr>
-    </w:p>
-    <w:p>
-      <w:pPr>
-        <w:rPr>
-          <w:rFonts w:hint="eastAsia"/>
-        </w:rPr>
-      </w:pPr>
-      <w:r>
-        <w:rPr>
-          <w:rFonts w:hint="eastAsia"/>
-        </w:rPr>
-        <w:t>fn:dateTime</w:t>
-      </w:r>
-    </w:p>
-    <w:p>
-      <w:pPr>
-        <w:rPr>
-          <w:rFonts w:hint="eastAsia"/>
-        </w:rPr>
-      </w:pPr>
-    </w:p>
-    <w:p>
-      <w:pPr>
-        <w:rPr>
-          <w:rFonts w:hint="eastAsia"/>
-        </w:rPr>
-      </w:pPr>
-      <w:r>
-        <w:t>1</w:t>
-      </w:r>
-      <w:r>
-        <w:t>1</w:t>
-      </w:r>
-      <w:r>
-        <w:t>)</w:t>
-      </w:r>
-      <w:r>
-        <w:t xml:space="preserve"> Component extraction functions on dates and times</w:t>
-      </w:r>
-    </w:p>
-    <w:p>
-      <w:pPr>
-        <w:rPr>
-          <w:rFonts w:hint="eastAsia"/>
-        </w:rPr>
-      </w:pPr>
-    </w:p>
-    <w:p>
-      <w:pPr>
-        <w:rPr>
-          <w:rFonts w:hint="eastAsia"/>
-        </w:rPr>
-      </w:pPr>
-      <w:r>
-        <w:rPr>
-          <w:rFonts w:hint="eastAsia"/>
-        </w:rPr>
-        <w:t>fn:year-from-dateTime</w:t>
-      </w:r>
-    </w:p>
-    <w:p>
-      <w:pPr>
-        <w:rPr>
-          <w:rFonts w:hint="eastAsia"/>
-        </w:rPr>
-      </w:pPr>
-      <w:r>
-        <w:rPr>
-          <w:rFonts w:hint="eastAsia"/>
-        </w:rPr>
-        <w:t>fn:month-from-dateTime</w:t>
-      </w:r>
-    </w:p>
-    <w:p>
-      <w:pPr>
-        <w:rPr>
-          <w:rFonts w:hint="eastAsia"/>
-        </w:rPr>
-      </w:pPr>
-      <w:r>
-        <w:rPr>
-          <w:rFonts w:hint="eastAsia"/>
-        </w:rPr>
-        <w:t>fn:day-from-dateTime</w:t>
-      </w:r>
-    </w:p>
-    <w:p>
-      <w:pPr>
-        <w:rPr>
-          <w:rFonts w:hint="eastAsia"/>
-        </w:rPr>
-      </w:pPr>
-      <w:r>
-        <w:rPr>
-          <w:rFonts w:hint="eastAsia"/>
-        </w:rPr>
-        <w:t>fn:hours-from-dateTime</w:t>
-      </w:r>
-    </w:p>
-    <w:p>
-      <w:pPr>
-        <w:rPr>
-          <w:rFonts w:hint="eastAsia"/>
-        </w:rPr>
-      </w:pPr>
-      <w:r>
-        <w:rPr>
-          <w:rFonts w:hint="eastAsia"/>
-        </w:rPr>
-        <w:t>fn:minutes-from-dateTime</w:t>
-      </w:r>
-    </w:p>
-    <w:p>
-      <w:pPr>
-        <w:rPr>
-          <w:rFonts w:hint="eastAsia"/>
-        </w:rPr>
-      </w:pPr>
-      <w:r>
-        <w:rPr>
-          <w:rFonts w:hint="eastAsia"/>
-        </w:rPr>
-        <w:t>fn:seconds-from-dateTime</w:t>
-      </w:r>
-    </w:p>
-    <w:p>
-      <w:pPr>
-        <w:rPr>
-          <w:rFonts w:hint="eastAsia"/>
-        </w:rPr>
-      </w:pPr>
-      <w:r>
-        <w:rPr>
-          <w:rFonts w:hint="eastAsia"/>
-        </w:rPr>
-        <w:t>fn:timezone-from-dateTime</w:t>
-      </w:r>
-    </w:p>
-    <w:p>
-      <w:pPr>
-        <w:rPr>
-          <w:rFonts w:hint="eastAsia"/>
-        </w:rPr>
-      </w:pPr>
-      <w:r>
-        <w:rPr>
-          <w:rFonts w:hint="eastAsia"/>
-        </w:rPr>
-        <w:t>fn:year-from-date</w:t>
-      </w:r>
-    </w:p>
-    <w:p>
-      <w:pPr>
-        <w:rPr>
-          <w:rFonts w:hint="eastAsia"/>
-        </w:rPr>
-      </w:pPr>
-      <w:r>
-        <w:rPr>
-          <w:rFonts w:hint="eastAsia"/>
-        </w:rPr>
-        <w:t>fn:month-from-date</w:t>
-      </w:r>
-    </w:p>
-    <w:p>
-      <w:pPr>
-        <w:rPr>
-          <w:rFonts w:hint="eastAsia"/>
-        </w:rPr>
-      </w:pPr>
-      <w:r>
-        <w:rPr>
-          <w:rFonts w:hint="eastAsia"/>
-        </w:rPr>
-        <w:t>fn:day-from-date</w:t>
-      </w:r>
-    </w:p>
-    <w:p>
-      <w:pPr>
-        <w:rPr>
-          <w:rFonts w:hint="eastAsia"/>
-        </w:rPr>
-      </w:pPr>
-      <w:r>
-        <w:rPr>
-          <w:rFonts w:hint="eastAsia"/>
-        </w:rPr>
-        <w:t>fn:timezone-from-date</w:t>
-      </w:r>
-    </w:p>
-    <w:p>
-      <w:pPr>
-        <w:rPr>
-          <w:rFonts w:hint="eastAsia"/>
-        </w:rPr>
-      </w:pPr>
-      <w:r>
-        <w:rPr>
-          <w:rFonts w:hint="eastAsia"/>
-        </w:rPr>
         <w:t>fn:hours-from-time</w:t>
       </w:r>
     </w:p>
@@ -6619,6 +6678,7 @@
         </w:rPr>
       </w:pPr>
       <w:r>
+        <w:lastRenderedPageBreak/>
         <w:t>fn:node-name</w:t>
       </w:r>
     </w:p>
@@ -6659,475 +6719,475 @@
         </w:rPr>
       </w:pPr>
       <w:r>
+        <w:t>fn:document-uri</w:t>
+      </w:r>
+    </w:p>
+    <w:p>
+      <w:pPr>
+        <w:rPr>
+          <w:rFonts w:hint="eastAsia"/>
+        </w:rPr>
+      </w:pPr>
+    </w:p>
+    <w:p>
+      <w:pPr>
+        <w:rPr>
+          <w:rFonts w:hint="eastAsia"/>
+        </w:rPr>
+      </w:pPr>
+      <w:r>
+        <w:t>1</w:t>
+      </w:r>
+      <w:r>
+        <w:t>7</w:t>
+      </w:r>
+      <w:r>
+        <w:t xml:space="preserve">) </w:t>
+      </w:r>
+      <w:r>
+        <w:rPr>
+          <w:rFonts w:hint="eastAsia"/>
+        </w:rPr>
+        <w:t>Functions related to QNames</w:t>
+      </w:r>
+    </w:p>
+    <w:p>
+      <w:pPr>
+        <w:rPr>
+          <w:rFonts w:hint="eastAsia"/>
+        </w:rPr>
+      </w:pPr>
+    </w:p>
+    <w:p>
+      <w:pPr>
+        <w:rPr>
+          <w:rFonts w:hint="eastAsia"/>
+        </w:rPr>
+      </w:pPr>
+      <w:r>
+        <w:rPr>
+          <w:rFonts w:hint="eastAsia"/>
+        </w:rPr>
+        <w:t>fn:resolve-QName</w:t>
+      </w:r>
+    </w:p>
+    <w:p>
+      <w:pPr>
+        <w:rPr>
+          <w:rFonts w:hint="eastAsia"/>
+        </w:rPr>
+      </w:pPr>
+      <w:r>
+        <w:rPr>
+          <w:rFonts w:hint="eastAsia"/>
+        </w:rPr>
+        <w:t>fn:QName</w:t>
+      </w:r>
+    </w:p>
+    <w:p>
+      <w:pPr>
+        <w:rPr>
+          <w:rFonts w:hint="eastAsia"/>
+        </w:rPr>
+      </w:pPr>
+    </w:p>
+    <w:p>
+      <w:pPr>
+        <w:rPr>
+          <w:rFonts w:hint="eastAsia"/>
+        </w:rPr>
+      </w:pPr>
+      <w:r>
+        <w:t>1</w:t>
+      </w:r>
+      <w:r>
+        <w:t>8</w:t>
+      </w:r>
+      <w:r>
+        <w:t>) Functions related to maps</w:t>
+      </w:r>
+    </w:p>
+    <w:p>
+      <w:pPr>
+        <w:rPr>
+          <w:rFonts w:hint="eastAsia"/>
+        </w:rPr>
+      </w:pPr>
+    </w:p>
+    <w:p>
+      <w:pPr>
+        <w:rPr>
+          <w:rFonts w:hint="eastAsia"/>
+        </w:rPr>
+      </w:pPr>
+      <w:r>
+        <w:t>map:merge</w:t>
+      </w:r>
+    </w:p>
+    <w:p>
+      <w:pPr>
+        <w:rPr>
+          <w:rFonts w:hint="eastAsia"/>
+        </w:rPr>
+      </w:pPr>
+      <w:r>
+        <w:t>map:size</w:t>
+      </w:r>
+    </w:p>
+    <w:p>
+      <w:pPr>
+        <w:rPr>
+          <w:rFonts w:hint="eastAsia"/>
+        </w:rPr>
+      </w:pPr>
+      <w:r>
+        <w:t>map:keys</w:t>
+      </w:r>
+    </w:p>
+    <w:p>
+      <w:pPr>
+        <w:rPr>
+          <w:rFonts w:hint="eastAsia"/>
+        </w:rPr>
+      </w:pPr>
+      <w:r>
+        <w:t>map:contains</w:t>
+      </w:r>
+    </w:p>
+    <w:p>
+      <w:pPr>
+        <w:rPr>
+          <w:rFonts w:hint="eastAsia"/>
+        </w:rPr>
+      </w:pPr>
+      <w:r>
+        <w:t>map:get</w:t>
+      </w:r>
+    </w:p>
+    <w:p>
+      <w:pPr>
+        <w:rPr>
+          <w:rFonts w:hint="eastAsia"/>
+        </w:rPr>
+      </w:pPr>
+      <w:r>
+        <w:t>map:find</w:t>
+      </w:r>
+    </w:p>
+    <w:p>
+      <w:pPr>
+        <w:rPr>
+          <w:rFonts w:hint="eastAsia"/>
+        </w:rPr>
+      </w:pPr>
+      <w:r>
+        <w:t>map:put</w:t>
+      </w:r>
+    </w:p>
+    <w:p>
+      <w:pPr>
+        <w:rPr>
+          <w:rFonts w:hint="eastAsia"/>
+        </w:rPr>
+      </w:pPr>
+      <w:r>
+        <w:t>map:entry</w:t>
+      </w:r>
+    </w:p>
+    <w:p>
+      <w:pPr>
+        <w:rPr>
+          <w:rFonts w:hint="eastAsia"/>
+        </w:rPr>
+      </w:pPr>
+      <w:r>
+        <w:t>map:remove</w:t>
+      </w:r>
+    </w:p>
+    <w:p>
+      <w:pPr>
+        <w:rPr>
+          <w:rFonts w:hint="eastAsia"/>
+        </w:rPr>
+      </w:pPr>
+      <w:r>
+        <w:t>map:for-each</w:t>
+      </w:r>
+    </w:p>
+    <w:p>
+      <w:pPr>
+        <w:rPr>
+          <w:rFonts w:hint="eastAsia"/>
+        </w:rPr>
+      </w:pPr>
+    </w:p>
+    <w:p>
+      <w:pPr>
+        <w:rPr>
+          <w:rFonts w:hint="eastAsia"/>
+        </w:rPr>
+      </w:pPr>
+      <w:r>
+        <w:t>1</w:t>
+      </w:r>
+      <w:r>
+        <w:t>9</w:t>
+      </w:r>
+      <w:r>
+        <w:t>) Functions related to arrays</w:t>
+      </w:r>
+    </w:p>
+    <w:p>
+      <w:pPr>
+        <w:rPr>
+          <w:rFonts w:hint="eastAsia"/>
+        </w:rPr>
+      </w:pPr>
+    </w:p>
+    <w:p>
+      <w:pPr>
+        <w:rPr>
+          <w:rFonts w:hint="eastAsia"/>
+        </w:rPr>
+      </w:pPr>
+      <w:r>
+        <w:t>array:size</w:t>
+      </w:r>
+    </w:p>
+    <w:p>
+      <w:pPr>
+        <w:rPr>
+          <w:rFonts w:hint="eastAsia"/>
+        </w:rPr>
+      </w:pPr>
+      <w:r>
+        <w:t>array:get</w:t>
+      </w:r>
+    </w:p>
+    <w:p>
+      <w:pPr>
+        <w:rPr>
+          <w:rFonts w:hint="eastAsia"/>
+        </w:rPr>
+      </w:pPr>
+      <w:r>
+        <w:t>array:put</w:t>
+      </w:r>
+    </w:p>
+    <w:p>
+      <w:pPr>
+        <w:rPr>
+          <w:rFonts w:hint="eastAsia"/>
+        </w:rPr>
+      </w:pPr>
+      <w:r>
+        <w:t>array:append</w:t>
+      </w:r>
+    </w:p>
+    <w:p>
+      <w:pPr>
+        <w:rPr>
+          <w:rFonts w:hint="eastAsia"/>
+        </w:rPr>
+      </w:pPr>
+      <w:r>
+        <w:t>array:subarray</w:t>
+      </w:r>
+    </w:p>
+    <w:p>
+      <w:pPr>
+        <w:rPr>
+          <w:rFonts w:hint="eastAsia"/>
+        </w:rPr>
+      </w:pPr>
+      <w:r>
+        <w:t>array:remove</w:t>
+      </w:r>
+    </w:p>
+    <w:p>
+      <w:pPr>
+        <w:rPr>
+          <w:rFonts w:hint="eastAsia"/>
+        </w:rPr>
+      </w:pPr>
+      <w:r>
+        <w:t>array:insert-before</w:t>
+      </w:r>
+    </w:p>
+    <w:p>
+      <w:pPr>
+        <w:rPr>
+          <w:rFonts w:hint="eastAsia"/>
+        </w:rPr>
+      </w:pPr>
+      <w:r>
+        <w:t>array:head</w:t>
+      </w:r>
+    </w:p>
+    <w:p>
+      <w:pPr>
+        <w:rPr>
+          <w:rFonts w:hint="eastAsia"/>
+        </w:rPr>
+      </w:pPr>
+      <w:r>
+        <w:t>array:tail</w:t>
+      </w:r>
+    </w:p>
+    <w:p>
+      <w:pPr>
+        <w:rPr>
+          <w:rFonts w:hint="eastAsia"/>
+        </w:rPr>
+      </w:pPr>
+      <w:r>
+        <w:t>array:reverse</w:t>
+      </w:r>
+    </w:p>
+    <w:p>
+      <w:pPr>
+        <w:rPr>
+          <w:rFonts w:hint="eastAsia"/>
+        </w:rPr>
+      </w:pPr>
+      <w:r>
+        <w:t>array:join</w:t>
+      </w:r>
+    </w:p>
+    <w:p>
+      <w:pPr>
+        <w:rPr>
+          <w:rFonts w:hint="eastAsia"/>
+        </w:rPr>
+      </w:pPr>
+      <w:r>
+        <w:t>array:for-each</w:t>
+      </w:r>
+    </w:p>
+    <w:p>
+      <w:pPr>
+        <w:rPr>
+          <w:rFonts w:hint="eastAsia"/>
+        </w:rPr>
+      </w:pPr>
+      <w:r>
+        <w:t>array:filter</w:t>
+      </w:r>
+    </w:p>
+    <w:p>
+      <w:pPr>
+        <w:rPr>
+          <w:rFonts w:hint="eastAsia"/>
+        </w:rPr>
+      </w:pPr>
+      <w:r>
+        <w:t>array:fold-left</w:t>
+      </w:r>
+    </w:p>
+    <w:p>
+      <w:pPr>
+        <w:rPr>
+          <w:rFonts w:hint="eastAsia"/>
+        </w:rPr>
+      </w:pPr>
+      <w:r>
+        <w:t>array:fold-right</w:t>
+      </w:r>
+    </w:p>
+    <w:p>
+      <w:pPr>
+        <w:rPr>
+          <w:rFonts w:hint="eastAsia"/>
+        </w:rPr>
+      </w:pPr>
+      <w:r>
+        <w:t>array:for-each-pair</w:t>
+      </w:r>
+    </w:p>
+    <w:p>
+      <w:pPr>
+        <w:rPr>
+          <w:rFonts w:hint="eastAsia"/>
+        </w:rPr>
+      </w:pPr>
+      <w:r>
+        <w:t>array:sort</w:t>
+      </w:r>
+      <w:r>
+        <w:t xml:space="preserve">                               (with support for collation argument)</w:t>
+      </w:r>
+    </w:p>
+    <w:p>
+      <w:pPr>
+        <w:rPr>
+          <w:rFonts w:hint="eastAsia"/>
+        </w:rPr>
+      </w:pPr>
+      <w:r>
+        <w:t>array:flatten</w:t>
+      </w:r>
+    </w:p>
+    <w:p>
+      <w:pPr>
+        <w:rPr>
+          <w:rFonts w:hint="eastAsia"/>
+        </w:rPr>
+      </w:pPr>
+    </w:p>
+    <w:p>
+      <w:pPr>
+        <w:rPr>
+          <w:rFonts w:hint="eastAsia"/>
+        </w:rPr>
+      </w:pPr>
+      <w:r>
+        <w:t>20</w:t>
+      </w:r>
+      <w:r>
+        <w:t xml:space="preserve">) Functions on JSON </w:t>
+      </w:r>
+      <w:r>
+        <w:t>d</w:t>
+      </w:r>
+      <w:r>
+        <w:t>ata</w:t>
+      </w:r>
+    </w:p>
+    <w:p>
+      <w:pPr>
+        <w:rPr>
+          <w:rFonts w:hint="eastAsia"/>
+        </w:rPr>
+      </w:pPr>
+    </w:p>
+    <w:p>
+      <w:pPr>
+        <w:rPr>
+          <w:rFonts w:hint="eastAsia"/>
+        </w:rPr>
+      </w:pPr>
+      <w:r>
+        <w:t>fn:parse-json</w:t>
+      </w:r>
+    </w:p>
+    <w:p>
+      <w:pPr>
+        <w:rPr>
+          <w:rFonts w:hint="eastAsia"/>
+        </w:rPr>
+      </w:pPr>
+      <w:r>
+        <w:t>fn:json-doc</w:t>
+      </w:r>
+    </w:p>
+    <w:p>
+      <w:pPr>
+        <w:rPr>
+          <w:rFonts w:hint="eastAsia"/>
+        </w:rPr>
+      </w:pPr>
+      <w:r>
         <w:lastRenderedPageBreak/>
-        <w:t>fn:document-uri</w:t>
-      </w:r>
-    </w:p>
-    <w:p>
-      <w:pPr>
-        <w:rPr>
-          <w:rFonts w:hint="eastAsia"/>
-        </w:rPr>
-      </w:pPr>
-    </w:p>
-    <w:p>
-      <w:pPr>
-        <w:rPr>
-          <w:rFonts w:hint="eastAsia"/>
-        </w:rPr>
-      </w:pPr>
-      <w:r>
-        <w:t>1</w:t>
-      </w:r>
-      <w:r>
-        <w:t>7</w:t>
-      </w:r>
-      <w:r>
-        <w:t xml:space="preserve">) </w:t>
-      </w:r>
-      <w:r>
-        <w:rPr>
-          <w:rFonts w:hint="eastAsia"/>
-        </w:rPr>
-        <w:t>Functions related to QNames</w:t>
-      </w:r>
-    </w:p>
-    <w:p>
-      <w:pPr>
-        <w:rPr>
-          <w:rFonts w:hint="eastAsia"/>
-        </w:rPr>
-      </w:pPr>
-    </w:p>
-    <w:p>
-      <w:pPr>
-        <w:rPr>
-          <w:rFonts w:hint="eastAsia"/>
-        </w:rPr>
-      </w:pPr>
-      <w:r>
-        <w:rPr>
-          <w:rFonts w:hint="eastAsia"/>
-        </w:rPr>
-        <w:t>fn:resolve-QName</w:t>
-      </w:r>
-    </w:p>
-    <w:p>
-      <w:pPr>
-        <w:rPr>
-          <w:rFonts w:hint="eastAsia"/>
-        </w:rPr>
-      </w:pPr>
-      <w:r>
-        <w:rPr>
-          <w:rFonts w:hint="eastAsia"/>
-        </w:rPr>
-        <w:t>fn:QName</w:t>
-      </w:r>
-    </w:p>
-    <w:p>
-      <w:pPr>
-        <w:rPr>
-          <w:rFonts w:hint="eastAsia"/>
-        </w:rPr>
-      </w:pPr>
-    </w:p>
-    <w:p>
-      <w:pPr>
-        <w:rPr>
-          <w:rFonts w:hint="eastAsia"/>
-        </w:rPr>
-      </w:pPr>
-      <w:r>
-        <w:t>1</w:t>
-      </w:r>
-      <w:r>
-        <w:t>8</w:t>
-      </w:r>
-      <w:r>
-        <w:t>) Functions related to maps</w:t>
-      </w:r>
-    </w:p>
-    <w:p>
-      <w:pPr>
-        <w:rPr>
-          <w:rFonts w:hint="eastAsia"/>
-        </w:rPr>
-      </w:pPr>
-    </w:p>
-    <w:p>
-      <w:pPr>
-        <w:rPr>
-          <w:rFonts w:hint="eastAsia"/>
-        </w:rPr>
-      </w:pPr>
-      <w:r>
-        <w:t>map:merge</w:t>
-      </w:r>
-    </w:p>
-    <w:p>
-      <w:pPr>
-        <w:rPr>
-          <w:rFonts w:hint="eastAsia"/>
-        </w:rPr>
-      </w:pPr>
-      <w:r>
-        <w:t>map:size</w:t>
-      </w:r>
-    </w:p>
-    <w:p>
-      <w:pPr>
-        <w:rPr>
-          <w:rFonts w:hint="eastAsia"/>
-        </w:rPr>
-      </w:pPr>
-      <w:r>
-        <w:t>map:keys</w:t>
-      </w:r>
-    </w:p>
-    <w:p>
-      <w:pPr>
-        <w:rPr>
-          <w:rFonts w:hint="eastAsia"/>
-        </w:rPr>
-      </w:pPr>
-      <w:r>
-        <w:t>map:contains</w:t>
-      </w:r>
-    </w:p>
-    <w:p>
-      <w:pPr>
-        <w:rPr>
-          <w:rFonts w:hint="eastAsia"/>
-        </w:rPr>
-      </w:pPr>
-      <w:r>
-        <w:t>map:get</w:t>
-      </w:r>
-    </w:p>
-    <w:p>
-      <w:pPr>
-        <w:rPr>
-          <w:rFonts w:hint="eastAsia"/>
-        </w:rPr>
-      </w:pPr>
-      <w:r>
-        <w:t>map:find</w:t>
-      </w:r>
-    </w:p>
-    <w:p>
-      <w:pPr>
-        <w:rPr>
-          <w:rFonts w:hint="eastAsia"/>
-        </w:rPr>
-      </w:pPr>
-      <w:r>
-        <w:t>map:put</w:t>
-      </w:r>
-    </w:p>
-    <w:p>
-      <w:pPr>
-        <w:rPr>
-          <w:rFonts w:hint="eastAsia"/>
-        </w:rPr>
-      </w:pPr>
-      <w:r>
-        <w:t>map:entry</w:t>
-      </w:r>
-    </w:p>
-    <w:p>
-      <w:pPr>
-        <w:rPr>
-          <w:rFonts w:hint="eastAsia"/>
-        </w:rPr>
-      </w:pPr>
-      <w:r>
-        <w:t>map:remove</w:t>
-      </w:r>
-    </w:p>
-    <w:p>
-      <w:pPr>
-        <w:rPr>
-          <w:rFonts w:hint="eastAsia"/>
-        </w:rPr>
-      </w:pPr>
-      <w:r>
-        <w:t>map:for-each</w:t>
-      </w:r>
-    </w:p>
-    <w:p>
-      <w:pPr>
-        <w:rPr>
-          <w:rFonts w:hint="eastAsia"/>
-        </w:rPr>
-      </w:pPr>
-    </w:p>
-    <w:p>
-      <w:pPr>
-        <w:rPr>
-          <w:rFonts w:hint="eastAsia"/>
-        </w:rPr>
-      </w:pPr>
-      <w:r>
-        <w:t>1</w:t>
-      </w:r>
-      <w:r>
-        <w:t>9</w:t>
-      </w:r>
-      <w:r>
-        <w:t>) Functions related to arrays</w:t>
-      </w:r>
-    </w:p>
-    <w:p>
-      <w:pPr>
-        <w:rPr>
-          <w:rFonts w:hint="eastAsia"/>
-        </w:rPr>
-      </w:pPr>
-    </w:p>
-    <w:p>
-      <w:pPr>
-        <w:rPr>
-          <w:rFonts w:hint="eastAsia"/>
-        </w:rPr>
-      </w:pPr>
-      <w:r>
-        <w:t>array:size</w:t>
-      </w:r>
-    </w:p>
-    <w:p>
-      <w:pPr>
-        <w:rPr>
-          <w:rFonts w:hint="eastAsia"/>
-        </w:rPr>
-      </w:pPr>
-      <w:r>
-        <w:t>array:get</w:t>
-      </w:r>
-    </w:p>
-    <w:p>
-      <w:pPr>
-        <w:rPr>
-          <w:rFonts w:hint="eastAsia"/>
-        </w:rPr>
-      </w:pPr>
-      <w:r>
-        <w:t>array:put</w:t>
-      </w:r>
-    </w:p>
-    <w:p>
-      <w:pPr>
-        <w:rPr>
-          <w:rFonts w:hint="eastAsia"/>
-        </w:rPr>
-      </w:pPr>
-      <w:r>
-        <w:t>array:append</w:t>
-      </w:r>
-    </w:p>
-    <w:p>
-      <w:pPr>
-        <w:rPr>
-          <w:rFonts w:hint="eastAsia"/>
-        </w:rPr>
-      </w:pPr>
-      <w:r>
-        <w:t>array:subarray</w:t>
-      </w:r>
-    </w:p>
-    <w:p>
-      <w:pPr>
-        <w:rPr>
-          <w:rFonts w:hint="eastAsia"/>
-        </w:rPr>
-      </w:pPr>
-      <w:r>
-        <w:t>array:remove</w:t>
-      </w:r>
-    </w:p>
-    <w:p>
-      <w:pPr>
-        <w:rPr>
-          <w:rFonts w:hint="eastAsia"/>
-        </w:rPr>
-      </w:pPr>
-      <w:r>
-        <w:t>array:insert-before</w:t>
-      </w:r>
-    </w:p>
-    <w:p>
-      <w:pPr>
-        <w:rPr>
-          <w:rFonts w:hint="eastAsia"/>
-        </w:rPr>
-      </w:pPr>
-      <w:r>
-        <w:t>array:head</w:t>
-      </w:r>
-    </w:p>
-    <w:p>
-      <w:pPr>
-        <w:rPr>
-          <w:rFonts w:hint="eastAsia"/>
-        </w:rPr>
-      </w:pPr>
-      <w:r>
-        <w:t>array:tail</w:t>
-      </w:r>
-    </w:p>
-    <w:p>
-      <w:pPr>
-        <w:rPr>
-          <w:rFonts w:hint="eastAsia"/>
-        </w:rPr>
-      </w:pPr>
-      <w:r>
-        <w:t>array:reverse</w:t>
-      </w:r>
-    </w:p>
-    <w:p>
-      <w:pPr>
-        <w:rPr>
-          <w:rFonts w:hint="eastAsia"/>
-        </w:rPr>
-      </w:pPr>
-      <w:r>
-        <w:t>array:join</w:t>
-      </w:r>
-    </w:p>
-    <w:p>
-      <w:pPr>
-        <w:rPr>
-          <w:rFonts w:hint="eastAsia"/>
-        </w:rPr>
-      </w:pPr>
-      <w:r>
-        <w:t>array:for-each</w:t>
-      </w:r>
-    </w:p>
-    <w:p>
-      <w:pPr>
-        <w:rPr>
-          <w:rFonts w:hint="eastAsia"/>
-        </w:rPr>
-      </w:pPr>
-      <w:r>
-        <w:t>array:filter</w:t>
-      </w:r>
-    </w:p>
-    <w:p>
-      <w:pPr>
-        <w:rPr>
-          <w:rFonts w:hint="eastAsia"/>
-        </w:rPr>
-      </w:pPr>
-      <w:r>
-        <w:t>array:fold-left</w:t>
-      </w:r>
-    </w:p>
-    <w:p>
-      <w:pPr>
-        <w:rPr>
-          <w:rFonts w:hint="eastAsia"/>
-        </w:rPr>
-      </w:pPr>
-      <w:r>
-        <w:t>array:fold-right</w:t>
-      </w:r>
-    </w:p>
-    <w:p>
-      <w:pPr>
-        <w:rPr>
-          <w:rFonts w:hint="eastAsia"/>
-        </w:rPr>
-      </w:pPr>
-      <w:r>
-        <w:t>array:for-each-pair</w:t>
-      </w:r>
-    </w:p>
-    <w:p>
-      <w:pPr>
-        <w:rPr>
-          <w:rFonts w:hint="eastAsia"/>
-        </w:rPr>
-      </w:pPr>
-      <w:r>
-        <w:t>array:sort</w:t>
-      </w:r>
-      <w:r>
-        <w:t xml:space="preserve">                               (with support for collation argument)</w:t>
-      </w:r>
-    </w:p>
-    <w:p>
-      <w:pPr>
-        <w:rPr>
-          <w:rFonts w:hint="eastAsia"/>
-        </w:rPr>
-      </w:pPr>
-      <w:r>
-        <w:t>array:flatten</w:t>
-      </w:r>
-    </w:p>
-    <w:p>
-      <w:pPr>
-        <w:rPr>
-          <w:rFonts w:hint="eastAsia"/>
-        </w:rPr>
-      </w:pPr>
-    </w:p>
-    <w:p>
-      <w:pPr>
-        <w:rPr>
-          <w:rFonts w:hint="eastAsia"/>
-        </w:rPr>
-      </w:pPr>
-      <w:r>
-        <w:t>20</w:t>
-      </w:r>
-      <w:r>
-        <w:t xml:space="preserve">) Functions on JSON </w:t>
-      </w:r>
-      <w:r>
-        <w:t>d</w:t>
-      </w:r>
-      <w:r>
-        <w:t>ata</w:t>
-      </w:r>
-    </w:p>
-    <w:p>
-      <w:pPr>
-        <w:rPr>
-          <w:rFonts w:hint="eastAsia"/>
-        </w:rPr>
-      </w:pPr>
-    </w:p>
-    <w:p>
-      <w:pPr>
-        <w:rPr>
-          <w:rFonts w:hint="eastAsia"/>
-        </w:rPr>
-      </w:pPr>
-      <w:r>
-        <w:t>fn:parse-json</w:t>
-      </w:r>
-    </w:p>
-    <w:p>
-      <w:pPr>
-        <w:rPr>
-          <w:rFonts w:hint="eastAsia"/>
-        </w:rPr>
-      </w:pPr>
-      <w:r>
-        <w:t>fn:json-doc</w:t>
-      </w:r>
-    </w:p>
-    <w:p>
-      <w:pPr>
-        <w:rPr>
-          <w:rFonts w:hint="eastAsia"/>
-        </w:rPr>
-      </w:pPr>
-      <w:r>
         <w:t>fn:json-to-xml</w:t>
       </w:r>
     </w:p>
@@ -7183,7 +7243,6 @@
           <w:bCs/>
           <w:szCs w:val="24"/>
         </w:rPr>
-        <w:lastRenderedPageBreak/>
         <w:t xml:space="preserve"> </w:t>
       </w:r>
       <w:r>
@@ -7716,7 +7775,7 @@
       <w:r>
         <w:t xml:space="preserve"> : </w:t>
       </w:r>
-      <w:hyperlink r:id="rId11" w:history="1">
+      <w:hyperlink r:id="rId12" w:history="1">
         <w:r>
           <w:rPr>
             <w:rStyle w:val="Hyperlink"/>
@@ -7763,7 +7822,7 @@
       <w:r>
         <w:t xml:space="preserve"> : </w:t>
       </w:r>
-      <w:hyperlink r:id="rId12" w:history="1">
+      <w:hyperlink r:id="rId13" w:history="1">
         <w:r>
           <w:rPr>
             <w:rStyle w:val="Hyperlink"/>
@@ -7773,128 +7832,64 @@
         </w:r>
       </w:hyperlink>
       <w:r>
+        <w:rPr>
+          <w:rFonts w:hint="eastAsia"/>
+        </w:rPr>
         <w:t xml:space="preserve"> </w:t>
       </w:r>
-      <w:r>
-        <w:t xml:space="preserve">and the </w:t>
-      </w:r>
-      <w:r>
-        <w:t xml:space="preserve">latest </w:t>
-      </w:r>
-      <w:r>
-        <w:t>results of these</w:t>
-      </w:r>
-      <w:r>
-        <w:t xml:space="preserve"> </w:t>
-      </w:r>
-      <w:r>
-        <w:t>XS</w:t>
-      </w:r>
-      <w:r>
-        <w:t xml:space="preserve">L </w:t>
-      </w:r>
-      <w:r>
-        <w:t>tests are available at</w:t>
-      </w:r>
-      <w:r>
-        <w:t xml:space="preserve"> </w:t>
-      </w:r>
-      <w:r>
-        <w:t>locations</w:t>
-      </w:r>
-      <w:r>
-        <w:t>,</w:t>
-      </w:r>
-      <w:r>
-        <w:t xml:space="preserve"> </w:t>
-      </w:r>
-      <w:hyperlink r:id="rId13" w:history="1">
-        <w:r>
-          <w:rPr>
-            <w:rStyle w:val="Hyperlink"/>
-          </w:rPr>
-          <w:t>https://xalan.apache.org/xalan-j/xsl3/tests/</w:t>
-        </w:r>
-        <w:r>
-          <w:rPr>
-            <w:rStyle w:val="Hyperlink"/>
-            <w:rFonts w:hint="eastAsia"/>
-          </w:rPr>
-          <w:t>xalan-j_xsl3_test_suite_result</w:t>
-        </w:r>
-        <w:r>
-          <w:rPr>
-            <w:rStyle w:val="Hyperlink"/>
-          </w:rPr>
-          <w:t>.xml</w:t>
-        </w:r>
-      </w:hyperlink>
-      <w:r>
-        <w:t xml:space="preserve"> &amp; </w:t>
-      </w:r>
+    </w:p>
+    <w:p>
+      <w:pPr>
+        <w:rPr>
+          <w:rFonts w:hint="eastAsia"/>
+        </w:rPr>
+      </w:pPr>
+    </w:p>
+    <w:p>
+      <w:pPr>
+        <w:rPr>
+          <w:rFonts w:hint="eastAsia"/>
+        </w:rPr>
+      </w:pPr>
+    </w:p>
+    <w:p>
+      <w:pPr>
+        <w:jc w:val="center"/>
+        <w:rPr>
+          <w:rFonts w:hint="eastAsia"/>
+        </w:rPr>
+      </w:pPr>
+    </w:p>
+    <w:p>
+      <w:pPr>
+        <w:jc w:val="center"/>
+        <w:rPr>
+          <w:rFonts w:hint="eastAsia"/>
+        </w:rPr>
+      </w:pPr>
+    </w:p>
+    <w:p>
+      <w:pPr>
+        <w:jc w:val="center"/>
+        <w:rPr>
+          <w:rFonts w:hint="eastAsia"/>
+        </w:rPr>
+      </w:pPr>
+      <w:r>
+        <w:t xml:space="preserve">Apache Xalan-J </w:t>
+      </w:r>
+      <w:r>
+        <w:t>site</w:t>
+      </w:r>
+    </w:p>
+    <w:p>
+      <w:pPr>
+        <w:jc w:val="center"/>
+        <w:rPr>
+          <w:rFonts w:hint="eastAsia"/>
+        </w:rPr>
+      </w:pPr>
       <w:hyperlink r:id="rId14" w:history="1">
-        <w:r>
-          <w:rPr>
-            <w:rStyle w:val="Hyperlink"/>
-            <w:rFonts w:hint="eastAsia"/>
-          </w:rPr>
-          <w:t>https://xalan.apache.org/xalan-j/xsl3/tests/xalan-j_xsl3_test_suite_result.html</w:t>
-        </w:r>
-      </w:hyperlink>
-    </w:p>
-    <w:p>
-      <w:pPr>
-        <w:rPr>
-          <w:rFonts w:hint="eastAsia"/>
-        </w:rPr>
-      </w:pPr>
-    </w:p>
-    <w:p>
-      <w:pPr>
-        <w:rPr>
-          <w:rFonts w:hint="eastAsia"/>
-        </w:rPr>
-      </w:pPr>
-    </w:p>
-    <w:p>
-      <w:pPr>
-        <w:jc w:val="center"/>
-        <w:rPr>
-          <w:rFonts w:hint="eastAsia"/>
-        </w:rPr>
-      </w:pPr>
-    </w:p>
-    <w:p>
-      <w:pPr>
-        <w:jc w:val="center"/>
-        <w:rPr>
-          <w:rFonts w:hint="eastAsia"/>
-        </w:rPr>
-      </w:pPr>
-    </w:p>
-    <w:p>
-      <w:pPr>
-        <w:jc w:val="center"/>
-        <w:rPr>
-          <w:rFonts w:hint="eastAsia"/>
-        </w:rPr>
-      </w:pPr>
-      <w:r>
-        <w:lastRenderedPageBreak/>
-        <w:t xml:space="preserve">Apache Xalan-J </w:t>
-      </w:r>
-      <w:r>
-        <w:t>site</w:t>
-      </w:r>
-    </w:p>
-    <w:p>
-      <w:pPr>
-        <w:jc w:val="center"/>
-        <w:rPr>
-          <w:rFonts w:hint="eastAsia"/>
-        </w:rPr>
-      </w:pPr>
-      <w:hyperlink r:id="rId15" w:history="1">
         <w:r>
           <w:rPr>
             <w:rStyle w:val="Hyperlink"/>
@@ -7961,6 +7956,119 @@
 <file path=word/numbering.xml><?xml version="1.0" encoding="utf-8"?>
 <w:numbering xmlns:wpc="http://schemas.microsoft.com/office/word/2010/wordprocessingCanvas" xmlns:cx="http://schemas.microsoft.com/office/drawing/2014/chartex" xmlns:cx1="http://schemas.microsoft.com/office/drawing/2015/9/8/chartex" xmlns:cx2="http://schemas.microsoft.com/office/drawing/2015/10/21/chartex" xmlns:cx3="http://schemas.microsoft.com/office/drawing/2016/5/9/chartex" xmlns:cx4="http://schemas.microsoft.com/office/drawing/2016/5/10/chartex" xmlns:cx5="http://schemas.microsoft.com/office/drawing/2016/5/11/chartex" xmlns:cx6="http://schemas.microsoft.com/office/drawing/2016/5/12/chartex" xmlns:cx7="http://schemas.microsoft.com/office/drawing/2016/5/13/chartex" xmlns:cx8="http://schemas.microsoft.com/office/drawing/2016/5/14/chartex" xmlns:mc="http://schemas.openxmlformats.org/markup-compatibility/2006" xmlns:aink="http://schemas.microsoft.com/office/drawing/2016/ink" xmlns:am3d="http://schemas.microsoft.com/office/drawing/2017/model3d" xmlns:o="urn:schemas-microsoft-com:office:office" xmlns:oel="http://schemas.microsoft.com/office/2019/extlst" xmlns:r="http://schemas.openxmlformats.org/officeDocument/2006/relationships" xmlns:m="http://schemas.openxmlformats.org/officeDocument/2006/math" xmlns:v="urn:schemas-microsoft-com:vml" xmlns:wp14="http://schemas.microsoft.com/office/word/2010/wordprocessingDrawing" xmlns:wp="http://schemas.openxmlformats.org/drawingml/2006/wordprocessingDrawing" xmlns:w10="urn:schemas-microsoft-com:office:word" xmlns:w="http://schemas.openxmlformats.org/wordprocessingml/2006/main" xmlns:w14="http://schemas.microsoft.com/office/word/2010/wordml" xmlns:w15="http://schemas.microsoft.com/office/word/2012/wordml" xmlns:w16cex="http://schemas.microsoft.com/office/word/2018/wordml/cex" xmlns:w16cid="http://schemas.microsoft.com/office/word/2016/wordml/cid" xmlns:w16="http://schemas.microsoft.com/office/word/2018/wordml" xmlns:w16du="http://schemas.microsoft.com/office/word/2023/wordml/word16du" xmlns:w16sdtdh="http://schemas.microsoft.com/office/word/2020/wordml/sdtdatahash" xmlns:w16sdtfl="http://schemas.microsoft.com/office/word/2024/wordml/sdtformatlock" xmlns:w16se="http://schemas.microsoft.com/office/word/2015/wordml/symex" xmlns:wpg="http://schemas.microsoft.com/office/word/2010/wordprocessingGroup" xmlns:wpi="http://schemas.microsoft.com/office/word/2010/wordprocessingInk" xmlns:wne="http://schemas.microsoft.com/office/word/2006/wordml" xmlns:wps="http://schemas.microsoft.com/office/word/2010/wordprocessingShape" mc:Ignorable="w14 w15 w16se w16cid w16 w16cex w16sdtdh w16sdtfl w16du wp14">
   <w:abstractNum w:abstractNumId="0" w15:restartNumberingAfterBreak="0">
+    <w:nsid w:val="05AE1EB2"/>
+    <w:multiLevelType w:val="hybridMultilevel"/>
+    <w:tmpl w:val="88C8F3BC"/>
+    <w:lvl w:ilvl="0" w:tplc="B0926636">
+      <w:start w:val="2"/>
+      <w:numFmt w:val="bullet"/>
+      <w:lvlText w:val=""/>
+      <w:lvlJc w:val="left"/>
+      <w:pPr>
+        <w:ind w:left="786" w:hanging="360"/>
+      </w:pPr>
+      <w:rPr>
+        <w:rFonts w:ascii="Wingdings" w:eastAsia="NSimSun" w:hAnsi="Wingdings" w:cs="Lucida Sans" w:hint="default"/>
+      </w:rPr>
+    </w:lvl>
+    <w:lvl w:ilvl="1" w:tplc="40090003" w:tentative="1">
+      <w:start w:val="1"/>
+      <w:numFmt w:val="bullet"/>
+      <w:lvlText w:val="o"/>
+      <w:lvlJc w:val="left"/>
+      <w:pPr>
+        <w:ind w:left="1506" w:hanging="360"/>
+      </w:pPr>
+      <w:rPr>
+        <w:rFonts w:ascii="Courier New" w:hAnsi="Courier New" w:cs="Courier New" w:hint="default"/>
+      </w:rPr>
+    </w:lvl>
+    <w:lvl w:ilvl="2" w:tplc="40090005" w:tentative="1">
+      <w:start w:val="1"/>
+      <w:numFmt w:val="bullet"/>
+      <w:lvlText w:val=""/>
+      <w:lvlJc w:val="left"/>
+      <w:pPr>
+        <w:ind w:left="2226" w:hanging="360"/>
+      </w:pPr>
+      <w:rPr>
+        <w:rFonts w:ascii="Wingdings" w:hAnsi="Wingdings" w:hint="default"/>
+      </w:rPr>
+    </w:lvl>
+    <w:lvl w:ilvl="3" w:tplc="40090001" w:tentative="1">
+      <w:start w:val="1"/>
+      <w:numFmt w:val="bullet"/>
+      <w:lvlText w:val=""/>
+      <w:lvlJc w:val="left"/>
+      <w:pPr>
+        <w:ind w:left="2946" w:hanging="360"/>
+      </w:pPr>
+      <w:rPr>
+        <w:rFonts w:ascii="Symbol" w:hAnsi="Symbol" w:hint="default"/>
+      </w:rPr>
+    </w:lvl>
+    <w:lvl w:ilvl="4" w:tplc="40090003" w:tentative="1">
+      <w:start w:val="1"/>
+      <w:numFmt w:val="bullet"/>
+      <w:lvlText w:val="o"/>
+      <w:lvlJc w:val="left"/>
+      <w:pPr>
+        <w:ind w:left="3666" w:hanging="360"/>
+      </w:pPr>
+      <w:rPr>
+        <w:rFonts w:ascii="Courier New" w:hAnsi="Courier New" w:cs="Courier New" w:hint="default"/>
+      </w:rPr>
+    </w:lvl>
+    <w:lvl w:ilvl="5" w:tplc="40090005" w:tentative="1">
+      <w:start w:val="1"/>
+      <w:numFmt w:val="bullet"/>
+      <w:lvlText w:val=""/>
+      <w:lvlJc w:val="left"/>
+      <w:pPr>
+        <w:ind w:left="4386" w:hanging="360"/>
+      </w:pPr>
+      <w:rPr>
+        <w:rFonts w:ascii="Wingdings" w:hAnsi="Wingdings" w:hint="default"/>
+      </w:rPr>
+    </w:lvl>
+    <w:lvl w:ilvl="6" w:tplc="40090001" w:tentative="1">
+      <w:start w:val="1"/>
+      <w:numFmt w:val="bullet"/>
+      <w:lvlText w:val=""/>
+      <w:lvlJc w:val="left"/>
+      <w:pPr>
+        <w:ind w:left="5106" w:hanging="360"/>
+      </w:pPr>
+      <w:rPr>
+        <w:rFonts w:ascii="Symbol" w:hAnsi="Symbol" w:hint="default"/>
+      </w:rPr>
+    </w:lvl>
+    <w:lvl w:ilvl="7" w:tplc="40090003" w:tentative="1">
+      <w:start w:val="1"/>
+      <w:numFmt w:val="bullet"/>
+      <w:lvlText w:val="o"/>
+      <w:lvlJc w:val="left"/>
+      <w:pPr>
+        <w:ind w:left="5826" w:hanging="360"/>
+      </w:pPr>
+      <w:rPr>
+        <w:rFonts w:ascii="Courier New" w:hAnsi="Courier New" w:cs="Courier New" w:hint="default"/>
+      </w:rPr>
+    </w:lvl>
+    <w:lvl w:ilvl="8" w:tplc="40090005" w:tentative="1">
+      <w:start w:val="1"/>
+      <w:numFmt w:val="bullet"/>
+      <w:lvlText w:val=""/>
+      <w:lvlJc w:val="left"/>
+      <w:pPr>
+        <w:ind w:left="6546" w:hanging="360"/>
+      </w:pPr>
+      <w:rPr>
+        <w:rFonts w:ascii="Wingdings" w:hAnsi="Wingdings" w:hint="default"/>
+      </w:rPr>
+    </w:lvl>
+  </w:abstractNum>
+  <w:abstractNum w:abstractNumId="1" w15:restartNumberingAfterBreak="0">
     <w:nsid w:val="17415D76"/>
     <w:multiLevelType w:val="hybridMultilevel"/>
     <w:tmpl w:val="26340026"/>
@@ -8049,7 +8157,232 @@
       </w:pPr>
     </w:lvl>
   </w:abstractNum>
-  <w:abstractNum w:abstractNumId="1" w15:restartNumberingAfterBreak="0">
+  <w:abstractNum w:abstractNumId="2" w15:restartNumberingAfterBreak="0">
+    <w:nsid w:val="1C964CF1"/>
+    <w:multiLevelType w:val="hybridMultilevel"/>
+    <w:tmpl w:val="115C384E"/>
+    <w:lvl w:ilvl="0" w:tplc="BD38B980">
+      <w:start w:val="2"/>
+      <w:numFmt w:val="bullet"/>
+      <w:lvlText w:val=""/>
+      <w:lvlJc w:val="left"/>
+      <w:pPr>
+        <w:ind w:left="786" w:hanging="360"/>
+      </w:pPr>
+      <w:rPr>
+        <w:rFonts w:ascii="Wingdings" w:eastAsia="NSimSun" w:hAnsi="Wingdings" w:cs="Lucida Sans" w:hint="default"/>
+      </w:rPr>
+    </w:lvl>
+    <w:lvl w:ilvl="1" w:tplc="40090003" w:tentative="1">
+      <w:start w:val="1"/>
+      <w:numFmt w:val="bullet"/>
+      <w:lvlText w:val="o"/>
+      <w:lvlJc w:val="left"/>
+      <w:pPr>
+        <w:ind w:left="1506" w:hanging="360"/>
+      </w:pPr>
+      <w:rPr>
+        <w:rFonts w:ascii="Courier New" w:hAnsi="Courier New" w:cs="Courier New" w:hint="default"/>
+      </w:rPr>
+    </w:lvl>
+    <w:lvl w:ilvl="2" w:tplc="40090005" w:tentative="1">
+      <w:start w:val="1"/>
+      <w:numFmt w:val="bullet"/>
+      <w:lvlText w:val=""/>
+      <w:lvlJc w:val="left"/>
+      <w:pPr>
+        <w:ind w:left="2226" w:hanging="360"/>
+      </w:pPr>
+      <w:rPr>
+        <w:rFonts w:ascii="Wingdings" w:hAnsi="Wingdings" w:hint="default"/>
+      </w:rPr>
+    </w:lvl>
+    <w:lvl w:ilvl="3" w:tplc="40090001" w:tentative="1">
+      <w:start w:val="1"/>
+      <w:numFmt w:val="bullet"/>
+      <w:lvlText w:val=""/>
+      <w:lvlJc w:val="left"/>
+      <w:pPr>
+        <w:ind w:left="2946" w:hanging="360"/>
+      </w:pPr>
+      <w:rPr>
+        <w:rFonts w:ascii="Symbol" w:hAnsi="Symbol" w:hint="default"/>
+      </w:rPr>
+    </w:lvl>
+    <w:lvl w:ilvl="4" w:tplc="40090003" w:tentative="1">
+      <w:start w:val="1"/>
+      <w:numFmt w:val="bullet"/>
+      <w:lvlText w:val="o"/>
+      <w:lvlJc w:val="left"/>
+      <w:pPr>
+        <w:ind w:left="3666" w:hanging="360"/>
+      </w:pPr>
+      <w:rPr>
+        <w:rFonts w:ascii="Courier New" w:hAnsi="Courier New" w:cs="Courier New" w:hint="default"/>
+      </w:rPr>
+    </w:lvl>
+    <w:lvl w:ilvl="5" w:tplc="40090005" w:tentative="1">
+      <w:start w:val="1"/>
+      <w:numFmt w:val="bullet"/>
+      <w:lvlText w:val=""/>
+      <w:lvlJc w:val="left"/>
+      <w:pPr>
+        <w:ind w:left="4386" w:hanging="360"/>
+      </w:pPr>
+      <w:rPr>
+        <w:rFonts w:ascii="Wingdings" w:hAnsi="Wingdings" w:hint="default"/>
+      </w:rPr>
+    </w:lvl>
+    <w:lvl w:ilvl="6" w:tplc="40090001" w:tentative="1">
+      <w:start w:val="1"/>
+      <w:numFmt w:val="bullet"/>
+      <w:lvlText w:val=""/>
+      <w:lvlJc w:val="left"/>
+      <w:pPr>
+        <w:ind w:left="5106" w:hanging="360"/>
+      </w:pPr>
+      <w:rPr>
+        <w:rFonts w:ascii="Symbol" w:hAnsi="Symbol" w:hint="default"/>
+      </w:rPr>
+    </w:lvl>
+    <w:lvl w:ilvl="7" w:tplc="40090003" w:tentative="1">
+      <w:start w:val="1"/>
+      <w:numFmt w:val="bullet"/>
+      <w:lvlText w:val="o"/>
+      <w:lvlJc w:val="left"/>
+      <w:pPr>
+        <w:ind w:left="5826" w:hanging="360"/>
+      </w:pPr>
+      <w:rPr>
+        <w:rFonts w:ascii="Courier New" w:hAnsi="Courier New" w:cs="Courier New" w:hint="default"/>
+      </w:rPr>
+    </w:lvl>
+    <w:lvl w:ilvl="8" w:tplc="40090005" w:tentative="1">
+      <w:start w:val="1"/>
+      <w:numFmt w:val="bullet"/>
+      <w:lvlText w:val=""/>
+      <w:lvlJc w:val="left"/>
+      <w:pPr>
+        <w:ind w:left="6546" w:hanging="360"/>
+      </w:pPr>
+      <w:rPr>
+        <w:rFonts w:ascii="Wingdings" w:hAnsi="Wingdings" w:hint="default"/>
+      </w:rPr>
+    </w:lvl>
+  </w:abstractNum>
+  <w:abstractNum w:abstractNumId="3" w15:restartNumberingAfterBreak="0">
+    <w:nsid w:val="234B2A2C"/>
+    <w:multiLevelType w:val="hybridMultilevel"/>
+    <w:tmpl w:val="3BD4C48E"/>
+    <w:lvl w:ilvl="0" w:tplc="FDA43D4E">
+      <w:numFmt w:val="bullet"/>
+      <w:lvlText w:val=""/>
+      <w:lvlJc w:val="left"/>
+      <w:pPr>
+        <w:ind w:left="786" w:hanging="360"/>
+      </w:pPr>
+      <w:rPr>
+        <w:rFonts w:ascii="Wingdings" w:eastAsia="NSimSun" w:hAnsi="Wingdings" w:cs="Lucida Sans" w:hint="default"/>
+      </w:rPr>
+    </w:lvl>
+    <w:lvl w:ilvl="1" w:tplc="40090003" w:tentative="1">
+      <w:start w:val="1"/>
+      <w:numFmt w:val="bullet"/>
+      <w:lvlText w:val="o"/>
+      <w:lvlJc w:val="left"/>
+      <w:pPr>
+        <w:ind w:left="1506" w:hanging="360"/>
+      </w:pPr>
+      <w:rPr>
+        <w:rFonts w:ascii="Courier New" w:hAnsi="Courier New" w:cs="Courier New" w:hint="default"/>
+      </w:rPr>
+    </w:lvl>
+    <w:lvl w:ilvl="2" w:tplc="40090005" w:tentative="1">
+      <w:start w:val="1"/>
+      <w:numFmt w:val="bullet"/>
+      <w:lvlText w:val=""/>
+      <w:lvlJc w:val="left"/>
+      <w:pPr>
+        <w:ind w:left="2226" w:hanging="360"/>
+      </w:pPr>
+      <w:rPr>
+        <w:rFonts w:ascii="Wingdings" w:hAnsi="Wingdings" w:hint="default"/>
+      </w:rPr>
+    </w:lvl>
+    <w:lvl w:ilvl="3" w:tplc="40090001" w:tentative="1">
+      <w:start w:val="1"/>
+      <w:numFmt w:val="bullet"/>
+      <w:lvlText w:val=""/>
+      <w:lvlJc w:val="left"/>
+      <w:pPr>
+        <w:ind w:left="2946" w:hanging="360"/>
+      </w:pPr>
+      <w:rPr>
+        <w:rFonts w:ascii="Symbol" w:hAnsi="Symbol" w:hint="default"/>
+      </w:rPr>
+    </w:lvl>
+    <w:lvl w:ilvl="4" w:tplc="40090003" w:tentative="1">
+      <w:start w:val="1"/>
+      <w:numFmt w:val="bullet"/>
+      <w:lvlText w:val="o"/>
+      <w:lvlJc w:val="left"/>
+      <w:pPr>
+        <w:ind w:left="3666" w:hanging="360"/>
+      </w:pPr>
+      <w:rPr>
+        <w:rFonts w:ascii="Courier New" w:hAnsi="Courier New" w:cs="Courier New" w:hint="default"/>
+      </w:rPr>
+    </w:lvl>
+    <w:lvl w:ilvl="5" w:tplc="40090005" w:tentative="1">
+      <w:start w:val="1"/>
+      <w:numFmt w:val="bullet"/>
+      <w:lvlText w:val=""/>
+      <w:lvlJc w:val="left"/>
+      <w:pPr>
+        <w:ind w:left="4386" w:hanging="360"/>
+      </w:pPr>
+      <w:rPr>
+        <w:rFonts w:ascii="Wingdings" w:hAnsi="Wingdings" w:hint="default"/>
+      </w:rPr>
+    </w:lvl>
+    <w:lvl w:ilvl="6" w:tplc="40090001" w:tentative="1">
+      <w:start w:val="1"/>
+      <w:numFmt w:val="bullet"/>
+      <w:lvlText w:val=""/>
+      <w:lvlJc w:val="left"/>
+      <w:pPr>
+        <w:ind w:left="5106" w:hanging="360"/>
+      </w:pPr>
+      <w:rPr>
+        <w:rFonts w:ascii="Symbol" w:hAnsi="Symbol" w:hint="default"/>
+      </w:rPr>
+    </w:lvl>
+    <w:lvl w:ilvl="7" w:tplc="40090003" w:tentative="1">
+      <w:start w:val="1"/>
+      <w:numFmt w:val="bullet"/>
+      <w:lvlText w:val="o"/>
+      <w:lvlJc w:val="left"/>
+      <w:pPr>
+        <w:ind w:left="5826" w:hanging="360"/>
+      </w:pPr>
+      <w:rPr>
+        <w:rFonts w:ascii="Courier New" w:hAnsi="Courier New" w:cs="Courier New" w:hint="default"/>
+      </w:rPr>
+    </w:lvl>
+    <w:lvl w:ilvl="8" w:tplc="40090005" w:tentative="1">
+      <w:start w:val="1"/>
+      <w:numFmt w:val="bullet"/>
+      <w:lvlText w:val=""/>
+      <w:lvlJc w:val="left"/>
+      <w:pPr>
+        <w:ind w:left="6546" w:hanging="360"/>
+      </w:pPr>
+      <w:rPr>
+        <w:rFonts w:ascii="Wingdings" w:hAnsi="Wingdings" w:hint="default"/>
+      </w:rPr>
+    </w:lvl>
+  </w:abstractNum>
+  <w:abstractNum w:abstractNumId="4" w15:restartNumberingAfterBreak="0">
     <w:nsid w:val="2B3E3413"/>
     <w:multiLevelType w:val="hybridMultilevel"/>
     <w:tmpl w:val="832EE9E2"/>
@@ -8138,7 +8471,120 @@
       </w:pPr>
     </w:lvl>
   </w:abstractNum>
-  <w:abstractNum w:abstractNumId="2" w15:restartNumberingAfterBreak="0">
+  <w:abstractNum w:abstractNumId="5" w15:restartNumberingAfterBreak="0">
+    <w:nsid w:val="2DB410BE"/>
+    <w:multiLevelType w:val="hybridMultilevel"/>
+    <w:tmpl w:val="9434F7E6"/>
+    <w:lvl w:ilvl="0" w:tplc="03A05738">
+      <w:start w:val="2"/>
+      <w:numFmt w:val="bullet"/>
+      <w:lvlText w:val=""/>
+      <w:lvlJc w:val="left"/>
+      <w:pPr>
+        <w:ind w:left="786" w:hanging="360"/>
+      </w:pPr>
+      <w:rPr>
+        <w:rFonts w:ascii="Wingdings" w:eastAsia="NSimSun" w:hAnsi="Wingdings" w:cs="Lucida Sans" w:hint="default"/>
+      </w:rPr>
+    </w:lvl>
+    <w:lvl w:ilvl="1" w:tplc="40090003" w:tentative="1">
+      <w:start w:val="1"/>
+      <w:numFmt w:val="bullet"/>
+      <w:lvlText w:val="o"/>
+      <w:lvlJc w:val="left"/>
+      <w:pPr>
+        <w:ind w:left="1506" w:hanging="360"/>
+      </w:pPr>
+      <w:rPr>
+        <w:rFonts w:ascii="Courier New" w:hAnsi="Courier New" w:cs="Courier New" w:hint="default"/>
+      </w:rPr>
+    </w:lvl>
+    <w:lvl w:ilvl="2" w:tplc="40090005" w:tentative="1">
+      <w:start w:val="1"/>
+      <w:numFmt w:val="bullet"/>
+      <w:lvlText w:val=""/>
+      <w:lvlJc w:val="left"/>
+      <w:pPr>
+        <w:ind w:left="2226" w:hanging="360"/>
+      </w:pPr>
+      <w:rPr>
+        <w:rFonts w:ascii="Wingdings" w:hAnsi="Wingdings" w:hint="default"/>
+      </w:rPr>
+    </w:lvl>
+    <w:lvl w:ilvl="3" w:tplc="40090001" w:tentative="1">
+      <w:start w:val="1"/>
+      <w:numFmt w:val="bullet"/>
+      <w:lvlText w:val=""/>
+      <w:lvlJc w:val="left"/>
+      <w:pPr>
+        <w:ind w:left="2946" w:hanging="360"/>
+      </w:pPr>
+      <w:rPr>
+        <w:rFonts w:ascii="Symbol" w:hAnsi="Symbol" w:hint="default"/>
+      </w:rPr>
+    </w:lvl>
+    <w:lvl w:ilvl="4" w:tplc="40090003" w:tentative="1">
+      <w:start w:val="1"/>
+      <w:numFmt w:val="bullet"/>
+      <w:lvlText w:val="o"/>
+      <w:lvlJc w:val="left"/>
+      <w:pPr>
+        <w:ind w:left="3666" w:hanging="360"/>
+      </w:pPr>
+      <w:rPr>
+        <w:rFonts w:ascii="Courier New" w:hAnsi="Courier New" w:cs="Courier New" w:hint="default"/>
+      </w:rPr>
+    </w:lvl>
+    <w:lvl w:ilvl="5" w:tplc="40090005" w:tentative="1">
+      <w:start w:val="1"/>
+      <w:numFmt w:val="bullet"/>
+      <w:lvlText w:val=""/>
+      <w:lvlJc w:val="left"/>
+      <w:pPr>
+        <w:ind w:left="4386" w:hanging="360"/>
+      </w:pPr>
+      <w:rPr>
+        <w:rFonts w:ascii="Wingdings" w:hAnsi="Wingdings" w:hint="default"/>
+      </w:rPr>
+    </w:lvl>
+    <w:lvl w:ilvl="6" w:tplc="40090001" w:tentative="1">
+      <w:start w:val="1"/>
+      <w:numFmt w:val="bullet"/>
+      <w:lvlText w:val=""/>
+      <w:lvlJc w:val="left"/>
+      <w:pPr>
+        <w:ind w:left="5106" w:hanging="360"/>
+      </w:pPr>
+      <w:rPr>
+        <w:rFonts w:ascii="Symbol" w:hAnsi="Symbol" w:hint="default"/>
+      </w:rPr>
+    </w:lvl>
+    <w:lvl w:ilvl="7" w:tplc="40090003" w:tentative="1">
+      <w:start w:val="1"/>
+      <w:numFmt w:val="bullet"/>
+      <w:lvlText w:val="o"/>
+      <w:lvlJc w:val="left"/>
+      <w:pPr>
+        <w:ind w:left="5826" w:hanging="360"/>
+      </w:pPr>
+      <w:rPr>
+        <w:rFonts w:ascii="Courier New" w:hAnsi="Courier New" w:cs="Courier New" w:hint="default"/>
+      </w:rPr>
+    </w:lvl>
+    <w:lvl w:ilvl="8" w:tplc="40090005" w:tentative="1">
+      <w:start w:val="1"/>
+      <w:numFmt w:val="bullet"/>
+      <w:lvlText w:val=""/>
+      <w:lvlJc w:val="left"/>
+      <w:pPr>
+        <w:ind w:left="6546" w:hanging="360"/>
+      </w:pPr>
+      <w:rPr>
+        <w:rFonts w:ascii="Wingdings" w:hAnsi="Wingdings" w:hint="default"/>
+      </w:rPr>
+    </w:lvl>
+  </w:abstractNum>
+  <w:abstractNum w:abstractNumId="6" w15:restartNumberingAfterBreak="0">
     <w:nsid w:val="313A2C8A"/>
     <w:multiLevelType w:val="hybridMultilevel"/>
     <w:tmpl w:val="10283368"/>
@@ -8227,7 +8673,232 @@
       </w:pPr>
     </w:lvl>
   </w:abstractNum>
-  <w:abstractNum w:abstractNumId="3" w15:restartNumberingAfterBreak="0">
+  <w:abstractNum w:abstractNumId="7" w15:restartNumberingAfterBreak="0">
+    <w:nsid w:val="34AB4661"/>
+    <w:multiLevelType w:val="hybridMultilevel"/>
+    <w:tmpl w:val="CF323872"/>
+    <w:lvl w:ilvl="0" w:tplc="F3CC6060">
+      <w:start w:val="2"/>
+      <w:numFmt w:val="bullet"/>
+      <w:lvlText w:val=""/>
+      <w:lvlJc w:val="left"/>
+      <w:pPr>
+        <w:ind w:left="786" w:hanging="360"/>
+      </w:pPr>
+      <w:rPr>
+        <w:rFonts w:ascii="Wingdings" w:eastAsia="NSimSun" w:hAnsi="Wingdings" w:cs="Lucida Sans" w:hint="default"/>
+      </w:rPr>
+    </w:lvl>
+    <w:lvl w:ilvl="1" w:tplc="40090003" w:tentative="1">
+      <w:start w:val="1"/>
+      <w:numFmt w:val="bullet"/>
+      <w:lvlText w:val="o"/>
+      <w:lvlJc w:val="left"/>
+      <w:pPr>
+        <w:ind w:left="1506" w:hanging="360"/>
+      </w:pPr>
+      <w:rPr>
+        <w:rFonts w:ascii="Courier New" w:hAnsi="Courier New" w:cs="Courier New" w:hint="default"/>
+      </w:rPr>
+    </w:lvl>
+    <w:lvl w:ilvl="2" w:tplc="40090005" w:tentative="1">
+      <w:start w:val="1"/>
+      <w:numFmt w:val="bullet"/>
+      <w:lvlText w:val=""/>
+      <w:lvlJc w:val="left"/>
+      <w:pPr>
+        <w:ind w:left="2226" w:hanging="360"/>
+      </w:pPr>
+      <w:rPr>
+        <w:rFonts w:ascii="Wingdings" w:hAnsi="Wingdings" w:hint="default"/>
+      </w:rPr>
+    </w:lvl>
+    <w:lvl w:ilvl="3" w:tplc="40090001" w:tentative="1">
+      <w:start w:val="1"/>
+      <w:numFmt w:val="bullet"/>
+      <w:lvlText w:val=""/>
+      <w:lvlJc w:val="left"/>
+      <w:pPr>
+        <w:ind w:left="2946" w:hanging="360"/>
+      </w:pPr>
+      <w:rPr>
+        <w:rFonts w:ascii="Symbol" w:hAnsi="Symbol" w:hint="default"/>
+      </w:rPr>
+    </w:lvl>
+    <w:lvl w:ilvl="4" w:tplc="40090003" w:tentative="1">
+      <w:start w:val="1"/>
+      <w:numFmt w:val="bullet"/>
+      <w:lvlText w:val="o"/>
+      <w:lvlJc w:val="left"/>
+      <w:pPr>
+        <w:ind w:left="3666" w:hanging="360"/>
+      </w:pPr>
+      <w:rPr>
+        <w:rFonts w:ascii="Courier New" w:hAnsi="Courier New" w:cs="Courier New" w:hint="default"/>
+      </w:rPr>
+    </w:lvl>
+    <w:lvl w:ilvl="5" w:tplc="40090005" w:tentative="1">
+      <w:start w:val="1"/>
+      <w:numFmt w:val="bullet"/>
+      <w:lvlText w:val=""/>
+      <w:lvlJc w:val="left"/>
+      <w:pPr>
+        <w:ind w:left="4386" w:hanging="360"/>
+      </w:pPr>
+      <w:rPr>
+        <w:rFonts w:ascii="Wingdings" w:hAnsi="Wingdings" w:hint="default"/>
+      </w:rPr>
+    </w:lvl>
+    <w:lvl w:ilvl="6" w:tplc="40090001" w:tentative="1">
+      <w:start w:val="1"/>
+      <w:numFmt w:val="bullet"/>
+      <w:lvlText w:val=""/>
+      <w:lvlJc w:val="left"/>
+      <w:pPr>
+        <w:ind w:left="5106" w:hanging="360"/>
+      </w:pPr>
+      <w:rPr>
+        <w:rFonts w:ascii="Symbol" w:hAnsi="Symbol" w:hint="default"/>
+      </w:rPr>
+    </w:lvl>
+    <w:lvl w:ilvl="7" w:tplc="40090003" w:tentative="1">
+      <w:start w:val="1"/>
+      <w:numFmt w:val="bullet"/>
+      <w:lvlText w:val="o"/>
+      <w:lvlJc w:val="left"/>
+      <w:pPr>
+        <w:ind w:left="5826" w:hanging="360"/>
+      </w:pPr>
+      <w:rPr>
+        <w:rFonts w:ascii="Courier New" w:hAnsi="Courier New" w:cs="Courier New" w:hint="default"/>
+      </w:rPr>
+    </w:lvl>
+    <w:lvl w:ilvl="8" w:tplc="40090005" w:tentative="1">
+      <w:start w:val="1"/>
+      <w:numFmt w:val="bullet"/>
+      <w:lvlText w:val=""/>
+      <w:lvlJc w:val="left"/>
+      <w:pPr>
+        <w:ind w:left="6546" w:hanging="360"/>
+      </w:pPr>
+      <w:rPr>
+        <w:rFonts w:ascii="Wingdings" w:hAnsi="Wingdings" w:hint="default"/>
+      </w:rPr>
+    </w:lvl>
+  </w:abstractNum>
+  <w:abstractNum w:abstractNumId="8" w15:restartNumberingAfterBreak="0">
+    <w:nsid w:val="360B7634"/>
+    <w:multiLevelType w:val="hybridMultilevel"/>
+    <w:tmpl w:val="B3F2FFE0"/>
+    <w:lvl w:ilvl="0" w:tplc="D0F629EC">
+      <w:numFmt w:val="bullet"/>
+      <w:lvlText w:val=""/>
+      <w:lvlJc w:val="left"/>
+      <w:pPr>
+        <w:ind w:left="786" w:hanging="360"/>
+      </w:pPr>
+      <w:rPr>
+        <w:rFonts w:ascii="Wingdings" w:eastAsia="NSimSun" w:hAnsi="Wingdings" w:cs="Lucida Sans" w:hint="default"/>
+      </w:rPr>
+    </w:lvl>
+    <w:lvl w:ilvl="1" w:tplc="40090003" w:tentative="1">
+      <w:start w:val="1"/>
+      <w:numFmt w:val="bullet"/>
+      <w:lvlText w:val="o"/>
+      <w:lvlJc w:val="left"/>
+      <w:pPr>
+        <w:ind w:left="1506" w:hanging="360"/>
+      </w:pPr>
+      <w:rPr>
+        <w:rFonts w:ascii="Courier New" w:hAnsi="Courier New" w:cs="Courier New" w:hint="default"/>
+      </w:rPr>
+    </w:lvl>
+    <w:lvl w:ilvl="2" w:tplc="40090005" w:tentative="1">
+      <w:start w:val="1"/>
+      <w:numFmt w:val="bullet"/>
+      <w:lvlText w:val=""/>
+      <w:lvlJc w:val="left"/>
+      <w:pPr>
+        <w:ind w:left="2226" w:hanging="360"/>
+      </w:pPr>
+      <w:rPr>
+        <w:rFonts w:ascii="Wingdings" w:hAnsi="Wingdings" w:hint="default"/>
+      </w:rPr>
+    </w:lvl>
+    <w:lvl w:ilvl="3" w:tplc="40090001" w:tentative="1">
+      <w:start w:val="1"/>
+      <w:numFmt w:val="bullet"/>
+      <w:lvlText w:val=""/>
+      <w:lvlJc w:val="left"/>
+      <w:pPr>
+        <w:ind w:left="2946" w:hanging="360"/>
+      </w:pPr>
+      <w:rPr>
+        <w:rFonts w:ascii="Symbol" w:hAnsi="Symbol" w:hint="default"/>
+      </w:rPr>
+    </w:lvl>
+    <w:lvl w:ilvl="4" w:tplc="40090003" w:tentative="1">
+      <w:start w:val="1"/>
+      <w:numFmt w:val="bullet"/>
+      <w:lvlText w:val="o"/>
+      <w:lvlJc w:val="left"/>
+      <w:pPr>
+        <w:ind w:left="3666" w:hanging="360"/>
+      </w:pPr>
+      <w:rPr>
+        <w:rFonts w:ascii="Courier New" w:hAnsi="Courier New" w:cs="Courier New" w:hint="default"/>
+      </w:rPr>
+    </w:lvl>
+    <w:lvl w:ilvl="5" w:tplc="40090005" w:tentative="1">
+      <w:start w:val="1"/>
+      <w:numFmt w:val="bullet"/>
+      <w:lvlText w:val=""/>
+      <w:lvlJc w:val="left"/>
+      <w:pPr>
+        <w:ind w:left="4386" w:hanging="360"/>
+      </w:pPr>
+      <w:rPr>
+        <w:rFonts w:ascii="Wingdings" w:hAnsi="Wingdings" w:hint="default"/>
+      </w:rPr>
+    </w:lvl>
+    <w:lvl w:ilvl="6" w:tplc="40090001" w:tentative="1">
+      <w:start w:val="1"/>
+      <w:numFmt w:val="bullet"/>
+      <w:lvlText w:val=""/>
+      <w:lvlJc w:val="left"/>
+      <w:pPr>
+        <w:ind w:left="5106" w:hanging="360"/>
+      </w:pPr>
+      <w:rPr>
+        <w:rFonts w:ascii="Symbol" w:hAnsi="Symbol" w:hint="default"/>
+      </w:rPr>
+    </w:lvl>
+    <w:lvl w:ilvl="7" w:tplc="40090003" w:tentative="1">
+      <w:start w:val="1"/>
+      <w:numFmt w:val="bullet"/>
+      <w:lvlText w:val="o"/>
+      <w:lvlJc w:val="left"/>
+      <w:pPr>
+        <w:ind w:left="5826" w:hanging="360"/>
+      </w:pPr>
+      <w:rPr>
+        <w:rFonts w:ascii="Courier New" w:hAnsi="Courier New" w:cs="Courier New" w:hint="default"/>
+      </w:rPr>
+    </w:lvl>
+    <w:lvl w:ilvl="8" w:tplc="40090005" w:tentative="1">
+      <w:start w:val="1"/>
+      <w:numFmt w:val="bullet"/>
+      <w:lvlText w:val=""/>
+      <w:lvlJc w:val="left"/>
+      <w:pPr>
+        <w:ind w:left="6546" w:hanging="360"/>
+      </w:pPr>
+      <w:rPr>
+        <w:rFonts w:ascii="Wingdings" w:hAnsi="Wingdings" w:hint="default"/>
+      </w:rPr>
+    </w:lvl>
+  </w:abstractNum>
+  <w:abstractNum w:abstractNumId="9" w15:restartNumberingAfterBreak="0">
     <w:nsid w:val="36477772"/>
     <w:multiLevelType w:val="hybridMultilevel"/>
     <w:tmpl w:val="40348CB6"/>
@@ -8316,7 +8987,119 @@
       </w:pPr>
     </w:lvl>
   </w:abstractNum>
-  <w:abstractNum w:abstractNumId="4" w15:restartNumberingAfterBreak="0">
+  <w:abstractNum w:abstractNumId="10" w15:restartNumberingAfterBreak="0">
+    <w:nsid w:val="36DC47E3"/>
+    <w:multiLevelType w:val="hybridMultilevel"/>
+    <w:tmpl w:val="FA88E1AC"/>
+    <w:lvl w:ilvl="0" w:tplc="202A4D90">
+      <w:numFmt w:val="bullet"/>
+      <w:lvlText w:val=""/>
+      <w:lvlJc w:val="left"/>
+      <w:pPr>
+        <w:ind w:left="1146" w:hanging="360"/>
+      </w:pPr>
+      <w:rPr>
+        <w:rFonts w:ascii="Wingdings" w:eastAsia="NSimSun" w:hAnsi="Wingdings" w:cs="Mangal" w:hint="default"/>
+      </w:rPr>
+    </w:lvl>
+    <w:lvl w:ilvl="1" w:tplc="40090003" w:tentative="1">
+      <w:start w:val="1"/>
+      <w:numFmt w:val="bullet"/>
+      <w:lvlText w:val="o"/>
+      <w:lvlJc w:val="left"/>
+      <w:pPr>
+        <w:ind w:left="1866" w:hanging="360"/>
+      </w:pPr>
+      <w:rPr>
+        <w:rFonts w:ascii="Courier New" w:hAnsi="Courier New" w:cs="Courier New" w:hint="default"/>
+      </w:rPr>
+    </w:lvl>
+    <w:lvl w:ilvl="2" w:tplc="40090005" w:tentative="1">
+      <w:start w:val="1"/>
+      <w:numFmt w:val="bullet"/>
+      <w:lvlText w:val=""/>
+      <w:lvlJc w:val="left"/>
+      <w:pPr>
+        <w:ind w:left="2586" w:hanging="360"/>
+      </w:pPr>
+      <w:rPr>
+        <w:rFonts w:ascii="Wingdings" w:hAnsi="Wingdings" w:hint="default"/>
+      </w:rPr>
+    </w:lvl>
+    <w:lvl w:ilvl="3" w:tplc="40090001" w:tentative="1">
+      <w:start w:val="1"/>
+      <w:numFmt w:val="bullet"/>
+      <w:lvlText w:val=""/>
+      <w:lvlJc w:val="left"/>
+      <w:pPr>
+        <w:ind w:left="3306" w:hanging="360"/>
+      </w:pPr>
+      <w:rPr>
+        <w:rFonts w:ascii="Symbol" w:hAnsi="Symbol" w:hint="default"/>
+      </w:rPr>
+    </w:lvl>
+    <w:lvl w:ilvl="4" w:tplc="40090003" w:tentative="1">
+      <w:start w:val="1"/>
+      <w:numFmt w:val="bullet"/>
+      <w:lvlText w:val="o"/>
+      <w:lvlJc w:val="left"/>
+      <w:pPr>
+        <w:ind w:left="4026" w:hanging="360"/>
+      </w:pPr>
+      <w:rPr>
+        <w:rFonts w:ascii="Courier New" w:hAnsi="Courier New" w:cs="Courier New" w:hint="default"/>
+      </w:rPr>
+    </w:lvl>
+    <w:lvl w:ilvl="5" w:tplc="40090005" w:tentative="1">
+      <w:start w:val="1"/>
+      <w:numFmt w:val="bullet"/>
+      <w:lvlText w:val=""/>
+      <w:lvlJc w:val="left"/>
+      <w:pPr>
+        <w:ind w:left="4746" w:hanging="360"/>
+      </w:pPr>
+      <w:rPr>
+        <w:rFonts w:ascii="Wingdings" w:hAnsi="Wingdings" w:hint="default"/>
+      </w:rPr>
+    </w:lvl>
+    <w:lvl w:ilvl="6" w:tplc="40090001" w:tentative="1">
+      <w:start w:val="1"/>
+      <w:numFmt w:val="bullet"/>
+      <w:lvlText w:val=""/>
+      <w:lvlJc w:val="left"/>
+      <w:pPr>
+        <w:ind w:left="5466" w:hanging="360"/>
+      </w:pPr>
+      <w:rPr>
+        <w:rFonts w:ascii="Symbol" w:hAnsi="Symbol" w:hint="default"/>
+      </w:rPr>
+    </w:lvl>
+    <w:lvl w:ilvl="7" w:tplc="40090003" w:tentative="1">
+      <w:start w:val="1"/>
+      <w:numFmt w:val="bullet"/>
+      <w:lvlText w:val="o"/>
+      <w:lvlJc w:val="left"/>
+      <w:pPr>
+        <w:ind w:left="6186" w:hanging="360"/>
+      </w:pPr>
+      <w:rPr>
+        <w:rFonts w:ascii="Courier New" w:hAnsi="Courier New" w:cs="Courier New" w:hint="default"/>
+      </w:rPr>
+    </w:lvl>
+    <w:lvl w:ilvl="8" w:tplc="40090005" w:tentative="1">
+      <w:start w:val="1"/>
+      <w:numFmt w:val="bullet"/>
+      <w:lvlText w:val=""/>
+      <w:lvlJc w:val="left"/>
+      <w:pPr>
+        <w:ind w:left="6906" w:hanging="360"/>
+      </w:pPr>
+      <w:rPr>
+        <w:rFonts w:ascii="Wingdings" w:hAnsi="Wingdings" w:hint="default"/>
+      </w:rPr>
+    </w:lvl>
+  </w:abstractNum>
+  <w:abstractNum w:abstractNumId="11" w15:restartNumberingAfterBreak="0">
     <w:nsid w:val="39DF6BF7"/>
     <w:multiLevelType w:val="hybridMultilevel"/>
     <w:tmpl w:val="25627EF0"/>
@@ -8405,7 +9188,7 @@
       </w:pPr>
     </w:lvl>
   </w:abstractNum>
-  <w:abstractNum w:abstractNumId="5" w15:restartNumberingAfterBreak="0">
+  <w:abstractNum w:abstractNumId="12" w15:restartNumberingAfterBreak="0">
     <w:nsid w:val="46BF4C9B"/>
     <w:multiLevelType w:val="hybridMultilevel"/>
     <w:tmpl w:val="E5847F16"/>
@@ -8494,7 +9277,7 @@
       </w:pPr>
     </w:lvl>
   </w:abstractNum>
-  <w:abstractNum w:abstractNumId="6" w15:restartNumberingAfterBreak="0">
+  <w:abstractNum w:abstractNumId="13" w15:restartNumberingAfterBreak="0">
     <w:nsid w:val="485E092B"/>
     <w:multiLevelType w:val="hybridMultilevel"/>
     <w:tmpl w:val="B142CAF2"/>
@@ -8583,7 +9366,7 @@
       </w:pPr>
     </w:lvl>
   </w:abstractNum>
-  <w:abstractNum w:abstractNumId="7" w15:restartNumberingAfterBreak="0">
+  <w:abstractNum w:abstractNumId="14" w15:restartNumberingAfterBreak="0">
     <w:nsid w:val="4B246B31"/>
     <w:multiLevelType w:val="hybridMultilevel"/>
     <w:tmpl w:val="3D94D470"/>
@@ -8672,7 +9455,7 @@
       </w:pPr>
     </w:lvl>
   </w:abstractNum>
-  <w:abstractNum w:abstractNumId="8" w15:restartNumberingAfterBreak="0">
+  <w:abstractNum w:abstractNumId="15" w15:restartNumberingAfterBreak="0">
     <w:nsid w:val="4E462AF5"/>
     <w:multiLevelType w:val="hybridMultilevel"/>
     <w:tmpl w:val="FB42D12E"/>
@@ -8761,7 +9544,120 @@
       </w:pPr>
     </w:lvl>
   </w:abstractNum>
-  <w:abstractNum w:abstractNumId="9" w15:restartNumberingAfterBreak="0">
+  <w:abstractNum w:abstractNumId="16" w15:restartNumberingAfterBreak="0">
+    <w:nsid w:val="65413145"/>
+    <w:multiLevelType w:val="hybridMultilevel"/>
+    <w:tmpl w:val="146A8018"/>
+    <w:lvl w:ilvl="0" w:tplc="2580EB00">
+      <w:start w:val="2"/>
+      <w:numFmt w:val="bullet"/>
+      <w:lvlText w:val=""/>
+      <w:lvlJc w:val="left"/>
+      <w:pPr>
+        <w:ind w:left="786" w:hanging="360"/>
+      </w:pPr>
+      <w:rPr>
+        <w:rFonts w:ascii="Wingdings" w:eastAsia="NSimSun" w:hAnsi="Wingdings" w:cs="Lucida Sans" w:hint="default"/>
+      </w:rPr>
+    </w:lvl>
+    <w:lvl w:ilvl="1" w:tplc="40090003" w:tentative="1">
+      <w:start w:val="1"/>
+      <w:numFmt w:val="bullet"/>
+      <w:lvlText w:val="o"/>
+      <w:lvlJc w:val="left"/>
+      <w:pPr>
+        <w:ind w:left="1506" w:hanging="360"/>
+      </w:pPr>
+      <w:rPr>
+        <w:rFonts w:ascii="Courier New" w:hAnsi="Courier New" w:cs="Courier New" w:hint="default"/>
+      </w:rPr>
+    </w:lvl>
+    <w:lvl w:ilvl="2" w:tplc="40090005" w:tentative="1">
+      <w:start w:val="1"/>
+      <w:numFmt w:val="bullet"/>
+      <w:lvlText w:val=""/>
+      <w:lvlJc w:val="left"/>
+      <w:pPr>
+        <w:ind w:left="2226" w:hanging="360"/>
+      </w:pPr>
+      <w:rPr>
+        <w:rFonts w:ascii="Wingdings" w:hAnsi="Wingdings" w:hint="default"/>
+      </w:rPr>
+    </w:lvl>
+    <w:lvl w:ilvl="3" w:tplc="40090001" w:tentative="1">
+      <w:start w:val="1"/>
+      <w:numFmt w:val="bullet"/>
+      <w:lvlText w:val=""/>
+      <w:lvlJc w:val="left"/>
+      <w:pPr>
+        <w:ind w:left="2946" w:hanging="360"/>
+      </w:pPr>
+      <w:rPr>
+        <w:rFonts w:ascii="Symbol" w:hAnsi="Symbol" w:hint="default"/>
+      </w:rPr>
+    </w:lvl>
+    <w:lvl w:ilvl="4" w:tplc="40090003" w:tentative="1">
+      <w:start w:val="1"/>
+      <w:numFmt w:val="bullet"/>
+      <w:lvlText w:val="o"/>
+      <w:lvlJc w:val="left"/>
+      <w:pPr>
+        <w:ind w:left="3666" w:hanging="360"/>
+      </w:pPr>
+      <w:rPr>
+        <w:rFonts w:ascii="Courier New" w:hAnsi="Courier New" w:cs="Courier New" w:hint="default"/>
+      </w:rPr>
+    </w:lvl>
+    <w:lvl w:ilvl="5" w:tplc="40090005" w:tentative="1">
+      <w:start w:val="1"/>
+      <w:numFmt w:val="bullet"/>
+      <w:lvlText w:val=""/>
+      <w:lvlJc w:val="left"/>
+      <w:pPr>
+        <w:ind w:left="4386" w:hanging="360"/>
+      </w:pPr>
+      <w:rPr>
+        <w:rFonts w:ascii="Wingdings" w:hAnsi="Wingdings" w:hint="default"/>
+      </w:rPr>
+    </w:lvl>
+    <w:lvl w:ilvl="6" w:tplc="40090001" w:tentative="1">
+      <w:start w:val="1"/>
+      <w:numFmt w:val="bullet"/>
+      <w:lvlText w:val=""/>
+      <w:lvlJc w:val="left"/>
+      <w:pPr>
+        <w:ind w:left="5106" w:hanging="360"/>
+      </w:pPr>
+      <w:rPr>
+        <w:rFonts w:ascii="Symbol" w:hAnsi="Symbol" w:hint="default"/>
+      </w:rPr>
+    </w:lvl>
+    <w:lvl w:ilvl="7" w:tplc="40090003" w:tentative="1">
+      <w:start w:val="1"/>
+      <w:numFmt w:val="bullet"/>
+      <w:lvlText w:val="o"/>
+      <w:lvlJc w:val="left"/>
+      <w:pPr>
+        <w:ind w:left="5826" w:hanging="360"/>
+      </w:pPr>
+      <w:rPr>
+        <w:rFonts w:ascii="Courier New" w:hAnsi="Courier New" w:cs="Courier New" w:hint="default"/>
+      </w:rPr>
+    </w:lvl>
+    <w:lvl w:ilvl="8" w:tplc="40090005" w:tentative="1">
+      <w:start w:val="1"/>
+      <w:numFmt w:val="bullet"/>
+      <w:lvlText w:val=""/>
+      <w:lvlJc w:val="left"/>
+      <w:pPr>
+        <w:ind w:left="6546" w:hanging="360"/>
+      </w:pPr>
+      <w:rPr>
+        <w:rFonts w:ascii="Wingdings" w:hAnsi="Wingdings" w:hint="default"/>
+      </w:rPr>
+    </w:lvl>
+  </w:abstractNum>
+  <w:abstractNum w:abstractNumId="17" w15:restartNumberingAfterBreak="0">
     <w:nsid w:val="673365AE"/>
     <w:multiLevelType w:val="hybridMultilevel"/>
     <w:tmpl w:val="6E7E3548"/>
@@ -8850,7 +9746,7 @@
       </w:pPr>
     </w:lvl>
   </w:abstractNum>
-  <w:abstractNum w:abstractNumId="10" w15:restartNumberingAfterBreak="0">
+  <w:abstractNum w:abstractNumId="18" w15:restartNumberingAfterBreak="0">
     <w:nsid w:val="69F47A80"/>
     <w:multiLevelType w:val="hybridMultilevel"/>
     <w:tmpl w:val="3B382CF2"/>
@@ -8939,7 +9835,120 @@
       </w:pPr>
     </w:lvl>
   </w:abstractNum>
-  <w:abstractNum w:abstractNumId="11" w15:restartNumberingAfterBreak="0">
+  <w:abstractNum w:abstractNumId="19" w15:restartNumberingAfterBreak="0">
+    <w:nsid w:val="6FDC286E"/>
+    <w:multiLevelType w:val="hybridMultilevel"/>
+    <w:tmpl w:val="727EC066"/>
+    <w:lvl w:ilvl="0" w:tplc="EBC6CB72">
+      <w:start w:val="2"/>
+      <w:numFmt w:val="bullet"/>
+      <w:lvlText w:val=""/>
+      <w:lvlJc w:val="left"/>
+      <w:pPr>
+        <w:ind w:left="786" w:hanging="360"/>
+      </w:pPr>
+      <w:rPr>
+        <w:rFonts w:ascii="Wingdings" w:eastAsia="NSimSun" w:hAnsi="Wingdings" w:cs="Mangal" w:hint="default"/>
+      </w:rPr>
+    </w:lvl>
+    <w:lvl w:ilvl="1" w:tplc="40090003" w:tentative="1">
+      <w:start w:val="1"/>
+      <w:numFmt w:val="bullet"/>
+      <w:lvlText w:val="o"/>
+      <w:lvlJc w:val="left"/>
+      <w:pPr>
+        <w:ind w:left="1506" w:hanging="360"/>
+      </w:pPr>
+      <w:rPr>
+        <w:rFonts w:ascii="Courier New" w:hAnsi="Courier New" w:cs="Courier New" w:hint="default"/>
+      </w:rPr>
+    </w:lvl>
+    <w:lvl w:ilvl="2" w:tplc="40090005" w:tentative="1">
+      <w:start w:val="1"/>
+      <w:numFmt w:val="bullet"/>
+      <w:lvlText w:val=""/>
+      <w:lvlJc w:val="left"/>
+      <w:pPr>
+        <w:ind w:left="2226" w:hanging="360"/>
+      </w:pPr>
+      <w:rPr>
+        <w:rFonts w:ascii="Wingdings" w:hAnsi="Wingdings" w:hint="default"/>
+      </w:rPr>
+    </w:lvl>
+    <w:lvl w:ilvl="3" w:tplc="40090001" w:tentative="1">
+      <w:start w:val="1"/>
+      <w:numFmt w:val="bullet"/>
+      <w:lvlText w:val=""/>
+      <w:lvlJc w:val="left"/>
+      <w:pPr>
+        <w:ind w:left="2946" w:hanging="360"/>
+      </w:pPr>
+      <w:rPr>
+        <w:rFonts w:ascii="Symbol" w:hAnsi="Symbol" w:hint="default"/>
+      </w:rPr>
+    </w:lvl>
+    <w:lvl w:ilvl="4" w:tplc="40090003" w:tentative="1">
+      <w:start w:val="1"/>
+      <w:numFmt w:val="bullet"/>
+      <w:lvlText w:val="o"/>
+      <w:lvlJc w:val="left"/>
+      <w:pPr>
+        <w:ind w:left="3666" w:hanging="360"/>
+      </w:pPr>
+      <w:rPr>
+        <w:rFonts w:ascii="Courier New" w:hAnsi="Courier New" w:cs="Courier New" w:hint="default"/>
+      </w:rPr>
+    </w:lvl>
+    <w:lvl w:ilvl="5" w:tplc="40090005" w:tentative="1">
+      <w:start w:val="1"/>
+      <w:numFmt w:val="bullet"/>
+      <w:lvlText w:val=""/>
+      <w:lvlJc w:val="left"/>
+      <w:pPr>
+        <w:ind w:left="4386" w:hanging="360"/>
+      </w:pPr>
+      <w:rPr>
+        <w:rFonts w:ascii="Wingdings" w:hAnsi="Wingdings" w:hint="default"/>
+      </w:rPr>
+    </w:lvl>
+    <w:lvl w:ilvl="6" w:tplc="40090001" w:tentative="1">
+      <w:start w:val="1"/>
+      <w:numFmt w:val="bullet"/>
+      <w:lvlText w:val=""/>
+      <w:lvlJc w:val="left"/>
+      <w:pPr>
+        <w:ind w:left="5106" w:hanging="360"/>
+      </w:pPr>
+      <w:rPr>
+        <w:rFonts w:ascii="Symbol" w:hAnsi="Symbol" w:hint="default"/>
+      </w:rPr>
+    </w:lvl>
+    <w:lvl w:ilvl="7" w:tplc="40090003" w:tentative="1">
+      <w:start w:val="1"/>
+      <w:numFmt w:val="bullet"/>
+      <w:lvlText w:val="o"/>
+      <w:lvlJc w:val="left"/>
+      <w:pPr>
+        <w:ind w:left="5826" w:hanging="360"/>
+      </w:pPr>
+      <w:rPr>
+        <w:rFonts w:ascii="Courier New" w:hAnsi="Courier New" w:cs="Courier New" w:hint="default"/>
+      </w:rPr>
+    </w:lvl>
+    <w:lvl w:ilvl="8" w:tplc="40090005" w:tentative="1">
+      <w:start w:val="1"/>
+      <w:numFmt w:val="bullet"/>
+      <w:lvlText w:val=""/>
+      <w:lvlJc w:val="left"/>
+      <w:pPr>
+        <w:ind w:left="6546" w:hanging="360"/>
+      </w:pPr>
+      <w:rPr>
+        <w:rFonts w:ascii="Wingdings" w:hAnsi="Wingdings" w:hint="default"/>
+      </w:rPr>
+    </w:lvl>
+  </w:abstractNum>
+  <w:abstractNum w:abstractNumId="20" w15:restartNumberingAfterBreak="0">
     <w:nsid w:val="75297A31"/>
     <w:multiLevelType w:val="hybridMultilevel"/>
     <w:tmpl w:val="0A68B94E"/>
@@ -9028,7 +10037,7 @@
       </w:pPr>
     </w:lvl>
   </w:abstractNum>
-  <w:abstractNum w:abstractNumId="12" w15:restartNumberingAfterBreak="0">
+  <w:abstractNum w:abstractNumId="21" w15:restartNumberingAfterBreak="0">
     <w:nsid w:val="7FC4561E"/>
     <w:multiLevelType w:val="hybridMultilevel"/>
     <w:tmpl w:val="93549D14"/>
@@ -9118,43 +10127,70 @@
     </w:lvl>
   </w:abstractNum>
   <w:num w:numId="1" w16cid:durableId="1890149070">
+    <w:abstractNumId w:val="20"/>
+  </w:num>
+  <w:num w:numId="2" w16cid:durableId="651253014">
+    <w:abstractNumId w:val="15"/>
+  </w:num>
+  <w:num w:numId="3" w16cid:durableId="1761952996">
+    <w:abstractNumId w:val="1"/>
+  </w:num>
+  <w:num w:numId="4" w16cid:durableId="1500972320">
+    <w:abstractNumId w:val="21"/>
+  </w:num>
+  <w:num w:numId="5" w16cid:durableId="2130738537">
+    <w:abstractNumId w:val="6"/>
+  </w:num>
+  <w:num w:numId="6" w16cid:durableId="826826870">
+    <w:abstractNumId w:val="12"/>
+  </w:num>
+  <w:num w:numId="7" w16cid:durableId="1276719871">
+    <w:abstractNumId w:val="9"/>
+  </w:num>
+  <w:num w:numId="8" w16cid:durableId="1788964340">
+    <w:abstractNumId w:val="17"/>
+  </w:num>
+  <w:num w:numId="9" w16cid:durableId="216822008">
+    <w:abstractNumId w:val="14"/>
+  </w:num>
+  <w:num w:numId="10" w16cid:durableId="1668364865">
     <w:abstractNumId w:val="11"/>
   </w:num>
-  <w:num w:numId="2" w16cid:durableId="651253014">
+  <w:num w:numId="11" w16cid:durableId="185027600">
+    <w:abstractNumId w:val="13"/>
+  </w:num>
+  <w:num w:numId="12" w16cid:durableId="255401786">
+    <w:abstractNumId w:val="18"/>
+  </w:num>
+  <w:num w:numId="13" w16cid:durableId="1947736867">
+    <w:abstractNumId w:val="4"/>
+  </w:num>
+  <w:num w:numId="14" w16cid:durableId="669065544">
+    <w:abstractNumId w:val="3"/>
+  </w:num>
+  <w:num w:numId="15" w16cid:durableId="472913093">
+    <w:abstractNumId w:val="10"/>
+  </w:num>
+  <w:num w:numId="16" w16cid:durableId="1457328805">
     <w:abstractNumId w:val="8"/>
   </w:num>
-  <w:num w:numId="3" w16cid:durableId="1761952996">
+  <w:num w:numId="17" w16cid:durableId="1628468941">
+    <w:abstractNumId w:val="19"/>
+  </w:num>
+  <w:num w:numId="18" w16cid:durableId="2059207232">
+    <w:abstractNumId w:val="16"/>
+  </w:num>
+  <w:num w:numId="19" w16cid:durableId="438573163">
+    <w:abstractNumId w:val="7"/>
+  </w:num>
+  <w:num w:numId="20" w16cid:durableId="1460994230">
+    <w:abstractNumId w:val="5"/>
+  </w:num>
+  <w:num w:numId="21" w16cid:durableId="1113941981">
     <w:abstractNumId w:val="0"/>
   </w:num>
-  <w:num w:numId="4" w16cid:durableId="1500972320">
-    <w:abstractNumId w:val="12"/>
-  </w:num>
-  <w:num w:numId="5" w16cid:durableId="2130738537">
+  <w:num w:numId="22" w16cid:durableId="240875536">
     <w:abstractNumId w:val="2"/>
-  </w:num>
-  <w:num w:numId="6" w16cid:durableId="826826870">
-    <w:abstractNumId w:val="5"/>
-  </w:num>
-  <w:num w:numId="7" w16cid:durableId="1276719871">
-    <w:abstractNumId w:val="3"/>
-  </w:num>
-  <w:num w:numId="8" w16cid:durableId="1788964340">
-    <w:abstractNumId w:val="9"/>
-  </w:num>
-  <w:num w:numId="9" w16cid:durableId="216822008">
-    <w:abstractNumId w:val="7"/>
-  </w:num>
-  <w:num w:numId="10" w16cid:durableId="1668364865">
-    <w:abstractNumId w:val="4"/>
-  </w:num>
-  <w:num w:numId="11" w16cid:durableId="185027600">
-    <w:abstractNumId w:val="6"/>
-  </w:num>
-  <w:num w:numId="12" w16cid:durableId="255401786">
-    <w:abstractNumId w:val="10"/>
-  </w:num>
-  <w:num w:numId="13" w16cid:durableId="1947736867">
-    <w:abstractNumId w:val="1"/>
   </w:num>
 </w:numbering>
 </file>
@@ -9581,7 +10617,6 @@
   <w:style w:type="character" w:default="1" w:styleId="DefaultParagraphFont">
     <w:name w:val="Default Paragraph Font"/>
     <w:uiPriority w:val="1"/>
-    <w:semiHidden/>
     <w:unhideWhenUsed/>
   </w:style>
   <w:style w:type="table" w:default="1" w:styleId="TableNormal">

</xml_diff>

<commit_message>
committing modifications to xalan-j xslt3.0 alpha2 release notes and jira issue addressed list
</commit_message>
<xml_diff>
--- a/xalan-j/xsl3/xalanj_xslt3.0_implementation_status.docx
+++ b/xalan-j/xsl3/xalanj_xslt3.0_implementation_status.docx
@@ -170,21 +170,7 @@
           <w:color w:val="404040" w:themeColor="text1" w:themeTint="BF"/>
           <w:lang w:val="en-IN"/>
         </w:rPr>
-        <w:t>4</w:t>
-      </w:r>
-      <w:r>
-        <w:rPr>
-          <w:color w:val="404040" w:themeColor="text1" w:themeTint="BF"/>
-          <w:lang w:val="en-IN"/>
-        </w:rPr>
-        <w:t>-</w:t>
-      </w:r>
-      <w:r>
-        <w:rPr>
-          <w:color w:val="404040" w:themeColor="text1" w:themeTint="BF"/>
-          <w:lang w:val="en-IN"/>
-        </w:rPr>
-        <w:t>28</w:t>
+        <w:t>5-10</w:t>
       </w:r>
     </w:p>
     <w:p>
@@ -6229,11 +6215,6 @@
       </w:r>
     </w:p>
     <w:p>
-      <w:pPr>
-        <w:rPr>
-          <w:rFonts w:hint="eastAsia"/>
-        </w:rPr>
-      </w:pPr>
       <w:r>
         <w:rPr>
           <w:rFonts w:hint="eastAsia"/>
@@ -6241,6 +6222,33 @@
         <w:t>fn:adjust-time-to-timezone</w:t>
       </w:r>
     </w:p>
+    <w:p/>
+    <w:p>
+      <w:r>
+        <w:t>fn:format-dateTime</w:t>
+      </w:r>
+    </w:p>
+    <w:p>
+      <w:r>
+        <w:t>fn:format-date</w:t>
+      </w:r>
+    </w:p>
+    <w:p>
+      <w:r>
+        <w:t>fn:format-time</w:t>
+      </w:r>
+    </w:p>
+    <w:p/>
+    <w:p>
+      <w:pPr>
+        <w:rPr>
+          <w:rFonts w:hint="eastAsia"/>
+        </w:rPr>
+      </w:pPr>
+      <w:r>
+        <w:t>fn:parse-ietf-date</w:t>
+      </w:r>
+    </w:p>
     <w:p>
       <w:pPr>
         <w:rPr>
@@ -6646,6 +6654,11 @@
       </w:r>
     </w:p>
     <w:p>
+      <w:pPr>
+        <w:rPr>
+          <w:rFonts w:hint="eastAsia"/>
+        </w:rPr>
+      </w:pPr>
       <w:r>
         <w:t>fn:parse-xml-fragment</w:t>
       </w:r>
@@ -7132,6 +7145,7 @@
         </w:rPr>
       </w:pPr>
       <w:r>
+        <w:lastRenderedPageBreak/>
         <w:t>array:sort</w:t>
       </w:r>
       <w:r>
@@ -7198,7 +7212,6 @@
         </w:rPr>
       </w:pPr>
       <w:r>
-        <w:lastRenderedPageBreak/>
         <w:t>fn:json-doc</w:t>
       </w:r>
     </w:p>
@@ -7802,7 +7815,15 @@
             <w:rStyle w:val="Hyperlink"/>
             <w:rFonts w:hint="eastAsia"/>
           </w:rPr>
-          <w:t>https://github.com/apache/xalan-java/blob/xalan-j_xslt3.0_mvn/src/test/java/org/apache/xalan/tests/w3c/xslt3/result/w3c_xslt3_testsuite_xalan-j_result.xml</w:t>
+          <w:t>https://github.com/apache/xalan-java/blob/xalan-</w:t>
+        </w:r>
+        <w:r>
+          <w:rPr>
+            <w:rStyle w:val="Hyperlink"/>
+            <w:rFonts w:hint="eastAsia"/>
+          </w:rPr>
+          <w:lastRenderedPageBreak/>
+          <w:t>j_xslt3.0_mvn/src/test/java/org/apache/xalan/tests/w3c/xslt3/result/w3c_xslt3_testsuite_xalan-j_result.xml</w:t>
         </w:r>
       </w:hyperlink>
     </w:p>

</xml_diff>